<commit_message>
Chương 3 xong vẽ DFD mức 1
</commit_message>
<xml_diff>
--- a/thesis/qt_baocao_110123058_huynhlengoctrinh_110123058_da23ttb.docx
+++ b/thesis/qt_baocao_110123058_huynhlengoctrinh_110123058_da23ttb.docx
@@ -3640,6 +3640,29 @@
     </w:p>
     <w:p>
       <w:pPr>
+        <w:pStyle w:val="nd"/>
+        <w:rPr>
+          <w:lang w:val="vi-VN"/>
+        </w:rPr>
+      </w:pPr>
+      <w:r>
+        <w:t xml:space="preserve">Visual Studio Code (VS Code) là trình soạn thảo mã nguồn miễn phí do Microsoft phát triển, được sử dụng phổ biến trong quá trình xây dựng và phát triển các ứng dụng web. Công cụ này có giao diện thân thiện, dễ sử dụng và hỗ trợ nhiều ngôn ngữ lập trình như HTML, CSS, JavaScript, PHP và </w:t>
+      </w:r>
+      <w:r>
+        <w:t>SQL</w:t>
+      </w:r>
+      <w:r>
+        <w:rPr>
+          <w:lang w:val="vi-VN"/>
+        </w:rPr>
+        <w:t xml:space="preserve">. </w:t>
+      </w:r>
+      <w:r>
+        <w:t>Một trong những lợi ích nổi bật của VS Code là khả năng tô màu cú pháp, tự động gợi ý mã nguồn và hỗ trợ phát hiện lỗi trong quá trình lập trình. Những tính năng này giúp người phát triển dễ dàng nhận biết cấu trúc mã nguồn, hạn chế các lỗi cú pháp và nâng cao hiệu quả làm việc. Bên cạnh đó, VS Code còn hỗ trợ tích hợp Git, giúp quản lý các phiên bản mã nguồn, theo dõi những thay đổi và thuận tiện khi phối hợp làm việc nhóm. Công cụ này cũng cung cấp hệ thống tiện ích mở rộng phong phú, cho phép bổ sung các chức năng như hỗ trợ PHP, kết nối cơ sở dữ liệu, định dạng mã nguồn và kiểm tra lỗi.</w:t>
+      </w:r>
+    </w:p>
+    <w:p>
+      <w:pPr>
         <w:pStyle w:val="Heading4"/>
         <w:rPr>
           <w:lang w:val="vi-VN"/>
@@ -3651,17 +3674,58 @@
     </w:p>
     <w:p>
       <w:pPr>
+        <w:pStyle w:val="nd"/>
+      </w:pPr>
+      <w:r>
+        <w:t>WSL 2</w:t>
+      </w:r>
+      <w:r>
+        <w:t xml:space="preserve"> (</w:t>
+      </w:r>
+      <w:r>
+        <w:t xml:space="preserve">Windows Subsystem for Linux </w:t>
+      </w:r>
+      <w:r>
+        <w:t>2)</w:t>
+      </w:r>
+      <w:r>
+        <w:t xml:space="preserve"> là công nghệ cho phép người dùng chạy môi trường Linux trực tiếp trên hệ điều hành Windows mà không cần cài đặt Linux trên một máy tính riêng hoặc thiết lập hệ thống khởi động kép. WSL 2 sử dụng nhân Linux thực tế trong môi trường máy ảo được tối ưu hóa, nhờ đó có khả năng tương thích tốt với nhiều công cụ và tiện ích dành cho Linux. Trong quá trình phát triển hệ thống quản lý sản phẩm và đơn hàng, WSL 2 hỗ trợ lập trình viên sử dụng các câu lệnh Linux để quản lý thư mục, thao tác với tệp tin, cài đặt công cụ và thực hiện các tác vụ liên quan đến môi trường phát triển ứng dụng. Ngoài ra, WSL 2 có khả năng phối hợp với Docker Desktop, tạo điều kiện thuận lợi cho việc xây dựng và vận hành các container trên Windows. Điều này giúp môi trường phát triển gần với môi trường triển khai ứng dụng trên các máy chủ Linux, từ đó hạn chế một số vấn đề phát sinh do sự khác biệt giữa các hệ điều hành. WSL 2 còn cho phép người dùng làm việc với mã nguồn trong môi trường Linux nhưng vẫn tận dụng được giao diện và các ứng dụng quen thuộc của Windows.</w:t>
+      </w:r>
+    </w:p>
+    <w:p>
+      <w:pPr>
         <w:pStyle w:val="Heading4"/>
         <w:rPr>
           <w:lang w:val="vi-VN"/>
         </w:rPr>
       </w:pPr>
       <w:r>
+        <w:lastRenderedPageBreak/>
         <w:t>Docker Desktop</w:t>
       </w:r>
     </w:p>
     <w:p>
       <w:pPr>
+        <w:pStyle w:val="nd"/>
+        <w:rPr>
+          <w:lang w:val="vi-VN"/>
+        </w:rPr>
+      </w:pPr>
+      <w:r>
+        <w:t>Docker Desktop là công cụ hỗ trợ xây dựng, quản lý và vận hành các ứng dụng sử dụng công nghệ container trên máy tính cá nhân. Container cho phép đóng gói ứng dụng cùng với các thành phần và cấu hình môi trường cần thiết để ứng dụng hoạt động, giúp hạn chế sự khác biệt giữa môi trường phát triển và môi trường triển khai. Đối với đề tài xây dựng hệ thống quản lý sản phẩm và đơn hàng, Docker Desktop được sử dụng để tạo môi trường chạy ứng dụng PHP kết hợp với máy chủ web Apache và hệ quản trị cơ sở dữ liệu MySQL. Thay vì phải cài đặt và cấu hình riêng từng thành phần trực tiếp trên hệ điều hành, người phát triển có thể khai báo môi trường thông qua các tệp cấu hình Docker.</w:t>
+      </w:r>
+      <w:r>
+        <w:rPr>
+          <w:lang w:val="vi-VN"/>
+        </w:rPr>
+        <w:t xml:space="preserve"> </w:t>
+      </w:r>
+      <w:r>
+        <w:t>Docker Desktop còn hỗ trợ quản lý cổng kết nối, biến môi trường, mạng giữa các container và vùng lưu trữ dữ liệu. Nhờ đó, quá trình thiết lập, kiểm thử và khắc phục sự cố trở nên thuận tiện hơn, đồng thời giúp các thành viên trong nhóm sử dụng môi trường phát triển thống nhất.</w:t>
+      </w:r>
+    </w:p>
+    <w:p>
+      <w:pPr>
         <w:pStyle w:val="Heading4"/>
         <w:rPr>
           <w:lang w:val="vi-VN"/>
@@ -3673,6 +3737,21 @@
     </w:p>
     <w:p>
       <w:pPr>
+        <w:pStyle w:val="nd"/>
+        <w:rPr>
+          <w:lang w:val="vi-VN"/>
+        </w:rPr>
+      </w:pPr>
+      <w:r>
+        <w:t xml:space="preserve">Apache HTTP Server là máy chủ web mã nguồn mở được sử dụng rộng rãi trong việc cung cấp các ứng dụng web cho người dùng thông qua mạng Internet hoặc mạng nội bộ. Apache có nhiệm vụ tiếp nhận các yêu cầu HTTP hoặc HTTPS từ trình duyệt, xác định tài nguyên cần truy cập và trả kết quả tương ứng về phía người dùng. Trong hệ thống quản lý sản phẩm và đơn hàng, Apache đóng vai trò là thành phần trung gian tiếp nhận yêu cầu khi người dùng truy cập các trang chức năng như danh sách sản phẩm, thêm sản phẩm, chỉnh sửa thông tin, quản lý danh mục và theo dõi đơn hàng. Khi người dùng gửi biểu mẫu thêm hoặc cập nhật dữ liệu, Apache phối hợp với môi trường thực thi PHP để xử lý các tệp mã nguồn tương ứng và trả về nội dung trang web sau khi xử lý. Bên cạnh việc hỗ trợ ứng dụng web động, Apache còn có khả năng cung cấp các tài nguyên tĩnh như hình ảnh sản phẩm, tệp CSS và JavaScript. Điều này giúp giao diện hệ thống hiển thị đầy đủ nội dung, hình ảnh và các thành phần tương tác cần thiết. Apache còn hỗ trợ cấu hình linh hoạt thông qua các tệp cấu hình và mô-đun mở rộng, cho phép điều chỉnh cách máy chủ xử lý yêu cầu, quản lý quyền truy cập và thiết lập các chức năng phù hợp với nhu cầu sử dụng. Trong môi trường Docker, Apache có thể được tích hợp với PHP trong cùng một container hoặc được tổ chức theo cấu hình phù hợp với kiến trúc triển khai của hệ thống. Việc sử dụng Apache giúp ứng dụng có môi trường phục vụ web ổn định, hỗ </w:t>
+      </w:r>
+      <w:r>
+        <w:lastRenderedPageBreak/>
+        <w:t>trợ xử lý các yêu cầu từ người dùng và tạo điều kiện thuận lợi cho việc triển khai, kiểm thử và bảo trì hệ thống.</w:t>
+      </w:r>
+    </w:p>
+    <w:p>
+      <w:pPr>
         <w:pStyle w:val="Heading4"/>
         <w:rPr>
           <w:lang w:val="vi-VN"/>
@@ -3684,6 +3763,17 @@
     </w:p>
     <w:p>
       <w:pPr>
+        <w:pStyle w:val="nd"/>
+        <w:rPr>
+          <w:lang w:val="vi-VN"/>
+        </w:rPr>
+      </w:pPr>
+      <w:r>
+        <w:t>PHP Runtime là môi trường thực thi ngôn ngữ lập trình PHP, có nhiệm vụ diễn giải và thực hiện mã nguồn PHP để xử lý các yêu cầu của ứng dụng web. Khác với HTML, chủ yếu dùng để xây dựng cấu trúc nội dung trang web, PHP cho phép thực hiện các thao tác xử lý dữ liệu, kiểm tra điều kiện, thực thi câu lệnh và tương tác với cơ sở dữ liệu ở phía máy chủ. Trong đề tài xây dựng hệ thống quản lý sản phẩm và đơn hàng, PHP Runtime giữ vai trò quan trọng trong việc triển khai các nghiệp vụ chính của hệ thống. Cụ thể, khi người dùng thực hiện thao tác thêm sản phẩm, chương trình PHP tiếp nhận dữ liệu từ biểu mẫu, kiểm tra tính hợp lệ của các trường thông tin như mã sản phẩm, tên sản phẩm, đơn giá, số lượng tồn kho, danh mục và nhà cung cấp. Sau khi dữ liệu đáp ứng các điều kiện cần thiết, chương trình thực hiện câu lệnh SQL để lưu thông tin vào cơ sở dữ liệu MySQL và trả về kết quả xử lý cho người dùng. Tương tự, các chức năng chỉnh sửa, xóa, tìm kiếm sản phẩm, quản lý danh mục và xử lý đơn hàng đều có thể được triển khai thông qua mã nguồn PHP. Ngoài ra, PHP còn hỗ trợ xử lý biểu mẫu, quản lý phiên làm việc bằng session, kiểm tra trạng thái đăng nhập và phân quyền truy cập theo vai trò người dùng. Khi kết hợp với MySQL, PHP có thể thực hiện các thao tác truy vấn, thêm, sửa và xóa dữ liệu thông qua các câu lệnh SQL, đồng thời sử dụng các cơ chế như truy vấn chuẩn bị sẵn (prepared statements) để hạn chế nguy cơ tấn công SQL injection khi được triển khai đúng cách. Trong môi trường Docker, PHP Runtime được cấu hình cùng với các thư viện và tiện ích cần thiết để đảm bảo ứng dụng có thể hoạt động ổn định. Việc sử dụng PHP giúp quá trình phát triển các chức năng nghiệp vụ trở nên linh hoạt, dễ tổ chức và thuận tiện cho việc bảo trì. Qua đó, PHP Runtime góp phần kết nối giao diện người dùng với cơ sở dữ liệu, đảm bảo các thao tác quản lý được xử lý theo đúng yêu cầu và tạo nền tảng để mở rộng hệ thống khi phát sinh thêm nhu cầu sử dụng.</w:t>
+      </w:r>
+    </w:p>
+    <w:p>
+      <w:pPr>
         <w:pStyle w:val="Heading3"/>
         <w:rPr>
           <w:lang w:val="vi-VN"/>
@@ -3714,431 +3804,317 @@
     </w:p>
     <w:p>
       <w:pPr>
-        <w:pStyle w:val="Heading4"/>
-        <w:rPr>
-          <w:lang w:val="vi-VN"/>
-        </w:rPr>
-      </w:pPr>
-      <w:r>
-        <w:t>Tìm</w:t>
-      </w:r>
-      <w:r>
-        <w:rPr>
-          <w:lang w:val="vi-VN"/>
-        </w:rPr>
-        <w:t xml:space="preserve"> hiểu</w:t>
-      </w:r>
-      <w:r>
-        <w:t xml:space="preserve"> REST API</w:t>
-      </w:r>
-    </w:p>
-    <w:p>
-      <w:pPr>
-        <w:pStyle w:val="Heading4"/>
-      </w:pPr>
-      <w:bookmarkStart w:id="1" w:name="_Toc218514176"/>
-      <w:r>
-        <w:t>Hệ</w:t>
-      </w:r>
-      <w:r>
-        <w:rPr>
-          <w:lang w:val="vi-VN"/>
-        </w:rPr>
-        <w:t xml:space="preserve"> thống quản lý Git/</w:t>
-      </w:r>
-      <w:r>
-        <w:t>GitHub</w:t>
-      </w:r>
-      <w:bookmarkEnd w:id="1"/>
-    </w:p>
-    <w:p>
-      <w:pPr>
-        <w:pStyle w:val="Heading2"/>
-        <w:rPr>
-          <w:lang w:val="vi-VN"/>
-        </w:rPr>
-      </w:pPr>
-      <w:r>
-        <w:t>Ngôn ngữ kịch bản phí server</w:t>
-      </w:r>
-    </w:p>
-    <w:p>
-      <w:pPr>
-        <w:pStyle w:val="Heading3"/>
-      </w:pPr>
-      <w:r>
-        <w:rPr>
-          <w:lang w:val="vi-VN"/>
-        </w:rPr>
-        <w:t>Giới thiệu ngôn ngữ PHP</w:t>
-      </w:r>
-      <w:r>
-        <w:rPr>
-          <w:lang w:val="vi-VN"/>
-        </w:rPr>
-        <w:t xml:space="preserve"> </w:t>
-      </w:r>
-    </w:p>
-    <w:p>
-      <w:pPr>
         <w:pStyle w:val="nd"/>
         <w:rPr>
-          <w:lang w:val="vi-VN"/>
-        </w:rPr>
-      </w:pPr>
-      <w:r>
-        <w:t xml:space="preserve">PHP là từ viết tắt của thuật ngữ Personal Home Page và hiện nay đang có tên Hypertext Preprocessor. Đây là một dạng mã lệnh hoặc một chuỗi ngôn ngữ kịch bản. Trong đó, ngôn ngữ PHP chủ yếu được phát triển để dành cho những ứng dụng nằm trên máy </w:t>
-      </w:r>
-      <w:r>
-        <w:t>chủ</w:t>
-      </w:r>
-      <w:r>
-        <w:t>.</w:t>
-      </w:r>
-    </w:p>
-    <w:p>
-      <w:pPr>
-        <w:pStyle w:val="Heading3"/>
-        <w:rPr>
-          <w:lang w:val="vi-VN"/>
-        </w:rPr>
-      </w:pPr>
-      <w:r>
-        <w:t>Lịch</w:t>
-      </w:r>
-      <w:r>
-        <w:rPr>
-          <w:lang w:val="vi-VN"/>
-        </w:rPr>
-        <w:t xml:space="preserve"> sử phát triển</w:t>
-      </w:r>
-    </w:p>
-    <w:p>
-      <w:pPr>
-        <w:pStyle w:val="nd"/>
-        <w:rPr>
-          <w:lang w:val="vi-VN"/>
-        </w:rPr>
-      </w:pPr>
-      <w:r>
-        <w:rPr>
-          <w:lang w:val="vi-VN"/>
-        </w:rPr>
-        <w:t xml:space="preserve">Năm </w:t>
-      </w:r>
-      <w:r>
-        <w:rPr>
-          <w:lang w:val="vi-VN"/>
-        </w:rPr>
-        <w:t>1994: PHP được tạo ra bởi Rasmus Lerdorf, ban đầu chỉ là một tập hợp các kịch bản viết bằng ngôn ngữ C để quản lý và theo dõi lượt truy cập trang cá nhân của ông. Công cụ này được đặt tên là Personal Home Page Tools (PHP Tools).</w:t>
-      </w:r>
-    </w:p>
-    <w:p>
-      <w:pPr>
-        <w:pStyle w:val="nd"/>
-        <w:rPr>
-          <w:lang w:val="vi-VN"/>
-        </w:rPr>
-      </w:pPr>
-      <w:r>
-        <w:rPr>
-          <w:lang w:val="vi-VN"/>
-        </w:rPr>
-        <w:t>Năm 1995</w:t>
-      </w:r>
-      <w:r>
-        <w:rPr>
-          <w:lang w:val="vi-VN"/>
-        </w:rPr>
-        <w:t>: Sau khi công bố mã nguồn của PHP Tools, Rasmus đã phát triển thêm chức năng hỗ trợ xử lý biểu mẫu web và tương tác với cơ sở dữ liệu. Công cụ này được đặt tên là PHP/FI (Personal Home Page/Form Interpreter), cho phép lập trình viên tạo các trang web động. Đây là phiên bản PHP đầu tiên có thể sử dụng rộng rãi.</w:t>
-      </w:r>
-    </w:p>
-    <w:p>
-      <w:pPr>
-        <w:pStyle w:val="nd"/>
-        <w:rPr>
-          <w:lang w:val="vi-VN"/>
-        </w:rPr>
-      </w:pPr>
-      <w:r>
-        <w:rPr>
-          <w:lang w:val="vi-VN"/>
-        </w:rPr>
-        <w:lastRenderedPageBreak/>
-        <w:t xml:space="preserve">Năm </w:t>
-      </w:r>
-      <w:r>
-        <w:rPr>
-          <w:lang w:val="vi-VN"/>
-        </w:rPr>
-        <w:t>1997: Sự phổ biến của PHP/FI dẫn đến việc cần một hệ thống mạnh mẽ hơn. Zeev Suraski và Andi Gutmans, hai lập trình viên từ Israel, đã tiến hành viết lại cốt lõi của PHP. Kết quả là một phiên bản ổn định và hiệu quả hơn, đặt nền móng cho PHP 3.</w:t>
-      </w:r>
-    </w:p>
-    <w:p>
-      <w:pPr>
-        <w:pStyle w:val="nd"/>
-        <w:rPr>
-          <w:lang w:val="vi-VN"/>
-        </w:rPr>
-      </w:pPr>
-      <w:r>
-        <w:rPr>
-          <w:lang w:val="vi-VN"/>
-        </w:rPr>
-        <w:t>Năm</w:t>
-      </w:r>
-      <w:r>
-        <w:rPr>
-          <w:lang w:val="vi-VN"/>
-        </w:rPr>
-        <w:t xml:space="preserve"> 1998: PHP 3 chính thức ra mắt, đánh dấu bước ngoặt lớn trong lịch sử phát triển của ngôn ngữ.</w:t>
-      </w:r>
-    </w:p>
-    <w:p>
-      <w:pPr>
-        <w:pStyle w:val="nd"/>
-        <w:rPr>
-          <w:lang w:val="vi-VN"/>
-        </w:rPr>
-      </w:pPr>
-      <w:r>
-        <w:rPr>
-          <w:lang w:val="vi-VN"/>
-        </w:rPr>
-        <w:t>Năm</w:t>
-      </w:r>
-      <w:r>
-        <w:rPr>
-          <w:lang w:val="vi-VN"/>
-        </w:rPr>
-        <w:t xml:space="preserve"> 2000: PHP 4 ra đời, sử dụng Zend Engine 1.0, một công cụ thực thi mới được phát triển bởi Zeev Suraski và Andi Gutmans. Phiên bản này cải thiện đáng kể hiệu suất và khả năng mở rộng, làm cho PHP trở thành lựa chọn ưu tiên cho các dự án lớn.</w:t>
-      </w:r>
-    </w:p>
-    <w:p>
-      <w:pPr>
-        <w:pStyle w:val="nd"/>
-        <w:rPr>
-          <w:lang w:val="vi-VN"/>
-        </w:rPr>
-      </w:pPr>
-      <w:r>
-        <w:rPr>
-          <w:lang w:val="vi-VN"/>
-        </w:rPr>
-        <w:t>Năm</w:t>
-      </w:r>
-      <w:r>
-        <w:rPr>
-          <w:lang w:val="vi-VN"/>
-        </w:rPr>
-        <w:t xml:space="preserve"> 2004: PHP 5 ra mắt với nhiều cải tiến mạnh mẽ nhờ Zend Engine 2.0. Phiên bản này đánh dấu sự trưởng thành của PHP trong việc hỗ trợ các mô hình lập trình hiện đại.</w:t>
-      </w:r>
-    </w:p>
-    <w:p>
-      <w:pPr>
-        <w:pStyle w:val="nd"/>
-        <w:rPr>
-          <w:lang w:val="vi-VN"/>
-        </w:rPr>
-      </w:pPr>
-      <w:r>
-        <w:rPr>
-          <w:lang w:val="vi-VN"/>
-        </w:rPr>
-        <w:t>Năm</w:t>
-      </w:r>
-      <w:r>
-        <w:rPr>
-          <w:lang w:val="vi-VN"/>
-        </w:rPr>
-        <w:t xml:space="preserve"> 2015: PHP 7 chính thức phát hành, sử dụng Zend Engine 3.0, mang lại những cải tiến vượt trội về hiệu suất và hiệu quả.</w:t>
-      </w:r>
-    </w:p>
-    <w:p>
-      <w:pPr>
-        <w:pStyle w:val="nd"/>
-        <w:rPr>
-          <w:lang w:val="vi-VN"/>
-        </w:rPr>
-      </w:pPr>
-      <w:r>
-        <w:rPr>
-          <w:lang w:val="vi-VN"/>
-        </w:rPr>
-        <w:t>Năm</w:t>
-      </w:r>
-      <w:r>
-        <w:rPr>
-          <w:lang w:val="vi-VN"/>
-        </w:rPr>
-        <w:t xml:space="preserve"> 2020: PHP 8 phát hành với những thay đổi quan trọng, đưa ngôn ngữ lên một tầm cao </w:t>
-      </w:r>
-      <w:r>
-        <w:rPr>
-          <w:lang w:val="vi-VN"/>
-        </w:rPr>
-        <w:t>mới.</w:t>
-      </w:r>
-    </w:p>
-    <w:p>
-      <w:pPr>
-        <w:pStyle w:val="Heading2"/>
-        <w:rPr>
-          <w:lang w:val="vi-VN"/>
-        </w:rPr>
-      </w:pPr>
-      <w:r>
-        <w:t xml:space="preserve">Ngôn ngữ truy vấn </w:t>
-      </w:r>
-      <w:r>
-        <w:t>SQL</w:t>
-      </w:r>
-    </w:p>
-    <w:p>
-      <w:pPr>
-        <w:pStyle w:val="Heading3"/>
-        <w:rPr>
-          <w:lang w:val="vi-VN"/>
-        </w:rPr>
-      </w:pPr>
-      <w:bookmarkStart w:id="2" w:name="_Toc218514158"/>
-      <w:r>
-        <w:rPr>
-          <w:lang w:val="vi-VN"/>
-        </w:rPr>
-        <w:t>Giới thiệu</w:t>
-      </w:r>
-      <w:bookmarkEnd w:id="2"/>
-    </w:p>
-    <w:p>
-      <w:pPr>
-        <w:pStyle w:val="Heading3"/>
-        <w:rPr>
-          <w:lang w:val="vi-VN"/>
-        </w:rPr>
-      </w:pPr>
-      <w:r>
-        <w:t>Vai trò của SQL</w:t>
-      </w:r>
-    </w:p>
-    <w:p>
-      <w:pPr>
-        <w:pStyle w:val="Heading3"/>
-        <w:rPr>
-          <w:lang w:val="vi-VN"/>
-        </w:rPr>
-      </w:pPr>
-      <w:r>
-        <w:t>Các nhóm lệnh SQL</w:t>
-      </w:r>
-    </w:p>
-    <w:p>
-      <w:pPr>
-        <w:rPr>
-          <w:lang w:val="vi-VN"/>
-        </w:rPr>
-      </w:pPr>
-    </w:p>
-    <w:p>
-      <w:r>
-        <w:br w:type="page"/>
-      </w:r>
-    </w:p>
-    <w:p>
-      <w:pPr>
-        <w:pStyle w:val="Heading1"/>
-      </w:pPr>
-      <w:r>
-        <w:rPr>
-          <w:caps w:val="0"/>
-        </w:rPr>
-        <w:lastRenderedPageBreak/>
-        <w:t>HIỆN</w:t>
-      </w:r>
-      <w:r>
-        <w:rPr>
-          <w:caps w:val="0"/>
-          <w:lang w:val="vi-VN"/>
-        </w:rPr>
-        <w:t xml:space="preserve"> THỰC </w:t>
-      </w:r>
-      <w:r>
-        <w:rPr>
-          <w:caps w:val="0"/>
-        </w:rPr>
-        <w:t>HÓA NGHIÊN CỨU</w:t>
-      </w:r>
-    </w:p>
-    <w:p>
-      <w:pPr>
-        <w:pStyle w:val="nd"/>
-        <w:ind w:firstLine="432"/>
-        <w:rPr>
-          <w:lang w:val="vi-VN"/>
-        </w:rPr>
-      </w:pPr>
-      <w:r>
-        <w:t>Chương</w:t>
-      </w:r>
-      <w:r>
-        <w:rPr>
-          <w:lang w:val="vi-VN"/>
-        </w:rPr>
-        <w:t xml:space="preserve"> 3</w:t>
-      </w:r>
-      <w:r>
-        <w:rPr>
-          <w:lang w:val="vi-VN"/>
-        </w:rPr>
-        <w:t xml:space="preserve"> </w:t>
-      </w:r>
-      <w:r>
-        <w:t xml:space="preserve">trình bày các phương pháp nghiên cứu được sử dụng trong quá trình thực hiện đề tài </w:t>
-      </w:r>
+          <w:b/>
+          <w:bCs/>
+        </w:rPr>
+      </w:pPr>
       <w:r>
         <w:rPr>
           <w:rStyle w:val="Strong"/>
           <w:b w:val="0"/>
           <w:bCs w:val="0"/>
-        </w:rPr>
-        <w:t>“Xây dựng hệ thống quản lý sản phẩm và đơn hàng”</w:t>
-      </w:r>
-      <w:r>
-        <w:t>.</w:t>
-      </w:r>
-      <w:r>
-        <w:t xml:space="preserve"> Việc lựa chọn phương pháp nghiên cứu phù hợp giúp xác định rõ các yêu cầu của hệ thống, phân tích quy trình nghiệp vụ và xây dựng mô hình dữ liệu đáp ứng nhu cầu quản lý.</w:t>
-      </w:r>
-    </w:p>
-    <w:p>
-      <w:pPr>
-        <w:pStyle w:val="Heading2"/>
-        <w:jc w:val="both"/>
-        <w:rPr>
-          <w:lang w:val="vi-VN"/>
-        </w:rPr>
-      </w:pPr>
-      <w:bookmarkStart w:id="3" w:name="_Ref242367482"/>
-      <w:r>
-        <w:t>Mô tả bài toán</w:t>
-      </w:r>
-      <w:bookmarkEnd w:id="3"/>
-    </w:p>
-    <w:p>
-      <w:pPr>
-        <w:pStyle w:val="nd"/>
-        <w:rPr>
-          <w:lang w:val="vi-VN"/>
-        </w:rPr>
-      </w:pPr>
-      <w:r>
-        <w:t xml:space="preserve">Đề tài </w:t>
+          <w:szCs w:val="26"/>
+        </w:rPr>
+        <w:t xml:space="preserve">Bootstrap là một bộ sưu tập miễn phí của các mã nguồn mở và công cụ dùng để tạo ra một mẫu webiste hoàn chỉnh. Với các thuộc tính về giao diện được quy định </w:t>
       </w:r>
       <w:r>
         <w:rPr>
           <w:rStyle w:val="Strong"/>
           <w:b w:val="0"/>
           <w:bCs w:val="0"/>
+          <w:szCs w:val="26"/>
+        </w:rPr>
+        <w:lastRenderedPageBreak/>
+        <w:t xml:space="preserve">sẵn như kích thước, màu sắc, độ cao, độ rộng…, các designer có thể sáng tạo nhiều sản phẩm mới mẻ nhưng vẫn tiết kiệm thời gian khi làm việc với framework này trong quá trình thiết kế giao diện </w:t>
+      </w:r>
+      <w:r>
+        <w:rPr>
+          <w:rStyle w:val="Strong"/>
+          <w:b w:val="0"/>
+          <w:bCs w:val="0"/>
+          <w:szCs w:val="26"/>
+        </w:rPr>
+        <w:t>website</w:t>
+      </w:r>
+      <w:r>
+        <w:rPr>
+          <w:rStyle w:val="Strong"/>
+          <w:b w:val="0"/>
+          <w:bCs w:val="0"/>
+          <w:szCs w:val="26"/>
+          <w:lang w:val="vi-VN"/>
+        </w:rPr>
+        <w:t>.</w:t>
+      </w:r>
+    </w:p>
+    <w:p>
+      <w:pPr>
+        <w:pStyle w:val="Heading4"/>
+        <w:rPr>
+          <w:lang w:val="vi-VN"/>
+        </w:rPr>
+      </w:pPr>
+      <w:r>
+        <w:t>Tìm</w:t>
+      </w:r>
+      <w:r>
+        <w:rPr>
+          <w:lang w:val="vi-VN"/>
+        </w:rPr>
+        <w:t xml:space="preserve"> hiểu</w:t>
+      </w:r>
+      <w:r>
+        <w:t xml:space="preserve"> REST API</w:t>
+      </w:r>
+    </w:p>
+    <w:p>
+      <w:pPr>
+        <w:pStyle w:val="Heading4"/>
+      </w:pPr>
+      <w:bookmarkStart w:id="1" w:name="_Toc218514176"/>
+      <w:r>
+        <w:t>Hệ</w:t>
+      </w:r>
+      <w:r>
+        <w:rPr>
+          <w:lang w:val="vi-VN"/>
+        </w:rPr>
+        <w:t xml:space="preserve"> thống quản lý Git/</w:t>
+      </w:r>
+      <w:r>
+        <w:t>GitHub</w:t>
+      </w:r>
+      <w:bookmarkEnd w:id="1"/>
+    </w:p>
+    <w:p>
+      <w:pPr>
+        <w:pStyle w:val="Heading2"/>
+        <w:rPr>
+          <w:lang w:val="vi-VN"/>
+        </w:rPr>
+      </w:pPr>
+      <w:r>
+        <w:t>Ngôn ngữ kịch bản phí server</w:t>
+      </w:r>
+    </w:p>
+    <w:p>
+      <w:pPr>
+        <w:pStyle w:val="Heading3"/>
+      </w:pPr>
+      <w:r>
+        <w:rPr>
+          <w:lang w:val="vi-VN"/>
+        </w:rPr>
+        <w:t>Giới thiệu ngôn ngữ PHP</w:t>
+      </w:r>
+      <w:r>
+        <w:rPr>
+          <w:lang w:val="vi-VN"/>
+        </w:rPr>
+        <w:t xml:space="preserve"> </w:t>
+      </w:r>
+    </w:p>
+    <w:p>
+      <w:pPr>
+        <w:pStyle w:val="Heading3"/>
+        <w:rPr>
+          <w:lang w:val="vi-VN"/>
+        </w:rPr>
+      </w:pPr>
+      <w:r>
+        <w:t>Lịch</w:t>
+      </w:r>
+      <w:r>
+        <w:rPr>
+          <w:lang w:val="vi-VN"/>
+        </w:rPr>
+        <w:t xml:space="preserve"> sử phát triển</w:t>
+      </w:r>
+    </w:p>
+    <w:p>
+      <w:pPr>
+        <w:pStyle w:val="Heading3"/>
+        <w:rPr>
+          <w:lang w:val="vi-VN"/>
+        </w:rPr>
+      </w:pPr>
+      <w:r>
+        <w:t>Vai trò của</w:t>
+      </w:r>
+      <w:r>
+        <w:rPr>
+          <w:lang w:val="vi-VN"/>
+        </w:rPr>
+        <w:t xml:space="preserve"> </w:t>
+      </w:r>
+      <w:r>
+        <w:rPr>
+          <w:lang w:val="vi-VN"/>
+        </w:rPr>
+        <w:t>ngôn ngữ PHP</w:t>
+      </w:r>
+    </w:p>
+    <w:p>
+      <w:pPr>
+        <w:pStyle w:val="Heading2"/>
+        <w:rPr>
+          <w:lang w:val="vi-VN"/>
+        </w:rPr>
+      </w:pPr>
+      <w:r>
+        <w:t xml:space="preserve">Ngôn ngữ truy vấn </w:t>
+      </w:r>
+      <w:r>
+        <w:t>SQL</w:t>
+      </w:r>
+    </w:p>
+    <w:p>
+      <w:pPr>
+        <w:pStyle w:val="Heading3"/>
+        <w:rPr>
+          <w:lang w:val="vi-VN"/>
+        </w:rPr>
+      </w:pPr>
+      <w:bookmarkStart w:id="2" w:name="_Toc218514158"/>
+      <w:r>
+        <w:rPr>
+          <w:lang w:val="vi-VN"/>
+        </w:rPr>
+        <w:t>Giới thiệu</w:t>
+      </w:r>
+      <w:bookmarkEnd w:id="2"/>
+    </w:p>
+    <w:p>
+      <w:pPr>
+        <w:pStyle w:val="Heading3"/>
+        <w:rPr>
+          <w:lang w:val="vi-VN"/>
+        </w:rPr>
+      </w:pPr>
+      <w:r>
+        <w:t>Vai trò của SQL</w:t>
+      </w:r>
+    </w:p>
+    <w:p>
+      <w:pPr>
+        <w:pStyle w:val="Heading3"/>
+        <w:rPr>
+          <w:lang w:val="vi-VN"/>
+        </w:rPr>
+      </w:pPr>
+      <w:r>
+        <w:t>Các nhóm lệnh SQL</w:t>
+      </w:r>
+    </w:p>
+    <w:p>
+      <w:pPr>
+        <w:rPr>
+          <w:lang w:val="vi-VN"/>
+        </w:rPr>
+      </w:pPr>
+    </w:p>
+    <w:p>
+      <w:r>
+        <w:br w:type="page"/>
+      </w:r>
+    </w:p>
+    <w:p>
+      <w:pPr>
+        <w:pStyle w:val="Heading1"/>
+      </w:pPr>
+      <w:r>
+        <w:rPr>
+          <w:caps w:val="0"/>
+        </w:rPr>
+        <w:lastRenderedPageBreak/>
+        <w:t>HIỆN</w:t>
+      </w:r>
+      <w:r>
+        <w:rPr>
+          <w:caps w:val="0"/>
+          <w:lang w:val="vi-VN"/>
+        </w:rPr>
+        <w:t xml:space="preserve"> THỰC </w:t>
+      </w:r>
+      <w:r>
+        <w:rPr>
+          <w:caps w:val="0"/>
+        </w:rPr>
+        <w:t>HÓA NGHIÊN CỨU</w:t>
+      </w:r>
+    </w:p>
+    <w:p>
+      <w:pPr>
+        <w:pStyle w:val="nd"/>
+        <w:ind w:firstLine="432"/>
+        <w:rPr>
+          <w:lang w:val="vi-VN"/>
+        </w:rPr>
+      </w:pPr>
+      <w:r>
+        <w:t>Chương</w:t>
+      </w:r>
+      <w:r>
+        <w:rPr>
+          <w:lang w:val="vi-VN"/>
+        </w:rPr>
+        <w:t xml:space="preserve"> 3</w:t>
+      </w:r>
+      <w:r>
+        <w:rPr>
+          <w:lang w:val="vi-VN"/>
+        </w:rPr>
+        <w:t xml:space="preserve"> </w:t>
+      </w:r>
+      <w:r>
+        <w:t xml:space="preserve">trình bày các phương pháp nghiên cứu được sử dụng trong quá trình thực hiện đề tài </w:t>
+      </w:r>
+      <w:r>
+        <w:rPr>
+          <w:rStyle w:val="Strong"/>
+          <w:b w:val="0"/>
+          <w:bCs w:val="0"/>
+        </w:rPr>
+        <w:t>“Xây dựng hệ thống quản lý sản phẩm và đơn hàng”</w:t>
+      </w:r>
+      <w:r>
+        <w:t>.</w:t>
+      </w:r>
+      <w:r>
+        <w:t xml:space="preserve"> Việc lựa chọn phương pháp nghiên cứu phù hợp giúp xác định rõ các yêu cầu của hệ thống, phân tích quy trình nghiệp vụ và xây dựng mô hình dữ liệu đáp ứng nhu cầu quản lý.</w:t>
+      </w:r>
+    </w:p>
+    <w:p>
+      <w:pPr>
+        <w:pStyle w:val="Heading2"/>
+        <w:jc w:val="both"/>
+        <w:rPr>
+          <w:lang w:val="vi-VN"/>
+        </w:rPr>
+      </w:pPr>
+      <w:bookmarkStart w:id="3" w:name="_Ref242367482"/>
+      <w:r>
+        <w:t>Mô tả bài toán</w:t>
+      </w:r>
+      <w:bookmarkEnd w:id="3"/>
+    </w:p>
+    <w:p>
+      <w:pPr>
+        <w:pStyle w:val="nd"/>
+        <w:rPr>
+          <w:lang w:val="vi-VN"/>
+        </w:rPr>
+      </w:pPr>
+      <w:r>
+        <w:t xml:space="preserve">Đề tài </w:t>
+      </w:r>
+      <w:r>
+        <w:rPr>
+          <w:rStyle w:val="Strong"/>
+          <w:b w:val="0"/>
+          <w:bCs w:val="0"/>
         </w:rPr>
         <w:t>“Xây dựng hệ thống quản lý sản phẩm và đơn hàng”</w:t>
       </w:r>
@@ -4302,8 +4278,8 @@
           <w:lang w:val="vi-VN"/>
         </w:rPr>
       </w:pPr>
-      <w:bookmarkStart w:id="4" w:name="_Toc242645973"/>
-      <w:bookmarkStart w:id="5" w:name="_Ref242454868"/>
+      <w:bookmarkStart w:id="4" w:name="_Ref242454868"/>
+      <w:bookmarkStart w:id="5" w:name="_Toc242645973"/>
       <w:r>
         <w:rPr>
           <w:i w:val="0"/>
@@ -4426,21 +4402,21 @@
         </w:rPr>
         <w:fldChar w:fldCharType="end"/>
       </w:r>
+      <w:bookmarkEnd w:id="4"/>
+      <w:r>
+        <w:t xml:space="preserve"> </w:t>
+      </w:r>
+      <w:r>
+        <w:rPr>
+          <w:i w:val="0"/>
+          <w:iCs w:val="0"/>
+          <w:color w:val="auto"/>
+          <w:sz w:val="26"/>
+          <w:szCs w:val="26"/>
+        </w:rPr>
+        <w:t>Các yêu cầu chức năng của hệ thống</w:t>
+      </w:r>
       <w:bookmarkEnd w:id="5"/>
-      <w:r>
-        <w:t xml:space="preserve"> </w:t>
-      </w:r>
-      <w:r>
-        <w:rPr>
-          <w:i w:val="0"/>
-          <w:iCs w:val="0"/>
-          <w:color w:val="auto"/>
-          <w:sz w:val="26"/>
-          <w:szCs w:val="26"/>
-        </w:rPr>
-        <w:t>Các yêu cầu chức năng của hệ thống</w:t>
-      </w:r>
-      <w:bookmarkEnd w:id="4"/>
     </w:p>
     <w:tbl>
       <w:tblPr>
@@ -6521,8 +6497,8 @@
           <w:lang w:val="vi-VN"/>
         </w:rPr>
       </w:pPr>
-      <w:bookmarkStart w:id="6" w:name="_Toc242645974"/>
-      <w:bookmarkStart w:id="7" w:name="_Ref242455183"/>
+      <w:bookmarkStart w:id="6" w:name="_Ref242455183"/>
+      <w:bookmarkStart w:id="7" w:name="_Toc242645974"/>
       <w:r>
         <w:rPr>
           <w:i w:val="0"/>
@@ -6645,50 +6621,50 @@
         </w:rPr>
         <w:fldChar w:fldCharType="end"/>
       </w:r>
+      <w:bookmarkEnd w:id="6"/>
+      <w:r>
+        <w:rPr>
+          <w:i w:val="0"/>
+          <w:iCs w:val="0"/>
+          <w:color w:val="auto"/>
+          <w:sz w:val="26"/>
+          <w:szCs w:val="26"/>
+          <w:lang w:val="vi-VN"/>
+        </w:rPr>
+        <w:t xml:space="preserve"> </w:t>
+      </w:r>
+      <w:r>
+        <w:rPr>
+          <w:i w:val="0"/>
+          <w:iCs w:val="0"/>
+          <w:color w:val="auto"/>
+          <w:sz w:val="26"/>
+          <w:szCs w:val="26"/>
+        </w:rPr>
+        <w:t>Các yêu cầu phi</w:t>
+      </w:r>
+      <w:r>
+        <w:rPr>
+          <w:i w:val="0"/>
+          <w:iCs w:val="0"/>
+          <w:color w:val="auto"/>
+          <w:sz w:val="26"/>
+          <w:szCs w:val="26"/>
+          <w:lang w:val="vi-VN"/>
+        </w:rPr>
+        <w:t xml:space="preserve"> </w:t>
+      </w:r>
+      <w:r>
+        <w:rPr>
+          <w:i w:val="0"/>
+          <w:iCs w:val="0"/>
+          <w:color w:val="auto"/>
+          <w:sz w:val="26"/>
+          <w:szCs w:val="26"/>
+        </w:rPr>
+        <w:t>chức năng</w:t>
+      </w:r>
       <w:bookmarkEnd w:id="7"/>
-      <w:r>
-        <w:rPr>
-          <w:i w:val="0"/>
-          <w:iCs w:val="0"/>
-          <w:color w:val="auto"/>
-          <w:sz w:val="26"/>
-          <w:szCs w:val="26"/>
-          <w:lang w:val="vi-VN"/>
-        </w:rPr>
-        <w:t xml:space="preserve"> </w:t>
-      </w:r>
-      <w:r>
-        <w:rPr>
-          <w:i w:val="0"/>
-          <w:iCs w:val="0"/>
-          <w:color w:val="auto"/>
-          <w:sz w:val="26"/>
-          <w:szCs w:val="26"/>
-        </w:rPr>
-        <w:t>Các yêu cầu phi</w:t>
-      </w:r>
-      <w:r>
-        <w:rPr>
-          <w:i w:val="0"/>
-          <w:iCs w:val="0"/>
-          <w:color w:val="auto"/>
-          <w:sz w:val="26"/>
-          <w:szCs w:val="26"/>
-          <w:lang w:val="vi-VN"/>
-        </w:rPr>
-        <w:t xml:space="preserve"> </w:t>
-      </w:r>
-      <w:r>
-        <w:rPr>
-          <w:i w:val="0"/>
-          <w:iCs w:val="0"/>
-          <w:color w:val="auto"/>
-          <w:sz w:val="26"/>
-          <w:szCs w:val="26"/>
-        </w:rPr>
-        <w:t>chức năng</w:t>
-      </w:r>
-      <w:bookmarkEnd w:id="6"/>
     </w:p>
     <w:tbl>
       <w:tblPr>
@@ -7604,6 +7580,7 @@
         </w:rPr>
       </w:pPr>
       <w:r>
+        <w:lastRenderedPageBreak/>
         <w:t>Kiến trúc hệ thống</w:t>
       </w:r>
     </w:p>
@@ -7613,6 +7590,53 @@
           <w:lang w:val="vi-VN"/>
         </w:rPr>
       </w:pPr>
+      <w:r>
+        <w:rPr>
+          <w:noProof/>
+          <w:lang w:val="vi-VN"/>
+        </w:rPr>
+        <w:drawing>
+          <wp:inline distT="0" distB="0" distL="0" distR="0" wp14:anchorId="28650AD7" wp14:editId="6E70A3C3">
+            <wp:extent cx="5580380" cy="2873375"/>
+            <wp:effectExtent l="0" t="0" r="1270" b="3175"/>
+            <wp:docPr id="1860424522" name="Picture 1"/>
+            <wp:cNvGraphicFramePr>
+              <a:graphicFrameLocks xmlns:a="http://schemas.openxmlformats.org/drawingml/2006/main" noChangeAspect="1"/>
+            </wp:cNvGraphicFramePr>
+            <a:graphic xmlns:a="http://schemas.openxmlformats.org/drawingml/2006/main">
+              <a:graphicData uri="http://schemas.openxmlformats.org/drawingml/2006/picture">
+                <pic:pic xmlns:pic="http://schemas.openxmlformats.org/drawingml/2006/picture">
+                  <pic:nvPicPr>
+                    <pic:cNvPr id="1860424522" name="Picture 1860424522"/>
+                    <pic:cNvPicPr/>
+                  </pic:nvPicPr>
+                  <pic:blipFill>
+                    <a:blip r:embed="rId9" cstate="print">
+                      <a:extLst>
+                        <a:ext uri="{28A0092B-C50C-407E-A947-70E740481C1C}">
+                          <a14:useLocalDpi xmlns:a14="http://schemas.microsoft.com/office/drawing/2010/main" val="0"/>
+                        </a:ext>
+                      </a:extLst>
+                    </a:blip>
+                    <a:stretch>
+                      <a:fillRect/>
+                    </a:stretch>
+                  </pic:blipFill>
+                  <pic:spPr>
+                    <a:xfrm>
+                      <a:off x="0" y="0"/>
+                      <a:ext cx="5580380" cy="2873375"/>
+                    </a:xfrm>
+                    <a:prstGeom prst="rect">
+                      <a:avLst/>
+                    </a:prstGeom>
+                  </pic:spPr>
+                </pic:pic>
+              </a:graphicData>
+            </a:graphic>
+          </wp:inline>
+        </w:drawing>
+      </w:r>
     </w:p>
     <w:p>
       <w:pPr>
@@ -7786,21 +7810,36 @@
         <w:pStyle w:val="nd"/>
       </w:pPr>
       <w:r>
-        <w:t xml:space="preserve">Mô tả: </w:t>
-      </w:r>
-      <w:r>
-        <w:t xml:space="preserve">Hệ thống được thiết kế theo mô hình Frontend – Backend – Cơ sở dữ liệu và lưu trữ hình ảnh. Trong đó, Frontend sử dụng HTML, CSS, JavaScript và Bootstrap 5 để xây dựng giao diện người dùng trên trình duyệt web, cho phép người dùng thao tác và gửi các yêu cầu HTTP đến máy chủ. Backend sử dụng PHP để xử lý nghiệp vụ, cung cấp REST API, quản lý session và thực hiện các chức năng quản lý sản phẩm, danh mục, nhà cung cấp, khách hàng, nhân viên và đơn hàng. Cơ sở dữ </w:t>
-      </w:r>
+        <w:t xml:space="preserve">Mô </w:t>
+      </w:r>
+      <w:r>
+        <w:t>tả</w:t>
+      </w:r>
+      <w:r>
+        <w:rPr>
+          <w:lang w:val="vi-VN"/>
+        </w:rPr>
+        <w:t>:</w:t>
+      </w:r>
+      <w:r>
+        <w:rPr>
+          <w:sz w:val="28"/>
+        </w:rPr>
+        <w:t xml:space="preserve"> </w:t>
+      </w:r>
+      <w:r>
+        <w:t>Sơ đồ kiến trúc hệ thống quản lý sản phẩm và đơn hàng được xây dựng theo mô hình Client–Server, kết hợp với hệ quản trị cơ sở dữ liệu MySQL và công cụ Docker Compose để tổ chức môi trường triển khai. Sơ đồ gồm các thành phần chính: người dùng, Client, Server PHP, MySQL và Git/GitHub. Trong đó, người dùng truy cập hệ thống thông qua trình duyệt web. Thành phần Client đảm nhiệm việc hiển thị giao diện và tương tác với người dùng, sử dụng các công nghệ HTML5, CSS3, JavaScript và Bootstrap 5. Khi người dùng thực hiện các thao tác như xem danh sách sản phẩm, thêm sản phẩm hoặc quản lý đơn hàng, Client gửi yêu cầu HTTP đến Server PHP để xử lý. Server PHP chịu trách nhiệm thực hiện các nghiệp vụ của hệ thống, kiểm tra tính hợp lệ của dữ liệu, quản lý phiên đăng nhập và xử lý các yêu cầu liên quan đến sản phẩm, danh mục, nhà cung cấp, khách hàng, nhân viên, đơn vị vận chuyển và đơn hàng. Server PHP kết nối với MySQL thông qua các câu lệnh SQL để truy vấn, thêm, sửa hoặc xóa dữ liệu. Sau khi xử lý, MySQL trả kết quả về Server PHP, sau đó máy chủ phản hồi cho Client để hiển thị thông tin tương ứng trên giao diện. Bên cạnh đó, Docker Compose được sử dụng để tổ chức và quản lý môi trường chạy của các dịch vụ PHP/Apache và MySQL, giúp việc triển khai hệ thống thuận tiện hơn. Git và GitHub hỗ trợ quản lý phiên bản mã nguồn, lưu trữ mã nguồn trực tuyến và phối hợp công việc giữa các thành viên trong quá trình phát triển</w:t>
+      </w:r>
+      <w:r>
+        <w:t>.</w:t>
+      </w:r>
+    </w:p>
+    <w:p>
+      <w:pPr>
+        <w:pStyle w:val="Heading2"/>
+      </w:pPr>
       <w:r>
         <w:lastRenderedPageBreak/>
-        <w:t>liệu MySQL có nhiệm vụ lưu trữ và quản lý thông tin của các đối tượng trong hệ thống, bao gồm sản phẩm, danh mục, nhà cung cấp, khách hàng, nhân viên, đơn hàng và chi tiết đơn hàng. Bên cạnh đó, thành phần lưu trữ hình ảnh được sử dụng để lưu các tệp hình ảnh sản phẩm, hỗ trợ Backend thực hiện việc tải lên, đọc và cung cấp hình ảnh khi cần thiết.</w:t>
-      </w:r>
-    </w:p>
-    <w:p>
-      <w:pPr>
-        <w:pStyle w:val="Heading2"/>
-      </w:pPr>
-      <w:r>
         <w:t>Thiết kế dữ liệu</w:t>
       </w:r>
     </w:p>
@@ -7840,7 +7879,7 @@
                     <pic:cNvPicPr/>
                   </pic:nvPicPr>
                   <pic:blipFill>
-                    <a:blip r:embed="rId9">
+                    <a:blip r:embed="rId10">
                       <a:extLst>
                         <a:ext uri="{28A0092B-C50C-407E-A947-70E740481C1C}">
                           <a14:useLocalDpi xmlns:a14="http://schemas.microsoft.com/office/drawing/2010/main" val="0"/>
@@ -8075,7 +8114,6 @@
         </w:rPr>
       </w:pPr>
       <w:r>
-        <w:lastRenderedPageBreak/>
         <w:t>Đặc tả</w:t>
       </w:r>
       <w:r>
@@ -8248,17 +8286,18 @@
           <w:lang w:val="vi-VN"/>
         </w:rPr>
       </w:pPr>
-      <w:bookmarkStart w:id="10" w:name="_Ref242645622"/>
-      <w:bookmarkStart w:id="11" w:name="_Toc242645975"/>
-      <w:bookmarkStart w:id="12" w:name="_Ref242454215"/>
-      <w:r>
-        <w:rPr>
-          <w:i w:val="0"/>
-          <w:iCs w:val="0"/>
-          <w:color w:val="auto"/>
-          <w:sz w:val="26"/>
-          <w:szCs w:val="26"/>
-        </w:rPr>
+      <w:bookmarkStart w:id="10" w:name="_Ref242454215"/>
+      <w:bookmarkStart w:id="11" w:name="_Ref242645622"/>
+      <w:bookmarkStart w:id="12" w:name="_Toc242645975"/>
+      <w:r>
+        <w:rPr>
+          <w:i w:val="0"/>
+          <w:iCs w:val="0"/>
+          <w:color w:val="auto"/>
+          <w:sz w:val="26"/>
+          <w:szCs w:val="26"/>
+        </w:rPr>
+        <w:lastRenderedPageBreak/>
         <w:t xml:space="preserve">Bảng </w:t>
       </w:r>
       <w:r>
@@ -8373,60 +8412,60 @@
         </w:rPr>
         <w:fldChar w:fldCharType="end"/>
       </w:r>
+      <w:bookmarkEnd w:id="10"/>
+      <w:r>
+        <w:rPr>
+          <w:i w:val="0"/>
+          <w:iCs w:val="0"/>
+          <w:color w:val="auto"/>
+          <w:sz w:val="26"/>
+          <w:szCs w:val="26"/>
+          <w:lang w:val="vi-VN"/>
+        </w:rPr>
+        <w:t xml:space="preserve"> </w:t>
+      </w:r>
+      <w:r>
+        <w:rPr>
+          <w:i w:val="0"/>
+          <w:iCs w:val="0"/>
+          <w:color w:val="auto"/>
+          <w:sz w:val="26"/>
+          <w:szCs w:val="26"/>
+        </w:rPr>
+        <w:t>T</w:t>
+      </w:r>
+      <w:r>
+        <w:rPr>
+          <w:i w:val="0"/>
+          <w:iCs w:val="0"/>
+          <w:color w:val="auto"/>
+          <w:sz w:val="26"/>
+          <w:szCs w:val="26"/>
+        </w:rPr>
+        <w:t xml:space="preserve">hực thể </w:t>
+      </w:r>
+      <w:r>
+        <w:rPr>
+          <w:i w:val="0"/>
+          <w:iCs w:val="0"/>
+          <w:color w:val="auto"/>
+          <w:sz w:val="26"/>
+          <w:szCs w:val="26"/>
+        </w:rPr>
+        <w:t>c</w:t>
+      </w:r>
+      <w:r>
+        <w:rPr>
+          <w:i w:val="0"/>
+          <w:iCs w:val="0"/>
+          <w:color w:val="auto"/>
+          <w:sz w:val="26"/>
+          <w:szCs w:val="26"/>
+        </w:rPr>
+        <w:t>ategories</w:t>
+      </w:r>
+      <w:bookmarkEnd w:id="11"/>
       <w:bookmarkEnd w:id="12"/>
-      <w:r>
-        <w:rPr>
-          <w:i w:val="0"/>
-          <w:iCs w:val="0"/>
-          <w:color w:val="auto"/>
-          <w:sz w:val="26"/>
-          <w:szCs w:val="26"/>
-          <w:lang w:val="vi-VN"/>
-        </w:rPr>
-        <w:t xml:space="preserve"> </w:t>
-      </w:r>
-      <w:r>
-        <w:rPr>
-          <w:i w:val="0"/>
-          <w:iCs w:val="0"/>
-          <w:color w:val="auto"/>
-          <w:sz w:val="26"/>
-          <w:szCs w:val="26"/>
-        </w:rPr>
-        <w:t>T</w:t>
-      </w:r>
-      <w:r>
-        <w:rPr>
-          <w:i w:val="0"/>
-          <w:iCs w:val="0"/>
-          <w:color w:val="auto"/>
-          <w:sz w:val="26"/>
-          <w:szCs w:val="26"/>
-        </w:rPr>
-        <w:t xml:space="preserve">hực thể </w:t>
-      </w:r>
-      <w:r>
-        <w:rPr>
-          <w:i w:val="0"/>
-          <w:iCs w:val="0"/>
-          <w:color w:val="auto"/>
-          <w:sz w:val="26"/>
-          <w:szCs w:val="26"/>
-        </w:rPr>
-        <w:t>c</w:t>
-      </w:r>
-      <w:r>
-        <w:rPr>
-          <w:i w:val="0"/>
-          <w:iCs w:val="0"/>
-          <w:color w:val="auto"/>
-          <w:sz w:val="26"/>
-          <w:szCs w:val="26"/>
-        </w:rPr>
-        <w:t>ategories</w:t>
-      </w:r>
-      <w:bookmarkEnd w:id="10"/>
-      <w:bookmarkEnd w:id="11"/>
     </w:p>
     <w:tbl>
       <w:tblPr>
@@ -8878,72 +8917,46 @@
           <w:lang w:val="vi-VN"/>
         </w:rPr>
       </w:pPr>
-      <w:bookmarkStart w:id="13" w:name="_Ref242645558"/>
-      <w:bookmarkStart w:id="14" w:name="_Ref242645572"/>
-      <w:bookmarkStart w:id="15" w:name="_Ref242645608"/>
-      <w:bookmarkStart w:id="16" w:name="_Ref242645619"/>
-      <w:bookmarkStart w:id="17" w:name="_Toc242645976"/>
-      <w:bookmarkStart w:id="18" w:name="_Ref242822477"/>
+      <w:bookmarkStart w:id="13" w:name="_Ref242822477"/>
+      <w:bookmarkStart w:id="14" w:name="_Ref242645558"/>
+      <w:bookmarkStart w:id="15" w:name="_Ref242645572"/>
+      <w:bookmarkStart w:id="16" w:name="_Ref242645608"/>
+      <w:bookmarkStart w:id="17" w:name="_Ref242645619"/>
+      <w:bookmarkStart w:id="18" w:name="_Toc242645976"/>
       <w:r>
         <w:t xml:space="preserve">Bảng </w:t>
       </w:r>
-      <w:r>
-        <w:fldChar w:fldCharType="begin"/>
-      </w:r>
-      <w:r>
-        <w:instrText xml:space="preserve"> STYLEREF 1 \s </w:instrText>
-      </w:r>
-      <w:r>
-        <w:fldChar w:fldCharType="separate"/>
-      </w:r>
-      <w:r>
-        <w:rPr>
-          <w:noProof/>
-        </w:rPr>
-        <w:t>3</w:t>
-      </w:r>
-      <w:r>
-        <w:rPr>
-          <w:noProof/>
-        </w:rPr>
-        <w:fldChar w:fldCharType="end"/>
-      </w:r>
+      <w:fldSimple w:instr=" STYLEREF 1 \s ">
+        <w:r>
+          <w:rPr>
+            <w:noProof/>
+          </w:rPr>
+          <w:t>3</w:t>
+        </w:r>
+      </w:fldSimple>
       <w:r>
         <w:t>.</w:t>
       </w:r>
-      <w:r>
-        <w:fldChar w:fldCharType="begin"/>
-      </w:r>
-      <w:r>
-        <w:instrText xml:space="preserve"> SEQ Bảng \* ARABIC \s 1 </w:instrText>
-      </w:r>
-      <w:r>
-        <w:fldChar w:fldCharType="separate"/>
-      </w:r>
-      <w:r>
-        <w:rPr>
-          <w:noProof/>
-        </w:rPr>
-        <w:t>4</w:t>
-      </w:r>
-      <w:r>
-        <w:rPr>
-          <w:noProof/>
-        </w:rPr>
-        <w:fldChar w:fldCharType="end"/>
-      </w:r>
-      <w:bookmarkEnd w:id="18"/>
+      <w:fldSimple w:instr=" SEQ Bảng \* ARABIC \s 1 ">
+        <w:r>
+          <w:rPr>
+            <w:noProof/>
+          </w:rPr>
+          <w:t>4</w:t>
+        </w:r>
+      </w:fldSimple>
+      <w:bookmarkEnd w:id="13"/>
       <w:r>
         <w:rPr>
           <w:lang w:val="vi-VN"/>
         </w:rPr>
         <w:t xml:space="preserve"> Thực thể </w:t>
       </w:r>
-      <w:bookmarkEnd w:id="13"/>
       <w:bookmarkEnd w:id="14"/>
       <w:bookmarkEnd w:id="15"/>
       <w:bookmarkEnd w:id="16"/>
       <w:bookmarkEnd w:id="17"/>
+      <w:bookmarkEnd w:id="18"/>
       <w:r>
         <w:rPr>
           <w:lang w:val="vi-VN"/>
@@ -9855,9 +9868,9 @@
           <w:lang w:val="vi-VN"/>
         </w:rPr>
       </w:pPr>
-      <w:bookmarkStart w:id="19" w:name="_Ref242645705"/>
-      <w:bookmarkStart w:id="20" w:name="_Toc242645977"/>
-      <w:bookmarkStart w:id="21" w:name="_Ref242454583"/>
+      <w:bookmarkStart w:id="19" w:name="_Ref242454583"/>
+      <w:bookmarkStart w:id="20" w:name="_Ref242645705"/>
+      <w:bookmarkStart w:id="21" w:name="_Toc242645977"/>
       <w:r>
         <w:rPr>
           <w:szCs w:val="26"/>
@@ -9932,25 +9945,25 @@
         </w:rPr>
         <w:fldChar w:fldCharType="end"/>
       </w:r>
+      <w:bookmarkEnd w:id="19"/>
+      <w:r>
+        <w:rPr>
+          <w:szCs w:val="26"/>
+          <w:lang w:val="vi-VN"/>
+        </w:rPr>
+        <w:t xml:space="preserve"> </w:t>
+      </w:r>
+      <w:r>
+        <w:t xml:space="preserve">Thực thể </w:t>
+      </w:r>
+      <w:r>
+        <w:t>c</w:t>
+      </w:r>
+      <w:r>
+        <w:t>ustomers</w:t>
+      </w:r>
+      <w:bookmarkEnd w:id="20"/>
       <w:bookmarkEnd w:id="21"/>
-      <w:r>
-        <w:rPr>
-          <w:szCs w:val="26"/>
-          <w:lang w:val="vi-VN"/>
-        </w:rPr>
-        <w:t xml:space="preserve"> </w:t>
-      </w:r>
-      <w:r>
-        <w:t xml:space="preserve">Thực thể </w:t>
-      </w:r>
-      <w:r>
-        <w:t>c</w:t>
-      </w:r>
-      <w:r>
-        <w:t>ustomers</w:t>
-      </w:r>
-      <w:bookmarkEnd w:id="19"/>
-      <w:bookmarkEnd w:id="20"/>
     </w:p>
     <w:tbl>
       <w:tblPr>
@@ -10088,7 +10101,6 @@
               <w:rPr>
                 <w:bCs/>
               </w:rPr>
-              <w:lastRenderedPageBreak/>
               <w:t>1</w:t>
             </w:r>
           </w:p>
@@ -10487,6 +10499,7 @@
               <w:rPr>
                 <w:bCs/>
               </w:rPr>
+              <w:lastRenderedPageBreak/>
               <w:t>6</w:t>
             </w:r>
           </w:p>
@@ -10760,9 +10773,9 @@
           <w:lang w:val="vi-VN"/>
         </w:rPr>
       </w:pPr>
-      <w:bookmarkStart w:id="22" w:name="_Ref242645743"/>
-      <w:bookmarkStart w:id="23" w:name="_Toc242645978"/>
-      <w:bookmarkStart w:id="24" w:name="_Ref242456404"/>
+      <w:bookmarkStart w:id="22" w:name="_Ref242456404"/>
+      <w:bookmarkStart w:id="23" w:name="_Ref242645743"/>
+      <w:bookmarkStart w:id="24" w:name="_Toc242645978"/>
       <w:r>
         <w:rPr>
           <w:szCs w:val="26"/>
@@ -10837,25 +10850,25 @@
         </w:rPr>
         <w:fldChar w:fldCharType="end"/>
       </w:r>
+      <w:bookmarkEnd w:id="22"/>
+      <w:r>
+        <w:rPr>
+          <w:szCs w:val="26"/>
+          <w:lang w:val="vi-VN"/>
+        </w:rPr>
+        <w:t xml:space="preserve"> </w:t>
+      </w:r>
+      <w:r>
+        <w:t xml:space="preserve">Thực thể </w:t>
+      </w:r>
+      <w:r>
+        <w:t>e</w:t>
+      </w:r>
+      <w:r>
+        <w:t>mployees</w:t>
+      </w:r>
+      <w:bookmarkEnd w:id="23"/>
       <w:bookmarkEnd w:id="24"/>
-      <w:r>
-        <w:rPr>
-          <w:szCs w:val="26"/>
-          <w:lang w:val="vi-VN"/>
-        </w:rPr>
-        <w:t xml:space="preserve"> </w:t>
-      </w:r>
-      <w:r>
-        <w:t xml:space="preserve">Thực thể </w:t>
-      </w:r>
-      <w:r>
-        <w:t>e</w:t>
-      </w:r>
-      <w:r>
-        <w:t>mployees</w:t>
-      </w:r>
-      <w:bookmarkEnd w:id="22"/>
-      <w:bookmarkEnd w:id="23"/>
     </w:p>
     <w:tbl>
       <w:tblPr>
@@ -11593,9 +11606,9 @@
           <w:lang w:val="vi-VN"/>
         </w:rPr>
       </w:pPr>
-      <w:bookmarkStart w:id="25" w:name="_Ref242645788"/>
-      <w:bookmarkStart w:id="26" w:name="_Toc242645979"/>
-      <w:bookmarkStart w:id="27" w:name="_Ref242456647"/>
+      <w:bookmarkStart w:id="25" w:name="_Ref242456647"/>
+      <w:bookmarkStart w:id="26" w:name="_Ref242645788"/>
+      <w:bookmarkStart w:id="27" w:name="_Toc242645979"/>
       <w:r>
         <w:rPr>
           <w:szCs w:val="26"/>
@@ -11670,25 +11683,25 @@
         </w:rPr>
         <w:fldChar w:fldCharType="end"/>
       </w:r>
+      <w:bookmarkEnd w:id="25"/>
+      <w:r>
+        <w:rPr>
+          <w:szCs w:val="26"/>
+          <w:lang w:val="vi-VN"/>
+        </w:rPr>
+        <w:t xml:space="preserve"> </w:t>
+      </w:r>
+      <w:r>
+        <w:t xml:space="preserve">Thực thể </w:t>
+      </w:r>
+      <w:r>
+        <w:t>s</w:t>
+      </w:r>
+      <w:r>
+        <w:t>hippers</w:t>
+      </w:r>
+      <w:bookmarkEnd w:id="26"/>
       <w:bookmarkEnd w:id="27"/>
-      <w:r>
-        <w:rPr>
-          <w:szCs w:val="26"/>
-          <w:lang w:val="vi-VN"/>
-        </w:rPr>
-        <w:t xml:space="preserve"> </w:t>
-      </w:r>
-      <w:r>
-        <w:t xml:space="preserve">Thực thể </w:t>
-      </w:r>
-      <w:r>
-        <w:t>s</w:t>
-      </w:r>
-      <w:r>
-        <w:t>hippers</w:t>
-      </w:r>
-      <w:bookmarkEnd w:id="25"/>
-      <w:bookmarkEnd w:id="26"/>
     </w:p>
     <w:tbl>
       <w:tblPr>
@@ -11715,7 +11728,6 @@
           </w:tcPr>
           <w:p>
             <w:r>
-              <w:lastRenderedPageBreak/>
               <w:t>STT</w:t>
             </w:r>
           </w:p>
@@ -12024,6 +12036,7 @@
         <w:ind w:firstLine="720"/>
       </w:pPr>
       <w:r>
+        <w:lastRenderedPageBreak/>
         <w:t xml:space="preserve">Thực </w:t>
       </w:r>
       <w:r>
@@ -12162,9 +12175,9 @@
           <w:lang w:val="vi-VN"/>
         </w:rPr>
       </w:pPr>
-      <w:bookmarkStart w:id="28" w:name="_Ref242645847"/>
-      <w:bookmarkStart w:id="29" w:name="_Toc242645980"/>
-      <w:bookmarkStart w:id="30" w:name="_Ref242457071"/>
+      <w:bookmarkStart w:id="28" w:name="_Ref242457071"/>
+      <w:bookmarkStart w:id="29" w:name="_Ref242645847"/>
+      <w:bookmarkStart w:id="30" w:name="_Toc242645980"/>
       <w:r>
         <w:rPr>
           <w:szCs w:val="26"/>
@@ -12239,18 +12252,18 @@
         </w:rPr>
         <w:fldChar w:fldCharType="end"/>
       </w:r>
+      <w:bookmarkEnd w:id="28"/>
+      <w:r>
+        <w:t xml:space="preserve"> Thực thể </w:t>
+      </w:r>
+      <w:r>
+        <w:t>p</w:t>
+      </w:r>
+      <w:r>
+        <w:t>roducts</w:t>
+      </w:r>
+      <w:bookmarkEnd w:id="29"/>
       <w:bookmarkEnd w:id="30"/>
-      <w:r>
-        <w:t xml:space="preserve"> Thực thể </w:t>
-      </w:r>
-      <w:r>
-        <w:t>p</w:t>
-      </w:r>
-      <w:r>
-        <w:t>roducts</w:t>
-      </w:r>
-      <w:bookmarkEnd w:id="28"/>
-      <w:bookmarkEnd w:id="29"/>
     </w:p>
     <w:tbl>
       <w:tblPr>
@@ -13293,9 +13306,9 @@
           <w:lang w:val="vi-VN"/>
         </w:rPr>
       </w:pPr>
-      <w:bookmarkStart w:id="31" w:name="_Ref242645875"/>
-      <w:bookmarkStart w:id="32" w:name="_Toc242645981"/>
-      <w:bookmarkStart w:id="33" w:name="_Ref242457136"/>
+      <w:bookmarkStart w:id="31" w:name="_Ref242457136"/>
+      <w:bookmarkStart w:id="32" w:name="_Ref242645875"/>
+      <w:bookmarkStart w:id="33" w:name="_Toc242645981"/>
       <w:r>
         <w:rPr>
           <w:szCs w:val="26"/>
@@ -13370,31 +13383,31 @@
         </w:rPr>
         <w:fldChar w:fldCharType="end"/>
       </w:r>
+      <w:bookmarkEnd w:id="31"/>
+      <w:r>
+        <w:rPr>
+          <w:szCs w:val="26"/>
+          <w:lang w:val="vi-VN"/>
+        </w:rPr>
+        <w:t xml:space="preserve"> </w:t>
+      </w:r>
+      <w:r>
+        <w:t xml:space="preserve">Thực thể </w:t>
+      </w:r>
+      <w:r>
+        <w:t>p</w:t>
+      </w:r>
+      <w:r>
+        <w:t>roduct_</w:t>
+      </w:r>
+      <w:r>
+        <w:t>i</w:t>
+      </w:r>
+      <w:r>
+        <w:t>mages</w:t>
+      </w:r>
+      <w:bookmarkEnd w:id="32"/>
       <w:bookmarkEnd w:id="33"/>
-      <w:r>
-        <w:rPr>
-          <w:szCs w:val="26"/>
-          <w:lang w:val="vi-VN"/>
-        </w:rPr>
-        <w:t xml:space="preserve"> </w:t>
-      </w:r>
-      <w:r>
-        <w:t xml:space="preserve">Thực thể </w:t>
-      </w:r>
-      <w:r>
-        <w:t>p</w:t>
-      </w:r>
-      <w:r>
-        <w:t>roduct_</w:t>
-      </w:r>
-      <w:r>
-        <w:t>i</w:t>
-      </w:r>
-      <w:r>
-        <w:t>mages</w:t>
-      </w:r>
-      <w:bookmarkEnd w:id="31"/>
-      <w:bookmarkEnd w:id="32"/>
     </w:p>
     <w:tbl>
       <w:tblPr>
@@ -13580,7 +13593,6 @@
               <w:rPr>
                 <w:bCs/>
               </w:rPr>
-              <w:lastRenderedPageBreak/>
               <w:t>2</w:t>
             </w:r>
           </w:p>
@@ -13779,7 +13791,11 @@
               </w:rPr>
             </w:pPr>
             <w:r>
-              <w:t>Văn bản mô tả hình ảnh, hỗ trợ người dùng và khả năng truy cập</w:t>
+              <w:t xml:space="preserve">Văn bản mô tả hình ảnh, hỗ trợ người </w:t>
+            </w:r>
+            <w:r>
+              <w:lastRenderedPageBreak/>
+              <w:t>dùng và khả năng truy cập</w:t>
             </w:r>
           </w:p>
         </w:tc>
@@ -13793,6 +13809,7 @@
               <w:cnfStyle w:val="000000000000" w:firstRow="0" w:lastRow="0" w:firstColumn="0" w:lastColumn="0" w:oddVBand="0" w:evenVBand="0" w:oddHBand="0" w:evenHBand="0" w:firstRowFirstColumn="0" w:firstRowLastColumn="0" w:lastRowFirstColumn="0" w:lastRowLastColumn="0"/>
             </w:pPr>
             <w:r>
+              <w:lastRenderedPageBreak/>
               <w:t>VARCHAR(255)</w:t>
             </w:r>
           </w:p>
@@ -14151,9 +14168,9 @@
           <w:lang w:val="vi-VN"/>
         </w:rPr>
       </w:pPr>
-      <w:bookmarkStart w:id="34" w:name="_Ref242645910"/>
-      <w:bookmarkStart w:id="35" w:name="_Toc242645982"/>
-      <w:bookmarkStart w:id="36" w:name="_Ref242457632"/>
+      <w:bookmarkStart w:id="34" w:name="_Ref242457632"/>
+      <w:bookmarkStart w:id="35" w:name="_Ref242645910"/>
+      <w:bookmarkStart w:id="36" w:name="_Toc242645982"/>
       <w:r>
         <w:rPr>
           <w:szCs w:val="26"/>
@@ -14228,25 +14245,25 @@
         </w:rPr>
         <w:fldChar w:fldCharType="end"/>
       </w:r>
+      <w:bookmarkEnd w:id="34"/>
+      <w:r>
+        <w:rPr>
+          <w:szCs w:val="26"/>
+          <w:lang w:val="vi-VN"/>
+        </w:rPr>
+        <w:t xml:space="preserve"> </w:t>
+      </w:r>
+      <w:r>
+        <w:t xml:space="preserve">Thực thể </w:t>
+      </w:r>
+      <w:r>
+        <w:t>o</w:t>
+      </w:r>
+      <w:r>
+        <w:t>rders</w:t>
+      </w:r>
+      <w:bookmarkEnd w:id="35"/>
       <w:bookmarkEnd w:id="36"/>
-      <w:r>
-        <w:rPr>
-          <w:szCs w:val="26"/>
-          <w:lang w:val="vi-VN"/>
-        </w:rPr>
-        <w:t xml:space="preserve"> </w:t>
-      </w:r>
-      <w:r>
-        <w:t xml:space="preserve">Thực thể </w:t>
-      </w:r>
-      <w:r>
-        <w:t>o</w:t>
-      </w:r>
-      <w:r>
-        <w:t>rders</w:t>
-      </w:r>
-      <w:bookmarkEnd w:id="34"/>
-      <w:bookmarkEnd w:id="35"/>
     </w:p>
     <w:tbl>
       <w:tblPr>
@@ -14905,9 +14922,9 @@
           <w:lang w:val="vi-VN"/>
         </w:rPr>
       </w:pPr>
-      <w:bookmarkStart w:id="37" w:name="_Ref242645951"/>
-      <w:bookmarkStart w:id="38" w:name="_Toc242645983"/>
-      <w:bookmarkStart w:id="39" w:name="_Ref242458121"/>
+      <w:bookmarkStart w:id="37" w:name="_Ref242458121"/>
+      <w:bookmarkStart w:id="38" w:name="_Ref242645951"/>
+      <w:bookmarkStart w:id="39" w:name="_Toc242645983"/>
       <w:r>
         <w:rPr>
           <w:i w:val="0"/>
@@ -15030,61 +15047,61 @@
         </w:rPr>
         <w:fldChar w:fldCharType="end"/>
       </w:r>
+      <w:bookmarkEnd w:id="37"/>
+      <w:r>
+        <w:rPr>
+          <w:i w:val="0"/>
+          <w:iCs w:val="0"/>
+          <w:color w:val="auto"/>
+          <w:sz w:val="26"/>
+          <w:szCs w:val="26"/>
+          <w:lang w:val="vi-VN"/>
+        </w:rPr>
+        <w:t xml:space="preserve"> </w:t>
+      </w:r>
+      <w:r>
+        <w:rPr>
+          <w:i w:val="0"/>
+          <w:iCs w:val="0"/>
+          <w:color w:val="auto"/>
+          <w:sz w:val="26"/>
+          <w:szCs w:val="26"/>
+        </w:rPr>
+        <w:t>T</w:t>
+      </w:r>
+      <w:r>
+        <w:rPr>
+          <w:i w:val="0"/>
+          <w:iCs w:val="0"/>
+          <w:color w:val="auto"/>
+          <w:sz w:val="26"/>
+          <w:szCs w:val="26"/>
+        </w:rPr>
+        <w:t>hực thể</w:t>
+      </w:r>
+      <w:r>
+        <w:rPr>
+          <w:i w:val="0"/>
+          <w:iCs w:val="0"/>
+          <w:color w:val="auto"/>
+          <w:sz w:val="26"/>
+          <w:szCs w:val="26"/>
+          <w:lang w:val="vi-VN"/>
+        </w:rPr>
+        <w:t xml:space="preserve"> </w:t>
+      </w:r>
+      <w:r>
+        <w:rPr>
+          <w:i w:val="0"/>
+          <w:iCs w:val="0"/>
+          <w:color w:val="auto"/>
+          <w:sz w:val="26"/>
+          <w:szCs w:val="26"/>
+        </w:rPr>
+        <w:t>OrderDetail</w:t>
+      </w:r>
+      <w:bookmarkEnd w:id="38"/>
       <w:bookmarkEnd w:id="39"/>
-      <w:r>
-        <w:rPr>
-          <w:i w:val="0"/>
-          <w:iCs w:val="0"/>
-          <w:color w:val="auto"/>
-          <w:sz w:val="26"/>
-          <w:szCs w:val="26"/>
-          <w:lang w:val="vi-VN"/>
-        </w:rPr>
-        <w:t xml:space="preserve"> </w:t>
-      </w:r>
-      <w:r>
-        <w:rPr>
-          <w:i w:val="0"/>
-          <w:iCs w:val="0"/>
-          <w:color w:val="auto"/>
-          <w:sz w:val="26"/>
-          <w:szCs w:val="26"/>
-        </w:rPr>
-        <w:t>T</w:t>
-      </w:r>
-      <w:r>
-        <w:rPr>
-          <w:i w:val="0"/>
-          <w:iCs w:val="0"/>
-          <w:color w:val="auto"/>
-          <w:sz w:val="26"/>
-          <w:szCs w:val="26"/>
-        </w:rPr>
-        <w:t>hực thể</w:t>
-      </w:r>
-      <w:r>
-        <w:rPr>
-          <w:i w:val="0"/>
-          <w:iCs w:val="0"/>
-          <w:color w:val="auto"/>
-          <w:sz w:val="26"/>
-          <w:szCs w:val="26"/>
-          <w:lang w:val="vi-VN"/>
-        </w:rPr>
-        <w:t xml:space="preserve"> </w:t>
-      </w:r>
-      <w:r>
-        <w:rPr>
-          <w:i w:val="0"/>
-          <w:iCs w:val="0"/>
-          <w:color w:val="auto"/>
-          <w:sz w:val="26"/>
-          <w:szCs w:val="26"/>
-        </w:rPr>
-        <w:t>OrderDetail</w:t>
-      </w:r>
-      <w:bookmarkEnd w:id="37"/>
-      <w:bookmarkEnd w:id="38"/>
     </w:p>
     <w:tbl>
       <w:tblPr>
@@ -15190,7 +15207,6 @@
               <w:rPr>
                 <w:bCs/>
               </w:rPr>
-              <w:lastRenderedPageBreak/>
               <w:t>1</w:t>
             </w:r>
           </w:p>
@@ -15437,6 +15453,7 @@
               <w:rPr>
                 <w:bCs/>
               </w:rPr>
+              <w:lastRenderedPageBreak/>
               <w:t>4</w:t>
             </w:r>
           </w:p>
@@ -15751,7 +15768,6 @@
         <w:rPr>
           <w:noProof/>
         </w:rPr>
-        <w:lastRenderedPageBreak/>
         <w:drawing>
           <wp:inline distT="0" distB="0" distL="0" distR="0" wp14:anchorId="35E4485E" wp14:editId="5243BB10">
             <wp:extent cx="5580380" cy="3007995"/>
@@ -15768,7 +15784,7 @@
                     <pic:cNvPicPr/>
                   </pic:nvPicPr>
                   <pic:blipFill>
-                    <a:blip r:embed="rId10">
+                    <a:blip r:embed="rId11">
                       <a:extLst>
                         <a:ext uri="{28A0092B-C50C-407E-A947-70E740481C1C}">
                           <a14:useLocalDpi xmlns:a14="http://schemas.microsoft.com/office/drawing/2010/main" val="0"/>
@@ -15937,51 +15953,62 @@
           <w:szCs w:val="26"/>
           <w:lang w:val="vi-VN"/>
         </w:rPr>
+        <w:t xml:space="preserve"> Mô hình DFD mức ngữ cảnh</w:t>
+      </w:r>
+    </w:p>
+    <w:p>
+      <w:pPr>
+        <w:pStyle w:val="Heading3"/>
+        <w:rPr>
+          <w:lang w:val="vi-VN"/>
+        </w:rPr>
+      </w:pPr>
+      <w:r>
+        <w:lastRenderedPageBreak/>
+        <w:t>Mô hình DFD phân rã chức năng</w:t>
+      </w:r>
+    </w:p>
+    <w:p>
+      <w:pPr>
+        <w:pStyle w:val="nd"/>
+      </w:pPr>
+      <w:r>
+        <w:t>- Sơ đồ DFD mức 1</w:t>
+      </w:r>
+    </w:p>
+    <w:p>
+      <w:pPr>
+        <w:pStyle w:val="nd"/>
+      </w:pPr>
+      <w:r>
+        <w:rPr>
+          <w:lang w:val="vi-VN"/>
+        </w:rPr>
+        <w:t xml:space="preserve">- </w:t>
+      </w:r>
+      <w:r>
+        <w:t xml:space="preserve">Mô </w:t>
+      </w:r>
+      <w:r>
+        <w:t>tả</w:t>
+      </w:r>
+      <w:r>
+        <w:rPr>
+          <w:lang w:val="vi-VN"/>
+        </w:rPr>
+        <w:t>:</w:t>
+      </w:r>
+      <w:r>
+        <w:t xml:space="preserve"> gồm các chức năng</w:t>
+      </w:r>
+      <w:r>
+        <w:rPr>
+          <w:lang w:val="vi-VN"/>
+        </w:rPr>
         <w:t xml:space="preserve"> </w:t>
       </w:r>
       <w:r>
-        <w:rPr>
-          <w:i w:val="0"/>
-          <w:iCs w:val="0"/>
-          <w:color w:val="auto"/>
-          <w:sz w:val="26"/>
-          <w:szCs w:val="26"/>
-          <w:lang w:val="vi-VN"/>
-        </w:rPr>
-        <w:t>Mô hình DFD mức ngữ cảnh</w:t>
-      </w:r>
-    </w:p>
-    <w:p>
-      <w:pPr>
-        <w:pStyle w:val="Heading3"/>
-        <w:rPr>
-          <w:lang w:val="vi-VN"/>
-        </w:rPr>
-      </w:pPr>
-      <w:r>
-        <w:t>Mô hình DFD phân rã chức năng</w:t>
-      </w:r>
-    </w:p>
-    <w:p>
-      <w:pPr>
-        <w:pStyle w:val="nd"/>
-      </w:pPr>
-      <w:r>
-        <w:t>- Sơ đồ DFD mức 1</w:t>
-      </w:r>
-    </w:p>
-    <w:p>
-      <w:pPr>
-        <w:pStyle w:val="nd"/>
-      </w:pPr>
-      <w:r>
-        <w:rPr>
-          <w:lang w:val="vi-VN"/>
-        </w:rPr>
-        <w:t xml:space="preserve">- </w:t>
-      </w:r>
-      <w:r>
-        <w:t>Mô tả: Sơ đồ gồm 5 tiến trình chính: quản lý sản phẩm và danh mục, quản lý nhà cung cấp, quản lý vận chuyển, quản lý khách hàng và đơn hàng, báo cáo thống kê. Các tiến trình thực hiện việc tiếp nhận, thêm, sửa, xóa và cập nhật thông tin sản phẩm, danh mục, nhà cung cấp, khách hàng và đơn hàng. Hệ thống xử lý yêu cầu đặt hàng, xác nhận đơn hàng, phối hợp vận chuyển và cập nhật trạng thái giao hàng, chức năng báo cáo thống kê tổng hợp dữ liệu để cung cấp thông tin, hỗ trợ theo dõi và quản lý hoạt động kinh doanh.</w:t>
+        <w:t>quản lý sản phẩm, quản lý nhà cung cấp, quản lý đơn hàng, quản lý vận chuyển và thống kê báo cáo. Nhà cung cấp cung cấp thông tin sản phẩm và nhà cung cấp; khách hàng gửi yêu cầu quản lý sản phẩm và mua hàng. Quản trị viên thực hiện cập nhật thông tin sản phẩm, quản lý đơn hàng và yêu cầu thống kê doanh thu. Đơn vị vận chuyển tiếp nhận thông tin đơn hàng để thực hiện giao hàng. Hệ thống lưu trữ dữ liệu sản phẩm, nhà cung cấp, đơn hàng và vận chuyển, đồng thời tổng hợp doanh thu để lập báo cáo phục vụ công tác quản lý.</w:t>
       </w:r>
     </w:p>
     <w:p>
@@ -15994,12 +16021,11 @@
         <w:rPr>
           <w:noProof/>
         </w:rPr>
-        <w:lastRenderedPageBreak/>
         <w:drawing>
-          <wp:inline distT="0" distB="0" distL="0" distR="0" wp14:anchorId="076235F2" wp14:editId="2F3B8A9B">
-            <wp:extent cx="5580380" cy="3960495"/>
-            <wp:effectExtent l="0" t="0" r="1270" b="1905"/>
-            <wp:docPr id="1931610068" name="Picture 7"/>
+          <wp:inline distT="0" distB="0" distL="0" distR="0" wp14:anchorId="151F65EC" wp14:editId="57277089">
+            <wp:extent cx="5580380" cy="3611245"/>
+            <wp:effectExtent l="0" t="0" r="1270" b="8255"/>
+            <wp:docPr id="1911799108" name="Picture 5"/>
             <wp:cNvGraphicFramePr>
               <a:graphicFrameLocks xmlns:a="http://schemas.openxmlformats.org/drawingml/2006/main" noChangeAspect="1"/>
             </wp:cNvGraphicFramePr>
@@ -16007,11 +16033,11 @@
               <a:graphicData uri="http://schemas.openxmlformats.org/drawingml/2006/picture">
                 <pic:pic xmlns:pic="http://schemas.openxmlformats.org/drawingml/2006/picture">
                   <pic:nvPicPr>
-                    <pic:cNvPr id="1931610068" name="Picture 1931610068"/>
+                    <pic:cNvPr id="1911799108" name="Picture 1911799108"/>
                     <pic:cNvPicPr/>
                   </pic:nvPicPr>
                   <pic:blipFill>
-                    <a:blip r:embed="rId11">
+                    <a:blip r:embed="rId12">
                       <a:extLst>
                         <a:ext uri="{28A0092B-C50C-407E-A947-70E740481C1C}">
                           <a14:useLocalDpi xmlns:a14="http://schemas.microsoft.com/office/drawing/2010/main" val="0"/>
@@ -16025,7 +16051,7 @@
                   <pic:spPr>
                     <a:xfrm>
                       <a:off x="0" y="0"/>
-                      <a:ext cx="5580380" cy="3960495"/>
+                      <a:ext cx="5580380" cy="3611245"/>
                     </a:xfrm>
                     <a:prstGeom prst="rect">
                       <a:avLst/>
@@ -16048,6 +16074,7 @@
           <w:color w:val="auto"/>
           <w:sz w:val="26"/>
           <w:szCs w:val="26"/>
+          <w:lang w:val="vi-VN"/>
         </w:rPr>
       </w:pPr>
       <w:r>
@@ -16181,18 +16208,7 @@
           <w:szCs w:val="26"/>
           <w:lang w:val="vi-VN"/>
         </w:rPr>
-        <w:t xml:space="preserve"> </w:t>
-      </w:r>
-      <w:r>
-        <w:rPr>
-          <w:i w:val="0"/>
-          <w:iCs w:val="0"/>
-          <w:color w:val="auto"/>
-          <w:sz w:val="26"/>
-          <w:szCs w:val="26"/>
-          <w:lang w:val="vi-VN"/>
-        </w:rPr>
-        <w:t xml:space="preserve">Sơ đồ DFD mức </w:t>
+        <w:t xml:space="preserve"> Sơ đồ DFD mức </w:t>
       </w:r>
       <w:r>
         <w:rPr>
@@ -16204,12 +16220,6 @@
         </w:rPr>
         <w:t>1</w:t>
       </w:r>
-    </w:p>
-    <w:p>
-      <w:pPr>
-        <w:pStyle w:val="Caption"/>
-        <w:jc w:val="center"/>
-      </w:pPr>
     </w:p>
     <w:p>
       <w:pPr>
@@ -16276,8 +16286,9 @@
         <w:rPr>
           <w:noProof/>
         </w:rPr>
+        <w:lastRenderedPageBreak/>
         <w:drawing>
-          <wp:inline distT="0" distB="0" distL="0" distR="0" wp14:anchorId="1362ED2C" wp14:editId="55316E93">
+          <wp:inline distT="0" distB="0" distL="0" distR="0" wp14:anchorId="1362ED2C" wp14:editId="65EDCA24">
             <wp:extent cx="4878953" cy="2351203"/>
             <wp:effectExtent l="19050" t="19050" r="17145" b="11430"/>
             <wp:docPr id="719135524" name="Picture 1"/>
@@ -16292,7 +16303,7 @@
                     <pic:cNvPicPr/>
                   </pic:nvPicPr>
                   <pic:blipFill>
-                    <a:blip r:embed="rId12" cstate="print">
+                    <a:blip r:embed="rId13" cstate="print">
                       <a:extLst>
                         <a:ext uri="{28A0092B-C50C-407E-A947-70E740481C1C}">
                           <a14:useLocalDpi xmlns:a14="http://schemas.microsoft.com/office/drawing/2010/main" val="0"/>
@@ -16329,6 +16340,173 @@
         <w:pStyle w:val="Caption"/>
         <w:jc w:val="center"/>
         <w:rPr>
+          <w:i w:val="0"/>
+          <w:iCs w:val="0"/>
+          <w:color w:val="auto"/>
+          <w:sz w:val="26"/>
+          <w:szCs w:val="26"/>
+        </w:rPr>
+      </w:pPr>
+      <w:r>
+        <w:rPr>
+          <w:i w:val="0"/>
+          <w:iCs w:val="0"/>
+          <w:color w:val="auto"/>
+          <w:sz w:val="26"/>
+          <w:szCs w:val="26"/>
+        </w:rPr>
+        <w:t xml:space="preserve">Hình </w:t>
+      </w:r>
+      <w:r>
+        <w:rPr>
+          <w:i w:val="0"/>
+          <w:iCs w:val="0"/>
+          <w:color w:val="auto"/>
+          <w:sz w:val="26"/>
+          <w:szCs w:val="26"/>
+        </w:rPr>
+        <w:fldChar w:fldCharType="begin"/>
+      </w:r>
+      <w:r>
+        <w:rPr>
+          <w:i w:val="0"/>
+          <w:iCs w:val="0"/>
+          <w:color w:val="auto"/>
+          <w:sz w:val="26"/>
+          <w:szCs w:val="26"/>
+        </w:rPr>
+        <w:instrText xml:space="preserve"> STYLEREF 1 \s </w:instrText>
+      </w:r>
+      <w:r>
+        <w:rPr>
+          <w:i w:val="0"/>
+          <w:iCs w:val="0"/>
+          <w:color w:val="auto"/>
+          <w:sz w:val="26"/>
+          <w:szCs w:val="26"/>
+        </w:rPr>
+        <w:fldChar w:fldCharType="separate"/>
+      </w:r>
+      <w:r>
+        <w:rPr>
+          <w:i w:val="0"/>
+          <w:iCs w:val="0"/>
+          <w:noProof/>
+          <w:color w:val="auto"/>
+          <w:sz w:val="26"/>
+          <w:szCs w:val="26"/>
+        </w:rPr>
+        <w:t>3</w:t>
+      </w:r>
+      <w:r>
+        <w:rPr>
+          <w:i w:val="0"/>
+          <w:iCs w:val="0"/>
+          <w:color w:val="auto"/>
+          <w:sz w:val="26"/>
+          <w:szCs w:val="26"/>
+        </w:rPr>
+        <w:fldChar w:fldCharType="end"/>
+      </w:r>
+      <w:r>
+        <w:rPr>
+          <w:i w:val="0"/>
+          <w:iCs w:val="0"/>
+          <w:color w:val="auto"/>
+          <w:sz w:val="26"/>
+          <w:szCs w:val="26"/>
+        </w:rPr>
+        <w:t>.</w:t>
+      </w:r>
+      <w:r>
+        <w:rPr>
+          <w:i w:val="0"/>
+          <w:iCs w:val="0"/>
+          <w:color w:val="auto"/>
+          <w:sz w:val="26"/>
+          <w:szCs w:val="26"/>
+        </w:rPr>
+        <w:fldChar w:fldCharType="begin"/>
+      </w:r>
+      <w:r>
+        <w:rPr>
+          <w:i w:val="0"/>
+          <w:iCs w:val="0"/>
+          <w:color w:val="auto"/>
+          <w:sz w:val="26"/>
+          <w:szCs w:val="26"/>
+        </w:rPr>
+        <w:instrText xml:space="preserve"> SEQ Hình \* ARABIC \s 1 </w:instrText>
+      </w:r>
+      <w:r>
+        <w:rPr>
+          <w:i w:val="0"/>
+          <w:iCs w:val="0"/>
+          <w:color w:val="auto"/>
+          <w:sz w:val="26"/>
+          <w:szCs w:val="26"/>
+        </w:rPr>
+        <w:fldChar w:fldCharType="separate"/>
+      </w:r>
+      <w:r>
+        <w:rPr>
+          <w:i w:val="0"/>
+          <w:iCs w:val="0"/>
+          <w:noProof/>
+          <w:color w:val="auto"/>
+          <w:sz w:val="26"/>
+          <w:szCs w:val="26"/>
+        </w:rPr>
+        <w:t>5</w:t>
+      </w:r>
+      <w:r>
+        <w:rPr>
+          <w:i w:val="0"/>
+          <w:iCs w:val="0"/>
+          <w:color w:val="auto"/>
+          <w:sz w:val="26"/>
+          <w:szCs w:val="26"/>
+        </w:rPr>
+        <w:fldChar w:fldCharType="end"/>
+      </w:r>
+      <w:r>
+        <w:rPr>
+          <w:i w:val="0"/>
+          <w:iCs w:val="0"/>
+          <w:color w:val="auto"/>
+          <w:sz w:val="26"/>
+          <w:szCs w:val="26"/>
+          <w:lang w:val="vi-VN"/>
+        </w:rPr>
+        <w:t xml:space="preserve"> </w:t>
+      </w:r>
+      <w:r>
+        <w:rPr>
+          <w:i w:val="0"/>
+          <w:iCs w:val="0"/>
+          <w:color w:val="auto"/>
+          <w:sz w:val="26"/>
+          <w:szCs w:val="26"/>
+          <w:lang w:val="vi-VN"/>
+        </w:rPr>
+        <w:t xml:space="preserve">Sơ đồ DFD mức </w:t>
+      </w:r>
+      <w:r>
+        <w:rPr>
+          <w:i w:val="0"/>
+          <w:iCs w:val="0"/>
+          <w:color w:val="auto"/>
+          <w:sz w:val="26"/>
+          <w:szCs w:val="26"/>
+        </w:rPr>
+        <w:t>1.1</w:t>
+      </w:r>
+    </w:p>
+    <w:p>
+      <w:pPr>
+        <w:pStyle w:val="Caption"/>
+        <w:jc w:val="center"/>
+        <w:rPr>
           <w:b/>
           <w:bCs/>
           <w:i w:val="0"/>
@@ -16336,173 +16514,9 @@
           <w:color w:val="auto"/>
           <w:sz w:val="26"/>
           <w:szCs w:val="26"/>
-        </w:rPr>
-      </w:pPr>
-      <w:r>
-        <w:rPr>
-          <w:i w:val="0"/>
-          <w:iCs w:val="0"/>
-          <w:color w:val="auto"/>
-          <w:sz w:val="26"/>
-          <w:szCs w:val="26"/>
-        </w:rPr>
-        <w:t xml:space="preserve">Hình </w:t>
-      </w:r>
-      <w:r>
-        <w:rPr>
-          <w:i w:val="0"/>
-          <w:iCs w:val="0"/>
-          <w:color w:val="auto"/>
-          <w:sz w:val="26"/>
-          <w:szCs w:val="26"/>
-        </w:rPr>
-        <w:fldChar w:fldCharType="begin"/>
-      </w:r>
-      <w:r>
-        <w:rPr>
-          <w:i w:val="0"/>
-          <w:iCs w:val="0"/>
-          <w:color w:val="auto"/>
-          <w:sz w:val="26"/>
-          <w:szCs w:val="26"/>
-        </w:rPr>
-        <w:instrText xml:space="preserve"> STYLEREF 1 \s </w:instrText>
-      </w:r>
-      <w:r>
-        <w:rPr>
-          <w:i w:val="0"/>
-          <w:iCs w:val="0"/>
-          <w:color w:val="auto"/>
-          <w:sz w:val="26"/>
-          <w:szCs w:val="26"/>
-        </w:rPr>
-        <w:fldChar w:fldCharType="separate"/>
-      </w:r>
-      <w:r>
-        <w:rPr>
-          <w:i w:val="0"/>
-          <w:iCs w:val="0"/>
-          <w:noProof/>
-          <w:color w:val="auto"/>
-          <w:sz w:val="26"/>
-          <w:szCs w:val="26"/>
-        </w:rPr>
-        <w:t>3</w:t>
-      </w:r>
-      <w:r>
-        <w:rPr>
-          <w:i w:val="0"/>
-          <w:iCs w:val="0"/>
-          <w:color w:val="auto"/>
-          <w:sz w:val="26"/>
-          <w:szCs w:val="26"/>
-        </w:rPr>
-        <w:fldChar w:fldCharType="end"/>
-      </w:r>
-      <w:r>
-        <w:rPr>
-          <w:i w:val="0"/>
-          <w:iCs w:val="0"/>
-          <w:color w:val="auto"/>
-          <w:sz w:val="26"/>
-          <w:szCs w:val="26"/>
-        </w:rPr>
-        <w:t>.</w:t>
-      </w:r>
-      <w:r>
-        <w:rPr>
-          <w:i w:val="0"/>
-          <w:iCs w:val="0"/>
-          <w:color w:val="auto"/>
-          <w:sz w:val="26"/>
-          <w:szCs w:val="26"/>
-        </w:rPr>
-        <w:fldChar w:fldCharType="begin"/>
-      </w:r>
-      <w:r>
-        <w:rPr>
-          <w:i w:val="0"/>
-          <w:iCs w:val="0"/>
-          <w:color w:val="auto"/>
-          <w:sz w:val="26"/>
-          <w:szCs w:val="26"/>
-        </w:rPr>
-        <w:instrText xml:space="preserve"> SEQ Hình \* ARABIC \s 1 </w:instrText>
-      </w:r>
-      <w:r>
-        <w:rPr>
-          <w:i w:val="0"/>
-          <w:iCs w:val="0"/>
-          <w:color w:val="auto"/>
-          <w:sz w:val="26"/>
-          <w:szCs w:val="26"/>
-        </w:rPr>
-        <w:fldChar w:fldCharType="separate"/>
-      </w:r>
-      <w:r>
-        <w:rPr>
-          <w:i w:val="0"/>
-          <w:iCs w:val="0"/>
-          <w:noProof/>
-          <w:color w:val="auto"/>
-          <w:sz w:val="26"/>
-          <w:szCs w:val="26"/>
-        </w:rPr>
-        <w:t>6</w:t>
-      </w:r>
-      <w:r>
-        <w:rPr>
-          <w:i w:val="0"/>
-          <w:iCs w:val="0"/>
-          <w:color w:val="auto"/>
-          <w:sz w:val="26"/>
-          <w:szCs w:val="26"/>
-        </w:rPr>
-        <w:fldChar w:fldCharType="end"/>
-      </w:r>
-      <w:r>
-        <w:rPr>
-          <w:i w:val="0"/>
-          <w:iCs w:val="0"/>
-          <w:color w:val="auto"/>
-          <w:sz w:val="26"/>
-          <w:szCs w:val="26"/>
-          <w:lang w:val="vi-VN"/>
-        </w:rPr>
-        <w:t xml:space="preserve"> </w:t>
-      </w:r>
-      <w:r>
-        <w:rPr>
-          <w:i w:val="0"/>
-          <w:iCs w:val="0"/>
-          <w:color w:val="auto"/>
-          <w:sz w:val="26"/>
-          <w:szCs w:val="26"/>
-          <w:lang w:val="vi-VN"/>
-        </w:rPr>
-        <w:t xml:space="preserve">Sơ đồ </w:t>
-      </w:r>
-      <w:r>
-        <w:rPr>
-          <w:i w:val="0"/>
-          <w:iCs w:val="0"/>
-          <w:color w:val="auto"/>
-          <w:sz w:val="26"/>
-          <w:szCs w:val="26"/>
-          <w:lang w:val="vi-VN"/>
-        </w:rPr>
-        <w:t xml:space="preserve">DFD mức </w:t>
-      </w:r>
-      <w:r>
-        <w:rPr>
-          <w:i w:val="0"/>
-          <w:iCs w:val="0"/>
-          <w:color w:val="auto"/>
-          <w:sz w:val="26"/>
-          <w:szCs w:val="26"/>
-        </w:rPr>
-        <w:t>1.1</w:t>
-      </w:r>
+          <w:lang w:val="vi-VN"/>
+        </w:rPr>
+      </w:pPr>
     </w:p>
     <w:p>
       <w:pPr>
@@ -16515,7 +16529,6 @@
         <w:rPr>
           <w:lang w:val="vi-VN"/>
         </w:rPr>
-        <w:lastRenderedPageBreak/>
         <w:t xml:space="preserve">- Mô hình DFD mức </w:t>
       </w:r>
       <w:r>
@@ -16593,7 +16606,7 @@
                     <pic:cNvPicPr/>
                   </pic:nvPicPr>
                   <pic:blipFill>
-                    <a:blip r:embed="rId13" cstate="print">
+                    <a:blip r:embed="rId14" cstate="print">
                       <a:extLst>
                         <a:ext uri="{28A0092B-C50C-407E-A947-70E740481C1C}">
                           <a14:useLocalDpi xmlns:a14="http://schemas.microsoft.com/office/drawing/2010/main" val="0"/>
@@ -16748,7 +16761,7 @@
           <w:sz w:val="26"/>
           <w:szCs w:val="26"/>
         </w:rPr>
-        <w:t>7</w:t>
+        <w:t>6</w:t>
       </w:r>
       <w:r>
         <w:rPr>
@@ -16875,7 +16888,11 @@
         <w:t xml:space="preserve">- Mô tả: </w:t>
       </w:r>
       <w:r>
-        <w:t>Sơ đồ mô tả quy trình quản lý đơn vị vận chuyển, phân công giao hàng và cập nhật trạng thái giao hàng. Quản trị viên/Nhân viên quản lý thông tin đơn vị vận chuyển, thực hiện phân công giao hàng cho đơn vị vận chuyển phù hợp. Đơn vị vận chuyển tiếp nhận thông tin đơn hàng và người nhận, sau đó cập nhật trạng thái giao hàng để hệ thống theo dõi tiến trình giao hàng.</w:t>
+        <w:t xml:space="preserve">Sơ đồ mô tả quy trình quản lý đơn vị vận chuyển, phân công giao hàng và cập nhật trạng thái giao hàng. Quản trị viên/Nhân viên quản lý thông tin đơn vị vận chuyển, thực hiện phân công giao hàng cho đơn vị vận chuyển phù hợp. Đơn vị </w:t>
+      </w:r>
+      <w:r>
+        <w:lastRenderedPageBreak/>
+        <w:t>vận chuyển tiếp nhận thông tin đơn hàng và người nhận, sau đó cập nhật trạng thái giao hàng để hệ thống theo dõi tiến trình giao hàng.</w:t>
       </w:r>
     </w:p>
     <w:p>
@@ -16889,9 +16906,8 @@
         <w:rPr>
           <w:noProof/>
         </w:rPr>
-        <w:lastRenderedPageBreak/>
         <w:drawing>
-          <wp:inline distT="0" distB="0" distL="0" distR="0" wp14:anchorId="2920AD48" wp14:editId="65A45FD9">
+          <wp:inline distT="0" distB="0" distL="0" distR="0" wp14:anchorId="2920AD48" wp14:editId="347ACBEB">
             <wp:extent cx="4159360" cy="2238709"/>
             <wp:effectExtent l="19050" t="19050" r="12700" b="28575"/>
             <wp:docPr id="1193658731" name="Picture 1"/>
@@ -16906,7 +16922,7 @@
                     <pic:cNvPicPr/>
                   </pic:nvPicPr>
                   <pic:blipFill>
-                    <a:blip r:embed="rId14" cstate="print">
+                    <a:blip r:embed="rId15" cstate="print">
                       <a:extLst>
                         <a:ext uri="{28A0092B-C50C-407E-A947-70E740481C1C}">
                           <a14:useLocalDpi xmlns:a14="http://schemas.microsoft.com/office/drawing/2010/main" val="0"/>
@@ -17061,7 +17077,7 @@
           <w:sz w:val="26"/>
           <w:szCs w:val="26"/>
         </w:rPr>
-        <w:t>8</w:t>
+        <w:t>7</w:t>
       </w:r>
       <w:r>
         <w:rPr>
@@ -17182,7 +17198,7 @@
                     <pic:cNvPicPr/>
                   </pic:nvPicPr>
                   <pic:blipFill>
-                    <a:blip r:embed="rId15" cstate="print">
+                    <a:blip r:embed="rId16" cstate="print">
                       <a:extLst>
                         <a:ext uri="{28A0092B-C50C-407E-A947-70E740481C1C}">
                           <a14:useLocalDpi xmlns:a14="http://schemas.microsoft.com/office/drawing/2010/main" val="0"/>
@@ -17337,7 +17353,7 @@
           <w:sz w:val="26"/>
           <w:szCs w:val="26"/>
         </w:rPr>
-        <w:t>9</w:t>
+        <w:t>8</w:t>
       </w:r>
       <w:r>
         <w:rPr>
@@ -17434,7 +17450,11 @@
         <w:t xml:space="preserve">- Mô tả: </w:t>
       </w:r>
       <w:r>
-        <w:t>Quản trị viên/Nhân viên có thể thống kê sản phẩm, thống kê đơn hàng và doanh thu dựa trên dữ liệu sản phẩm, đơn hàng và khách hàng. Hệ thống tổng hợp kết quả thống kê, cho phép lựa chọn tiêu chí và định dạng báo cáo, sau đó xuất báo cáo phục vụ công tác quản lý.</w:t>
+        <w:t xml:space="preserve">Quản trị viên/Nhân viên có thể thống kê sản phẩm, thống kê đơn hàng và doanh thu dựa trên dữ liệu sản phẩm, đơn hàng và khách hàng. Hệ thống tổng hợp </w:t>
+      </w:r>
+      <w:r>
+        <w:lastRenderedPageBreak/>
+        <w:t>kết quả thống kê, cho phép lựa chọn tiêu chí và định dạng báo cáo, sau đó xuất báo cáo phục vụ công tác quản lý.</w:t>
       </w:r>
     </w:p>
     <w:p>
@@ -17448,7 +17468,6 @@
           <w:noProof/>
           <w:lang w:val="vi-VN"/>
         </w:rPr>
-        <w:lastRenderedPageBreak/>
         <w:drawing>
           <wp:inline distT="0" distB="0" distL="0" distR="0" wp14:anchorId="4B4205B4" wp14:editId="3EE1B158">
             <wp:extent cx="5149298" cy="2237144"/>
@@ -17465,7 +17484,7 @@
                     <pic:cNvPicPr/>
                   </pic:nvPicPr>
                   <pic:blipFill>
-                    <a:blip r:embed="rId16">
+                    <a:blip r:embed="rId17">
                       <a:extLst>
                         <a:ext uri="{28A0092B-C50C-407E-A947-70E740481C1C}">
                           <a14:useLocalDpi xmlns:a14="http://schemas.microsoft.com/office/drawing/2010/main" val="0"/>
@@ -17620,7 +17639,7 @@
           <w:sz w:val="26"/>
           <w:szCs w:val="26"/>
         </w:rPr>
-        <w:t>10</w:t>
+        <w:t>9</w:t>
       </w:r>
       <w:r>
         <w:rPr>
@@ -17736,7 +17755,7 @@
                     <pic:cNvPicPr/>
                   </pic:nvPicPr>
                   <pic:blipFill>
-                    <a:blip r:embed="rId17" cstate="print">
+                    <a:blip r:embed="rId18" cstate="print">
                       <a:extLst>
                         <a:ext uri="{28A0092B-C50C-407E-A947-70E740481C1C}">
                           <a14:useLocalDpi xmlns:a14="http://schemas.microsoft.com/office/drawing/2010/main" val="0"/>
@@ -17888,7 +17907,7 @@
           <w:sz w:val="26"/>
           <w:szCs w:val="26"/>
         </w:rPr>
-        <w:t>11</w:t>
+        <w:t>10</w:t>
       </w:r>
       <w:r>
         <w:rPr>
@@ -17925,6 +17944,7 @@
         <w:rPr>
           <w:lang w:val="vi-VN"/>
         </w:rPr>
+        <w:lastRenderedPageBreak/>
         <w:t>Giao diện trang chủ</w:t>
       </w:r>
     </w:p>
@@ -17948,11 +17968,7 @@
         <w:t xml:space="preserve"> </w:t>
       </w:r>
       <w:r>
-        <w:t xml:space="preserve">Giao diện trang chủ hệ thống quản lý bán hàng gồm thanh điều hướng, ô tìm kiếm, giỏ hàng và nút đăng nhập. Nội dung hiển thị các sản phẩm nổi bật, sản </w:t>
-      </w:r>
-      <w:r>
-        <w:lastRenderedPageBreak/>
-        <w:t xml:space="preserve">phẩm mới với hình ảnh, tên sản phẩm, giá và nút xem chi tiết. Phía dưới là khu vực banner thương hiệu và chân </w:t>
+        <w:t xml:space="preserve">Giao diện trang chủ hệ thống quản lý bán hàng gồm thanh điều hướng, ô tìm kiếm, giỏ hàng và nút đăng nhập. Nội dung hiển thị các sản phẩm nổi bật, sản phẩm mới với hình ảnh, tên sản phẩm, giá và nút xem chi tiết. Phía dưới là khu vực banner thương hiệu và chân </w:t>
       </w:r>
       <w:r>
         <w:t>trang</w:t>
@@ -17980,7 +17996,7 @@
           <w:noProof/>
         </w:rPr>
         <w:drawing>
-          <wp:inline distT="0" distB="0" distL="0" distR="0" wp14:anchorId="24440EFF" wp14:editId="26B83A2C">
+          <wp:inline distT="0" distB="0" distL="0" distR="0" wp14:anchorId="24440EFF" wp14:editId="585E4B47">
             <wp:extent cx="5580380" cy="6107430"/>
             <wp:effectExtent l="19050" t="19050" r="20320" b="26670"/>
             <wp:docPr id="325028545" name="Picture 2"/>
@@ -17992,279 +18008,6 @@
                 <pic:pic xmlns:pic="http://schemas.openxmlformats.org/drawingml/2006/picture">
                   <pic:nvPicPr>
                     <pic:cNvPr id="325028545" name="Picture 325028545"/>
-                    <pic:cNvPicPr/>
-                  </pic:nvPicPr>
-                  <pic:blipFill>
-                    <a:blip r:embed="rId18" cstate="print">
-                      <a:extLst>
-                        <a:ext uri="{28A0092B-C50C-407E-A947-70E740481C1C}">
-                          <a14:useLocalDpi xmlns:a14="http://schemas.microsoft.com/office/drawing/2010/main" val="0"/>
-                        </a:ext>
-                      </a:extLst>
-                    </a:blip>
-                    <a:stretch>
-                      <a:fillRect/>
-                    </a:stretch>
-                  </pic:blipFill>
-                  <pic:spPr>
-                    <a:xfrm>
-                      <a:off x="0" y="0"/>
-                      <a:ext cx="5580380" cy="6107430"/>
-                    </a:xfrm>
-                    <a:prstGeom prst="rect">
-                      <a:avLst/>
-                    </a:prstGeom>
-                    <a:ln w="3175">
-                      <a:solidFill>
-                        <a:schemeClr val="tx1"/>
-                      </a:solidFill>
-                    </a:ln>
-                  </pic:spPr>
-                </pic:pic>
-              </a:graphicData>
-            </a:graphic>
-          </wp:inline>
-        </w:drawing>
-      </w:r>
-    </w:p>
-    <w:p>
-      <w:pPr>
-        <w:pStyle w:val="Caption"/>
-        <w:jc w:val="center"/>
-        <w:rPr>
-          <w:i w:val="0"/>
-          <w:iCs w:val="0"/>
-          <w:color w:val="auto"/>
-          <w:sz w:val="26"/>
-          <w:szCs w:val="26"/>
-          <w:lang w:val="vi-VN"/>
-        </w:rPr>
-      </w:pPr>
-      <w:bookmarkStart w:id="42" w:name="_Toc242546996"/>
-      <w:bookmarkStart w:id="43" w:name="_Toc242724021"/>
-      <w:r>
-        <w:rPr>
-          <w:i w:val="0"/>
-          <w:iCs w:val="0"/>
-          <w:color w:val="auto"/>
-          <w:sz w:val="26"/>
-          <w:szCs w:val="26"/>
-        </w:rPr>
-        <w:t xml:space="preserve">Hình </w:t>
-      </w:r>
-      <w:r>
-        <w:rPr>
-          <w:i w:val="0"/>
-          <w:iCs w:val="0"/>
-          <w:color w:val="auto"/>
-          <w:sz w:val="26"/>
-          <w:szCs w:val="26"/>
-        </w:rPr>
-        <w:fldChar w:fldCharType="begin"/>
-      </w:r>
-      <w:r>
-        <w:rPr>
-          <w:i w:val="0"/>
-          <w:iCs w:val="0"/>
-          <w:color w:val="auto"/>
-          <w:sz w:val="26"/>
-          <w:szCs w:val="26"/>
-        </w:rPr>
-        <w:instrText xml:space="preserve"> STYLEREF 1 \s </w:instrText>
-      </w:r>
-      <w:r>
-        <w:rPr>
-          <w:i w:val="0"/>
-          <w:iCs w:val="0"/>
-          <w:color w:val="auto"/>
-          <w:sz w:val="26"/>
-          <w:szCs w:val="26"/>
-        </w:rPr>
-        <w:fldChar w:fldCharType="separate"/>
-      </w:r>
-      <w:r>
-        <w:rPr>
-          <w:i w:val="0"/>
-          <w:iCs w:val="0"/>
-          <w:noProof/>
-          <w:color w:val="auto"/>
-          <w:sz w:val="26"/>
-          <w:szCs w:val="26"/>
-        </w:rPr>
-        <w:t>3</w:t>
-      </w:r>
-      <w:r>
-        <w:rPr>
-          <w:i w:val="0"/>
-          <w:iCs w:val="0"/>
-          <w:color w:val="auto"/>
-          <w:sz w:val="26"/>
-          <w:szCs w:val="26"/>
-        </w:rPr>
-        <w:fldChar w:fldCharType="end"/>
-      </w:r>
-      <w:r>
-        <w:rPr>
-          <w:i w:val="0"/>
-          <w:iCs w:val="0"/>
-          <w:color w:val="auto"/>
-          <w:sz w:val="26"/>
-          <w:szCs w:val="26"/>
-        </w:rPr>
-        <w:t>.</w:t>
-      </w:r>
-      <w:r>
-        <w:rPr>
-          <w:i w:val="0"/>
-          <w:iCs w:val="0"/>
-          <w:color w:val="auto"/>
-          <w:sz w:val="26"/>
-          <w:szCs w:val="26"/>
-        </w:rPr>
-        <w:fldChar w:fldCharType="begin"/>
-      </w:r>
-      <w:r>
-        <w:rPr>
-          <w:i w:val="0"/>
-          <w:iCs w:val="0"/>
-          <w:color w:val="auto"/>
-          <w:sz w:val="26"/>
-          <w:szCs w:val="26"/>
-        </w:rPr>
-        <w:instrText xml:space="preserve"> SEQ Hình \* ARABIC \s 1 </w:instrText>
-      </w:r>
-      <w:r>
-        <w:rPr>
-          <w:i w:val="0"/>
-          <w:iCs w:val="0"/>
-          <w:color w:val="auto"/>
-          <w:sz w:val="26"/>
-          <w:szCs w:val="26"/>
-        </w:rPr>
-        <w:fldChar w:fldCharType="separate"/>
-      </w:r>
-      <w:r>
-        <w:rPr>
-          <w:i w:val="0"/>
-          <w:iCs w:val="0"/>
-          <w:noProof/>
-          <w:color w:val="auto"/>
-          <w:sz w:val="26"/>
-          <w:szCs w:val="26"/>
-        </w:rPr>
-        <w:t>12</w:t>
-      </w:r>
-      <w:r>
-        <w:rPr>
-          <w:i w:val="0"/>
-          <w:iCs w:val="0"/>
-          <w:color w:val="auto"/>
-          <w:sz w:val="26"/>
-          <w:szCs w:val="26"/>
-        </w:rPr>
-        <w:fldChar w:fldCharType="end"/>
-      </w:r>
-      <w:r>
-        <w:rPr>
-          <w:i w:val="0"/>
-          <w:iCs w:val="0"/>
-          <w:color w:val="auto"/>
-          <w:sz w:val="26"/>
-          <w:szCs w:val="26"/>
-          <w:lang w:val="vi-VN"/>
-        </w:rPr>
-        <w:t xml:space="preserve"> Giao diện trang chủ</w:t>
-      </w:r>
-      <w:bookmarkEnd w:id="42"/>
-      <w:bookmarkEnd w:id="43"/>
-    </w:p>
-    <w:p>
-      <w:pPr>
-        <w:pStyle w:val="Heading3"/>
-        <w:rPr>
-          <w:lang w:val="vi-VN"/>
-        </w:rPr>
-      </w:pPr>
-      <w:r>
-        <w:rPr>
-          <w:lang w:val="vi-VN"/>
-        </w:rPr>
-        <w:t xml:space="preserve">Giao diện trang </w:t>
-      </w:r>
-      <w:r>
-        <w:rPr>
-          <w:lang w:val="vi-VN"/>
-        </w:rPr>
-        <w:t>quản trị</w:t>
-      </w:r>
-    </w:p>
-    <w:p>
-      <w:pPr>
-        <w:pStyle w:val="nd"/>
-        <w:rPr>
-          <w:lang w:val="vi-VN"/>
-        </w:rPr>
-      </w:pPr>
-      <w:r>
-        <w:rPr>
-          <w:lang w:val="vi-VN"/>
-        </w:rPr>
-        <w:t>Mô tả:</w:t>
-      </w:r>
-      <w:r>
-        <w:rPr>
-          <w:sz w:val="28"/>
-        </w:rPr>
-        <w:t xml:space="preserve"> </w:t>
-      </w:r>
-      <w:r>
-        <w:t xml:space="preserve">Giao diện trang </w:t>
-      </w:r>
-      <w:r>
-        <w:t>quản</w:t>
-      </w:r>
-      <w:r>
-        <w:rPr>
-          <w:lang w:val="vi-VN"/>
-        </w:rPr>
-        <w:t xml:space="preserve"> trị</w:t>
-      </w:r>
-      <w:r>
-        <w:t xml:space="preserve"> của hệ thống quản lý bán hàng gồm thanh điều hướng các chức năng như Home, Danh mục, Sản phẩm, Giỏ hàng, Người giao hàng và Khách hàng. Khu vực nội dung hiển thị thông tin quản lý tương ứng, hỗ trợ thêm, xem và thao tác với dữ </w:t>
-      </w:r>
-      <w:r>
-        <w:t>liệu</w:t>
-      </w:r>
-      <w:r>
-        <w:rPr>
-          <w:lang w:val="vi-VN"/>
-        </w:rPr>
-        <w:t>.Ví dụ như bấm vào mục danh mục sẽ hiển thị nội dung ở dưới thanh điều hướng.</w:t>
-      </w:r>
-    </w:p>
-    <w:p>
-      <w:pPr>
-        <w:keepNext/>
-        <w:jc w:val="center"/>
-      </w:pPr>
-      <w:r>
-        <w:rPr>
-          <w:noProof/>
-        </w:rPr>
-        <w:lastRenderedPageBreak/>
-        <w:drawing>
-          <wp:inline distT="0" distB="0" distL="0" distR="0" wp14:anchorId="6D169D41" wp14:editId="14E4C076">
-            <wp:extent cx="5580380" cy="6107430"/>
-            <wp:effectExtent l="19050" t="19050" r="20320" b="26670"/>
-            <wp:docPr id="1452594711" name="Picture 5"/>
-            <wp:cNvGraphicFramePr>
-              <a:graphicFrameLocks xmlns:a="http://schemas.openxmlformats.org/drawingml/2006/main" noChangeAspect="1"/>
-            </wp:cNvGraphicFramePr>
-            <a:graphic xmlns:a="http://schemas.openxmlformats.org/drawingml/2006/main">
-              <a:graphicData uri="http://schemas.openxmlformats.org/drawingml/2006/picture">
-                <pic:pic xmlns:pic="http://schemas.openxmlformats.org/drawingml/2006/picture">
-                  <pic:nvPicPr>
-                    <pic:cNvPr id="1452594711" name="Picture 1452594711"/>
                     <pic:cNvPicPr/>
                   </pic:nvPicPr>
                   <pic:blipFill>
@@ -18313,8 +18056,8 @@
           <w:lang w:val="vi-VN"/>
         </w:rPr>
       </w:pPr>
-      <w:bookmarkStart w:id="44" w:name="_Toc242546997"/>
-      <w:bookmarkStart w:id="45" w:name="_Toc242724022"/>
+      <w:bookmarkStart w:id="42" w:name="_Toc242546996"/>
+      <w:bookmarkStart w:id="43" w:name="_Toc242724021"/>
       <w:r>
         <w:rPr>
           <w:i w:val="0"/>
@@ -18425,7 +18168,7 @@
           <w:sz w:val="26"/>
           <w:szCs w:val="26"/>
         </w:rPr>
-        <w:t>13</w:t>
+        <w:t>11</w:t>
       </w:r>
       <w:r>
         <w:rPr>
@@ -18446,10 +18189,10 @@
           <w:szCs w:val="26"/>
           <w:lang w:val="vi-VN"/>
         </w:rPr>
-        <w:t xml:space="preserve"> Giao diện trang quản trị</w:t>
-      </w:r>
-      <w:bookmarkEnd w:id="44"/>
-      <w:bookmarkEnd w:id="45"/>
+        <w:t xml:space="preserve"> Giao diện trang chủ</w:t>
+      </w:r>
+      <w:bookmarkEnd w:id="42"/>
+      <w:bookmarkEnd w:id="43"/>
     </w:p>
     <w:p>
       <w:pPr>
@@ -18462,7 +18205,13 @@
         <w:rPr>
           <w:lang w:val="vi-VN"/>
         </w:rPr>
-        <w:t>Giao diện trang đăng nhập, đăng ký</w:t>
+        <w:t xml:space="preserve">Giao diện trang </w:t>
+      </w:r>
+      <w:r>
+        <w:rPr>
+          <w:lang w:val="vi-VN"/>
+        </w:rPr>
+        <w:t>quản trị</w:t>
       </w:r>
     </w:p>
     <w:p>
@@ -18476,23 +18225,41 @@
         <w:rPr>
           <w:lang w:val="vi-VN"/>
         </w:rPr>
-        <w:t xml:space="preserve">Mô </w:t>
-      </w:r>
-      <w:r>
-        <w:rPr>
-          <w:lang w:val="vi-VN"/>
-        </w:rPr>
-        <w:t>tả:</w:t>
-      </w:r>
-      <w:r>
+        <w:t>Mô tả:</w:t>
+      </w:r>
+      <w:r>
+        <w:rPr>
+          <w:sz w:val="28"/>
+        </w:rPr>
         <w:t xml:space="preserve"> </w:t>
       </w:r>
       <w:r>
-        <w:t xml:space="preserve">Giao diện đăng nhập và đăng ký cho phép khách hàng truy cập hệ thống bằng tài khoản cá nhân. Trang đăng nhập gồm hai trường nhập liệu là Email và Mật khẩu, cùng nút “Đăng nhập” để gửi thông tin xác thực; khi thông tin hợp lệ, hệ thống tạo phiên làm việc (session) và chuyển khách hàng về trang sản phẩm. Trang đăng ký dành cho khách hàng chưa có tài khoản, gồm các trường Họ và tên, Số điện thoại, Email, Mật khẩu và Xác nhận mật khẩu, cùng nút “Đăng ký” để hoàn tất việc tạo tài khoản. Hệ thống kiểm tra tính hợp lệ của dữ liệu nhập vào, như các trường không được để trống, email đúng định dạng và không trùng với tài khoản đã có, mật khẩu </w:t>
+        <w:t xml:space="preserve">Giao diện trang </w:t>
+      </w:r>
+      <w:r>
+        <w:t>quản</w:t>
+      </w:r>
+      <w:r>
+        <w:rPr>
+          <w:lang w:val="vi-VN"/>
+        </w:rPr>
+        <w:t xml:space="preserve"> trị</w:t>
+      </w:r>
+      <w:r>
+        <w:t xml:space="preserve"> của hệ thống quản lý bán hàng gồm thanh điều hướng các chức năng như Home, Danh mục, Sản phẩm, Giỏ hàng, Người giao hàng </w:t>
       </w:r>
       <w:r>
         <w:lastRenderedPageBreak/>
-        <w:t>xác nhận phải trùng khớp với mật khẩu đã nhập. Mật khẩu được mã hóa trước khi lưu vào cơ sở dữ liệu (trường PasswordHash) để đảm bảo an toàn.</w:t>
+        <w:t xml:space="preserve">và Khách hàng. Khu vực nội dung hiển thị thông tin quản lý tương ứng, hỗ trợ thêm, xem và thao tác với dữ </w:t>
+      </w:r>
+      <w:r>
+        <w:t>liệu</w:t>
+      </w:r>
+      <w:r>
+        <w:rPr>
+          <w:lang w:val="vi-VN"/>
+        </w:rPr>
+        <w:t>.Ví dụ như bấm vào mục danh mục sẽ hiển thị nội dung ở dưới thanh điều hướng.</w:t>
       </w:r>
     </w:p>
     <w:p>
@@ -18505,10 +18272,10 @@
           <w:noProof/>
         </w:rPr>
         <w:drawing>
-          <wp:inline distT="0" distB="0" distL="0" distR="0" wp14:anchorId="6914A94E" wp14:editId="0F88F9D3">
-            <wp:extent cx="5580380" cy="3137535"/>
-            <wp:effectExtent l="0" t="0" r="1270" b="5715"/>
-            <wp:docPr id="2050384003" name="Picture 4"/>
+          <wp:inline distT="0" distB="0" distL="0" distR="0" wp14:anchorId="6D169D41" wp14:editId="7F96D45F">
+            <wp:extent cx="5580380" cy="6107430"/>
+            <wp:effectExtent l="19050" t="19050" r="20320" b="26670"/>
+            <wp:docPr id="1452594711" name="Picture 5"/>
             <wp:cNvGraphicFramePr>
               <a:graphicFrameLocks xmlns:a="http://schemas.openxmlformats.org/drawingml/2006/main" noChangeAspect="1"/>
             </wp:cNvGraphicFramePr>
@@ -18516,258 +18283,11 @@
               <a:graphicData uri="http://schemas.openxmlformats.org/drawingml/2006/picture">
                 <pic:pic xmlns:pic="http://schemas.openxmlformats.org/drawingml/2006/picture">
                   <pic:nvPicPr>
-                    <pic:cNvPr id="2050384003" name="Picture 2050384003"/>
+                    <pic:cNvPr id="1452594711" name="Picture 1452594711"/>
                     <pic:cNvPicPr/>
                   </pic:nvPicPr>
                   <pic:blipFill>
                     <a:blip r:embed="rId20" cstate="print">
-                      <a:extLst>
-                        <a:ext uri="{28A0092B-C50C-407E-A947-70E740481C1C}">
-                          <a14:useLocalDpi xmlns:a14="http://schemas.microsoft.com/office/drawing/2010/main" val="0"/>
-                        </a:ext>
-                      </a:extLst>
-                    </a:blip>
-                    <a:stretch>
-                      <a:fillRect/>
-                    </a:stretch>
-                  </pic:blipFill>
-                  <pic:spPr>
-                    <a:xfrm>
-                      <a:off x="0" y="0"/>
-                      <a:ext cx="5580380" cy="3137535"/>
-                    </a:xfrm>
-                    <a:prstGeom prst="rect">
-                      <a:avLst/>
-                    </a:prstGeom>
-                  </pic:spPr>
-                </pic:pic>
-              </a:graphicData>
-            </a:graphic>
-          </wp:inline>
-        </w:drawing>
-      </w:r>
-    </w:p>
-    <w:p>
-      <w:pPr>
-        <w:pStyle w:val="Caption"/>
-        <w:jc w:val="center"/>
-        <w:rPr>
-          <w:i w:val="0"/>
-          <w:iCs w:val="0"/>
-          <w:color w:val="auto"/>
-          <w:sz w:val="26"/>
-          <w:szCs w:val="26"/>
-          <w:lang w:val="vi-VN"/>
-        </w:rPr>
-      </w:pPr>
-      <w:bookmarkStart w:id="46" w:name="_Toc242546998"/>
-      <w:bookmarkStart w:id="47" w:name="_Toc242724023"/>
-      <w:r>
-        <w:rPr>
-          <w:i w:val="0"/>
-          <w:iCs w:val="0"/>
-          <w:color w:val="auto"/>
-          <w:sz w:val="26"/>
-          <w:szCs w:val="26"/>
-        </w:rPr>
-        <w:t xml:space="preserve">Hình </w:t>
-      </w:r>
-      <w:r>
-        <w:rPr>
-          <w:i w:val="0"/>
-          <w:iCs w:val="0"/>
-          <w:color w:val="auto"/>
-          <w:sz w:val="26"/>
-          <w:szCs w:val="26"/>
-        </w:rPr>
-        <w:fldChar w:fldCharType="begin"/>
-      </w:r>
-      <w:r>
-        <w:rPr>
-          <w:i w:val="0"/>
-          <w:iCs w:val="0"/>
-          <w:color w:val="auto"/>
-          <w:sz w:val="26"/>
-          <w:szCs w:val="26"/>
-        </w:rPr>
-        <w:instrText xml:space="preserve"> STYLEREF 1 \s </w:instrText>
-      </w:r>
-      <w:r>
-        <w:rPr>
-          <w:i w:val="0"/>
-          <w:iCs w:val="0"/>
-          <w:color w:val="auto"/>
-          <w:sz w:val="26"/>
-          <w:szCs w:val="26"/>
-        </w:rPr>
-        <w:fldChar w:fldCharType="separate"/>
-      </w:r>
-      <w:r>
-        <w:rPr>
-          <w:i w:val="0"/>
-          <w:iCs w:val="0"/>
-          <w:noProof/>
-          <w:color w:val="auto"/>
-          <w:sz w:val="26"/>
-          <w:szCs w:val="26"/>
-        </w:rPr>
-        <w:t>3</w:t>
-      </w:r>
-      <w:r>
-        <w:rPr>
-          <w:i w:val="0"/>
-          <w:iCs w:val="0"/>
-          <w:color w:val="auto"/>
-          <w:sz w:val="26"/>
-          <w:szCs w:val="26"/>
-        </w:rPr>
-        <w:fldChar w:fldCharType="end"/>
-      </w:r>
-      <w:r>
-        <w:rPr>
-          <w:i w:val="0"/>
-          <w:iCs w:val="0"/>
-          <w:color w:val="auto"/>
-          <w:sz w:val="26"/>
-          <w:szCs w:val="26"/>
-        </w:rPr>
-        <w:t>.</w:t>
-      </w:r>
-      <w:r>
-        <w:rPr>
-          <w:i w:val="0"/>
-          <w:iCs w:val="0"/>
-          <w:color w:val="auto"/>
-          <w:sz w:val="26"/>
-          <w:szCs w:val="26"/>
-        </w:rPr>
-        <w:fldChar w:fldCharType="begin"/>
-      </w:r>
-      <w:r>
-        <w:rPr>
-          <w:i w:val="0"/>
-          <w:iCs w:val="0"/>
-          <w:color w:val="auto"/>
-          <w:sz w:val="26"/>
-          <w:szCs w:val="26"/>
-        </w:rPr>
-        <w:instrText xml:space="preserve"> SEQ Hình \* ARABIC \s 1 </w:instrText>
-      </w:r>
-      <w:r>
-        <w:rPr>
-          <w:i w:val="0"/>
-          <w:iCs w:val="0"/>
-          <w:color w:val="auto"/>
-          <w:sz w:val="26"/>
-          <w:szCs w:val="26"/>
-        </w:rPr>
-        <w:fldChar w:fldCharType="separate"/>
-      </w:r>
-      <w:r>
-        <w:rPr>
-          <w:i w:val="0"/>
-          <w:iCs w:val="0"/>
-          <w:noProof/>
-          <w:color w:val="auto"/>
-          <w:sz w:val="26"/>
-          <w:szCs w:val="26"/>
-        </w:rPr>
-        <w:t>14</w:t>
-      </w:r>
-      <w:r>
-        <w:rPr>
-          <w:i w:val="0"/>
-          <w:iCs w:val="0"/>
-          <w:color w:val="auto"/>
-          <w:sz w:val="26"/>
-          <w:szCs w:val="26"/>
-        </w:rPr>
-        <w:fldChar w:fldCharType="end"/>
-      </w:r>
-      <w:r>
-        <w:rPr>
-          <w:i w:val="0"/>
-          <w:iCs w:val="0"/>
-          <w:color w:val="auto"/>
-          <w:sz w:val="26"/>
-          <w:szCs w:val="26"/>
-          <w:lang w:val="vi-VN"/>
-        </w:rPr>
-        <w:t xml:space="preserve"> Giao diện trang đăng nhập và đăng ký</w:t>
-      </w:r>
-      <w:bookmarkEnd w:id="46"/>
-      <w:bookmarkEnd w:id="47"/>
-    </w:p>
-    <w:p>
-      <w:pPr>
-        <w:pStyle w:val="Heading3"/>
-        <w:rPr>
-          <w:lang w:val="vi-VN"/>
-        </w:rPr>
-      </w:pPr>
-      <w:r>
-        <w:rPr>
-          <w:lang w:val="vi-VN"/>
-        </w:rPr>
-        <w:t>Giao diện trang</w:t>
-      </w:r>
-      <w:r>
-        <w:rPr>
-          <w:lang w:val="vi-VN"/>
-        </w:rPr>
-        <w:t xml:space="preserve"> </w:t>
-      </w:r>
-      <w:r>
-        <w:rPr>
-          <w:lang w:val="vi-VN"/>
-        </w:rPr>
-        <w:t>sản phẩm</w:t>
-      </w:r>
-    </w:p>
-    <w:p>
-      <w:pPr>
-        <w:pStyle w:val="nd"/>
-        <w:rPr>
-          <w:lang w:val="vi-VN"/>
-        </w:rPr>
-      </w:pPr>
-      <w:r>
-        <w:rPr>
-          <w:lang w:val="vi-VN"/>
-        </w:rPr>
-        <w:t xml:space="preserve">Mô tả: </w:t>
-      </w:r>
-      <w:r>
-        <w:t>Giao diện trang sản phẩm là nơi khách hàng bắt đầu quá trình mua sắm, hiển thị danh mục sản phẩm cùng hình ảnh, tên sản phẩm và giá bán của từng mặt hàng. Các sản phẩm được trình bày dưới dạng lưới thẻ đều nhau, mỗi hàng gồm 5 sản phẩm, giúp người dùng dễ quan sát và so sánh. Phía trên là thanh điều hướng cố định, cho phép người dùng quay về trang chủ, chọn danh mục để lọc sản phẩm theo nhóm, nhập từ khóa vào ô tìm kiếm để tìm sản phẩm theo tên, truy cập giỏ hàng và đăng nhập vào hệ thống. Dòng đường dẫn “Home / Sản phẩm” cho biết vị trí hiện tại và hỗ trợ quay lại trang trước. Tại mỗi thẻ sản phẩm, nút “Xem chi tiết” dẫn đến trang thông tin đầy đủ của sản phẩm, từ đó khách hàng có thể thêm sản phẩm vào giỏ hàng và tiến hành thanh toán.</w:t>
-      </w:r>
-    </w:p>
-    <w:p>
-      <w:pPr>
-        <w:keepNext/>
-        <w:jc w:val="center"/>
-      </w:pPr>
-      <w:r>
-        <w:rPr>
-          <w:noProof/>
-        </w:rPr>
-        <w:lastRenderedPageBreak/>
-        <w:drawing>
-          <wp:inline distT="0" distB="0" distL="0" distR="0" wp14:anchorId="10605CAD" wp14:editId="5E481CE2">
-            <wp:extent cx="5580380" cy="6107430"/>
-            <wp:effectExtent l="19050" t="19050" r="20320" b="26670"/>
-            <wp:docPr id="735307609" name="Picture 6"/>
-            <wp:cNvGraphicFramePr>
-              <a:graphicFrameLocks xmlns:a="http://schemas.openxmlformats.org/drawingml/2006/main" noChangeAspect="1"/>
-            </wp:cNvGraphicFramePr>
-            <a:graphic xmlns:a="http://schemas.openxmlformats.org/drawingml/2006/main">
-              <a:graphicData uri="http://schemas.openxmlformats.org/drawingml/2006/picture">
-                <pic:pic xmlns:pic="http://schemas.openxmlformats.org/drawingml/2006/picture">
-                  <pic:nvPicPr>
-                    <pic:cNvPr id="735307609" name="Picture 735307609"/>
-                    <pic:cNvPicPr/>
-                  </pic:nvPicPr>
-                  <pic:blipFill>
-                    <a:blip r:embed="rId21" cstate="print">
                       <a:extLst>
                         <a:ext uri="{28A0092B-C50C-407E-A947-70E740481C1C}">
                           <a14:useLocalDpi xmlns:a14="http://schemas.microsoft.com/office/drawing/2010/main" val="0"/>
@@ -18812,6 +18332,499 @@
           <w:lang w:val="vi-VN"/>
         </w:rPr>
       </w:pPr>
+      <w:bookmarkStart w:id="44" w:name="_Toc242546997"/>
+      <w:bookmarkStart w:id="45" w:name="_Toc242724022"/>
+      <w:r>
+        <w:rPr>
+          <w:i w:val="0"/>
+          <w:iCs w:val="0"/>
+          <w:color w:val="auto"/>
+          <w:sz w:val="26"/>
+          <w:szCs w:val="26"/>
+        </w:rPr>
+        <w:t xml:space="preserve">Hình </w:t>
+      </w:r>
+      <w:r>
+        <w:rPr>
+          <w:i w:val="0"/>
+          <w:iCs w:val="0"/>
+          <w:color w:val="auto"/>
+          <w:sz w:val="26"/>
+          <w:szCs w:val="26"/>
+        </w:rPr>
+        <w:fldChar w:fldCharType="begin"/>
+      </w:r>
+      <w:r>
+        <w:rPr>
+          <w:i w:val="0"/>
+          <w:iCs w:val="0"/>
+          <w:color w:val="auto"/>
+          <w:sz w:val="26"/>
+          <w:szCs w:val="26"/>
+        </w:rPr>
+        <w:instrText xml:space="preserve"> STYLEREF 1 \s </w:instrText>
+      </w:r>
+      <w:r>
+        <w:rPr>
+          <w:i w:val="0"/>
+          <w:iCs w:val="0"/>
+          <w:color w:val="auto"/>
+          <w:sz w:val="26"/>
+          <w:szCs w:val="26"/>
+        </w:rPr>
+        <w:fldChar w:fldCharType="separate"/>
+      </w:r>
+      <w:r>
+        <w:rPr>
+          <w:i w:val="0"/>
+          <w:iCs w:val="0"/>
+          <w:noProof/>
+          <w:color w:val="auto"/>
+          <w:sz w:val="26"/>
+          <w:szCs w:val="26"/>
+        </w:rPr>
+        <w:t>3</w:t>
+      </w:r>
+      <w:r>
+        <w:rPr>
+          <w:i w:val="0"/>
+          <w:iCs w:val="0"/>
+          <w:color w:val="auto"/>
+          <w:sz w:val="26"/>
+          <w:szCs w:val="26"/>
+        </w:rPr>
+        <w:fldChar w:fldCharType="end"/>
+      </w:r>
+      <w:r>
+        <w:rPr>
+          <w:i w:val="0"/>
+          <w:iCs w:val="0"/>
+          <w:color w:val="auto"/>
+          <w:sz w:val="26"/>
+          <w:szCs w:val="26"/>
+        </w:rPr>
+        <w:t>.</w:t>
+      </w:r>
+      <w:r>
+        <w:rPr>
+          <w:i w:val="0"/>
+          <w:iCs w:val="0"/>
+          <w:color w:val="auto"/>
+          <w:sz w:val="26"/>
+          <w:szCs w:val="26"/>
+        </w:rPr>
+        <w:fldChar w:fldCharType="begin"/>
+      </w:r>
+      <w:r>
+        <w:rPr>
+          <w:i w:val="0"/>
+          <w:iCs w:val="0"/>
+          <w:color w:val="auto"/>
+          <w:sz w:val="26"/>
+          <w:szCs w:val="26"/>
+        </w:rPr>
+        <w:instrText xml:space="preserve"> SEQ Hình \* ARABIC \s 1 </w:instrText>
+      </w:r>
+      <w:r>
+        <w:rPr>
+          <w:i w:val="0"/>
+          <w:iCs w:val="0"/>
+          <w:color w:val="auto"/>
+          <w:sz w:val="26"/>
+          <w:szCs w:val="26"/>
+        </w:rPr>
+        <w:fldChar w:fldCharType="separate"/>
+      </w:r>
+      <w:r>
+        <w:rPr>
+          <w:i w:val="0"/>
+          <w:iCs w:val="0"/>
+          <w:noProof/>
+          <w:color w:val="auto"/>
+          <w:sz w:val="26"/>
+          <w:szCs w:val="26"/>
+        </w:rPr>
+        <w:t>12</w:t>
+      </w:r>
+      <w:r>
+        <w:rPr>
+          <w:i w:val="0"/>
+          <w:iCs w:val="0"/>
+          <w:color w:val="auto"/>
+          <w:sz w:val="26"/>
+          <w:szCs w:val="26"/>
+        </w:rPr>
+        <w:fldChar w:fldCharType="end"/>
+      </w:r>
+      <w:r>
+        <w:rPr>
+          <w:i w:val="0"/>
+          <w:iCs w:val="0"/>
+          <w:color w:val="auto"/>
+          <w:sz w:val="26"/>
+          <w:szCs w:val="26"/>
+          <w:lang w:val="vi-VN"/>
+        </w:rPr>
+        <w:t xml:space="preserve"> Giao diện trang quản trị</w:t>
+      </w:r>
+      <w:bookmarkEnd w:id="44"/>
+      <w:bookmarkEnd w:id="45"/>
+    </w:p>
+    <w:p>
+      <w:pPr>
+        <w:pStyle w:val="Heading3"/>
+        <w:rPr>
+          <w:lang w:val="vi-VN"/>
+        </w:rPr>
+      </w:pPr>
+      <w:r>
+        <w:rPr>
+          <w:lang w:val="vi-VN"/>
+        </w:rPr>
+        <w:t>Giao diện trang đăng nhập, đăng ký</w:t>
+      </w:r>
+    </w:p>
+    <w:p>
+      <w:pPr>
+        <w:pStyle w:val="nd"/>
+        <w:rPr>
+          <w:lang w:val="vi-VN"/>
+        </w:rPr>
+      </w:pPr>
+      <w:r>
+        <w:rPr>
+          <w:lang w:val="vi-VN"/>
+        </w:rPr>
+        <w:t xml:space="preserve">Mô </w:t>
+      </w:r>
+      <w:r>
+        <w:rPr>
+          <w:lang w:val="vi-VN"/>
+        </w:rPr>
+        <w:t>tả:</w:t>
+      </w:r>
+      <w:r>
+        <w:t xml:space="preserve"> </w:t>
+      </w:r>
+      <w:r>
+        <w:t xml:space="preserve">Giao diện đăng nhập và đăng ký cho phép khách hàng truy cập hệ thống bằng tài khoản cá nhân. Trang đăng nhập gồm hai trường nhập liệu là Email và Mật khẩu, cùng nút “Đăng nhập” để gửi thông tin xác thực; khi thông tin hợp lệ, hệ thống tạo phiên làm việc (session) và chuyển khách hàng về trang sản phẩm. Trang đăng ký dành cho khách hàng chưa có tài khoản, gồm các trường Họ và tên, Số điện thoại, </w:t>
+      </w:r>
+      <w:r>
+        <w:lastRenderedPageBreak/>
+        <w:t>Email, Mật khẩu và Xác nhận mật khẩu, cùng nút “Đăng ký” để hoàn tất việc tạo tài khoản. Hệ thống kiểm tra tính hợp lệ của dữ liệu nhập vào, như các trường không được để trống, email đúng định dạng và không trùng với tài khoản đã có, mật khẩu xác nhận phải trùng khớp với mật khẩu đã nhập. Mật khẩu được mã hóa trước khi lưu vào cơ sở dữ liệu (trường PasswordHash) để đảm bảo an toàn.</w:t>
+      </w:r>
+    </w:p>
+    <w:p>
+      <w:pPr>
+        <w:keepNext/>
+        <w:jc w:val="center"/>
+      </w:pPr>
+      <w:r>
+        <w:rPr>
+          <w:noProof/>
+        </w:rPr>
+        <w:drawing>
+          <wp:inline distT="0" distB="0" distL="0" distR="0" wp14:anchorId="6914A94E" wp14:editId="49B3537E">
+            <wp:extent cx="5580380" cy="3137535"/>
+            <wp:effectExtent l="0" t="0" r="1270" b="5715"/>
+            <wp:docPr id="2050384003" name="Picture 4"/>
+            <wp:cNvGraphicFramePr>
+              <a:graphicFrameLocks xmlns:a="http://schemas.openxmlformats.org/drawingml/2006/main" noChangeAspect="1"/>
+            </wp:cNvGraphicFramePr>
+            <a:graphic xmlns:a="http://schemas.openxmlformats.org/drawingml/2006/main">
+              <a:graphicData uri="http://schemas.openxmlformats.org/drawingml/2006/picture">
+                <pic:pic xmlns:pic="http://schemas.openxmlformats.org/drawingml/2006/picture">
+                  <pic:nvPicPr>
+                    <pic:cNvPr id="2050384003" name="Picture 2050384003"/>
+                    <pic:cNvPicPr/>
+                  </pic:nvPicPr>
+                  <pic:blipFill>
+                    <a:blip r:embed="rId21" cstate="print">
+                      <a:extLst>
+                        <a:ext uri="{28A0092B-C50C-407E-A947-70E740481C1C}">
+                          <a14:useLocalDpi xmlns:a14="http://schemas.microsoft.com/office/drawing/2010/main" val="0"/>
+                        </a:ext>
+                      </a:extLst>
+                    </a:blip>
+                    <a:stretch>
+                      <a:fillRect/>
+                    </a:stretch>
+                  </pic:blipFill>
+                  <pic:spPr>
+                    <a:xfrm>
+                      <a:off x="0" y="0"/>
+                      <a:ext cx="5580380" cy="3137535"/>
+                    </a:xfrm>
+                    <a:prstGeom prst="rect">
+                      <a:avLst/>
+                    </a:prstGeom>
+                  </pic:spPr>
+                </pic:pic>
+              </a:graphicData>
+            </a:graphic>
+          </wp:inline>
+        </w:drawing>
+      </w:r>
+    </w:p>
+    <w:p>
+      <w:pPr>
+        <w:pStyle w:val="Caption"/>
+        <w:jc w:val="center"/>
+        <w:rPr>
+          <w:i w:val="0"/>
+          <w:iCs w:val="0"/>
+          <w:color w:val="auto"/>
+          <w:sz w:val="26"/>
+          <w:szCs w:val="26"/>
+          <w:lang w:val="vi-VN"/>
+        </w:rPr>
+      </w:pPr>
+      <w:bookmarkStart w:id="46" w:name="_Toc242546998"/>
+      <w:bookmarkStart w:id="47" w:name="_Toc242724023"/>
+      <w:r>
+        <w:rPr>
+          <w:i w:val="0"/>
+          <w:iCs w:val="0"/>
+          <w:color w:val="auto"/>
+          <w:sz w:val="26"/>
+          <w:szCs w:val="26"/>
+        </w:rPr>
+        <w:t xml:space="preserve">Hình </w:t>
+      </w:r>
+      <w:r>
+        <w:rPr>
+          <w:i w:val="0"/>
+          <w:iCs w:val="0"/>
+          <w:color w:val="auto"/>
+          <w:sz w:val="26"/>
+          <w:szCs w:val="26"/>
+        </w:rPr>
+        <w:fldChar w:fldCharType="begin"/>
+      </w:r>
+      <w:r>
+        <w:rPr>
+          <w:i w:val="0"/>
+          <w:iCs w:val="0"/>
+          <w:color w:val="auto"/>
+          <w:sz w:val="26"/>
+          <w:szCs w:val="26"/>
+        </w:rPr>
+        <w:instrText xml:space="preserve"> STYLEREF 1 \s </w:instrText>
+      </w:r>
+      <w:r>
+        <w:rPr>
+          <w:i w:val="0"/>
+          <w:iCs w:val="0"/>
+          <w:color w:val="auto"/>
+          <w:sz w:val="26"/>
+          <w:szCs w:val="26"/>
+        </w:rPr>
+        <w:fldChar w:fldCharType="separate"/>
+      </w:r>
+      <w:r>
+        <w:rPr>
+          <w:i w:val="0"/>
+          <w:iCs w:val="0"/>
+          <w:noProof/>
+          <w:color w:val="auto"/>
+          <w:sz w:val="26"/>
+          <w:szCs w:val="26"/>
+        </w:rPr>
+        <w:t>3</w:t>
+      </w:r>
+      <w:r>
+        <w:rPr>
+          <w:i w:val="0"/>
+          <w:iCs w:val="0"/>
+          <w:color w:val="auto"/>
+          <w:sz w:val="26"/>
+          <w:szCs w:val="26"/>
+        </w:rPr>
+        <w:fldChar w:fldCharType="end"/>
+      </w:r>
+      <w:r>
+        <w:rPr>
+          <w:i w:val="0"/>
+          <w:iCs w:val="0"/>
+          <w:color w:val="auto"/>
+          <w:sz w:val="26"/>
+          <w:szCs w:val="26"/>
+        </w:rPr>
+        <w:t>.</w:t>
+      </w:r>
+      <w:r>
+        <w:rPr>
+          <w:i w:val="0"/>
+          <w:iCs w:val="0"/>
+          <w:color w:val="auto"/>
+          <w:sz w:val="26"/>
+          <w:szCs w:val="26"/>
+        </w:rPr>
+        <w:fldChar w:fldCharType="begin"/>
+      </w:r>
+      <w:r>
+        <w:rPr>
+          <w:i w:val="0"/>
+          <w:iCs w:val="0"/>
+          <w:color w:val="auto"/>
+          <w:sz w:val="26"/>
+          <w:szCs w:val="26"/>
+        </w:rPr>
+        <w:instrText xml:space="preserve"> SEQ Hình \* ARABIC \s 1 </w:instrText>
+      </w:r>
+      <w:r>
+        <w:rPr>
+          <w:i w:val="0"/>
+          <w:iCs w:val="0"/>
+          <w:color w:val="auto"/>
+          <w:sz w:val="26"/>
+          <w:szCs w:val="26"/>
+        </w:rPr>
+        <w:fldChar w:fldCharType="separate"/>
+      </w:r>
+      <w:r>
+        <w:rPr>
+          <w:i w:val="0"/>
+          <w:iCs w:val="0"/>
+          <w:noProof/>
+          <w:color w:val="auto"/>
+          <w:sz w:val="26"/>
+          <w:szCs w:val="26"/>
+        </w:rPr>
+        <w:t>13</w:t>
+      </w:r>
+      <w:r>
+        <w:rPr>
+          <w:i w:val="0"/>
+          <w:iCs w:val="0"/>
+          <w:color w:val="auto"/>
+          <w:sz w:val="26"/>
+          <w:szCs w:val="26"/>
+        </w:rPr>
+        <w:fldChar w:fldCharType="end"/>
+      </w:r>
+      <w:r>
+        <w:rPr>
+          <w:i w:val="0"/>
+          <w:iCs w:val="0"/>
+          <w:color w:val="auto"/>
+          <w:sz w:val="26"/>
+          <w:szCs w:val="26"/>
+          <w:lang w:val="vi-VN"/>
+        </w:rPr>
+        <w:t xml:space="preserve"> Giao diện trang đăng nhập và đăng ký</w:t>
+      </w:r>
+      <w:bookmarkEnd w:id="46"/>
+      <w:bookmarkEnd w:id="47"/>
+    </w:p>
+    <w:p>
+      <w:pPr>
+        <w:pStyle w:val="Heading3"/>
+        <w:rPr>
+          <w:lang w:val="vi-VN"/>
+        </w:rPr>
+      </w:pPr>
+      <w:r>
+        <w:rPr>
+          <w:lang w:val="vi-VN"/>
+        </w:rPr>
+        <w:t>Giao diện trang</w:t>
+      </w:r>
+      <w:r>
+        <w:rPr>
+          <w:lang w:val="vi-VN"/>
+        </w:rPr>
+        <w:t xml:space="preserve"> </w:t>
+      </w:r>
+      <w:r>
+        <w:rPr>
+          <w:lang w:val="vi-VN"/>
+        </w:rPr>
+        <w:t>sản phẩm</w:t>
+      </w:r>
+    </w:p>
+    <w:p>
+      <w:pPr>
+        <w:pStyle w:val="nd"/>
+      </w:pPr>
+      <w:r>
+        <w:t xml:space="preserve">Mô tả: </w:t>
+      </w:r>
+      <w:r>
+        <w:t>Giao diện trang sản phẩm là nơi khách hàng bắt đầu quá trình mua sắm, hiển thị danh mục sản phẩm cùng hình ảnh, tên sản phẩm và giá bán của từng mặt hàng. Các sản phẩm được trình bày dưới dạng lưới thẻ đều nhau, mỗi hàng gồm 5 sản phẩm, giúp người dùng dễ quan sát và so sánh. Phía trên là thanh điều hướng cố định, cho phép người dùng quay về trang chủ, chọn danh mục để lọc sản phẩm theo nhóm, nhập từ khóa vào ô tìm kiếm để tìm sản phẩm theo tên, truy cập giỏ hàng và đăng nhập vào hệ thống. Dòng đường dẫn “Home / Sản phẩm” cho biết vị trí hiện tại và hỗ trợ quay lại trang trước. Tại mỗi thẻ sản phẩm, nút “Xem chi tiết” dẫn đến trang thông tin đầy đủ của sản phẩm, từ đó khách hàng có thể thêm sản phẩm vào giỏ hàng và tiến hành thanh toán.</w:t>
+      </w:r>
+    </w:p>
+    <w:p>
+      <w:pPr>
+        <w:keepNext/>
+        <w:jc w:val="center"/>
+      </w:pPr>
+      <w:r>
+        <w:rPr>
+          <w:noProof/>
+        </w:rPr>
+        <w:lastRenderedPageBreak/>
+        <w:drawing>
+          <wp:inline distT="0" distB="0" distL="0" distR="0" wp14:anchorId="10605CAD" wp14:editId="4CD95C36">
+            <wp:extent cx="5580380" cy="6107430"/>
+            <wp:effectExtent l="19050" t="19050" r="20320" b="26670"/>
+            <wp:docPr id="735307609" name="Picture 6"/>
+            <wp:cNvGraphicFramePr>
+              <a:graphicFrameLocks xmlns:a="http://schemas.openxmlformats.org/drawingml/2006/main" noChangeAspect="1"/>
+            </wp:cNvGraphicFramePr>
+            <a:graphic xmlns:a="http://schemas.openxmlformats.org/drawingml/2006/main">
+              <a:graphicData uri="http://schemas.openxmlformats.org/drawingml/2006/picture">
+                <pic:pic xmlns:pic="http://schemas.openxmlformats.org/drawingml/2006/picture">
+                  <pic:nvPicPr>
+                    <pic:cNvPr id="735307609" name="Picture 735307609"/>
+                    <pic:cNvPicPr/>
+                  </pic:nvPicPr>
+                  <pic:blipFill>
+                    <a:blip r:embed="rId22" cstate="print">
+                      <a:extLst>
+                        <a:ext uri="{28A0092B-C50C-407E-A947-70E740481C1C}">
+                          <a14:useLocalDpi xmlns:a14="http://schemas.microsoft.com/office/drawing/2010/main" val="0"/>
+                        </a:ext>
+                      </a:extLst>
+                    </a:blip>
+                    <a:stretch>
+                      <a:fillRect/>
+                    </a:stretch>
+                  </pic:blipFill>
+                  <pic:spPr>
+                    <a:xfrm>
+                      <a:off x="0" y="0"/>
+                      <a:ext cx="5580380" cy="6107430"/>
+                    </a:xfrm>
+                    <a:prstGeom prst="rect">
+                      <a:avLst/>
+                    </a:prstGeom>
+                    <a:ln w="3175">
+                      <a:solidFill>
+                        <a:schemeClr val="tx1"/>
+                      </a:solidFill>
+                    </a:ln>
+                  </pic:spPr>
+                </pic:pic>
+              </a:graphicData>
+            </a:graphic>
+          </wp:inline>
+        </w:drawing>
+      </w:r>
+    </w:p>
+    <w:p>
+      <w:pPr>
+        <w:pStyle w:val="Caption"/>
+        <w:jc w:val="center"/>
+        <w:rPr>
+          <w:i w:val="0"/>
+          <w:iCs w:val="0"/>
+          <w:color w:val="auto"/>
+          <w:sz w:val="26"/>
+          <w:szCs w:val="26"/>
+          <w:lang w:val="vi-VN"/>
+        </w:rPr>
+      </w:pPr>
       <w:bookmarkStart w:id="48" w:name="_Toc242546999"/>
       <w:bookmarkStart w:id="49" w:name="_Toc242724024"/>
       <w:r>
@@ -18924,7 +18937,7 @@
           <w:sz w:val="26"/>
           <w:szCs w:val="26"/>
         </w:rPr>
-        <w:t>15</w:t>
+        <w:t>14</w:t>
       </w:r>
       <w:r>
         <w:rPr>
@@ -18995,7 +19008,7 @@
           <w:noProof/>
         </w:rPr>
         <w:drawing>
-          <wp:inline distT="0" distB="0" distL="0" distR="0" wp14:anchorId="3E50603C" wp14:editId="6FCB1DEE">
+          <wp:inline distT="0" distB="0" distL="0" distR="0" wp14:anchorId="3E50603C" wp14:editId="4BD53183">
             <wp:extent cx="5580380" cy="5069840"/>
             <wp:effectExtent l="19050" t="19050" r="20320" b="16510"/>
             <wp:docPr id="712871940" name="Picture 3"/>
@@ -19010,7 +19023,7 @@
                     <pic:cNvPicPr/>
                   </pic:nvPicPr>
                   <pic:blipFill>
-                    <a:blip r:embed="rId22" cstate="print">
+                    <a:blip r:embed="rId23" cstate="print">
                       <a:extLst>
                         <a:ext uri="{28A0092B-C50C-407E-A947-70E740481C1C}">
                           <a14:useLocalDpi xmlns:a14="http://schemas.microsoft.com/office/drawing/2010/main" val="0"/>
@@ -19167,7 +19180,7 @@
           <w:sz w:val="26"/>
           <w:szCs w:val="26"/>
         </w:rPr>
-        <w:t>16</w:t>
+        <w:t>15</w:t>
       </w:r>
       <w:r>
         <w:rPr>
@@ -19213,6 +19226,12 @@
     <w:p>
       <w:pPr>
         <w:pStyle w:val="Heading1"/>
+        <w:numPr>
+          <w:ilvl w:val="0"/>
+          <w:numId w:val="0"/>
+        </w:numPr>
+        <w:ind w:left="432"/>
+        <w:jc w:val="left"/>
       </w:pPr>
       <w:r>
         <w:br w:type="page"/>
@@ -19320,18 +19339,12 @@
       </w:pPr>
     </w:p>
     <w:p>
-      <w:pPr>
-        <w:rPr>
-          <w:lang w:val="vi-VN"/>
-        </w:rPr>
-      </w:pPr>
-    </w:p>
-    <w:p>
-      <w:pPr>
-        <w:rPr>
-          <w:lang w:val="vi-VN"/>
-        </w:rPr>
-      </w:pPr>
+      <w:r>
+        <w:rPr>
+          <w:lang w:val="vi-VN"/>
+        </w:rPr>
+        <w:br w:type="page"/>
+      </w:r>
     </w:p>
     <w:p>
       <w:pPr>
@@ -19345,6 +19358,7 @@
           <w:caps w:val="0"/>
           <w:lang w:val="vi-VN"/>
         </w:rPr>
+        <w:lastRenderedPageBreak/>
         <w:t>KẾT LUẬN VÀ HƯỚNG PHÁT TRIỂN</w:t>
       </w:r>
     </w:p>
@@ -21457,6 +21471,18 @@
       </w:pPr>
     </w:tblStylePr>
   </w:style>
+  <w:style w:type="character" w:styleId="UnresolvedMention">
+    <w:name w:val="Unresolved Mention"/>
+    <w:basedOn w:val="DefaultParagraphFont"/>
+    <w:uiPriority w:val="99"/>
+    <w:semiHidden/>
+    <w:unhideWhenUsed/>
+    <w:rsid w:val="004A13D7"/>
+    <w:rPr>
+      <w:color w:val="605E5C"/>
+      <w:shd w:val="clear" w:color="auto" w:fill="E1DFDD"/>
+    </w:rPr>
+  </w:style>
 </w:styles>
 </file>
 

</xml_diff>

<commit_message>
Hoàn thành chương 3
</commit_message>
<xml_diff>
--- a/thesis/qt_baocao_110123058_huynhlengoctrinh_110123058_da23ttb.docx
+++ b/thesis/qt_baocao_110123058_huynhlengoctrinh_110123058_da23ttb.docx
@@ -938,7 +938,7 @@
         </w:rPr>
         <w:fldChar w:fldCharType="separate"/>
       </w:r>
-      <w:hyperlink w:anchor="_Toc242724018" w:history="1">
+      <w:hyperlink w:anchor="_Toc242972285" w:history="1">
         <w:r>
           <w:rPr>
             <w:rStyle w:val="Hyperlink"/>
@@ -973,7 +973,7 @@
             <w:noProof/>
             <w:webHidden/>
           </w:rPr>
-          <w:instrText xml:space="preserve"> PAGEREF _Toc242724018 \h </w:instrText>
+          <w:instrText xml:space="preserve"> PAGEREF _Toc242972285 \h </w:instrText>
         </w:r>
         <w:r>
           <w:rPr>
@@ -993,7 +993,7 @@
             <w:noProof/>
             <w:webHidden/>
           </w:rPr>
-          <w:t>16</w:t>
+          <w:t>19</w:t>
         </w:r>
         <w:r>
           <w:rPr>
@@ -1019,7 +1019,7 @@
           <w14:ligatures w14:val="standardContextual"/>
         </w:rPr>
       </w:pPr>
-      <w:hyperlink w:anchor="_Toc242724019" w:history="1">
+      <w:hyperlink w:anchor="_Toc242972286" w:history="1">
         <w:r>
           <w:rPr>
             <w:rStyle w:val="Hyperlink"/>
@@ -1054,7 +1054,7 @@
             <w:noProof/>
             <w:webHidden/>
           </w:rPr>
-          <w:instrText xml:space="preserve"> PAGEREF _Toc242724019 \h </w:instrText>
+          <w:instrText xml:space="preserve"> PAGEREF _Toc242972286 \h </w:instrText>
         </w:r>
         <w:r>
           <w:rPr>
@@ -1074,7 +1074,7 @@
             <w:noProof/>
             <w:webHidden/>
           </w:rPr>
-          <w:t>17</w:t>
+          <w:t>20</w:t>
         </w:r>
         <w:r>
           <w:rPr>
@@ -1100,7 +1100,7 @@
           <w14:ligatures w14:val="standardContextual"/>
         </w:rPr>
       </w:pPr>
-      <w:hyperlink w:anchor="_Toc242724020" w:history="1">
+      <w:hyperlink w:anchor="_Toc242972287" w:history="1">
         <w:r>
           <w:rPr>
             <w:rStyle w:val="Hyperlink"/>
@@ -1114,7 +1114,7 @@
             <w:noProof/>
             <w:lang w:val="vi-VN"/>
           </w:rPr>
-          <w:t xml:space="preserve"> Sơ đồ website</w:t>
+          <w:t xml:space="preserve"> Mô hình DFD mức ngữ cảnh</w:t>
         </w:r>
         <w:r>
           <w:rPr>
@@ -1135,7 +1135,7 @@
             <w:noProof/>
             <w:webHidden/>
           </w:rPr>
-          <w:instrText xml:space="preserve"> PAGEREF _Toc242724020 \h </w:instrText>
+          <w:instrText xml:space="preserve"> PAGEREF _Toc242972287 \h </w:instrText>
         </w:r>
         <w:r>
           <w:rPr>
@@ -1155,7 +1155,7 @@
             <w:noProof/>
             <w:webHidden/>
           </w:rPr>
-          <w:t>23</w:t>
+          <w:t>25</w:t>
         </w:r>
         <w:r>
           <w:rPr>
@@ -1181,7 +1181,7 @@
           <w14:ligatures w14:val="standardContextual"/>
         </w:rPr>
       </w:pPr>
-      <w:hyperlink w:anchor="_Toc242724021" w:history="1">
+      <w:hyperlink w:anchor="_Toc242972288" w:history="1">
         <w:r>
           <w:rPr>
             <w:rStyle w:val="Hyperlink"/>
@@ -1195,7 +1195,14 @@
             <w:noProof/>
             <w:lang w:val="vi-VN"/>
           </w:rPr>
-          <w:t xml:space="preserve"> Giao diện trang chủ</w:t>
+          <w:t xml:space="preserve"> Sơ đồ DFD mức </w:t>
+        </w:r>
+        <w:r>
+          <w:rPr>
+            <w:rStyle w:val="Hyperlink"/>
+            <w:noProof/>
+          </w:rPr>
+          <w:t>1</w:t>
         </w:r>
         <w:r>
           <w:rPr>
@@ -1216,7 +1223,7 @@
             <w:noProof/>
             <w:webHidden/>
           </w:rPr>
-          <w:instrText xml:space="preserve"> PAGEREF _Toc242724021 \h </w:instrText>
+          <w:instrText xml:space="preserve"> PAGEREF _Toc242972288 \h </w:instrText>
         </w:r>
         <w:r>
           <w:rPr>
@@ -1236,7 +1243,7 @@
             <w:noProof/>
             <w:webHidden/>
           </w:rPr>
-          <w:t>23</w:t>
+          <w:t>26</w:t>
         </w:r>
         <w:r>
           <w:rPr>
@@ -1262,7 +1269,7 @@
           <w14:ligatures w14:val="standardContextual"/>
         </w:rPr>
       </w:pPr>
-      <w:hyperlink w:anchor="_Toc242724022" w:history="1">
+      <w:hyperlink w:anchor="_Toc242972289" w:history="1">
         <w:r>
           <w:rPr>
             <w:rStyle w:val="Hyperlink"/>
@@ -1276,7 +1283,14 @@
             <w:noProof/>
             <w:lang w:val="vi-VN"/>
           </w:rPr>
-          <w:t xml:space="preserve"> Giao diện trang quản trị</w:t>
+          <w:t xml:space="preserve"> Sơ đồ DFD mức </w:t>
+        </w:r>
+        <w:r>
+          <w:rPr>
+            <w:rStyle w:val="Hyperlink"/>
+            <w:noProof/>
+          </w:rPr>
+          <w:t>1.1</w:t>
         </w:r>
         <w:r>
           <w:rPr>
@@ -1297,7 +1311,7 @@
             <w:noProof/>
             <w:webHidden/>
           </w:rPr>
-          <w:instrText xml:space="preserve"> PAGEREF _Toc242724022 \h </w:instrText>
+          <w:instrText xml:space="preserve"> PAGEREF _Toc242972289 \h </w:instrText>
         </w:r>
         <w:r>
           <w:rPr>
@@ -1317,7 +1331,7 @@
             <w:noProof/>
             <w:webHidden/>
           </w:rPr>
-          <w:t>24</w:t>
+          <w:t>27</w:t>
         </w:r>
         <w:r>
           <w:rPr>
@@ -1343,7 +1357,7 @@
           <w14:ligatures w14:val="standardContextual"/>
         </w:rPr>
       </w:pPr>
-      <w:hyperlink w:anchor="_Toc242724023" w:history="1">
+      <w:hyperlink w:anchor="_Toc242972290" w:history="1">
         <w:r>
           <w:rPr>
             <w:rStyle w:val="Hyperlink"/>
@@ -1357,7 +1371,7 @@
             <w:noProof/>
             <w:lang w:val="vi-VN"/>
           </w:rPr>
-          <w:t xml:space="preserve"> Giao diện trang đăng nhập và đăng ký</w:t>
+          <w:t xml:space="preserve"> Sơ đồ DFD mức 1.2</w:t>
         </w:r>
         <w:r>
           <w:rPr>
@@ -1378,7 +1392,7 @@
             <w:noProof/>
             <w:webHidden/>
           </w:rPr>
-          <w:instrText xml:space="preserve"> PAGEREF _Toc242724023 \h </w:instrText>
+          <w:instrText xml:space="preserve"> PAGEREF _Toc242972290 \h </w:instrText>
         </w:r>
         <w:r>
           <w:rPr>
@@ -1398,7 +1412,7 @@
             <w:noProof/>
             <w:webHidden/>
           </w:rPr>
-          <w:t>25</w:t>
+          <w:t>27</w:t>
         </w:r>
         <w:r>
           <w:rPr>
@@ -1424,7 +1438,7 @@
           <w14:ligatures w14:val="standardContextual"/>
         </w:rPr>
       </w:pPr>
-      <w:hyperlink w:anchor="_Toc242724024" w:history="1">
+      <w:hyperlink w:anchor="_Toc242972291" w:history="1">
         <w:r>
           <w:rPr>
             <w:rStyle w:val="Hyperlink"/>
@@ -1438,7 +1452,14 @@
             <w:noProof/>
             <w:lang w:val="vi-VN"/>
           </w:rPr>
-          <w:t xml:space="preserve"> Giao diện trang sản phẩm</w:t>
+          <w:t xml:space="preserve"> Sơ đồ DFD mức </w:t>
+        </w:r>
+        <w:r>
+          <w:rPr>
+            <w:rStyle w:val="Hyperlink"/>
+            <w:noProof/>
+          </w:rPr>
+          <w:t>1.3</w:t>
         </w:r>
         <w:r>
           <w:rPr>
@@ -1459,7 +1480,7 @@
             <w:noProof/>
             <w:webHidden/>
           </w:rPr>
-          <w:instrText xml:space="preserve"> PAGEREF _Toc242724024 \h </w:instrText>
+          <w:instrText xml:space="preserve"> PAGEREF _Toc242972291 \h </w:instrText>
         </w:r>
         <w:r>
           <w:rPr>
@@ -1479,7 +1500,7 @@
             <w:noProof/>
             <w:webHidden/>
           </w:rPr>
-          <w:t>25</w:t>
+          <w:t>28</w:t>
         </w:r>
         <w:r>
           <w:rPr>
@@ -1505,7 +1526,7 @@
           <w14:ligatures w14:val="standardContextual"/>
         </w:rPr>
       </w:pPr>
-      <w:hyperlink w:anchor="_Toc242724025" w:history="1">
+      <w:hyperlink w:anchor="_Toc242972292" w:history="1">
         <w:r>
           <w:rPr>
             <w:rStyle w:val="Hyperlink"/>
@@ -1519,7 +1540,29 @@
             <w:noProof/>
             <w:lang w:val="vi-VN"/>
           </w:rPr>
-          <w:t xml:space="preserve"> Giao diện trang chi tiết sản phẩm</w:t>
+          <w:t xml:space="preserve"> </w:t>
+        </w:r>
+        <w:r>
+          <w:rPr>
+            <w:rStyle w:val="Hyperlink"/>
+            <w:noProof/>
+          </w:rPr>
+          <w:t>Sơ</w:t>
+        </w:r>
+        <w:r>
+          <w:rPr>
+            <w:rStyle w:val="Hyperlink"/>
+            <w:noProof/>
+            <w:lang w:val="vi-VN"/>
+          </w:rPr>
+          <w:t xml:space="preserve"> đồ </w:t>
+        </w:r>
+        <w:r>
+          <w:rPr>
+            <w:rStyle w:val="Hyperlink"/>
+            <w:noProof/>
+          </w:rPr>
+          <w:t>DFD mức 1.4</w:t>
         </w:r>
         <w:r>
           <w:rPr>
@@ -1540,7 +1583,7 @@
             <w:noProof/>
             <w:webHidden/>
           </w:rPr>
-          <w:instrText xml:space="preserve"> PAGEREF _Toc242724025 \h </w:instrText>
+          <w:instrText xml:space="preserve"> PAGEREF _Toc242972292 \h </w:instrText>
         </w:r>
         <w:r>
           <w:rPr>
@@ -1560,7 +1603,7 @@
             <w:noProof/>
             <w:webHidden/>
           </w:rPr>
-          <w:t>26</w:t>
+          <w:t>29</w:t>
         </w:r>
         <w:r>
           <w:rPr>
@@ -1586,7 +1629,7 @@
           <w14:ligatures w14:val="standardContextual"/>
         </w:rPr>
       </w:pPr>
-      <w:hyperlink w:anchor="_Toc242724026" w:history="1">
+      <w:hyperlink w:anchor="_Toc242972293" w:history="1">
         <w:r>
           <w:rPr>
             <w:rStyle w:val="Hyperlink"/>
@@ -1600,7 +1643,14 @@
             <w:noProof/>
             <w:lang w:val="vi-VN"/>
           </w:rPr>
-          <w:t xml:space="preserve"> Mô hình DFD mức ngữ cảnh</w:t>
+          <w:t xml:space="preserve"> Sơ đồ DFD mức </w:t>
+        </w:r>
+        <w:r>
+          <w:rPr>
+            <w:rStyle w:val="Hyperlink"/>
+            <w:noProof/>
+          </w:rPr>
+          <w:t>1.5</w:t>
         </w:r>
         <w:r>
           <w:rPr>
@@ -1621,7 +1671,7 @@
             <w:noProof/>
             <w:webHidden/>
           </w:rPr>
-          <w:instrText xml:space="preserve"> PAGEREF _Toc242724026 \h </w:instrText>
+          <w:instrText xml:space="preserve"> PAGEREF _Toc242972293 \h </w:instrText>
         </w:r>
         <w:r>
           <w:rPr>
@@ -1641,7 +1691,7 @@
             <w:noProof/>
             <w:webHidden/>
           </w:rPr>
-          <w:t>27</w:t>
+          <w:t>30</w:t>
         </w:r>
         <w:r>
           <w:rPr>
@@ -1667,7 +1717,7 @@
           <w14:ligatures w14:val="standardContextual"/>
         </w:rPr>
       </w:pPr>
-      <w:hyperlink w:anchor="_Toc242724027" w:history="1">
+      <w:hyperlink w:anchor="_Toc242972294" w:history="1">
         <w:r>
           <w:rPr>
             <w:rStyle w:val="Hyperlink"/>
@@ -1681,14 +1731,7 @@
             <w:noProof/>
             <w:lang w:val="vi-VN"/>
           </w:rPr>
-          <w:t xml:space="preserve"> Sơ đồ DFD mức </w:t>
-        </w:r>
-        <w:r>
-          <w:rPr>
-            <w:rStyle w:val="Hyperlink"/>
-            <w:noProof/>
-          </w:rPr>
-          <w:t>1</w:t>
+          <w:t xml:space="preserve"> Sơ đồ website</w:t>
         </w:r>
         <w:r>
           <w:rPr>
@@ -1709,7 +1752,7 @@
             <w:noProof/>
             <w:webHidden/>
           </w:rPr>
-          <w:instrText xml:space="preserve"> PAGEREF _Toc242724027 \h </w:instrText>
+          <w:instrText xml:space="preserve"> PAGEREF _Toc242972294 \h </w:instrText>
         </w:r>
         <w:r>
           <w:rPr>
@@ -1729,7 +1772,7 @@
             <w:noProof/>
             <w:webHidden/>
           </w:rPr>
-          <w:t>27</w:t>
+          <w:t>30</w:t>
         </w:r>
         <w:r>
           <w:rPr>
@@ -1755,7 +1798,7 @@
           <w14:ligatures w14:val="standardContextual"/>
         </w:rPr>
       </w:pPr>
-      <w:hyperlink w:anchor="_Toc242724028" w:history="1">
+      <w:hyperlink w:anchor="_Toc242972295" w:history="1">
         <w:r>
           <w:rPr>
             <w:rStyle w:val="Hyperlink"/>
@@ -1769,14 +1812,7 @@
             <w:noProof/>
             <w:lang w:val="vi-VN"/>
           </w:rPr>
-          <w:t xml:space="preserve"> Sơ đồ DFD mức </w:t>
-        </w:r>
-        <w:r>
-          <w:rPr>
-            <w:rStyle w:val="Hyperlink"/>
-            <w:noProof/>
-          </w:rPr>
-          <w:t>1.1</w:t>
+          <w:t xml:space="preserve"> Giao diện trang chủ</w:t>
         </w:r>
         <w:r>
           <w:rPr>
@@ -1797,7 +1833,7 @@
             <w:noProof/>
             <w:webHidden/>
           </w:rPr>
-          <w:instrText xml:space="preserve"> PAGEREF _Toc242724028 \h </w:instrText>
+          <w:instrText xml:space="preserve"> PAGEREF _Toc242972295 \h </w:instrText>
         </w:r>
         <w:r>
           <w:rPr>
@@ -1817,7 +1853,7 @@
             <w:noProof/>
             <w:webHidden/>
           </w:rPr>
-          <w:t>28</w:t>
+          <w:t>31</w:t>
         </w:r>
         <w:r>
           <w:rPr>
@@ -1843,7 +1879,7 @@
           <w14:ligatures w14:val="standardContextual"/>
         </w:rPr>
       </w:pPr>
-      <w:hyperlink w:anchor="_Toc242724029" w:history="1">
+      <w:hyperlink w:anchor="_Toc242972296" w:history="1">
         <w:r>
           <w:rPr>
             <w:rStyle w:val="Hyperlink"/>
@@ -1857,7 +1893,7 @@
             <w:noProof/>
             <w:lang w:val="vi-VN"/>
           </w:rPr>
-          <w:t xml:space="preserve"> Mô hình DFD mức 1.2</w:t>
+          <w:t xml:space="preserve"> Giao diện trang quản trị</w:t>
         </w:r>
         <w:r>
           <w:rPr>
@@ -1878,7 +1914,7 @@
             <w:noProof/>
             <w:webHidden/>
           </w:rPr>
-          <w:instrText xml:space="preserve"> PAGEREF _Toc242724029 \h </w:instrText>
+          <w:instrText xml:space="preserve"> PAGEREF _Toc242972296 \h </w:instrText>
         </w:r>
         <w:r>
           <w:rPr>
@@ -1898,7 +1934,7 @@
             <w:noProof/>
             <w:webHidden/>
           </w:rPr>
-          <w:t>28</w:t>
+          <w:t>32</w:t>
         </w:r>
         <w:r>
           <w:rPr>
@@ -1924,7 +1960,7 @@
           <w14:ligatures w14:val="standardContextual"/>
         </w:rPr>
       </w:pPr>
-      <w:hyperlink w:anchor="_Toc242724030" w:history="1">
+      <w:hyperlink w:anchor="_Toc242972297" w:history="1">
         <w:r>
           <w:rPr>
             <w:rStyle w:val="Hyperlink"/>
@@ -1938,14 +1974,7 @@
             <w:noProof/>
             <w:lang w:val="vi-VN"/>
           </w:rPr>
-          <w:t xml:space="preserve"> Sơ đồ DFD mức </w:t>
-        </w:r>
-        <w:r>
-          <w:rPr>
-            <w:rStyle w:val="Hyperlink"/>
-            <w:noProof/>
-          </w:rPr>
-          <w:t>1.3</w:t>
+          <w:t xml:space="preserve"> Giao diện trang đăng nhập và đăng ký</w:t>
         </w:r>
         <w:r>
           <w:rPr>
@@ -1966,7 +1995,7 @@
             <w:noProof/>
             <w:webHidden/>
           </w:rPr>
-          <w:instrText xml:space="preserve"> PAGEREF _Toc242724030 \h </w:instrText>
+          <w:instrText xml:space="preserve"> PAGEREF _Toc242972297 \h </w:instrText>
         </w:r>
         <w:r>
           <w:rPr>
@@ -1986,7 +2015,7 @@
             <w:noProof/>
             <w:webHidden/>
           </w:rPr>
-          <w:t>29</w:t>
+          <w:t>33</w:t>
         </w:r>
         <w:r>
           <w:rPr>
@@ -2012,7 +2041,7 @@
           <w14:ligatures w14:val="standardContextual"/>
         </w:rPr>
       </w:pPr>
-      <w:hyperlink w:anchor="_Toc242724031" w:history="1">
+      <w:hyperlink w:anchor="_Toc242972298" w:history="1">
         <w:r>
           <w:rPr>
             <w:rStyle w:val="Hyperlink"/>
@@ -2026,29 +2055,7 @@
             <w:noProof/>
             <w:lang w:val="vi-VN"/>
           </w:rPr>
-          <w:t xml:space="preserve"> </w:t>
-        </w:r>
-        <w:r>
-          <w:rPr>
-            <w:rStyle w:val="Hyperlink"/>
-            <w:noProof/>
-          </w:rPr>
-          <w:t>Sơ</w:t>
-        </w:r>
-        <w:r>
-          <w:rPr>
-            <w:rStyle w:val="Hyperlink"/>
-            <w:noProof/>
-            <w:lang w:val="vi-VN"/>
-          </w:rPr>
-          <w:t xml:space="preserve"> đồ </w:t>
-        </w:r>
-        <w:r>
-          <w:rPr>
-            <w:rStyle w:val="Hyperlink"/>
-            <w:noProof/>
-          </w:rPr>
-          <w:t>DFD mức 1.4</w:t>
+          <w:t xml:space="preserve"> Giao diện trang sản phẩm</w:t>
         </w:r>
         <w:r>
           <w:rPr>
@@ -2069,7 +2076,7 @@
             <w:noProof/>
             <w:webHidden/>
           </w:rPr>
-          <w:instrText xml:space="preserve"> PAGEREF _Toc242724031 \h </w:instrText>
+          <w:instrText xml:space="preserve"> PAGEREF _Toc242972298 \h </w:instrText>
         </w:r>
         <w:r>
           <w:rPr>
@@ -2089,7 +2096,7 @@
             <w:noProof/>
             <w:webHidden/>
           </w:rPr>
-          <w:t>29</w:t>
+          <w:t>34</w:t>
         </w:r>
         <w:r>
           <w:rPr>
@@ -2115,7 +2122,7 @@
           <w14:ligatures w14:val="standardContextual"/>
         </w:rPr>
       </w:pPr>
-      <w:hyperlink w:anchor="_Toc242724032" w:history="1">
+      <w:hyperlink w:anchor="_Toc242972299" w:history="1">
         <w:r>
           <w:rPr>
             <w:rStyle w:val="Hyperlink"/>
@@ -2129,14 +2136,7 @@
             <w:noProof/>
             <w:lang w:val="vi-VN"/>
           </w:rPr>
-          <w:t xml:space="preserve"> Sơ đồ DFD mức </w:t>
-        </w:r>
-        <w:r>
-          <w:rPr>
-            <w:rStyle w:val="Hyperlink"/>
-            <w:noProof/>
-          </w:rPr>
-          <w:t>1.5</w:t>
+          <w:t xml:space="preserve"> Giao diện trang chi tiết sản phẩm</w:t>
         </w:r>
         <w:r>
           <w:rPr>
@@ -2157,7 +2157,7 @@
             <w:noProof/>
             <w:webHidden/>
           </w:rPr>
-          <w:instrText xml:space="preserve"> PAGEREF _Toc242724032 \h </w:instrText>
+          <w:instrText xml:space="preserve"> PAGEREF _Toc242972299 \h </w:instrText>
         </w:r>
         <w:r>
           <w:rPr>
@@ -2177,7 +2177,7 @@
             <w:noProof/>
             <w:webHidden/>
           </w:rPr>
-          <w:t>30</w:t>
+          <w:t>35</w:t>
         </w:r>
         <w:r>
           <w:rPr>
@@ -3513,6 +3513,9 @@
     <w:p>
       <w:pPr>
         <w:pStyle w:val="nd"/>
+        <w:rPr>
+          <w:lang w:val="vi-VN"/>
+        </w:rPr>
       </w:pPr>
       <w:r>
         <w:rPr>
@@ -3532,34 +3535,6 @@
       <w:r>
         <w:t>có thể mở rộng trong tương lai.</w:t>
       </w:r>
-    </w:p>
-    <w:p>
-      <w:pPr>
-        <w:pStyle w:val="nd"/>
-      </w:pPr>
-      <w:r>
-        <w:t xml:space="preserve">Phạm vi đề tài giới hạn ở mức </w:t>
-      </w:r>
-      <w:r>
-        <w:rPr>
-          <w:rStyle w:val="Strong"/>
-          <w:szCs w:val="26"/>
-        </w:rPr>
-        <w:t>xây dựng website bán điện thoại cơ bản</w:t>
-      </w:r>
-      <w:r>
-        <w:t>, phục vụ mục đích học tập và thực hành kỹ năng lập trình web, chưa triển khai các tính năng nâng cao như thanh toán hay bảo mật nâng cao</w:t>
-      </w:r>
-      <w:r>
-        <w:t>.</w:t>
-      </w:r>
-    </w:p>
-    <w:p>
-      <w:pPr>
-        <w:rPr>
-          <w:lang w:val="vi-VN"/>
-        </w:rPr>
-      </w:pPr>
     </w:p>
     <w:p>
       <w:pPr>
@@ -3575,7 +3550,6 @@
           <w:ilvl w:val="0"/>
           <w:numId w:val="0"/>
         </w:numPr>
-        <w:ind w:left="576" w:hanging="576"/>
         <w:rPr>
           <w:lang w:val="vi-VN"/>
         </w:rPr>
@@ -3677,19 +3651,7 @@
         <w:pStyle w:val="nd"/>
       </w:pPr>
       <w:r>
-        <w:t>WSL 2</w:t>
-      </w:r>
-      <w:r>
-        <w:t xml:space="preserve"> (</w:t>
-      </w:r>
-      <w:r>
-        <w:t xml:space="preserve">Windows Subsystem for Linux </w:t>
-      </w:r>
-      <w:r>
-        <w:t>2)</w:t>
-      </w:r>
-      <w:r>
-        <w:t xml:space="preserve"> là công nghệ cho phép người dùng chạy môi trường Linux trực tiếp trên hệ điều hành Windows mà không cần cài đặt Linux trên một máy tính riêng hoặc thiết lập hệ thống khởi động kép. WSL 2 sử dụng nhân Linux thực tế trong môi trường máy ảo được tối ưu hóa, nhờ đó có khả năng tương thích tốt với nhiều công cụ và tiện ích dành cho Linux. Trong quá trình phát triển hệ thống quản lý sản phẩm và đơn hàng, WSL 2 hỗ trợ lập trình viên sử dụng các câu lệnh Linux để quản lý thư mục, thao tác với tệp tin, cài đặt công cụ và thực hiện các tác vụ liên quan đến môi trường phát triển ứng dụng. Ngoài ra, WSL 2 có khả năng phối hợp với Docker Desktop, tạo điều kiện thuận lợi cho việc xây dựng và vận hành các container trên Windows. Điều này giúp môi trường phát triển gần với môi trường triển khai ứng dụng trên các máy chủ Linux, từ đó hạn chế một số vấn đề phát sinh do sự khác biệt giữa các hệ điều hành. WSL 2 còn cho phép người dùng làm việc với mã nguồn trong môi trường Linux nhưng vẫn tận dụng được giao diện và các ứng dụng quen thuộc của Windows.</w:t>
+        <w:t>WSL 2 (Windows Subsystem for Linux 2) là công nghệ cho phép người dùng chạy môi trường Linux trực tiếp trên hệ điều hành Windows mà không cần cài đặt Linux trên một máy tính riêng hoặc thiết lập hệ thống khởi động kép. WSL 2 sử dụng nhân Linux thực tế trong môi trường máy ảo được tối ưu hóa, nhờ đó có khả năng tương thích tốt với nhiều công cụ và tiện ích dành cho Linux. Trong quá trình phát triển hệ thống quản lý sản phẩm và đơn hàng, WSL 2 hỗ trợ lập trình viên sử dụng các câu lệnh Linux để quản lý thư mục, thao tác với tệp tin, cài đặt công cụ và thực hiện các tác vụ liên quan đến môi trường phát triển ứng dụng. Ngoài ra, WSL 2 có khả năng phối hợp với Docker Desktop, tạo điều kiện thuận lợi cho việc xây dựng và vận hành các container trên Windows. Điều này giúp môi trường phát triển gần với môi trường triển khai ứng dụng trên các máy chủ Linux, từ đó hạn chế một số vấn đề phát sinh do sự khác biệt giữa các hệ điều hành. WSL 2 còn cho phép người dùng làm việc với mã nguồn trong môi trường Linux nhưng vẫn tận dụng được giao diện và các ứng dụng quen thuộc của Windows.</w:t>
       </w:r>
     </w:p>
     <w:p>
@@ -3827,7 +3789,7 @@
           <w:szCs w:val="26"/>
         </w:rPr>
         <w:lastRenderedPageBreak/>
-        <w:t xml:space="preserve">sẵn như kích thước, màu sắc, độ cao, độ rộng…, các designer có thể sáng tạo nhiều sản phẩm mới mẻ nhưng vẫn tiết kiệm thời gian khi làm việc với framework này trong quá trình thiết kế giao diện </w:t>
+        <w:t>sẵn như kích thước, màu sắc, độ cao, độ rộng…, các designer có thể sáng tạo nhiều sản phẩm mới mẻ nhưng vẫn tiết kiệm thời gian khi làm việc với framework này trong quá trình thiết kế giao diện website</w:t>
       </w:r>
       <w:r>
         <w:rPr>
@@ -3835,15 +3797,6 @@
           <w:b w:val="0"/>
           <w:bCs w:val="0"/>
           <w:szCs w:val="26"/>
-        </w:rPr>
-        <w:t>website</w:t>
-      </w:r>
-      <w:r>
-        <w:rPr>
-          <w:rStyle w:val="Strong"/>
-          <w:b w:val="0"/>
-          <w:bCs w:val="0"/>
-          <w:szCs w:val="26"/>
           <w:lang w:val="vi-VN"/>
         </w:rPr>
         <w:t>.</w:t>
@@ -3902,6 +3855,9 @@
     <w:p>
       <w:pPr>
         <w:pStyle w:val="Heading3"/>
+        <w:rPr>
+          <w:lang w:val="vi-VN"/>
+        </w:rPr>
       </w:pPr>
       <w:r>
         <w:rPr>
@@ -3918,6 +3874,13 @@
     </w:p>
     <w:p>
       <w:pPr>
+        <w:rPr>
+          <w:lang w:val="vi-VN"/>
+        </w:rPr>
+      </w:pPr>
+    </w:p>
+    <w:p>
+      <w:pPr>
         <w:pStyle w:val="Heading3"/>
         <w:rPr>
           <w:lang w:val="vi-VN"/>
@@ -3947,13 +3910,7 @@
         <w:rPr>
           <w:lang w:val="vi-VN"/>
         </w:rPr>
-        <w:t xml:space="preserve"> </w:t>
-      </w:r>
-      <w:r>
-        <w:rPr>
-          <w:lang w:val="vi-VN"/>
-        </w:rPr>
-        <w:t>ngôn ngữ PHP</w:t>
+        <w:t xml:space="preserve"> ngôn ngữ PHP</w:t>
       </w:r>
     </w:p>
     <w:p>
@@ -7586,6 +7543,7 @@
     </w:p>
     <w:p>
       <w:pPr>
+        <w:jc w:val="center"/>
         <w:rPr>
           <w:lang w:val="vi-VN"/>
         </w:rPr>
@@ -7640,12 +7598,6 @@
     </w:p>
     <w:p>
       <w:pPr>
-        <w:keepNext/>
-        <w:jc w:val="center"/>
-      </w:pPr>
-    </w:p>
-    <w:p>
-      <w:pPr>
         <w:pStyle w:val="Caption"/>
         <w:jc w:val="center"/>
         <w:rPr>
@@ -7658,7 +7610,7 @@
         </w:rPr>
       </w:pPr>
       <w:bookmarkStart w:id="8" w:name="_Toc242546993"/>
-      <w:bookmarkStart w:id="9" w:name="_Toc242724018"/>
+      <w:bookmarkStart w:id="9" w:name="_Toc242972285"/>
       <w:r>
         <w:rPr>
           <w:i w:val="0"/>
@@ -7837,6 +7789,9 @@
     <w:p>
       <w:pPr>
         <w:pStyle w:val="Heading2"/>
+        <w:rPr>
+          <w:lang w:val="vi-VN"/>
+        </w:rPr>
       </w:pPr>
       <w:r>
         <w:lastRenderedPageBreak/>
@@ -7851,22 +7806,24 @@
         </w:rPr>
       </w:pPr>
       <w:r>
+        <w:rPr>
+          <w:lang w:val="vi-VN"/>
+        </w:rPr>
         <w:t>Mô hình ERD</w:t>
       </w:r>
     </w:p>
     <w:p>
       <w:pPr>
-        <w:keepNext/>
         <w:jc w:val="center"/>
-      </w:pPr>
-      <w:r>
-        <w:rPr>
-          <w:noProof/>
-        </w:rPr>
+        <w:rPr>
+          <w:lang w:val="vi-VN"/>
+        </w:rPr>
+      </w:pPr>
+      <w:r>
         <w:drawing>
-          <wp:inline distT="0" distB="0" distL="0" distR="0" wp14:anchorId="158CACC5" wp14:editId="7E78DB92">
-            <wp:extent cx="5835962" cy="5422900"/>
-            <wp:effectExtent l="0" t="0" r="0" b="6350"/>
+          <wp:inline distT="0" distB="0" distL="0" distR="0" wp14:anchorId="158CACC5" wp14:editId="1A17680F">
+            <wp:extent cx="5678787" cy="5276850"/>
+            <wp:effectExtent l="0" t="0" r="0" b="0"/>
             <wp:docPr id="885440195" name="Picture 1"/>
             <wp:cNvGraphicFramePr>
               <a:graphicFrameLocks xmlns:a="http://schemas.openxmlformats.org/drawingml/2006/main" noChangeAspect="1"/>
@@ -7893,7 +7850,7 @@
                   <pic:spPr>
                     <a:xfrm>
                       <a:off x="0" y="0"/>
-                      <a:ext cx="5863302" cy="5448305"/>
+                      <a:ext cx="5707688" cy="5303706"/>
                     </a:xfrm>
                     <a:prstGeom prst="rect">
                       <a:avLst/>
@@ -7922,6 +7879,7 @@
           <w:lang w:val="vi-VN"/>
         </w:rPr>
       </w:pPr>
+      <w:bookmarkStart w:id="10" w:name="_Toc242972286"/>
       <w:r>
         <w:rPr>
           <w:i w:val="0"/>
@@ -8055,6 +8013,7 @@
         </w:rPr>
         <w:t xml:space="preserve"> Mô hình ERD</w:t>
       </w:r>
+      <w:bookmarkEnd w:id="10"/>
     </w:p>
     <w:p>
       <w:pPr>
@@ -8151,6 +8110,9 @@
           <w:lang w:val="vi-VN"/>
         </w:rPr>
         <w:t xml:space="preserve">. </w:t>
+      </w:r>
+      <w:r>
+        <w:t xml:space="preserve">Hệ thống cho phép thực hiện các thao tác thêm mới, cập nhật, tra cứu và quản lý thông tin danh mục. </w:t>
       </w:r>
       <w:r>
         <w:t xml:space="preserve">Mỗi danh mục có thể chứa nhiều sản </w:t>
@@ -8286,9 +8248,9 @@
           <w:lang w:val="vi-VN"/>
         </w:rPr>
       </w:pPr>
-      <w:bookmarkStart w:id="10" w:name="_Ref242454215"/>
-      <w:bookmarkStart w:id="11" w:name="_Ref242645622"/>
-      <w:bookmarkStart w:id="12" w:name="_Toc242645975"/>
+      <w:bookmarkStart w:id="11" w:name="_Ref242454215"/>
+      <w:bookmarkStart w:id="12" w:name="_Ref242645622"/>
+      <w:bookmarkStart w:id="13" w:name="_Toc242645975"/>
       <w:r>
         <w:rPr>
           <w:i w:val="0"/>
@@ -8412,7 +8374,7 @@
         </w:rPr>
         <w:fldChar w:fldCharType="end"/>
       </w:r>
-      <w:bookmarkEnd w:id="10"/>
+      <w:bookmarkEnd w:id="11"/>
       <w:r>
         <w:rPr>
           <w:i w:val="0"/>
@@ -8464,8 +8426,8 @@
         </w:rPr>
         <w:t>ategories</w:t>
       </w:r>
-      <w:bookmarkEnd w:id="11"/>
       <w:bookmarkEnd w:id="12"/>
+      <w:bookmarkEnd w:id="13"/>
     </w:p>
     <w:tbl>
       <w:tblPr>
@@ -8917,12 +8879,12 @@
           <w:lang w:val="vi-VN"/>
         </w:rPr>
       </w:pPr>
-      <w:bookmarkStart w:id="13" w:name="_Ref242822477"/>
-      <w:bookmarkStart w:id="14" w:name="_Ref242645558"/>
-      <w:bookmarkStart w:id="15" w:name="_Ref242645572"/>
-      <w:bookmarkStart w:id="16" w:name="_Ref242645608"/>
-      <w:bookmarkStart w:id="17" w:name="_Ref242645619"/>
-      <w:bookmarkStart w:id="18" w:name="_Toc242645976"/>
+      <w:bookmarkStart w:id="14" w:name="_Ref242822477"/>
+      <w:bookmarkStart w:id="15" w:name="_Ref242645558"/>
+      <w:bookmarkStart w:id="16" w:name="_Ref242645572"/>
+      <w:bookmarkStart w:id="17" w:name="_Ref242645608"/>
+      <w:bookmarkStart w:id="18" w:name="_Ref242645619"/>
+      <w:bookmarkStart w:id="19" w:name="_Toc242645976"/>
       <w:r>
         <w:t xml:space="preserve">Bảng </w:t>
       </w:r>
@@ -8945,18 +8907,18 @@
           <w:t>4</w:t>
         </w:r>
       </w:fldSimple>
-      <w:bookmarkEnd w:id="13"/>
+      <w:bookmarkEnd w:id="14"/>
       <w:r>
         <w:rPr>
           <w:lang w:val="vi-VN"/>
         </w:rPr>
         <w:t xml:space="preserve"> Thực thể </w:t>
       </w:r>
-      <w:bookmarkEnd w:id="14"/>
       <w:bookmarkEnd w:id="15"/>
       <w:bookmarkEnd w:id="16"/>
       <w:bookmarkEnd w:id="17"/>
       <w:bookmarkEnd w:id="18"/>
+      <w:bookmarkEnd w:id="19"/>
       <w:r>
         <w:rPr>
           <w:lang w:val="vi-VN"/>
@@ -9868,9 +9830,9 @@
           <w:lang w:val="vi-VN"/>
         </w:rPr>
       </w:pPr>
-      <w:bookmarkStart w:id="19" w:name="_Ref242454583"/>
-      <w:bookmarkStart w:id="20" w:name="_Ref242645705"/>
-      <w:bookmarkStart w:id="21" w:name="_Toc242645977"/>
+      <w:bookmarkStart w:id="20" w:name="_Ref242454583"/>
+      <w:bookmarkStart w:id="21" w:name="_Ref242645705"/>
+      <w:bookmarkStart w:id="22" w:name="_Toc242645977"/>
       <w:r>
         <w:rPr>
           <w:szCs w:val="26"/>
@@ -9945,7 +9907,7 @@
         </w:rPr>
         <w:fldChar w:fldCharType="end"/>
       </w:r>
-      <w:bookmarkEnd w:id="19"/>
+      <w:bookmarkEnd w:id="20"/>
       <w:r>
         <w:rPr>
           <w:szCs w:val="26"/>
@@ -9962,8 +9924,8 @@
       <w:r>
         <w:t>ustomers</w:t>
       </w:r>
-      <w:bookmarkEnd w:id="20"/>
       <w:bookmarkEnd w:id="21"/>
+      <w:bookmarkEnd w:id="22"/>
     </w:p>
     <w:tbl>
       <w:tblPr>
@@ -10773,9 +10735,9 @@
           <w:lang w:val="vi-VN"/>
         </w:rPr>
       </w:pPr>
-      <w:bookmarkStart w:id="22" w:name="_Ref242456404"/>
-      <w:bookmarkStart w:id="23" w:name="_Ref242645743"/>
-      <w:bookmarkStart w:id="24" w:name="_Toc242645978"/>
+      <w:bookmarkStart w:id="23" w:name="_Ref242456404"/>
+      <w:bookmarkStart w:id="24" w:name="_Ref242645743"/>
+      <w:bookmarkStart w:id="25" w:name="_Toc242645978"/>
       <w:r>
         <w:rPr>
           <w:szCs w:val="26"/>
@@ -10850,7 +10812,7 @@
         </w:rPr>
         <w:fldChar w:fldCharType="end"/>
       </w:r>
-      <w:bookmarkEnd w:id="22"/>
+      <w:bookmarkEnd w:id="23"/>
       <w:r>
         <w:rPr>
           <w:szCs w:val="26"/>
@@ -10867,8 +10829,8 @@
       <w:r>
         <w:t>mployees</w:t>
       </w:r>
-      <w:bookmarkEnd w:id="23"/>
       <w:bookmarkEnd w:id="24"/>
+      <w:bookmarkEnd w:id="25"/>
     </w:p>
     <w:tbl>
       <w:tblPr>
@@ -11606,9 +11568,9 @@
           <w:lang w:val="vi-VN"/>
         </w:rPr>
       </w:pPr>
-      <w:bookmarkStart w:id="25" w:name="_Ref242456647"/>
-      <w:bookmarkStart w:id="26" w:name="_Ref242645788"/>
-      <w:bookmarkStart w:id="27" w:name="_Toc242645979"/>
+      <w:bookmarkStart w:id="26" w:name="_Ref242456647"/>
+      <w:bookmarkStart w:id="27" w:name="_Ref242645788"/>
+      <w:bookmarkStart w:id="28" w:name="_Toc242645979"/>
       <w:r>
         <w:rPr>
           <w:szCs w:val="26"/>
@@ -11683,7 +11645,7 @@
         </w:rPr>
         <w:fldChar w:fldCharType="end"/>
       </w:r>
-      <w:bookmarkEnd w:id="25"/>
+      <w:bookmarkEnd w:id="26"/>
       <w:r>
         <w:rPr>
           <w:szCs w:val="26"/>
@@ -11700,8 +11662,8 @@
       <w:r>
         <w:t>hippers</w:t>
       </w:r>
-      <w:bookmarkEnd w:id="26"/>
       <w:bookmarkEnd w:id="27"/>
+      <w:bookmarkEnd w:id="28"/>
     </w:p>
     <w:tbl>
       <w:tblPr>
@@ -12175,9 +12137,9 @@
           <w:lang w:val="vi-VN"/>
         </w:rPr>
       </w:pPr>
-      <w:bookmarkStart w:id="28" w:name="_Ref242457071"/>
-      <w:bookmarkStart w:id="29" w:name="_Ref242645847"/>
-      <w:bookmarkStart w:id="30" w:name="_Toc242645980"/>
+      <w:bookmarkStart w:id="29" w:name="_Ref242457071"/>
+      <w:bookmarkStart w:id="30" w:name="_Ref242645847"/>
+      <w:bookmarkStart w:id="31" w:name="_Toc242645980"/>
       <w:r>
         <w:rPr>
           <w:szCs w:val="26"/>
@@ -12252,7 +12214,7 @@
         </w:rPr>
         <w:fldChar w:fldCharType="end"/>
       </w:r>
-      <w:bookmarkEnd w:id="28"/>
+      <w:bookmarkEnd w:id="29"/>
       <w:r>
         <w:t xml:space="preserve"> Thực thể </w:t>
       </w:r>
@@ -12262,8 +12224,8 @@
       <w:r>
         <w:t>roducts</w:t>
       </w:r>
-      <w:bookmarkEnd w:id="29"/>
       <w:bookmarkEnd w:id="30"/>
+      <w:bookmarkEnd w:id="31"/>
     </w:p>
     <w:tbl>
       <w:tblPr>
@@ -13306,9 +13268,9 @@
           <w:lang w:val="vi-VN"/>
         </w:rPr>
       </w:pPr>
-      <w:bookmarkStart w:id="31" w:name="_Ref242457136"/>
-      <w:bookmarkStart w:id="32" w:name="_Ref242645875"/>
-      <w:bookmarkStart w:id="33" w:name="_Toc242645981"/>
+      <w:bookmarkStart w:id="32" w:name="_Ref242457136"/>
+      <w:bookmarkStart w:id="33" w:name="_Ref242645875"/>
+      <w:bookmarkStart w:id="34" w:name="_Toc242645981"/>
       <w:r>
         <w:rPr>
           <w:szCs w:val="26"/>
@@ -13383,7 +13345,7 @@
         </w:rPr>
         <w:fldChar w:fldCharType="end"/>
       </w:r>
-      <w:bookmarkEnd w:id="31"/>
+      <w:bookmarkEnd w:id="32"/>
       <w:r>
         <w:rPr>
           <w:szCs w:val="26"/>
@@ -13406,8 +13368,8 @@
       <w:r>
         <w:t>mages</w:t>
       </w:r>
-      <w:bookmarkEnd w:id="32"/>
       <w:bookmarkEnd w:id="33"/>
+      <w:bookmarkEnd w:id="34"/>
     </w:p>
     <w:tbl>
       <w:tblPr>
@@ -14168,9 +14130,9 @@
           <w:lang w:val="vi-VN"/>
         </w:rPr>
       </w:pPr>
-      <w:bookmarkStart w:id="34" w:name="_Ref242457632"/>
-      <w:bookmarkStart w:id="35" w:name="_Ref242645910"/>
-      <w:bookmarkStart w:id="36" w:name="_Toc242645982"/>
+      <w:bookmarkStart w:id="35" w:name="_Ref242457632"/>
+      <w:bookmarkStart w:id="36" w:name="_Ref242645910"/>
+      <w:bookmarkStart w:id="37" w:name="_Toc242645982"/>
       <w:r>
         <w:rPr>
           <w:szCs w:val="26"/>
@@ -14245,7 +14207,7 @@
         </w:rPr>
         <w:fldChar w:fldCharType="end"/>
       </w:r>
-      <w:bookmarkEnd w:id="34"/>
+      <w:bookmarkEnd w:id="35"/>
       <w:r>
         <w:rPr>
           <w:szCs w:val="26"/>
@@ -14262,8 +14224,8 @@
       <w:r>
         <w:t>rders</w:t>
       </w:r>
-      <w:bookmarkEnd w:id="35"/>
       <w:bookmarkEnd w:id="36"/>
+      <w:bookmarkEnd w:id="37"/>
     </w:p>
     <w:tbl>
       <w:tblPr>
@@ -14922,9 +14884,9 @@
           <w:lang w:val="vi-VN"/>
         </w:rPr>
       </w:pPr>
-      <w:bookmarkStart w:id="37" w:name="_Ref242458121"/>
-      <w:bookmarkStart w:id="38" w:name="_Ref242645951"/>
-      <w:bookmarkStart w:id="39" w:name="_Toc242645983"/>
+      <w:bookmarkStart w:id="38" w:name="_Ref242458121"/>
+      <w:bookmarkStart w:id="39" w:name="_Ref242645951"/>
+      <w:bookmarkStart w:id="40" w:name="_Toc242645983"/>
       <w:r>
         <w:rPr>
           <w:i w:val="0"/>
@@ -15047,7 +15009,7 @@
         </w:rPr>
         <w:fldChar w:fldCharType="end"/>
       </w:r>
-      <w:bookmarkEnd w:id="37"/>
+      <w:bookmarkEnd w:id="38"/>
       <w:r>
         <w:rPr>
           <w:i w:val="0"/>
@@ -15100,8 +15062,8 @@
         </w:rPr>
         <w:t>OrderDetail</w:t>
       </w:r>
-      <w:bookmarkEnd w:id="38"/>
       <w:bookmarkEnd w:id="39"/>
+      <w:bookmarkEnd w:id="40"/>
     </w:p>
     <w:tbl>
       <w:tblPr>
@@ -15822,6 +15784,7 @@
           <w:lang w:val="vi-VN"/>
         </w:rPr>
       </w:pPr>
+      <w:bookmarkStart w:id="41" w:name="_Toc242972287"/>
       <w:r>
         <w:rPr>
           <w:i w:val="0"/>
@@ -15955,6 +15918,7 @@
         </w:rPr>
         <w:t xml:space="preserve"> Mô hình DFD mức ngữ cảnh</w:t>
       </w:r>
+      <w:bookmarkEnd w:id="41"/>
     </w:p>
     <w:p>
       <w:pPr>
@@ -16015,6 +15979,7 @@
       <w:pPr>
         <w:pStyle w:val="nd"/>
         <w:keepNext/>
+        <w:ind w:firstLine="0"/>
         <w:jc w:val="center"/>
       </w:pPr>
       <w:r>
@@ -16077,6 +16042,7 @@
           <w:lang w:val="vi-VN"/>
         </w:rPr>
       </w:pPr>
+      <w:bookmarkStart w:id="42" w:name="_Toc242972288"/>
       <w:r>
         <w:rPr>
           <w:i w:val="0"/>
@@ -16220,6 +16186,7 @@
         </w:rPr>
         <w:t>1</w:t>
       </w:r>
+      <w:bookmarkEnd w:id="42"/>
     </w:p>
     <w:p>
       <w:pPr>
@@ -16261,37 +16228,32 @@
         <w:t xml:space="preserve"> tả: </w:t>
       </w:r>
       <w:r>
-        <w:t>G</w:t>
-      </w:r>
-      <w:r>
-        <w:t xml:space="preserve">ồm bốn tiến trình: quản lý danh mục, quản lý sản phẩm, quản lý hình ảnh và tìm kiếm sản phẩm. Các tiến trình thực hiện tiếp nhận, cập nhật, xử lý và tra cứu thông tin sản phẩm. Quản trị viên/Nhân viên tương tác với hệ thống để quản lý danh mục, thông tin sản phẩm, hình ảnh và tìm kiếm sản </w:t>
-      </w:r>
-      <w:r>
-        <w:t>phẩm</w:t>
-      </w:r>
-      <w:r>
-        <w:rPr>
-          <w:lang w:val="vi-VN"/>
-        </w:rPr>
-        <w:t xml:space="preserve">. </w:t>
+        <w:t>Q</w:t>
+      </w:r>
+      <w:r>
+        <w:t xml:space="preserve">uản lý sản phẩm được phân rã thành ba tiến trình nhỏ. 1.1.1 – Tiếp nhận yêu cầu tiếp nhận yêu cầu xem, tìm kiếm sản phẩm từ khách hàng và yêu cầu thêm, sửa, xóa sản phẩm từ quản trị viên. 1.1.2 – Xử lý thông tin sản phẩm thực hiện kiểm tra tính hợp lệ, tìm kiếm và xử lý thông tin sản phẩm theo yêu cầu. 1.1.3 – Lưu trữ sản phẩm cập nhật dữ liệu vào kho dữ liệu D1 – Sản phẩm và trả kết quả xử lý cho các đối tượng liên quan. Các luồng dữ liệu giữa khách hàng, quản trị viên, các </w:t>
+      </w:r>
+      <w:r>
+        <w:lastRenderedPageBreak/>
+        <w:t>tiến trình và kho dữ liệu giúp việc quản lý sản phẩm được thực hiện thống nhất, chính xác và thuận tiện.</w:t>
       </w:r>
     </w:p>
     <w:p>
       <w:pPr>
         <w:pStyle w:val="nd"/>
         <w:keepNext/>
+        <w:ind w:firstLine="0"/>
         <w:jc w:val="center"/>
       </w:pPr>
       <w:r>
         <w:rPr>
           <w:noProof/>
         </w:rPr>
-        <w:lastRenderedPageBreak/>
         <w:drawing>
-          <wp:inline distT="0" distB="0" distL="0" distR="0" wp14:anchorId="1362ED2C" wp14:editId="65EDCA24">
-            <wp:extent cx="4878953" cy="2351203"/>
-            <wp:effectExtent l="19050" t="19050" r="17145" b="11430"/>
-            <wp:docPr id="719135524" name="Picture 1"/>
+          <wp:inline distT="0" distB="0" distL="0" distR="0" wp14:anchorId="6E033D51" wp14:editId="74EFFAF6">
+            <wp:extent cx="5454650" cy="2533650"/>
+            <wp:effectExtent l="0" t="0" r="0" b="0"/>
+            <wp:docPr id="1798499646" name="Picture 1"/>
             <wp:cNvGraphicFramePr>
               <a:graphicFrameLocks xmlns:a="http://schemas.openxmlformats.org/drawingml/2006/main" noChangeAspect="1"/>
             </wp:cNvGraphicFramePr>
@@ -16299,11 +16261,11 @@
               <a:graphicData uri="http://schemas.openxmlformats.org/drawingml/2006/picture">
                 <pic:pic xmlns:pic="http://schemas.openxmlformats.org/drawingml/2006/picture">
                   <pic:nvPicPr>
-                    <pic:cNvPr id="345107064" name="Picture 345107064"/>
+                    <pic:cNvPr id="1798499646" name="Picture 1798499646"/>
                     <pic:cNvPicPr/>
                   </pic:nvPicPr>
                   <pic:blipFill>
-                    <a:blip r:embed="rId13" cstate="print">
+                    <a:blip r:embed="rId13">
                       <a:extLst>
                         <a:ext uri="{28A0092B-C50C-407E-A947-70E740481C1C}">
                           <a14:useLocalDpi xmlns:a14="http://schemas.microsoft.com/office/drawing/2010/main" val="0"/>
@@ -16317,16 +16279,11 @@
                   <pic:spPr>
                     <a:xfrm>
                       <a:off x="0" y="0"/>
-                      <a:ext cx="4893836" cy="2358375"/>
+                      <a:ext cx="5454650" cy="2533650"/>
                     </a:xfrm>
                     <a:prstGeom prst="rect">
                       <a:avLst/>
                     </a:prstGeom>
-                    <a:ln w="3175">
-                      <a:solidFill>
-                        <a:schemeClr val="tx1"/>
-                      </a:solidFill>
-                    </a:ln>
                   </pic:spPr>
                 </pic:pic>
               </a:graphicData>
@@ -16347,6 +16304,7 @@
           <w:szCs w:val="26"/>
         </w:rPr>
       </w:pPr>
+      <w:bookmarkStart w:id="43" w:name="_Toc242972289"/>
       <w:r>
         <w:rPr>
           <w:i w:val="0"/>
@@ -16478,18 +16436,7 @@
           <w:szCs w:val="26"/>
           <w:lang w:val="vi-VN"/>
         </w:rPr>
-        <w:t xml:space="preserve"> </w:t>
-      </w:r>
-      <w:r>
-        <w:rPr>
-          <w:i w:val="0"/>
-          <w:iCs w:val="0"/>
-          <w:color w:val="auto"/>
-          <w:sz w:val="26"/>
-          <w:szCs w:val="26"/>
-          <w:lang w:val="vi-VN"/>
-        </w:rPr>
-        <w:t xml:space="preserve">Sơ đồ DFD mức </w:t>
+        <w:t xml:space="preserve"> Sơ đồ DFD mức </w:t>
       </w:r>
       <w:r>
         <w:rPr>
@@ -16501,6 +16448,7 @@
         </w:rPr>
         <w:t>1.1</w:t>
       </w:r>
+      <w:bookmarkEnd w:id="43"/>
     </w:p>
     <w:p>
       <w:pPr>
@@ -16544,57 +16492,33 @@
     <w:p>
       <w:pPr>
         <w:pStyle w:val="nd"/>
-        <w:rPr>
-          <w:lang w:val="vi-VN"/>
-        </w:rPr>
-      </w:pPr>
-      <w:r>
-        <w:rPr>
-          <w:lang w:val="vi-VN"/>
-        </w:rPr>
-        <w:t xml:space="preserve">- Mô tả: </w:t>
-      </w:r>
-      <w:r>
-        <w:t xml:space="preserve">Sơ đồ mô tả quy trình tiến </w:t>
-      </w:r>
-      <w:r>
-        <w:t>trình</w:t>
-      </w:r>
-      <w:r>
-        <w:rPr>
-          <w:lang w:val="vi-VN"/>
-        </w:rPr>
-        <w:t xml:space="preserve"> quản lý nhà cung cấp bao gồm các tiến trình </w:t>
-      </w:r>
-      <w:r>
-        <w:t xml:space="preserve">thêm/sửa nhà cung cấp, xóa nhà cung cấp, tìm kiếm nhà cung cấp và gửi yêu cầu cung cấp hàng. Quản trị viên/Nhân viên thực hiện quản lý thông tin nhà cung cấp, tìm kiếm dữ liệu và gửi yêu cầu cung cấp hàng hóa. Hệ thống trao đổi thông tin với nhà cung cấp để tiếp nhận thông tin hàng hóa, gửi yêu cầu cung cấp hàng và nhận thông tin đặt </w:t>
-      </w:r>
-      <w:r>
-        <w:t>hàng</w:t>
-      </w:r>
-      <w:r>
-        <w:rPr>
-          <w:lang w:val="vi-VN"/>
-        </w:rPr>
-        <w:t>.</w:t>
-      </w:r>
-    </w:p>
-    <w:p>
-      <w:pPr>
-        <w:pStyle w:val="nd"/>
-        <w:keepNext/>
+      </w:pPr>
+      <w:r>
+        <w:rPr>
+          <w:lang w:val="vi-VN"/>
+        </w:rPr>
+        <w:t xml:space="preserve">- Mô </w:t>
+      </w:r>
+      <w:r>
+        <w:rPr>
+          <w:lang w:val="vi-VN"/>
+        </w:rPr>
+        <w:t>tả: Q</w:t>
+      </w:r>
+      <w:r>
+        <w:t>uản lý nhà cung cấp gồm ba tiến trình con. Tiến trình 1.2.1 – Tiếp nhận yêu cầu tiếp nhận các yêu cầu quản lý thông tin nhà cung cấp từ quản trị viên hoặc nhân viên. Tiến trình 1.2.2 – Xử lý thông tin nhà cung cấp thực hiện thêm, sửa, xóa, tìm kiếm và cập nhật thông tin nhà cung cấp. Tiến trình 1.2.3 – Lưu trữ nhà cung cấp lưu thông tin đã xử lý vào kho D2 – Nhà cung cấp và cung cấp dữ liệu khi có yêu cầu tra cứu. Sau khi hoàn tất, hệ thống trả kết quả xử lý cho quản trị viên hoặc nhân viên, giúp quản lý tập trung thông tin và nguồn cung cấp sản phẩm.</w:t>
+      </w:r>
+    </w:p>
+    <w:p>
+      <w:pPr>
         <w:jc w:val="center"/>
       </w:pPr>
       <w:r>
-        <w:rPr>
-          <w:noProof/>
-          <w:lang w:val="vi-VN"/>
-        </w:rPr>
         <w:drawing>
-          <wp:inline distT="0" distB="0" distL="0" distR="0" wp14:anchorId="646BE314" wp14:editId="19F362C4">
-            <wp:extent cx="4632463" cy="2199207"/>
-            <wp:effectExtent l="19050" t="19050" r="15875" b="10795"/>
-            <wp:docPr id="414483535" name="Picture 2"/>
+          <wp:inline distT="0" distB="0" distL="0" distR="0" wp14:anchorId="202AAD81" wp14:editId="5117D7F1">
+            <wp:extent cx="5580380" cy="2453640"/>
+            <wp:effectExtent l="0" t="0" r="1270" b="3810"/>
+            <wp:docPr id="150467476" name="Picture 4"/>
             <wp:cNvGraphicFramePr>
               <a:graphicFrameLocks xmlns:a="http://schemas.openxmlformats.org/drawingml/2006/main" noChangeAspect="1"/>
             </wp:cNvGraphicFramePr>
@@ -16602,11 +16526,11 @@
               <a:graphicData uri="http://schemas.openxmlformats.org/drawingml/2006/picture">
                 <pic:pic xmlns:pic="http://schemas.openxmlformats.org/drawingml/2006/picture">
                   <pic:nvPicPr>
-                    <pic:cNvPr id="137742417" name="Picture 137742417"/>
+                    <pic:cNvPr id="150467476" name="Picture 150467476"/>
                     <pic:cNvPicPr/>
                   </pic:nvPicPr>
                   <pic:blipFill>
-                    <a:blip r:embed="rId14" cstate="print">
+                    <a:blip r:embed="rId14">
                       <a:extLst>
                         <a:ext uri="{28A0092B-C50C-407E-A947-70E740481C1C}">
                           <a14:useLocalDpi xmlns:a14="http://schemas.microsoft.com/office/drawing/2010/main" val="0"/>
@@ -16620,16 +16544,11 @@
                   <pic:spPr>
                     <a:xfrm>
                       <a:off x="0" y="0"/>
-                      <a:ext cx="4640734" cy="2203133"/>
+                      <a:ext cx="5580380" cy="2453640"/>
                     </a:xfrm>
                     <a:prstGeom prst="rect">
                       <a:avLst/>
                     </a:prstGeom>
-                    <a:ln w="3175">
-                      <a:solidFill>
-                        <a:schemeClr val="tx1"/>
-                      </a:solidFill>
-                    </a:ln>
                   </pic:spPr>
                 </pic:pic>
               </a:graphicData>
@@ -16651,6 +16570,7 @@
           <w:lang w:val="vi-VN"/>
         </w:rPr>
       </w:pPr>
+      <w:bookmarkStart w:id="44" w:name="_Toc242972290"/>
       <w:r>
         <w:rPr>
           <w:i w:val="0"/>
@@ -16837,7 +16757,19 @@
           <w:szCs w:val="26"/>
           <w:lang w:val="vi-VN"/>
         </w:rPr>
-        <w:t xml:space="preserve"> 1.2 </w:t>
+        <w:t xml:space="preserve"> 1.2</w:t>
+      </w:r>
+      <w:bookmarkEnd w:id="44"/>
+      <w:r>
+        <w:rPr>
+          <w:i w:val="0"/>
+          <w:iCs w:val="0"/>
+          <w:color w:val="auto"/>
+          <w:sz w:val="26"/>
+          <w:szCs w:val="26"/>
+          <w:lang w:val="vi-VN"/>
+        </w:rPr>
+        <w:t xml:space="preserve"> </w:t>
       </w:r>
     </w:p>
     <w:p>
@@ -16852,6 +16784,7 @@
         <w:rPr>
           <w:lang w:val="vi-VN"/>
         </w:rPr>
+        <w:lastRenderedPageBreak/>
         <w:t xml:space="preserve">- </w:t>
       </w:r>
       <w:r>
@@ -16882,35 +16815,31 @@
         </w:rPr>
       </w:pPr>
       <w:r>
-        <w:rPr>
-          <w:lang w:val="vi-VN"/>
-        </w:rPr>
-        <w:t xml:space="preserve">- Mô tả: </w:t>
-      </w:r>
-      <w:r>
-        <w:t xml:space="preserve">Sơ đồ mô tả quy trình quản lý đơn vị vận chuyển, phân công giao hàng và cập nhật trạng thái giao hàng. Quản trị viên/Nhân viên quản lý thông tin đơn vị vận chuyển, thực hiện phân công giao hàng cho đơn vị vận chuyển phù hợp. Đơn vị </w:t>
-      </w:r>
-      <w:r>
-        <w:lastRenderedPageBreak/>
-        <w:t>vận chuyển tiếp nhận thông tin đơn hàng và người nhận, sau đó cập nhật trạng thái giao hàng để hệ thống theo dõi tiến trình giao hàng.</w:t>
-      </w:r>
-    </w:p>
-    <w:p>
-      <w:pPr>
-        <w:pStyle w:val="nd"/>
-        <w:keepNext/>
-        <w:ind w:firstLine="576"/>
+        <w:t xml:space="preserve">- Mô </w:t>
+      </w:r>
+      <w:r>
+        <w:t xml:space="preserve">tả: </w:t>
+      </w:r>
+      <w:r>
+        <w:t>Q</w:t>
+      </w:r>
+      <w:r>
+        <w:t>uản lý đơn hàng được chia thành bốn tiến trình. Tiến trình 1.3.1 – Tiếp nhận đơn hàng tiếp nhận thông tin đặt hàng hoặc yêu cầu hủy đơn hàng từ khách hàng. Tiến trình 1.3.2 – Xử lý đơn hàng kiểm tra và xử lý thông tin đơn hàng, đồng thời hỗ trợ quản trị viên hoặc nhân viên theo dõi, cập nhật trạng thái đơn hàng. Tiến trình 1.3.3 – Gửi đơn vị vận chuyển chuyển thông tin đơn hàng cần giao đến đơn vị vận chuyển để thực hiện giao hàng. Tiến trình 1.3.4 – Quản lý chi tiết đơn hàng quản lý danh sách sản phẩm, số lượng, đơn giá và thành tiền của từng sản phẩm, lấy thông tin sản phẩm từ kho D1 – Sản phẩm và lưu dữ liệu vào kho D6 – Chi tiết đơn hàng. Thông tin đơn hàng được lưu tại kho D3 – Đơn hàng, phục vụ việc tra cứu và theo dõi quá trình xử lý.</w:t>
+      </w:r>
+    </w:p>
+    <w:p>
+      <w:pPr>
         <w:jc w:val="center"/>
-      </w:pPr>
-      <w:r>
-        <w:rPr>
-          <w:noProof/>
-        </w:rPr>
+        <w:rPr>
+          <w:lang w:val="vi-VN"/>
+        </w:rPr>
+      </w:pPr>
+      <w:r>
         <w:drawing>
-          <wp:inline distT="0" distB="0" distL="0" distR="0" wp14:anchorId="2920AD48" wp14:editId="347ACBEB">
-            <wp:extent cx="4159360" cy="2238709"/>
-            <wp:effectExtent l="19050" t="19050" r="12700" b="28575"/>
-            <wp:docPr id="1193658731" name="Picture 1"/>
+          <wp:inline distT="0" distB="0" distL="0" distR="0" wp14:anchorId="4DA4BAFD" wp14:editId="38224A87">
+            <wp:extent cx="5537200" cy="3524250"/>
+            <wp:effectExtent l="0" t="0" r="6350" b="0"/>
+            <wp:docPr id="1288343704" name="Picture 3"/>
             <wp:cNvGraphicFramePr>
               <a:graphicFrameLocks xmlns:a="http://schemas.openxmlformats.org/drawingml/2006/main" noChangeAspect="1"/>
             </wp:cNvGraphicFramePr>
@@ -16918,11 +16847,11 @@
               <a:graphicData uri="http://schemas.openxmlformats.org/drawingml/2006/picture">
                 <pic:pic xmlns:pic="http://schemas.openxmlformats.org/drawingml/2006/picture">
                   <pic:nvPicPr>
-                    <pic:cNvPr id="703376633" name="Picture 703376633"/>
+                    <pic:cNvPr id="1288343704" name="Picture 1288343704"/>
                     <pic:cNvPicPr/>
                   </pic:nvPicPr>
                   <pic:blipFill>
-                    <a:blip r:embed="rId15" cstate="print">
+                    <a:blip r:embed="rId15">
                       <a:extLst>
                         <a:ext uri="{28A0092B-C50C-407E-A947-70E740481C1C}">
                           <a14:useLocalDpi xmlns:a14="http://schemas.microsoft.com/office/drawing/2010/main" val="0"/>
@@ -16936,16 +16865,11 @@
                   <pic:spPr>
                     <a:xfrm>
                       <a:off x="0" y="0"/>
-                      <a:ext cx="4171672" cy="2245336"/>
+                      <a:ext cx="5537200" cy="3524250"/>
                     </a:xfrm>
                     <a:prstGeom prst="rect">
                       <a:avLst/>
                     </a:prstGeom>
-                    <a:ln w="3175">
-                      <a:solidFill>
-                        <a:schemeClr val="tx1"/>
-                      </a:solidFill>
-                    </a:ln>
                   </pic:spPr>
                 </pic:pic>
               </a:graphicData>
@@ -16967,6 +16891,7 @@
           <w:lang w:val="vi-VN"/>
         </w:rPr>
       </w:pPr>
+      <w:bookmarkStart w:id="45" w:name="_Toc242972291"/>
       <w:r>
         <w:rPr>
           <w:i w:val="0"/>
@@ -17132,10 +17057,14 @@
         </w:rPr>
         <w:t>1.3</w:t>
       </w:r>
+      <w:bookmarkEnd w:id="45"/>
     </w:p>
     <w:p>
       <w:pPr>
         <w:pStyle w:val="nd"/>
+        <w:rPr>
+          <w:lang w:val="vi-VN"/>
+        </w:rPr>
       </w:pPr>
       <w:r>
         <w:t xml:space="preserve">- </w:t>
@@ -17167,26 +17096,29 @@
         <w:pStyle w:val="nd"/>
       </w:pPr>
       <w:r>
-        <w:t>- Mô tả: Sơ đồ mô tả quy trình đặt hàng của khách hàng, bao gồm đăng ký/đăng nhập, quản lý giỏ hàng, đặt hàng và quản lý đơn hàng. Khách hàng có thể thêm, sửa, xóa sản phẩm trong giỏ hàng, xác nhận đơn hàng và xem thông tin đơn hàng. Quản trị viên/Nhân viên tiếp nhận, xác nhận đơn hàng và cập nhật trạng thái đơn hàng để theo dõi quá trình xử lý.</w:t>
-      </w:r>
-    </w:p>
-    <w:p>
-      <w:pPr>
-        <w:pStyle w:val="nd"/>
-        <w:keepNext/>
-        <w:ind w:firstLine="576"/>
+        <w:t xml:space="preserve">- </w:t>
+      </w:r>
+      <w:r>
+        <w:t xml:space="preserve">Mô tả: </w:t>
+      </w:r>
+      <w:r>
+        <w:t xml:space="preserve">Quản lý vận chuyển bao gồm ba tiến trình. Tiến trình 1.4.1 – Tiếp nhận thông tin vận chuyển tiếp nhận thông tin giao hàng và trạng thái vận chuyển từ đơn vị vận chuyển. Tiến trình 1.4.2 – Cập nhật trạng thái vận chuyển xử lý thông tin giao hàng, cập nhật trạng thái. Tiến trình 1.4.3 – Lưu trữ vận chuyển lưu thông tin vận chuyển đã cập nhật vào kho D4 – Vận chuyển và trả kết quả cập nhật cho người </w:t>
+      </w:r>
+      <w:r>
+        <w:lastRenderedPageBreak/>
+        <w:t>quản lý. Tiến trình giúp hệ thống theo dõi tình trạng giao hàng và hỗ trợ kiểm soát quá trình vận chuyển đơn hàng.</w:t>
+      </w:r>
+    </w:p>
+    <w:p>
+      <w:pPr>
         <w:jc w:val="center"/>
       </w:pPr>
       <w:r>
-        <w:rPr>
-          <w:noProof/>
-          <w:lang w:val="vi-VN"/>
-        </w:rPr>
         <w:drawing>
-          <wp:inline distT="0" distB="0" distL="0" distR="0" wp14:anchorId="6DFDE69D" wp14:editId="40850C9F">
-            <wp:extent cx="4246825" cy="2260172"/>
-            <wp:effectExtent l="19050" t="19050" r="20955" b="26035"/>
-            <wp:docPr id="1888972373" name="Picture 2"/>
+          <wp:inline distT="0" distB="0" distL="0" distR="0" wp14:anchorId="79652E41" wp14:editId="3143AD95">
+            <wp:extent cx="5213350" cy="2565400"/>
+            <wp:effectExtent l="0" t="0" r="6350" b="6350"/>
+            <wp:docPr id="271972541" name="Picture 6"/>
             <wp:cNvGraphicFramePr>
               <a:graphicFrameLocks xmlns:a="http://schemas.openxmlformats.org/drawingml/2006/main" noChangeAspect="1"/>
             </wp:cNvGraphicFramePr>
@@ -17194,11 +17126,11 @@
               <a:graphicData uri="http://schemas.openxmlformats.org/drawingml/2006/picture">
                 <pic:pic xmlns:pic="http://schemas.openxmlformats.org/drawingml/2006/picture">
                   <pic:nvPicPr>
-                    <pic:cNvPr id="694294369" name="Picture 694294369"/>
+                    <pic:cNvPr id="271972541" name="Picture 271972541"/>
                     <pic:cNvPicPr/>
                   </pic:nvPicPr>
                   <pic:blipFill>
-                    <a:blip r:embed="rId16" cstate="print">
+                    <a:blip r:embed="rId16">
                       <a:extLst>
                         <a:ext uri="{28A0092B-C50C-407E-A947-70E740481C1C}">
                           <a14:useLocalDpi xmlns:a14="http://schemas.microsoft.com/office/drawing/2010/main" val="0"/>
@@ -17212,16 +17144,11 @@
                   <pic:spPr>
                     <a:xfrm>
                       <a:off x="0" y="0"/>
-                      <a:ext cx="4257100" cy="2265641"/>
+                      <a:ext cx="5213350" cy="2565400"/>
                     </a:xfrm>
                     <a:prstGeom prst="rect">
                       <a:avLst/>
                     </a:prstGeom>
-                    <a:ln w="3175">
-                      <a:solidFill>
-                        <a:schemeClr val="tx1"/>
-                      </a:solidFill>
-                    </a:ln>
                   </pic:spPr>
                 </pic:pic>
               </a:graphicData>
@@ -17243,6 +17170,7 @@
           <w:lang w:val="vi-VN"/>
         </w:rPr>
       </w:pPr>
+      <w:bookmarkStart w:id="46" w:name="_Toc242972292"/>
       <w:r>
         <w:rPr>
           <w:i w:val="0"/>
@@ -17418,6 +17346,7 @@
         </w:rPr>
         <w:t>DFD mức 1.4</w:t>
       </w:r>
+      <w:bookmarkEnd w:id="46"/>
     </w:p>
     <w:p>
       <w:pPr>
@@ -17450,29 +17379,31 @@
         <w:t xml:space="preserve">- Mô tả: </w:t>
       </w:r>
       <w:r>
-        <w:t xml:space="preserve">Quản trị viên/Nhân viên có thể thống kê sản phẩm, thống kê đơn hàng và doanh thu dựa trên dữ liệu sản phẩm, đơn hàng và khách hàng. Hệ thống tổng hợp </w:t>
-      </w:r>
-      <w:r>
-        <w:lastRenderedPageBreak/>
-        <w:t>kết quả thống kê, cho phép lựa chọn tiêu chí và định dạng báo cáo, sau đó xuất báo cáo phục vụ công tác quản lý.</w:t>
-      </w:r>
-    </w:p>
-    <w:p>
-      <w:pPr>
-        <w:pStyle w:val="nd"/>
-        <w:keepNext/>
+        <w:t>T</w:t>
+      </w:r>
+      <w:r>
+        <w:t>hống kê và báo cáo gồm ba tiến trình. Tiến trình 1.5.1 – Thu thập dữ liệu tiếp nhận yêu cầu thống kê từ quản trị viên hoặc nhân viên, sau đó thu thập dữ liệu liên quan từ các kho dữ liệu của hệ thống. Tiến trình 1.5.2 – Tổng hợp và xử lý số liệu thực hiện tổng hợp, phân loại và tính toán dữ liệu sản phẩm, đơn hàng và vận chuyển để tạo ra các số liệu phục vụ công tác quản lý. Tiến trình 1.5.3 – Lập báo cáo sử dụng kết quả tổng hợp để lập báo cáo và cung cấp cho quản trị</w:t>
+      </w:r>
+      <w:r>
+        <w:rPr>
+          <w:lang w:val="vi-VN"/>
+        </w:rPr>
+        <w:t xml:space="preserve"> viên</w:t>
+      </w:r>
+      <w:r>
+        <w:t xml:space="preserve">. </w:t>
+      </w:r>
+    </w:p>
+    <w:p>
+      <w:pPr>
         <w:jc w:val="center"/>
       </w:pPr>
       <w:r>
-        <w:rPr>
-          <w:noProof/>
-          <w:lang w:val="vi-VN"/>
-        </w:rPr>
         <w:drawing>
-          <wp:inline distT="0" distB="0" distL="0" distR="0" wp14:anchorId="4B4205B4" wp14:editId="3EE1B158">
-            <wp:extent cx="5149298" cy="2237144"/>
-            <wp:effectExtent l="19050" t="19050" r="13335" b="10795"/>
-            <wp:docPr id="610037514" name="Picture 1"/>
+          <wp:inline distT="0" distB="0" distL="0" distR="0" wp14:anchorId="4B58F165" wp14:editId="409AD3DE">
+            <wp:extent cx="5391150" cy="2324100"/>
+            <wp:effectExtent l="0" t="0" r="0" b="0"/>
+            <wp:docPr id="1182697551" name="Picture 7"/>
             <wp:cNvGraphicFramePr>
               <a:graphicFrameLocks xmlns:a="http://schemas.openxmlformats.org/drawingml/2006/main" noChangeAspect="1"/>
             </wp:cNvGraphicFramePr>
@@ -17480,7 +17411,7 @@
               <a:graphicData uri="http://schemas.openxmlformats.org/drawingml/2006/picture">
                 <pic:pic xmlns:pic="http://schemas.openxmlformats.org/drawingml/2006/picture">
                   <pic:nvPicPr>
-                    <pic:cNvPr id="649055822" name="Picture 649055822"/>
+                    <pic:cNvPr id="1182697551" name="Picture 1182697551"/>
                     <pic:cNvPicPr/>
                   </pic:nvPicPr>
                   <pic:blipFill>
@@ -17498,16 +17429,11 @@
                   <pic:spPr>
                     <a:xfrm>
                       <a:off x="0" y="0"/>
-                      <a:ext cx="5151770" cy="2238218"/>
+                      <a:ext cx="5391150" cy="2324100"/>
                     </a:xfrm>
                     <a:prstGeom prst="rect">
                       <a:avLst/>
                     </a:prstGeom>
-                    <a:ln w="3175">
-                      <a:solidFill>
-                        <a:schemeClr val="tx1"/>
-                      </a:solidFill>
-                    </a:ln>
                   </pic:spPr>
                 </pic:pic>
               </a:graphicData>
@@ -17529,6 +17455,7 @@
           <w:lang w:val="vi-VN"/>
         </w:rPr>
       </w:pPr>
+      <w:bookmarkStart w:id="47" w:name="_Toc242972293"/>
       <w:r>
         <w:rPr>
           <w:i w:val="0"/>
@@ -17694,6 +17621,7 @@
         </w:rPr>
         <w:t>1.5</w:t>
       </w:r>
+      <w:bookmarkEnd w:id="47"/>
     </w:p>
     <w:p>
       <w:pPr>
@@ -17711,6 +17639,7 @@
         </w:rPr>
       </w:pPr>
       <w:r>
+        <w:lastRenderedPageBreak/>
         <w:t xml:space="preserve">Thiết kế giao diện </w:t>
       </w:r>
     </w:p>
@@ -17730,6 +17659,7 @@
     </w:p>
     <w:p>
       <w:pPr>
+        <w:jc w:val="center"/>
         <w:rPr>
           <w:lang w:val="vi-VN"/>
         </w:rPr>
@@ -17795,8 +17725,8 @@
           <w:lang w:val="vi-VN"/>
         </w:rPr>
       </w:pPr>
-      <w:bookmarkStart w:id="40" w:name="_Toc242546995"/>
-      <w:bookmarkStart w:id="41" w:name="_Toc242724020"/>
+      <w:bookmarkStart w:id="48" w:name="_Toc242546995"/>
+      <w:bookmarkStart w:id="49" w:name="_Toc242972294"/>
       <w:r>
         <w:rPr>
           <w:i w:val="0"/>
@@ -17930,8 +17860,8 @@
         </w:rPr>
         <w:t xml:space="preserve"> Sơ đồ website</w:t>
       </w:r>
-      <w:bookmarkEnd w:id="40"/>
-      <w:bookmarkEnd w:id="41"/>
+      <w:bookmarkEnd w:id="48"/>
+      <w:bookmarkEnd w:id="49"/>
     </w:p>
     <w:p>
       <w:pPr>
@@ -17944,7 +17874,6 @@
         <w:rPr>
           <w:lang w:val="vi-VN"/>
         </w:rPr>
-        <w:lastRenderedPageBreak/>
         <w:t>Giao diện trang chủ</w:t>
       </w:r>
     </w:p>
@@ -17995,8 +17924,9 @@
         <w:rPr>
           <w:noProof/>
         </w:rPr>
+        <w:lastRenderedPageBreak/>
         <w:drawing>
-          <wp:inline distT="0" distB="0" distL="0" distR="0" wp14:anchorId="24440EFF" wp14:editId="585E4B47">
+          <wp:inline distT="0" distB="0" distL="0" distR="0" wp14:anchorId="24440EFF" wp14:editId="61D7CF76">
             <wp:extent cx="5580380" cy="6107430"/>
             <wp:effectExtent l="19050" t="19050" r="20320" b="26670"/>
             <wp:docPr id="325028545" name="Picture 2"/>
@@ -18056,8 +17986,8 @@
           <w:lang w:val="vi-VN"/>
         </w:rPr>
       </w:pPr>
-      <w:bookmarkStart w:id="42" w:name="_Toc242546996"/>
-      <w:bookmarkStart w:id="43" w:name="_Toc242724021"/>
+      <w:bookmarkStart w:id="50" w:name="_Toc242546996"/>
+      <w:bookmarkStart w:id="51" w:name="_Toc242972295"/>
       <w:r>
         <w:rPr>
           <w:i w:val="0"/>
@@ -18191,8 +18121,8 @@
         </w:rPr>
         <w:t xml:space="preserve"> Giao diện trang chủ</w:t>
       </w:r>
-      <w:bookmarkEnd w:id="42"/>
-      <w:bookmarkEnd w:id="43"/>
+      <w:bookmarkEnd w:id="50"/>
+      <w:bookmarkEnd w:id="51"/>
     </w:p>
     <w:p>
       <w:pPr>
@@ -18246,11 +18176,7 @@
         <w:t xml:space="preserve"> trị</w:t>
       </w:r>
       <w:r>
-        <w:t xml:space="preserve"> của hệ thống quản lý bán hàng gồm thanh điều hướng các chức năng như Home, Danh mục, Sản phẩm, Giỏ hàng, Người giao hàng </w:t>
-      </w:r>
-      <w:r>
-        <w:lastRenderedPageBreak/>
-        <w:t xml:space="preserve">và Khách hàng. Khu vực nội dung hiển thị thông tin quản lý tương ứng, hỗ trợ thêm, xem và thao tác với dữ </w:t>
+        <w:t xml:space="preserve"> của hệ thống quản lý bán hàng gồm thanh điều hướng các chức năng như Home, Danh mục, Sản phẩm, Giỏ hàng, Người giao hàng và Khách hàng. Khu vực nội dung hiển thị thông tin quản lý tương ứng, hỗ trợ thêm, xem và thao tác với dữ </w:t>
       </w:r>
       <w:r>
         <w:t>liệu</w:t>
@@ -18271,8 +18197,9 @@
         <w:rPr>
           <w:noProof/>
         </w:rPr>
+        <w:lastRenderedPageBreak/>
         <w:drawing>
-          <wp:inline distT="0" distB="0" distL="0" distR="0" wp14:anchorId="6D169D41" wp14:editId="7F96D45F">
+          <wp:inline distT="0" distB="0" distL="0" distR="0" wp14:anchorId="6D169D41" wp14:editId="0DF74326">
             <wp:extent cx="5580380" cy="6107430"/>
             <wp:effectExtent l="19050" t="19050" r="20320" b="26670"/>
             <wp:docPr id="1452594711" name="Picture 5"/>
@@ -18332,8 +18259,8 @@
           <w:lang w:val="vi-VN"/>
         </w:rPr>
       </w:pPr>
-      <w:bookmarkStart w:id="44" w:name="_Toc242546997"/>
-      <w:bookmarkStart w:id="45" w:name="_Toc242724022"/>
+      <w:bookmarkStart w:id="52" w:name="_Toc242546997"/>
+      <w:bookmarkStart w:id="53" w:name="_Toc242972296"/>
       <w:r>
         <w:rPr>
           <w:i w:val="0"/>
@@ -18467,8 +18394,8 @@
         </w:rPr>
         <w:t xml:space="preserve"> Giao diện trang quản trị</w:t>
       </w:r>
-      <w:bookmarkEnd w:id="44"/>
-      <w:bookmarkEnd w:id="45"/>
+      <w:bookmarkEnd w:id="52"/>
+      <w:bookmarkEnd w:id="53"/>
     </w:p>
     <w:p>
       <w:pPr>
@@ -18507,11 +18434,11 @@
         <w:t xml:space="preserve"> </w:t>
       </w:r>
       <w:r>
-        <w:t xml:space="preserve">Giao diện đăng nhập và đăng ký cho phép khách hàng truy cập hệ thống bằng tài khoản cá nhân. Trang đăng nhập gồm hai trường nhập liệu là Email và Mật khẩu, cùng nút “Đăng nhập” để gửi thông tin xác thực; khi thông tin hợp lệ, hệ thống tạo phiên làm việc (session) và chuyển khách hàng về trang sản phẩm. Trang đăng ký dành cho khách hàng chưa có tài khoản, gồm các trường Họ và tên, Số điện thoại, </w:t>
+        <w:t xml:space="preserve">Giao diện đăng nhập và đăng ký cho phép khách hàng truy cập hệ thống bằng tài khoản cá nhân. Trang đăng nhập gồm hai trường nhập liệu là Email và Mật khẩu, cùng nút “Đăng nhập” để gửi thông tin xác thực; khi thông tin hợp lệ, hệ thống tạo phiên làm việc (session) và chuyển khách hàng về trang sản phẩm. Trang đăng ký dành cho khách hàng chưa có tài khoản, gồm các trường Họ và tên, Số điện thoại, Email, Mật khẩu và Xác nhận mật khẩu, cùng nút “Đăng ký” để hoàn tất việc tạo tài khoản. Hệ thống kiểm tra tính hợp lệ của dữ liệu nhập vào, như các trường không được để trống, email đúng định dạng và không trùng với tài khoản đã có, mật khẩu </w:t>
       </w:r>
       <w:r>
         <w:lastRenderedPageBreak/>
-        <w:t>Email, Mật khẩu và Xác nhận mật khẩu, cùng nút “Đăng ký” để hoàn tất việc tạo tài khoản. Hệ thống kiểm tra tính hợp lệ của dữ liệu nhập vào, như các trường không được để trống, email đúng định dạng và không trùng với tài khoản đã có, mật khẩu xác nhận phải trùng khớp với mật khẩu đã nhập. Mật khẩu được mã hóa trước khi lưu vào cơ sở dữ liệu (trường PasswordHash) để đảm bảo an toàn.</w:t>
+        <w:t>xác nhận phải trùng khớp với mật khẩu đã nhập. Mật khẩu được mã hóa trước khi lưu vào cơ sở dữ liệu (trường PasswordHash) để đảm bảo an toàn.</w:t>
       </w:r>
     </w:p>
     <w:p>
@@ -18524,7 +18451,7 @@
           <w:noProof/>
         </w:rPr>
         <w:drawing>
-          <wp:inline distT="0" distB="0" distL="0" distR="0" wp14:anchorId="6914A94E" wp14:editId="49B3537E">
+          <wp:inline distT="0" distB="0" distL="0" distR="0" wp14:anchorId="6914A94E" wp14:editId="5199A261">
             <wp:extent cx="5580380" cy="3137535"/>
             <wp:effectExtent l="0" t="0" r="1270" b="5715"/>
             <wp:docPr id="2050384003" name="Picture 4"/>
@@ -18579,8 +18506,8 @@
           <w:lang w:val="vi-VN"/>
         </w:rPr>
       </w:pPr>
-      <w:bookmarkStart w:id="46" w:name="_Toc242546998"/>
-      <w:bookmarkStart w:id="47" w:name="_Toc242724023"/>
+      <w:bookmarkStart w:id="54" w:name="_Toc242546998"/>
+      <w:bookmarkStart w:id="55" w:name="_Toc242972297"/>
       <w:r>
         <w:rPr>
           <w:i w:val="0"/>
@@ -18714,8 +18641,8 @@
         </w:rPr>
         <w:t xml:space="preserve"> Giao diện trang đăng nhập và đăng ký</w:t>
       </w:r>
-      <w:bookmarkEnd w:id="46"/>
-      <w:bookmarkEnd w:id="47"/>
+      <w:bookmarkEnd w:id="54"/>
+      <w:bookmarkEnd w:id="55"/>
     </w:p>
     <w:p>
       <w:pPr>
@@ -18765,7 +18692,7 @@
         </w:rPr>
         <w:lastRenderedPageBreak/>
         <w:drawing>
-          <wp:inline distT="0" distB="0" distL="0" distR="0" wp14:anchorId="10605CAD" wp14:editId="4CD95C36">
+          <wp:inline distT="0" distB="0" distL="0" distR="0" wp14:anchorId="10605CAD" wp14:editId="5645DF70">
             <wp:extent cx="5580380" cy="6107430"/>
             <wp:effectExtent l="19050" t="19050" r="20320" b="26670"/>
             <wp:docPr id="735307609" name="Picture 6"/>
@@ -18825,8 +18752,8 @@
           <w:lang w:val="vi-VN"/>
         </w:rPr>
       </w:pPr>
-      <w:bookmarkStart w:id="48" w:name="_Toc242546999"/>
-      <w:bookmarkStart w:id="49" w:name="_Toc242724024"/>
+      <w:bookmarkStart w:id="56" w:name="_Toc242546999"/>
+      <w:bookmarkStart w:id="57" w:name="_Toc242972298"/>
       <w:r>
         <w:rPr>
           <w:i w:val="0"/>
@@ -18960,8 +18887,8 @@
         </w:rPr>
         <w:t xml:space="preserve"> Giao diện trang sản phẩm</w:t>
       </w:r>
-      <w:bookmarkEnd w:id="48"/>
-      <w:bookmarkEnd w:id="49"/>
+      <w:bookmarkEnd w:id="56"/>
+      <w:bookmarkEnd w:id="57"/>
     </w:p>
     <w:p>
       <w:pPr>
@@ -19008,7 +18935,7 @@
           <w:noProof/>
         </w:rPr>
         <w:drawing>
-          <wp:inline distT="0" distB="0" distL="0" distR="0" wp14:anchorId="3E50603C" wp14:editId="4BD53183">
+          <wp:inline distT="0" distB="0" distL="0" distR="0" wp14:anchorId="3E50603C" wp14:editId="21DA7EF9">
             <wp:extent cx="5580380" cy="5069840"/>
             <wp:effectExtent l="19050" t="19050" r="20320" b="16510"/>
             <wp:docPr id="712871940" name="Picture 3"/>
@@ -19068,8 +18995,8 @@
           <w:lang w:val="vi-VN"/>
         </w:rPr>
       </w:pPr>
-      <w:bookmarkStart w:id="50" w:name="_Toc242547000"/>
-      <w:bookmarkStart w:id="51" w:name="_Toc242724025"/>
+      <w:bookmarkStart w:id="58" w:name="_Toc242547000"/>
+      <w:bookmarkStart w:id="59" w:name="_Toc242972299"/>
       <w:r>
         <w:rPr>
           <w:i w:val="0"/>
@@ -19203,8 +19130,8 @@
         </w:rPr>
         <w:t xml:space="preserve"> Giao diện trang chi tiết sản phẩm</w:t>
       </w:r>
-      <w:bookmarkEnd w:id="50"/>
-      <w:bookmarkEnd w:id="51"/>
+      <w:bookmarkEnd w:id="58"/>
+      <w:bookmarkEnd w:id="59"/>
     </w:p>
     <w:p>
       <w:pPr>
@@ -19220,131 +19147,137 @@
         <w:t xml:space="preserve"> kết</w:t>
       </w:r>
       <w:r>
-        <w:t xml:space="preserve"> chương</w:t>
-      </w:r>
+        <w:t xml:space="preserve"> </w:t>
+      </w:r>
+      <w:r>
+        <w:t>chương</w:t>
+      </w:r>
+    </w:p>
+    <w:p>
+      <w:pPr>
+        <w:pStyle w:val="nd"/>
+      </w:pPr>
+      <w:r>
+        <w:t>Chương 3 đã trình bày quá trình phân tích và thiết kế hệ thống quản lý sản phẩm và đơn hàng, bao gồm đặc tả yêu cầu, kiến trúc hệ thống, thiết kế dữ liệu ERD, mô hình xử lý DFD và giao diện. Hệ thống sử dụng PHP, MySQL và Docker Compose nhằm hỗ trợ quản lý tập trung các thông tin sản phẩm, nhà cung cấp, khách hàng và đơn hàng. Những kết quả đạt được là cơ sở cho quá trình xây dựng, triển khai và kiểm thử hệ thống.</w:t>
+      </w:r>
+    </w:p>
+    <w:p>
+      <w:pPr>
+        <w:rPr>
+          <w:rFonts w:eastAsiaTheme="majorEastAsia" w:cstheme="majorBidi"/>
+          <w:b/>
+          <w:sz w:val="26"/>
+          <w:szCs w:val="26"/>
+          <w:lang w:val="vi-VN"/>
+        </w:rPr>
+      </w:pPr>
     </w:p>
     <w:p>
       <w:pPr>
         <w:pStyle w:val="Heading1"/>
-        <w:numPr>
-          <w:ilvl w:val="0"/>
-          <w:numId w:val="0"/>
-        </w:numPr>
-        <w:ind w:left="432"/>
-        <w:jc w:val="left"/>
-      </w:pPr>
-      <w:r>
+        <w:rPr>
+          <w:rStyle w:val="Heading1Char"/>
+          <w:b/>
+          <w:caps/>
+          <w:lang w:val="vi-VN"/>
+        </w:rPr>
+      </w:pPr>
+      <w:r>
+        <w:rPr>
+          <w:lang w:val="vi-VN"/>
+        </w:rPr>
+        <w:t xml:space="preserve"> KẾT QUẢ NGHIÊN CỨU</w:t>
+      </w:r>
+    </w:p>
+    <w:p>
+      <w:pPr>
+        <w:pStyle w:val="Heading2"/>
+        <w:rPr>
+          <w:lang w:val="vi-VN"/>
+        </w:rPr>
+      </w:pPr>
+      <w:r>
+        <w:t>Kịch bản triển khai</w:t>
+      </w:r>
+    </w:p>
+    <w:p>
+      <w:pPr>
+        <w:rPr>
+          <w:lang w:val="vi-VN"/>
+        </w:rPr>
+      </w:pPr>
+    </w:p>
+    <w:p>
+      <w:pPr>
+        <w:pStyle w:val="nd"/>
+      </w:pPr>
+      <w:r>
+        <w:t xml:space="preserve">- Mua hàng </w:t>
+      </w:r>
+    </w:p>
+    <w:p>
+      <w:pPr>
+        <w:pStyle w:val="nd"/>
+      </w:pPr>
+      <w:r>
+        <w:t>- Quản lý sản phẩm</w:t>
+      </w:r>
+    </w:p>
+    <w:p>
+      <w:pPr>
+        <w:pStyle w:val="nd"/>
+      </w:pPr>
+      <w:r>
+        <w:t xml:space="preserve">- Theo quy trình cụ thể </w:t>
+      </w:r>
+    </w:p>
+    <w:p>
+      <w:pPr>
+        <w:pStyle w:val="Heading2"/>
+      </w:pPr>
+    </w:p>
+    <w:p>
+      <w:pPr>
+        <w:pStyle w:val="Heading2"/>
+      </w:pPr>
+      <w:r>
+        <w:t xml:space="preserve">Kết quả </w:t>
+      </w:r>
+    </w:p>
+    <w:p>
+      <w:pPr>
+        <w:pStyle w:val="Heading2"/>
+      </w:pPr>
+      <w:r>
+        <w:t>Các giao diện</w:t>
+      </w:r>
+    </w:p>
+    <w:p>
+      <w:pPr>
+        <w:rPr>
+          <w:lang w:val="vi-VN"/>
+        </w:rPr>
+      </w:pPr>
+    </w:p>
+    <w:p>
+      <w:pPr>
+        <w:rPr>
+          <w:lang w:val="vi-VN"/>
+        </w:rPr>
+      </w:pPr>
+      <w:r>
+        <w:rPr>
+          <w:lang w:val="vi-VN"/>
+        </w:rPr>
         <w:br w:type="page"/>
       </w:r>
-      <w:r>
-        <w:rPr>
-          <w:lang w:val="vi-VN"/>
-        </w:rPr>
-        <w:lastRenderedPageBreak/>
-        <w:t>KẾT QUẢ NGHIÊN CỨU</w:t>
-      </w:r>
-    </w:p>
-    <w:p>
-      <w:pPr>
-        <w:pStyle w:val="Heading2"/>
-        <w:rPr>
-          <w:lang w:val="vi-VN"/>
-        </w:rPr>
-      </w:pPr>
-      <w:r>
-        <w:rPr>
-          <w:lang w:val="vi-VN"/>
-        </w:rPr>
-        <w:t>Kịch bản triển khai</w:t>
-      </w:r>
-    </w:p>
-    <w:p>
-      <w:pPr>
-        <w:rPr>
-          <w:lang w:val="vi-VN"/>
-        </w:rPr>
-      </w:pPr>
-      <w:r>
-        <w:rPr>
-          <w:lang w:val="vi-VN"/>
-        </w:rPr>
-        <w:t xml:space="preserve">- Mua hàng </w:t>
-      </w:r>
-    </w:p>
-    <w:p>
-      <w:pPr>
-        <w:rPr>
-          <w:lang w:val="vi-VN"/>
-        </w:rPr>
-      </w:pPr>
-      <w:r>
-        <w:rPr>
-          <w:lang w:val="vi-VN"/>
-        </w:rPr>
-        <w:t>- Quản lý sản phẩm</w:t>
-      </w:r>
-    </w:p>
-    <w:p>
-      <w:pPr>
-        <w:rPr>
-          <w:lang w:val="vi-VN"/>
-        </w:rPr>
-      </w:pPr>
-      <w:r>
-        <w:rPr>
-          <w:lang w:val="vi-VN"/>
-        </w:rPr>
-        <w:t xml:space="preserve">- Theo quy trình cụ thể </w:t>
-      </w:r>
-    </w:p>
-    <w:p>
-      <w:pPr>
-        <w:rPr>
-          <w:lang w:val="vi-VN"/>
-        </w:rPr>
-      </w:pPr>
-    </w:p>
-    <w:p>
-      <w:pPr>
-        <w:pStyle w:val="Heading2"/>
-        <w:rPr>
-          <w:lang w:val="vi-VN"/>
-        </w:rPr>
-      </w:pPr>
-      <w:r>
-        <w:rPr>
-          <w:lang w:val="vi-VN"/>
-        </w:rPr>
-        <w:t xml:space="preserve">Kết quả </w:t>
-      </w:r>
-    </w:p>
-    <w:p>
-      <w:pPr>
-        <w:rPr>
-          <w:lang w:val="vi-VN"/>
-        </w:rPr>
-      </w:pPr>
-      <w:r>
-        <w:rPr>
-          <w:lang w:val="vi-VN"/>
-        </w:rPr>
-        <w:t>Các giao diện</w:t>
-      </w:r>
-    </w:p>
-    <w:p>
-      <w:pPr>
-        <w:rPr>
-          <w:lang w:val="vi-VN"/>
-        </w:rPr>
-      </w:pPr>
-    </w:p>
-    <w:p>
-      <w:r>
-        <w:rPr>
-          <w:lang w:val="vi-VN"/>
-        </w:rPr>
-        <w:br w:type="page"/>
-      </w:r>
+    </w:p>
+    <w:p>
+      <w:pPr>
+        <w:rPr>
+          <w:lang w:val="vi-VN"/>
+        </w:rPr>
+      </w:pPr>
     </w:p>
     <w:p>
       <w:pPr>
@@ -19358,7 +19291,6 @@
           <w:caps w:val="0"/>
           <w:lang w:val="vi-VN"/>
         </w:rPr>
-        <w:lastRenderedPageBreak/>
         <w:t>KẾT LUẬN VÀ HƯỚNG PHÁT TRIỂN</w:t>
       </w:r>
     </w:p>
@@ -21483,6 +21415,15 @@
       <w:shd w:val="clear" w:color="auto" w:fill="E1DFDD"/>
     </w:rPr>
   </w:style>
+  <w:style w:type="paragraph" w:styleId="NoSpacing">
+    <w:name w:val="No Spacing"/>
+    <w:uiPriority w:val="1"/>
+    <w:qFormat/>
+    <w:rsid w:val="00BC14AC"/>
+    <w:pPr>
+      <w:spacing w:after="0" w:line="240" w:lineRule="auto"/>
+    </w:pPr>
+  </w:style>
 </w:styles>
 </file>
 

</xml_diff>

<commit_message>
Hoàn thành chương 2
</commit_message>
<xml_diff>
--- a/thesis/qt_baocao_110123058_huynhlengoctrinh_110123058_da23ttb.docx
+++ b/thesis/qt_baocao_110123058_huynhlengoctrinh_110123058_da23ttb.docx
@@ -6394,7 +6394,13 @@
         <w:t xml:space="preserve">- </w:t>
       </w:r>
       <w:r>
-        <w:t>Ngôn ngữ thiết kế giao diện website: HTML5, CSS và Bootstrap framework.</w:t>
+        <w:t xml:space="preserve">Ngôn ngữ thiết kế giao diện website: HTML5, CSS và </w:t>
+      </w:r>
+      <w:r>
+        <w:t>Bootstrap5</w:t>
+      </w:r>
+      <w:r>
+        <w:t>.</w:t>
       </w:r>
     </w:p>
     <w:p>
@@ -6501,7 +6507,13 @@
         <w:t xml:space="preserve">- </w:t>
       </w:r>
       <w:r>
-        <w:t>Thiết kế giao diện website: Xây dựng giao diện quản trị hiện đại, bố cục hợp lý, dễ sử dụng và thuận tiện cho việc quản lý thông tin bằng HTML5, CSS và Bootstrap. Các giao diện</w:t>
+        <w:t xml:space="preserve">Thiết kế giao diện website: Xây dựng giao diện quản trị hiện đại, bố cục hợp lý, dễ sử dụng và thuận tiện cho việc quản lý thông tin bằng HTML5, CSS và </w:t>
+      </w:r>
+      <w:r>
+        <w:t>Bootstrap5</w:t>
+      </w:r>
+      <w:r>
+        <w:t>. Các giao diện</w:t>
       </w:r>
       <w:r>
         <w:rPr>
@@ -6659,7 +6671,13 @@
         <w:t xml:space="preserve">- </w:t>
       </w:r>
       <w:r>
-        <w:t xml:space="preserve">Ôn tập và vận dụng kiến thức về HTML5, CSS3, Bootstrap để xây dựng giao diện </w:t>
+        <w:t xml:space="preserve">Ôn tập và vận dụng kiến thức về HTML5, CSS3, </w:t>
+      </w:r>
+      <w:r>
+        <w:t>Bootstrap5</w:t>
+      </w:r>
+      <w:r>
+        <w:t xml:space="preserve"> để xây dựng giao diện </w:t>
       </w:r>
       <w:r>
         <w:t>website</w:t>
@@ -6736,7 +6754,13 @@
         <w:t xml:space="preserve">- </w:t>
       </w:r>
       <w:r>
-        <w:t xml:space="preserve">Sử dụng HTML5, CSS3, JavaScript, Bootstrap, PHP và MySQL để xây dựng website quản lý sản phẩm và đơn hàng. </w:t>
+        <w:t xml:space="preserve">Sử dụng HTML5, CSS3, JavaScript, </w:t>
+      </w:r>
+      <w:r>
+        <w:t>Bootstrap5</w:t>
+      </w:r>
+      <w:r>
+        <w:t xml:space="preserve">, PHP và MySQL để xây dựng website quản lý sản phẩm và đơn hàng. </w:t>
       </w:r>
     </w:p>
     <w:p>
@@ -6846,45 +6870,137 @@
     </w:p>
     <w:p>
       <w:pPr>
+        <w:pStyle w:val="Heading3"/>
+        <w:rPr>
+          <w:lang w:val="vi-VN"/>
+        </w:rPr>
+      </w:pPr>
+      <w:r>
+        <w:rPr>
+          <w:lang w:val="vi-VN"/>
+        </w:rPr>
+        <w:t>Nội dung nghiên cứu</w:t>
+      </w:r>
+    </w:p>
+    <w:p>
+      <w:pPr>
         <w:pStyle w:val="nd"/>
-        <w:rPr>
-          <w:lang w:val="vi-VN"/>
-        </w:rPr>
-      </w:pPr>
-      <w:r>
-        <w:rPr>
-          <w:lang w:val="vi-VN"/>
-        </w:rPr>
-        <w:t>Nội dung nghiên cứu</w:t>
+      </w:pPr>
+      <w:r>
+        <w:t>- Nghiên cứu cơ sở lý thuyết: Tìm hiểu các kiến thức về thiết kế và xây dựng ứng dụng web, ngôn ngữ HTML, CSS, JavaScript, PHP và SQL, cũng như cách tổ chức và quản lý dữ liệu bằng hệ quản trị cơ sở dữ liệu MySQL.</w:t>
       </w:r>
     </w:p>
     <w:p>
       <w:pPr>
         <w:pStyle w:val="nd"/>
-        <w:rPr>
-          <w:lang w:val="vi-VN"/>
-        </w:rPr>
-      </w:pPr>
-      <w:r>
-        <w:rPr>
-          <w:lang w:val="vi-VN"/>
-        </w:rPr>
+      </w:pPr>
+      <w:r>
+        <w:t>- Phân tích và thiết kế hệ thống: Khảo sát quy trình quản lý sản phẩm và đơn hàng, xác định các yêu cầu chức năng, yêu cầu phi chức năng, xây dựng sơ đồ luồng dữ liệu (DFD), thiết kế cơ sở dữ liệu và xác định mối quan hệ giữa các thực thể trong hệ thống.</w:t>
+      </w:r>
+    </w:p>
+    <w:p>
+      <w:pPr>
+        <w:pStyle w:val="nd"/>
+      </w:pPr>
+      <w:r>
+        <w:t>- Xây dựng cơ sở dữ liệu: Thiết kế cơ sở dữ liệu phục vụ việc lưu trữ và quản lý danh mục sản phẩm, thông tin sản phẩm, hình ảnh sản phẩm, nhà cung cấp, khách hàng, nhân viên, đơn vị vận chuyển và đơn hàng, đảm bảo dữ liệu được tổ chức hợp lý và thuận tiện cho việc truy xuất, cập nhật.</w:t>
+      </w:r>
+    </w:p>
+    <w:p>
+      <w:pPr>
+        <w:pStyle w:val="nd"/>
+        <w:rPr>
+          <w:lang w:val="vi-VN"/>
+        </w:rPr>
+      </w:pPr>
+      <w:r>
+        <w:lastRenderedPageBreak/>
+        <w:t>- Phát triển các chức năng của hệ thống: Xây dựng giao diện đăng nhập và các chức năng quản lý như thêm, sửa, xóa, tìm kiếm và cập nhật thông tin danh mục, sản phẩm, hình ảnh, nhà cung cấp, khách hàng, nhân viên và đơn vị vận chuyển.</w:t>
+      </w:r>
+    </w:p>
+    <w:p>
+      <w:pPr>
+        <w:pStyle w:val="nd"/>
+      </w:pPr>
+      <w:r>
+        <w:t>- Xây dựng giao diện người dùng: Thiết kế giao diện trực quan, dễ sử dụng, bố trí các chức năng hợp lý, giúp người quản trị và nhân viên thuận tiện trong quá trình thao tác và quản lý dữ liệu.</w:t>
+      </w:r>
+    </w:p>
+    <w:p>
+      <w:pPr>
+        <w:pStyle w:val="nd"/>
+        <w:rPr>
+          <w:lang w:val="vi-VN"/>
+        </w:rPr>
+      </w:pPr>
+      <w:r>
+        <w:t>- Kiểm thử và đánh giá hệ thống: Kiểm tra các chức năng sau khi triển khai, đánh giá tính chính xác của dữ liệu, khả năng xử lý các thao tác quản lý và mức độ đáp ứng yêu cầu đặt ra. Từ đó, phát hiện và khắc phục lỗi nhằm nâng cao tính ổn định, bảo mật và khả năng mở rộng của hệ thống.</w:t>
+      </w:r>
+    </w:p>
+    <w:p>
+      <w:pPr>
+        <w:pStyle w:val="Heading3"/>
+        <w:rPr>
+          <w:lang w:val="vi-VN"/>
+        </w:rPr>
+      </w:pPr>
+      <w:r>
+        <w:rPr>
+          <w:lang w:val="vi-VN"/>
+        </w:rPr>
+        <w:t>Phạm vi nghiên cứu</w:t>
+      </w:r>
+    </w:p>
+    <w:p>
+      <w:pPr>
+        <w:pStyle w:val="nd"/>
+        <w:rPr>
+          <w:lang w:val="vi-VN"/>
+        </w:rPr>
+      </w:pPr>
+      <w:r>
+        <w:rPr>
+          <w:lang w:val="vi-VN"/>
+        </w:rPr>
+        <w:t>-</w:t>
+      </w:r>
+      <w:r>
+        <w:rPr>
+          <w:lang w:val="vi-VN"/>
+        </w:rPr>
+        <w:t xml:space="preserve"> Tập trung</w:t>
+      </w:r>
+      <w:r>
+        <w:rPr>
+          <w:lang w:val="vi-VN"/>
+        </w:rPr>
+        <w:t xml:space="preserve"> </w:t>
+      </w:r>
+      <w:r>
+        <w:t>x</w:t>
+      </w:r>
+      <w:r>
+        <w:t>ây dựng cơ sở dữ liệu để lưu trữ thông tin danh mục sản phẩm, sản phẩm, hình ảnh sản phẩm, nhà cung cấp, khách hàng, nhân viên, đơn vị vận chuyển và đơn hàng.</w:t>
+      </w:r>
+    </w:p>
+    <w:p>
+      <w:pPr>
+        <w:pStyle w:val="nd"/>
+        <w:rPr>
+          <w:lang w:val="vi-VN"/>
+        </w:rPr>
+      </w:pPr>
+      <w:r>
         <w:t xml:space="preserve">- </w:t>
       </w:r>
       <w:r>
-        <w:t xml:space="preserve">Xây dựng cơ sở dữ liệu quản lý danh mục sản phẩm, thông </w:t>
-      </w:r>
-      <w:r>
-        <w:t>tin</w:t>
-      </w:r>
-      <w:r>
-        <w:rPr>
-          <w:lang w:val="vi-VN"/>
-        </w:rPr>
-        <w:t xml:space="preserve"> sản phẩm,</w:t>
-      </w:r>
-      <w:r>
-        <w:t xml:space="preserve"> hình ảnh, giá bán và đơn đặt hàng.</w:t>
+        <w:t xml:space="preserve">Hệ thống hỗ trợ các chức năng quản lý như thêm, sửa, xóa, tìm kiếm và cập nhật thông </w:t>
+      </w:r>
+      <w:r>
+        <w:t xml:space="preserve">tin, </w:t>
+      </w:r>
+      <w:r>
+        <w:t>cho phép theo dõi thông tin đơn hàng trong quá trình xử lý.</w:t>
       </w:r>
     </w:p>
     <w:p>
@@ -6898,133 +7014,16 @@
         <w:rPr>
           <w:lang w:val="vi-VN"/>
         </w:rPr>
-        <w:t xml:space="preserve">- </w:t>
-      </w:r>
-      <w:r>
-        <w:t xml:space="preserve">Phát triển các chức năng cơ bản như: đăng nhập quản trị, </w:t>
-      </w:r>
-      <w:r>
-        <w:t>thêm</w:t>
-      </w:r>
-      <w:r>
-        <w:rPr>
-          <w:lang w:val="vi-VN"/>
-        </w:rPr>
-        <w:t xml:space="preserve">, </w:t>
-      </w:r>
-      <w:r>
-        <w:t>sửa</w:t>
-      </w:r>
-      <w:r>
-        <w:rPr>
-          <w:lang w:val="vi-VN"/>
-        </w:rPr>
-        <w:t xml:space="preserve">, </w:t>
-      </w:r>
-      <w:r>
-        <w:t xml:space="preserve">xóa sản phẩm, tìm kiếm </w:t>
-      </w:r>
-      <w:r>
-        <w:t>sản</w:t>
-      </w:r>
-      <w:r>
-        <w:rPr>
-          <w:lang w:val="vi-VN"/>
-        </w:rPr>
-        <w:t xml:space="preserve"> phẩm</w:t>
-      </w:r>
-      <w:r>
-        <w:t>, giỏ hàng và đặt hàng trực tuyến.</w:t>
-      </w:r>
-    </w:p>
-    <w:p>
-      <w:pPr>
-        <w:pStyle w:val="nd"/>
-        <w:rPr>
-          <w:lang w:val="vi-VN"/>
-        </w:rPr>
-      </w:pPr>
-      <w:r>
-        <w:rPr>
-          <w:lang w:val="vi-VN"/>
-        </w:rPr>
-        <w:t xml:space="preserve">- </w:t>
-      </w:r>
-      <w:r>
-        <w:t>Kiểm thử, đánh giá và hoàn thiện website để đảm bảo hoạt động ổn định,</w:t>
-      </w:r>
-      <w:r>
-        <w:rPr>
-          <w:lang w:val="vi-VN"/>
+        <w:t>-</w:t>
+      </w:r>
+      <w:r>
+        <w:rPr>
+          <w:sz w:val="28"/>
         </w:rPr>
         <w:t xml:space="preserve"> </w:t>
       </w:r>
       <w:r>
-        <w:t>có thể mở rộng trong tương lai.</w:t>
-      </w:r>
-    </w:p>
-    <w:p>
-      <w:pPr>
-        <w:pStyle w:val="nd"/>
-        <w:rPr>
-          <w:lang w:val="vi-VN"/>
-        </w:rPr>
-      </w:pPr>
-      <w:r>
-        <w:rPr>
-          <w:lang w:val="vi-VN"/>
-        </w:rPr>
-        <w:t>Phạm vi nghiên cứu</w:t>
-      </w:r>
-    </w:p>
-    <w:p>
-      <w:pPr>
-        <w:pStyle w:val="nd"/>
-        <w:rPr>
-          <w:lang w:val="vi-VN"/>
-        </w:rPr>
-      </w:pPr>
-      <w:r>
-        <w:rPr>
-          <w:lang w:val="vi-VN"/>
-        </w:rPr>
-        <w:t xml:space="preserve">- </w:t>
-      </w:r>
-      <w:r>
-        <w:t>X</w:t>
-      </w:r>
-      <w:r>
-        <w:t>ây dựng cơ sở dữ liệu để lưu trữ thông tin danh mục sản phẩm, sản phẩm, hình ảnh sản phẩm, nhà cung cấp, khách hàng, nhân viên, đơn vị vận chuyển và đơn hàng.</w:t>
-      </w:r>
-    </w:p>
-    <w:p>
-      <w:pPr>
-        <w:pStyle w:val="nd"/>
-        <w:rPr>
-          <w:lang w:val="vi-VN"/>
-        </w:rPr>
-      </w:pPr>
-      <w:r>
-        <w:rPr>
-          <w:lang w:val="vi-VN"/>
-        </w:rPr>
-        <w:lastRenderedPageBreak/>
-        <w:t xml:space="preserve">- </w:t>
-      </w:r>
-      <w:r>
-        <w:t xml:space="preserve">Hệ thống hỗ trợ các chức năng quản lý như thêm, sửa, xóa, tìm kiếm và cập nhật thông </w:t>
-      </w:r>
-      <w:r>
-        <w:t>tin</w:t>
-      </w:r>
-      <w:r>
-        <w:rPr>
-          <w:lang w:val="vi-VN"/>
-        </w:rPr>
-        <w:t xml:space="preserve">, </w:t>
-      </w:r>
-      <w:r>
-        <w:t xml:space="preserve">cho phép theo dõi thông tin đơn hàng trong quá trình xử lý. </w:t>
+        <w:t>Hỗ trợ lưu trữ thông tin đơn hàng, tra cứu thông tin khách hàng liên quan, quản lý các sản phẩm thuộc đơn hàng và theo dõi trạng thái xử lý trong quá trình tiếp nhận, xử lý và vận chuyển.</w:t>
       </w:r>
     </w:p>
     <w:p>
@@ -7306,9 +7305,6 @@
     <w:p>
       <w:pPr>
         <w:pStyle w:val="Heading3"/>
-        <w:rPr>
-          <w:lang w:val="vi-VN"/>
-        </w:rPr>
       </w:pPr>
       <w:bookmarkStart w:id="6" w:name="_Toc243310695"/>
       <w:r>
@@ -7318,6 +7314,222 @@
         <w:t>Công nghệ sử dụng</w:t>
       </w:r>
       <w:bookmarkEnd w:id="6"/>
+    </w:p>
+    <w:p>
+      <w:pPr>
+        <w:pStyle w:val="Heading4"/>
+        <w:rPr>
+          <w:lang w:val="vi-VN"/>
+        </w:rPr>
+      </w:pPr>
+      <w:r>
+        <w:t>Ngôn</w:t>
+      </w:r>
+      <w:r>
+        <w:rPr>
+          <w:lang w:val="vi-VN"/>
+        </w:rPr>
+        <w:t xml:space="preserve"> ngữ HTML</w:t>
+      </w:r>
+    </w:p>
+    <w:p>
+      <w:pPr>
+        <w:pStyle w:val="nd"/>
+        <w:rPr>
+          <w:lang w:val="vi-VN"/>
+        </w:rPr>
+      </w:pPr>
+      <w:r>
+        <w:t xml:space="preserve">HTML là ngôn ngữ đánh dấu siêu văn bản, viết tắt từ “Hypertext Markup </w:t>
+      </w:r>
+      <w:r>
+        <w:t>Language</w:t>
+      </w:r>
+      <w:r>
+        <w:rPr>
+          <w:lang w:val="vi-VN"/>
+        </w:rPr>
+        <w:t>”</w:t>
+      </w:r>
+      <w:r>
+        <w:t xml:space="preserve">, dùng để tạo và cấu trúc các phần trong trang web như các đoạn văn bản, hình ảnh, bảng, đường link, tệp âm thanh và </w:t>
+      </w:r>
+      <w:r>
+        <w:t>video</w:t>
+      </w:r>
+      <w:r>
+        <w:rPr>
+          <w:lang w:val="vi-VN"/>
+        </w:rPr>
+        <w:t>.</w:t>
+      </w:r>
+    </w:p>
+    <w:p>
+      <w:pPr>
+        <w:pStyle w:val="nd"/>
+        <w:rPr>
+          <w:lang w:val="vi-VN"/>
+        </w:rPr>
+      </w:pPr>
+      <w:r>
+        <w:rPr>
+          <w:lang w:val="vi-VN"/>
+        </w:rPr>
+        <w:t>Vai trò</w:t>
+      </w:r>
+      <w:r>
+        <w:rPr>
+          <w:lang w:val="vi-VN"/>
+        </w:rPr>
+        <w:t xml:space="preserve"> </w:t>
+      </w:r>
+      <w:r>
+        <w:rPr>
+          <w:lang w:val="vi-VN"/>
+        </w:rPr>
+        <w:t>của HTML:</w:t>
+      </w:r>
+    </w:p>
+    <w:p>
+      <w:pPr>
+        <w:pStyle w:val="nd"/>
+        <w:rPr>
+          <w:lang w:val="vi-VN"/>
+        </w:rPr>
+      </w:pPr>
+      <w:r>
+        <w:lastRenderedPageBreak/>
+        <w:t>Tạo khung sườn cho trang web:</w:t>
+      </w:r>
+      <w:r>
+        <w:t xml:space="preserve"> HTML5 định nghĩa bố cục tổng thể gồm phần đầu trang, nội dung, thanh điều hướng, phần chân </w:t>
+      </w:r>
+      <w:r>
+        <w:t>trang</w:t>
+      </w:r>
+      <w:r>
+        <w:rPr>
+          <w:lang w:val="vi-VN"/>
+        </w:rPr>
+        <w:t>.</w:t>
+      </w:r>
+    </w:p>
+    <w:p>
+      <w:pPr>
+        <w:pStyle w:val="nd"/>
+      </w:pPr>
+      <w:r>
+        <w:t xml:space="preserve">Tương thích đa nền tảng: </w:t>
+      </w:r>
+      <w:r>
+        <w:t xml:space="preserve">HTML5 được thiết kế để hoạt động </w:t>
+      </w:r>
+      <w:r>
+        <w:rPr>
+          <w:lang w:val="vi-VN"/>
+        </w:rPr>
+        <w:t>tốt</w:t>
+      </w:r>
+      <w:r>
+        <w:t xml:space="preserve"> trên </w:t>
+      </w:r>
+      <w:r>
+        <w:t>máy tính, điện thoại, máy tính bảng, giúp dễ dàng phát triển giao diện responsive</w:t>
+      </w:r>
+    </w:p>
+    <w:p>
+      <w:pPr>
+        <w:pStyle w:val="nd"/>
+      </w:pPr>
+      <w:r>
+        <w:t>Kết hợp chặt chẽ với CSS và JavaScript:</w:t>
+      </w:r>
+      <w:r>
+        <w:t xml:space="preserve"> </w:t>
+      </w:r>
+      <w:r>
+        <w:t xml:space="preserve">HTML chịu trách </w:t>
+      </w:r>
+      <w:r>
+        <w:rPr>
+          <w:lang w:val="vi-VN"/>
+        </w:rPr>
+        <w:t>nhiệm</w:t>
+      </w:r>
+      <w:r>
+        <w:t xml:space="preserve"> về </w:t>
+      </w:r>
+      <w:r>
+        <w:t>nội dung và cấu trúc, trong khi CSS đảm nhận phần trình bày giao diện và JavaScript xử lý hành vi, tương tác.</w:t>
+      </w:r>
+    </w:p>
+    <w:p>
+      <w:pPr>
+        <w:pStyle w:val="Heading4"/>
+        <w:rPr>
+          <w:lang w:val="vi-VN"/>
+        </w:rPr>
+      </w:pPr>
+      <w:r>
+        <w:rPr>
+          <w:lang w:val="vi-VN"/>
+        </w:rPr>
+        <w:t>Ngôn ngữ CSS</w:t>
+      </w:r>
+    </w:p>
+    <w:p>
+      <w:pPr>
+        <w:pStyle w:val="nd"/>
+        <w:rPr>
+          <w:lang w:val="vi-VN"/>
+        </w:rPr>
+      </w:pPr>
+      <w:r>
+        <w:t xml:space="preserve">CSS là viết tắt của Cascading Style Sheets, một ngôn ngữ thiết kế đơn giản, xử lý một phần giao diện của trang web. CSS mô tả cách các phần tử HTML hiển thị trên màn hình và các phương tiện </w:t>
+      </w:r>
+      <w:r>
+        <w:t>khác</w:t>
+      </w:r>
+      <w:r>
+        <w:rPr>
+          <w:lang w:val="vi-VN"/>
+        </w:rPr>
+        <w:t>.</w:t>
+      </w:r>
+    </w:p>
+    <w:p>
+      <w:pPr>
+        <w:pStyle w:val="Heading4"/>
+        <w:rPr>
+          <w:lang w:val="vi-VN"/>
+        </w:rPr>
+      </w:pPr>
+      <w:r>
+        <w:rPr>
+          <w:lang w:val="vi-VN"/>
+        </w:rPr>
+        <w:t>Ngôn ngữ JavaScript</w:t>
+      </w:r>
+    </w:p>
+    <w:p>
+      <w:pPr>
+        <w:pStyle w:val="nd"/>
+        <w:rPr>
+          <w:lang w:val="vi-VN"/>
+        </w:rPr>
+      </w:pPr>
+      <w:r>
+        <w:rPr>
+          <w:lang w:val="vi-VN"/>
+        </w:rPr>
+        <w:t xml:space="preserve">JavaScript là ngôn ngữ lập trình được nhà phát triển sử dụng để tạo trang web tương tác. Từ làm mới bảng tin trên trang mạng xã hội đến hiển thị hình ảnh động và bản đồ tương tác, các chức năng của JavaScript có thể cải thiện trải nghiệm người dùng của trang </w:t>
+      </w:r>
+      <w:r>
+        <w:rPr>
+          <w:lang w:val="vi-VN"/>
+        </w:rPr>
+        <w:t>web.</w:t>
+      </w:r>
     </w:p>
     <w:p>
       <w:pPr>
@@ -7351,7 +7563,7 @@
           <w:b w:val="0"/>
           <w:bCs w:val="0"/>
         </w:rPr>
-        <w:t xml:space="preserve">Bootstrap là một bộ sưu tập miễn phí của các mã nguồn mở và công cụ dùng để tạo ra một mẫu webiste hoàn chỉnh. Với các thuộc tính về giao diện được quy định sẵn như kích thước, màu sắc, độ cao, độ rộng…, các designer có thể sáng tạo nhiều </w:t>
+        <w:t xml:space="preserve">Bootstrap là một bộ sưu tập miễn phí của các mã nguồn mở và công cụ dùng để tạo ra một mẫu webiste hoàn chỉnh. Với các thuộc tính về giao diện được quy định sẵn như kích thước, màu sắc, độ cao, độ rộng…, các designer có thể sáng tạo nhiều sản phẩm mới mẻ nhưng vẫn tiết kiệm thời gian khi làm việc với framework này trong quá trình thiết kế giao diện </w:t>
       </w:r>
       <w:r>
         <w:rPr>
@@ -7359,168 +7571,181 @@
           <w:b w:val="0"/>
           <w:bCs w:val="0"/>
         </w:rPr>
-        <w:lastRenderedPageBreak/>
-        <w:t xml:space="preserve">sản phẩm mới mẻ nhưng vẫn tiết kiệm thời gian khi làm việc với framework này trong quá trình thiết kế giao diện </w:t>
+        <w:t>website</w:t>
       </w:r>
       <w:r>
         <w:rPr>
           <w:rStyle w:val="Strong"/>
           <w:b w:val="0"/>
           <w:bCs w:val="0"/>
-        </w:rPr>
-        <w:t>website</w:t>
+          <w:lang w:val="vi-VN"/>
+        </w:rPr>
+        <w:t>.</w:t>
+      </w:r>
+      <w:bookmarkStart w:id="8" w:name="_Toc218514153"/>
+    </w:p>
+    <w:bookmarkEnd w:id="8"/>
+    <w:p>
+      <w:pPr>
+        <w:pStyle w:val="Heading4"/>
+        <w:rPr>
+          <w:lang w:val="vi-VN"/>
+        </w:rPr>
+      </w:pPr>
+      <w:r>
+        <w:t>Tìm</w:t>
+      </w:r>
+      <w:r>
+        <w:rPr>
+          <w:lang w:val="vi-VN"/>
+        </w:rPr>
+        <w:t xml:space="preserve"> hiểu</w:t>
+      </w:r>
+      <w:r>
+        <w:t xml:space="preserve"> REST API</w:t>
+      </w:r>
+    </w:p>
+    <w:p>
+      <w:pPr>
+        <w:pStyle w:val="nd"/>
+        <w:rPr>
+          <w:lang w:val="vi-VN"/>
+        </w:rPr>
+      </w:pPr>
+      <w:r>
+        <w:t>REST API (hay RESTful API) là một kiểu API được xây dựng theo phong cách kiến trúc REST (Representational State Transfer). Trong đó, mỗi dữ liệu được xem là một tài nguyên (resource), có địa chỉ riêng và được truy cập thông qua các phương thức HTTP chuẩn. Nói đơn giản, REST API là "ngôn ngữ chung" giúp ứng dụng di động, website và máy chủ hiểu nhau.</w:t>
+      </w:r>
+    </w:p>
+    <w:p>
+      <w:pPr>
+        <w:pStyle w:val="Heading4"/>
+        <w:rPr>
+          <w:lang w:val="vi-VN"/>
+        </w:rPr>
+      </w:pPr>
+      <w:bookmarkStart w:id="9" w:name="_Toc218514176"/>
+      <w:r>
+        <w:lastRenderedPageBreak/>
+        <w:t>Hệ</w:t>
+      </w:r>
+      <w:r>
+        <w:rPr>
+          <w:lang w:val="vi-VN"/>
+        </w:rPr>
+        <w:t xml:space="preserve"> thống quản lý Git/</w:t>
+      </w:r>
+      <w:r>
+        <w:t>GitHub</w:t>
+      </w:r>
+      <w:bookmarkEnd w:id="9"/>
+    </w:p>
+    <w:p>
+      <w:pPr>
+        <w:pStyle w:val="nd"/>
+        <w:rPr>
+          <w:lang w:val="vi-VN"/>
+        </w:rPr>
+      </w:pPr>
+      <w:r>
+        <w:t>GitHub là trang web có hệ</w:t>
+      </w:r>
+      <w:r>
+        <w:rPr>
+          <w:lang w:val="vi-VN"/>
+        </w:rPr>
+        <w:t xml:space="preserve"> </w:t>
+      </w:r>
+      <w:r>
+        <w:t>thống dựa trên Git, cung cấp hệ thống quản lý cho người dùng mà chủ yếu là các nhà lập trình các phiên bản code, chia sẻ mã nguồn tương tự như tính năng chia sẻ của mạng xã hội.</w:t>
+      </w:r>
+      <w:r>
+        <w:rPr>
+          <w:lang w:val="vi-VN"/>
+        </w:rPr>
+        <w:t xml:space="preserve"> </w:t>
+      </w:r>
+      <w:r>
+        <w:t>Các lập trình viên có thể tìm mã nguồn bằng nhiều ngôn ngữ khác nhau và sử dụng giao diện dòng lệnh Git để thực hiện và theo dõi bất kỳ thay đổi nào</w:t>
+      </w:r>
+      <w:r>
+        <w:t>.</w:t>
+      </w:r>
+    </w:p>
+    <w:p>
+      <w:pPr>
+        <w:pStyle w:val="Heading2"/>
+        <w:rPr>
+          <w:lang w:val="vi-VN"/>
+        </w:rPr>
+      </w:pPr>
+      <w:bookmarkStart w:id="10" w:name="_Toc243310696"/>
+      <w:r>
+        <w:t>Ngôn ngữ kịch bản phí server</w:t>
+      </w:r>
+      <w:bookmarkEnd w:id="10"/>
+    </w:p>
+    <w:p>
+      <w:pPr>
+        <w:pStyle w:val="Heading3"/>
+        <w:rPr>
+          <w:lang w:val="vi-VN"/>
+        </w:rPr>
+      </w:pPr>
+      <w:bookmarkStart w:id="11" w:name="_Toc243310697"/>
+      <w:r>
+        <w:rPr>
+          <w:lang w:val="vi-VN"/>
+        </w:rPr>
+        <w:t>Giới thiệu ngôn ngữ PHP</w:t>
+      </w:r>
+      <w:bookmarkEnd w:id="11"/>
+      <w:r>
+        <w:rPr>
+          <w:lang w:val="vi-VN"/>
+        </w:rPr>
+        <w:t xml:space="preserve"> </w:t>
+      </w:r>
+    </w:p>
+    <w:p>
+      <w:pPr>
+        <w:pStyle w:val="nd"/>
+        <w:rPr>
+          <w:lang w:val="vi-VN"/>
+        </w:rPr>
+      </w:pPr>
+      <w:r>
+        <w:t xml:space="preserve">PHP là từ viết tắt của thuật ngữ Personal Home Page và hiện nay đang có tên Hypertext Preprocessor. Đây là một dạng mã lệnh hoặc một chuỗi ngôn ngữ kịch bản. Trong đó, ngôn ngữ PHP chủ yếu được phát triển để dành cho những ứng dụng nằm trên máy </w:t>
+      </w:r>
+      <w:r>
+        <w:t>chủ</w:t>
+      </w:r>
+      <w:r>
+        <w:t>.</w:t>
+      </w:r>
+      <w:r>
+        <w:rPr>
+          <w:lang w:val="vi-VN"/>
+        </w:rPr>
+        <w:t xml:space="preserve"> </w:t>
+      </w:r>
+      <w:r>
+        <w:t xml:space="preserve">Khác với HTML chỉ hiển thị nội dung tĩnh, PHP có thể </w:t>
       </w:r>
       <w:r>
         <w:rPr>
           <w:rStyle w:val="Strong"/>
           <w:b w:val="0"/>
           <w:bCs w:val="0"/>
-          <w:lang w:val="vi-VN"/>
-        </w:rPr>
-        <w:t>.</w:t>
-      </w:r>
-    </w:p>
-    <w:p>
-      <w:pPr>
-        <w:pStyle w:val="Heading4"/>
-        <w:rPr>
-          <w:lang w:val="vi-VN"/>
-        </w:rPr>
-      </w:pPr>
-      <w:r>
-        <w:t>Tìm</w:t>
-      </w:r>
-      <w:r>
-        <w:rPr>
-          <w:lang w:val="vi-VN"/>
-        </w:rPr>
-        <w:t xml:space="preserve"> hiểu</w:t>
-      </w:r>
-      <w:r>
-        <w:t xml:space="preserve"> REST API</w:t>
-      </w:r>
-    </w:p>
-    <w:p>
-      <w:pPr>
-        <w:pStyle w:val="nd"/>
-        <w:rPr>
-          <w:lang w:val="vi-VN"/>
-        </w:rPr>
-      </w:pPr>
-      <w:r>
-        <w:t>REST API (hay RESTful API) là một kiểu API được xây dựng theo phong cách kiến trúc REST (Representational State Transfer). Trong đó, mỗi dữ liệu được xem là một tài nguyên (resource), có địa chỉ riêng và được truy cập thông qua các phương thức HTTP chuẩn. Nói đơn giản, REST API là "ngôn ngữ chung" giúp ứng dụng di động, website và máy chủ hiểu nhau.</w:t>
-      </w:r>
-    </w:p>
-    <w:p>
-      <w:pPr>
-        <w:pStyle w:val="Heading4"/>
-        <w:rPr>
-          <w:lang w:val="vi-VN"/>
-        </w:rPr>
-      </w:pPr>
-      <w:bookmarkStart w:id="8" w:name="_Toc218514176"/>
-      <w:r>
-        <w:t>Hệ</w:t>
-      </w:r>
-      <w:r>
-        <w:rPr>
-          <w:lang w:val="vi-VN"/>
-        </w:rPr>
-        <w:t xml:space="preserve"> thống quản lý Git/</w:t>
-      </w:r>
-      <w:r>
-        <w:t>GitHub</w:t>
-      </w:r>
-      <w:bookmarkEnd w:id="8"/>
-    </w:p>
-    <w:p>
-      <w:pPr>
-        <w:pStyle w:val="nd"/>
-        <w:rPr>
-          <w:lang w:val="vi-VN"/>
-        </w:rPr>
-      </w:pPr>
-      <w:r>
-        <w:t>GitHub là trang web có hệ</w:t>
-      </w:r>
-      <w:r>
-        <w:rPr>
-          <w:lang w:val="vi-VN"/>
+          <w:szCs w:val="26"/>
+        </w:rPr>
+        <w:t>xử lý dữ liệu,</w:t>
+      </w:r>
+      <w:r>
+        <w:rPr>
+          <w:rStyle w:val="Strong"/>
+          <w:szCs w:val="26"/>
         </w:rPr>
         <w:t xml:space="preserve"> </w:t>
-      </w:r>
-      <w:r>
-        <w:t>thống dựa trên Git, cung cấp hệ thống quản lý cho người dùng mà chủ yếu là các nhà lập trình các phiên bản code, chia sẻ mã nguồn tương tự như tính năng chia sẻ của mạng xã hội.</w:t>
-      </w:r>
-      <w:r>
-        <w:rPr>
-          <w:lang w:val="vi-VN"/>
-        </w:rPr>
-        <w:t xml:space="preserve"> </w:t>
-      </w:r>
-      <w:r>
-        <w:t>Các lập trình viên có thể tìm mã nguồn bằng nhiều ngôn ngữ khác nhau và sử dụng giao diện dòng lệnh Git để thực hiện và theo dõi bất kỳ thay đổi nào</w:t>
-      </w:r>
-    </w:p>
-    <w:p>
-      <w:pPr>
-        <w:pStyle w:val="Heading2"/>
-        <w:rPr>
-          <w:lang w:val="vi-VN"/>
-        </w:rPr>
-      </w:pPr>
-      <w:bookmarkStart w:id="9" w:name="_Toc243310696"/>
-      <w:r>
-        <w:t>Ngôn ngữ kịch bản phí server</w:t>
-      </w:r>
-      <w:bookmarkEnd w:id="9"/>
-    </w:p>
-    <w:p>
-      <w:pPr>
-        <w:pStyle w:val="Heading3"/>
-        <w:rPr>
-          <w:lang w:val="vi-VN"/>
-        </w:rPr>
-      </w:pPr>
-      <w:bookmarkStart w:id="10" w:name="_Toc243310697"/>
-      <w:r>
-        <w:rPr>
-          <w:lang w:val="vi-VN"/>
-        </w:rPr>
-        <w:t>Giới thiệu ngôn ngữ PHP</w:t>
-      </w:r>
-      <w:bookmarkEnd w:id="10"/>
-      <w:r>
-        <w:rPr>
-          <w:lang w:val="vi-VN"/>
-        </w:rPr>
-        <w:t xml:space="preserve"> </w:t>
-      </w:r>
-    </w:p>
-    <w:p>
-      <w:pPr>
-        <w:pStyle w:val="nd"/>
-        <w:rPr>
-          <w:lang w:val="vi-VN"/>
-        </w:rPr>
-      </w:pPr>
-      <w:r>
-        <w:t xml:space="preserve">PHP là từ viết tắt của thuật ngữ Personal Home Page và hiện nay đang có tên Hypertext Preprocessor. Đây là một dạng mã lệnh hoặc một chuỗi ngôn ngữ kịch bản. Trong đó, ngôn ngữ PHP chủ yếu được phát triển để dành cho những ứng dụng nằm trên máy </w:t>
-      </w:r>
-      <w:r>
-        <w:t>chủ</w:t>
-      </w:r>
-      <w:r>
-        <w:t>.</w:t>
-      </w:r>
-      <w:r>
-        <w:rPr>
-          <w:lang w:val="vi-VN"/>
-        </w:rPr>
-        <w:t xml:space="preserve"> </w:t>
-      </w:r>
-      <w:r>
-        <w:t xml:space="preserve">Khác với HTML chỉ hiển thị nội dung tĩnh, PHP có thể </w:t>
       </w:r>
       <w:r>
         <w:rPr>
@@ -7529,14 +7754,13 @@
           <w:bCs w:val="0"/>
           <w:szCs w:val="26"/>
         </w:rPr>
-        <w:t>xử lý dữ liệu,</w:t>
-      </w:r>
-      <w:r>
-        <w:rPr>
-          <w:rStyle w:val="Strong"/>
-          <w:szCs w:val="26"/>
-        </w:rPr>
-        <w:t xml:space="preserve"> </w:t>
+        <w:t>tương tác với cơ sở dữ liệu</w:t>
+      </w:r>
+      <w:r>
+        <w:t xml:space="preserve">, </w:t>
+      </w:r>
+      <w:r>
+        <w:t xml:space="preserve">và </w:t>
       </w:r>
       <w:r>
         <w:rPr>
@@ -7545,13 +7769,19 @@
           <w:bCs w:val="0"/>
           <w:szCs w:val="26"/>
         </w:rPr>
-        <w:t>tương tác với cơ sở dữ liệu</w:t>
-      </w:r>
-      <w:r>
-        <w:t xml:space="preserve">, </w:t>
-      </w:r>
-      <w:r>
-        <w:t xml:space="preserve">và </w:t>
+        <w:t>tạo ra nội dung tự động</w:t>
+      </w:r>
+      <w:r>
+        <w:t xml:space="preserve"> trước khi gửi đến trình duyệt của người dùng</w:t>
+      </w:r>
+      <w:r>
+        <w:rPr>
+          <w:lang w:val="vi-VN"/>
+        </w:rPr>
+        <w:t xml:space="preserve">. </w:t>
+      </w:r>
+      <w:r>
+        <w:t xml:space="preserve">PHP thường được </w:t>
       </w:r>
       <w:r>
         <w:rPr>
@@ -7560,19 +7790,13 @@
           <w:bCs w:val="0"/>
           <w:szCs w:val="26"/>
         </w:rPr>
-        <w:t>tạo ra nội dung tự động</w:t>
-      </w:r>
-      <w:r>
-        <w:t xml:space="preserve"> trước khi gửi đến trình duyệt của người dùng</w:t>
-      </w:r>
-      <w:r>
-        <w:rPr>
-          <w:lang w:val="vi-VN"/>
-        </w:rPr>
-        <w:t xml:space="preserve">. </w:t>
-      </w:r>
-      <w:r>
-        <w:t xml:space="preserve">PHP thường được </w:t>
+        <w:t>chạy trên máy chủ web (server)</w:t>
+      </w:r>
+      <w:r>
+        <w:t xml:space="preserve">, </w:t>
+      </w:r>
+      <w:r>
+        <w:t xml:space="preserve">chẳng hạn như Apache (trong XAMPP), và kết hợp với </w:t>
       </w:r>
       <w:r>
         <w:rPr>
@@ -7581,57 +7805,1070 @@
           <w:bCs w:val="0"/>
           <w:szCs w:val="26"/>
         </w:rPr>
-        <w:t>chạy trên máy chủ web (server)</w:t>
-      </w:r>
-      <w:r>
-        <w:t xml:space="preserve">, </w:t>
-      </w:r>
-      <w:r>
-        <w:t xml:space="preserve">chẳng hạn như Apache (trong XAMPP), và kết hợp với </w:t>
+        <w:t>MySQL</w:t>
+      </w:r>
+      <w:r>
+        <w:t xml:space="preserve"> để quản lý dữ liệu</w:t>
+      </w:r>
+    </w:p>
+    <w:p>
+      <w:pPr>
+        <w:pStyle w:val="Heading3"/>
+        <w:rPr>
+          <w:lang w:val="vi-VN"/>
+        </w:rPr>
+      </w:pPr>
+      <w:bookmarkStart w:id="12" w:name="_Toc243310698"/>
+      <w:r>
+        <w:t>Lịch</w:t>
+      </w:r>
+      <w:r>
+        <w:rPr>
+          <w:lang w:val="vi-VN"/>
+        </w:rPr>
+        <w:t xml:space="preserve"> </w:t>
+      </w:r>
+      <w:r>
+        <w:rPr>
+          <w:lang w:val="vi-VN"/>
+        </w:rPr>
+        <w:t>sử hình thành và quá trình</w:t>
+      </w:r>
+      <w:r>
+        <w:rPr>
+          <w:lang w:val="vi-VN"/>
+        </w:rPr>
+        <w:t xml:space="preserve"> phát triển</w:t>
+      </w:r>
+      <w:bookmarkEnd w:id="12"/>
+    </w:p>
+    <w:p>
+      <w:pPr>
+        <w:pStyle w:val="nd"/>
+        <w:rPr>
+          <w:lang w:val="vi-VN"/>
+        </w:rPr>
+      </w:pPr>
+      <w:r>
+        <w:t>PHP được khai sinh vào năm 1994 bởi lập trình viên người Đan Mạch-Canada tên là Rasmus Lerdorf. Ban đầu, nó chỉ là một tập hợp các mã kịch bản nhỏ ông viết để theo dõi lượng truy cập vào trang CV cá nhân của mình. Ông gọi nó là Personal Home Page Tools.</w:t>
+      </w:r>
+    </w:p>
+    <w:p>
+      <w:pPr>
+        <w:pStyle w:val="nd"/>
+        <w:rPr>
+          <w:lang w:val="vi-VN"/>
+        </w:rPr>
+      </w:pPr>
+      <w:r>
+        <w:rPr>
+          <w:lang w:val="vi-VN"/>
+        </w:rPr>
+        <w:t>1995: Sau khi công bố mã nguồn của PHP Tools, Rasmus đã phát triển thêm chức năng hỗ trợ xử lý biểu mẫu web và tương tác với cơ sở dữ liệu. Công cụ này được đặt tên là PHP/FI (Personal Home Page/Form Interpreter), cho phép lập trình viên tạo các trang web động. Đây là phiên bản PHP đầu tiên có thể sử dụng rộng rãi.</w:t>
+      </w:r>
+    </w:p>
+    <w:p>
+      <w:pPr>
+        <w:pStyle w:val="nd"/>
+        <w:rPr>
+          <w:lang w:val="vi-VN"/>
+        </w:rPr>
+      </w:pPr>
+      <w:r>
+        <w:rPr>
+          <w:lang w:val="vi-VN"/>
+        </w:rPr>
+        <w:t>1997: Sự phổ biến của PHP/FI dẫn đến việc cần một hệ thống mạnh mẽ hơn. Zeev Suraski và Andi Gutmans, hai lập trình viên từ Israel, đã tiến hành viết lại cốt lõi của PHP. Kết quả là một phiên bản ổn định và hiệu quả hơn, đặt nền móng cho PHP 3.</w:t>
+      </w:r>
+    </w:p>
+    <w:p>
+      <w:pPr>
+        <w:pStyle w:val="nd"/>
+        <w:rPr>
+          <w:lang w:val="vi-VN"/>
+        </w:rPr>
+      </w:pPr>
+      <w:r>
+        <w:rPr>
+          <w:lang w:val="vi-VN"/>
+        </w:rPr>
+        <w:t>1998: PHP 3 chính thức ra mắt, đánh dấu bước ngoặt lớn trong lịch sử phát triển của ngôn ngữ.</w:t>
+      </w:r>
+    </w:p>
+    <w:p>
+      <w:pPr>
+        <w:pStyle w:val="nd"/>
+        <w:rPr>
+          <w:lang w:val="vi-VN"/>
+        </w:rPr>
+      </w:pPr>
+      <w:r>
+        <w:rPr>
+          <w:lang w:val="vi-VN"/>
+        </w:rPr>
+        <w:lastRenderedPageBreak/>
+        <w:t>2000: PHP 4 ra đời, sử dụng Zend Engine 1.0, một công cụ thực thi mới được phát triển bởi Zeev Suraski và Andi Gutmans. Phiên bản này cải thiện đáng kể hiệu suất và khả năng mở rộng, làm cho PHP trở thành lựa chọn ưu tiên cho các dự án lớn.</w:t>
+      </w:r>
+    </w:p>
+    <w:p>
+      <w:pPr>
+        <w:pStyle w:val="nd"/>
+        <w:rPr>
+          <w:lang w:val="vi-VN"/>
+        </w:rPr>
+      </w:pPr>
+      <w:r>
+        <w:rPr>
+          <w:lang w:val="vi-VN"/>
+        </w:rPr>
+        <w:t>2004: PHP 5 ra mắt với nhiều cải tiến mạnh mẽ nhờ Zend Engine 2.0. Phiên bản này đánh dấu sự trưởng thành của PHP trong việc hỗ trợ các mô hình lập trình hiện đại.</w:t>
+      </w:r>
+    </w:p>
+    <w:p>
+      <w:pPr>
+        <w:pStyle w:val="nd"/>
+        <w:rPr>
+          <w:lang w:val="vi-VN"/>
+        </w:rPr>
+      </w:pPr>
+      <w:r>
+        <w:rPr>
+          <w:lang w:val="vi-VN"/>
+        </w:rPr>
+        <w:t>2015: PHP 7 chính thức phát hành, sử dụng Zend Engine 3.0, mang lại những cải tiến vượt trội về hiệu suất và hiệu quả.</w:t>
+      </w:r>
+    </w:p>
+    <w:p>
+      <w:pPr>
+        <w:pStyle w:val="nd"/>
+        <w:rPr>
+          <w:lang w:val="vi-VN"/>
+        </w:rPr>
+      </w:pPr>
+      <w:r>
+        <w:rPr>
+          <w:lang w:val="vi-VN"/>
+        </w:rPr>
+        <w:t xml:space="preserve">2020: PHP 8 phát hành với những thay đổi quan trọng, đưa ngôn ngữ lên một tầm cao </w:t>
+      </w:r>
+      <w:r>
+        <w:rPr>
+          <w:lang w:val="vi-VN"/>
+        </w:rPr>
+        <w:t>mới</w:t>
+      </w:r>
+      <w:r>
+        <w:rPr>
+          <w:lang w:val="vi-VN"/>
+        </w:rPr>
+        <w:t>.</w:t>
+      </w:r>
+    </w:p>
+    <w:p>
+      <w:pPr>
+        <w:pStyle w:val="Heading3"/>
+        <w:rPr>
+          <w:lang w:val="vi-VN"/>
+        </w:rPr>
+      </w:pPr>
+      <w:bookmarkStart w:id="13" w:name="_Toc243310699"/>
+      <w:r>
+        <w:t>Vai trò của</w:t>
+      </w:r>
+      <w:r>
+        <w:rPr>
+          <w:lang w:val="vi-VN"/>
+        </w:rPr>
+        <w:t xml:space="preserve"> ngôn ngữ PHP</w:t>
+      </w:r>
+      <w:bookmarkEnd w:id="13"/>
+    </w:p>
+    <w:p>
+      <w:pPr>
+        <w:pStyle w:val="nd"/>
+        <w:rPr>
+          <w:lang w:val="vi-VN"/>
+        </w:rPr>
+      </w:pPr>
+      <w:r>
+        <w:rPr>
+          <w:lang w:val="vi-VN"/>
+        </w:rPr>
+        <w:t>PHP đóng vai trò là "bộ não" phía máy chủ (server-side) của website, xử lý logic, tương tác dữ liệu và tạo nội dung động trước khi gửi về trình duyệt, giúp xây dựng các trang web động và kết nối hiệu quả với cơ sở dữ liệu (CSDL)</w:t>
+      </w:r>
+    </w:p>
+    <w:p>
+      <w:pPr>
+        <w:pStyle w:val="nd"/>
+        <w:rPr>
+          <w:lang w:val="vi-VN"/>
+        </w:rPr>
+      </w:pPr>
+      <w:r>
+        <w:rPr>
+          <w:lang w:val="vi-VN"/>
+        </w:rPr>
+        <w:t>Các vai trò của PHP:</w:t>
+      </w:r>
+    </w:p>
+    <w:p>
+      <w:pPr>
+        <w:pStyle w:val="nd"/>
+        <w:rPr>
+          <w:lang w:val="vi-VN"/>
+        </w:rPr>
+      </w:pPr>
+      <w:r>
+        <w:rPr>
+          <w:lang w:val="vi-VN"/>
+        </w:rPr>
+        <w:t xml:space="preserve">- Xử </w:t>
+      </w:r>
+      <w:r>
+        <w:rPr>
+          <w:bCs/>
+          <w:lang w:val="vi-VN"/>
+        </w:rPr>
+        <w:t>lý phía máy chủ</w:t>
+      </w:r>
+      <w:r>
+        <w:rPr>
+          <w:lang w:val="vi-VN"/>
+        </w:rPr>
+        <w:t>: PHP được thực thi trên web server, xử lý yêu cầu từ người dùng, truy vấn CSDL</w:t>
+      </w:r>
+    </w:p>
+    <w:p>
+      <w:pPr>
+        <w:pStyle w:val="nd"/>
+        <w:rPr>
+          <w:lang w:val="vi-VN"/>
+        </w:rPr>
+      </w:pPr>
+      <w:r>
+        <w:rPr>
+          <w:lang w:val="vi-VN"/>
+        </w:rPr>
+        <w:t xml:space="preserve">- </w:t>
+      </w:r>
+      <w:r>
+        <w:rPr>
+          <w:bCs/>
+          <w:lang w:val="vi-VN"/>
+        </w:rPr>
+        <w:t>Tạo nội dung động:</w:t>
+      </w:r>
+      <w:r>
+        <w:rPr>
+          <w:lang w:val="vi-VN"/>
+        </w:rPr>
+        <w:t xml:space="preserve"> Cho phép nhúng trực tiếp vào HTML, PHP tạo ra nội dung thay đổi dựa trên dữ </w:t>
+      </w:r>
+      <w:r>
+        <w:rPr>
+          <w:lang w:val="vi-VN"/>
+        </w:rPr>
+        <w:t>liệu.</w:t>
+      </w:r>
+    </w:p>
+    <w:p>
+      <w:pPr>
+        <w:pStyle w:val="nd"/>
+        <w:rPr>
+          <w:lang w:val="vi-VN"/>
+        </w:rPr>
+      </w:pPr>
+      <w:r>
+        <w:rPr>
+          <w:lang w:val="vi-VN"/>
+        </w:rPr>
+        <w:t xml:space="preserve">- </w:t>
+      </w:r>
+      <w:r>
+        <w:rPr>
+          <w:bCs/>
+          <w:lang w:val="vi-VN"/>
+        </w:rPr>
+        <w:t>Tương tác với cơ sở dữ liệu:</w:t>
+      </w:r>
+      <w:r>
+        <w:rPr>
+          <w:lang w:val="vi-VN"/>
+        </w:rPr>
+        <w:t xml:space="preserve"> PHP là công cụ mạnh mẽ để kết nối, truy vấn, cập nhật và quản lý dữ liệu trong các hệ quản trị </w:t>
+      </w:r>
+      <w:r>
+        <w:rPr>
+          <w:lang w:val="vi-VN"/>
+        </w:rPr>
+        <w:t>CSDL.</w:t>
+      </w:r>
+    </w:p>
+    <w:p>
+      <w:pPr>
+        <w:pStyle w:val="Heading2"/>
+        <w:rPr>
+          <w:lang w:val="vi-VN"/>
+        </w:rPr>
+      </w:pPr>
+      <w:bookmarkStart w:id="14" w:name="_Toc243310700"/>
+      <w:r>
+        <w:t xml:space="preserve">Ngôn ngữ truy vấn </w:t>
+      </w:r>
+      <w:r>
+        <w:t>SQL</w:t>
+      </w:r>
+      <w:bookmarkEnd w:id="14"/>
+    </w:p>
+    <w:p>
+      <w:pPr>
+        <w:pStyle w:val="Heading3"/>
+        <w:rPr>
+          <w:lang w:val="vi-VN"/>
+        </w:rPr>
+      </w:pPr>
+      <w:bookmarkStart w:id="15" w:name="_Toc243310701"/>
+      <w:r>
+        <w:rPr>
+          <w:lang w:val="vi-VN"/>
+        </w:rPr>
+        <w:t>Khái quát về ngôn ngữ SQL</w:t>
+      </w:r>
+      <w:bookmarkEnd w:id="15"/>
+    </w:p>
+    <w:p>
+      <w:pPr>
+        <w:pStyle w:val="nd"/>
+        <w:rPr>
+          <w:lang w:val="vi-VN"/>
+        </w:rPr>
+      </w:pPr>
+      <w:r>
+        <w:t xml:space="preserve">SQL, viết tắt của Structured Query Language (ngôn ngữ hỏi có cấu trúc), là công cụ sử dụng để tổ chức, quản lý và truy xuất dữ liệu đuợc lưu trữ trong các cơ sở dữ liệu. SQL là một hệ thống ngôn ngữ bao gồm tập các câu lệnh sử dụng để tương tác với cơ sở dữ liệu quan hệ. Tên gọi ngôn ngữ hỏi có cấu trúc phần nào làm chúng ta liên tưởng đến một công cụ (ngôn ngữ) dùng để truy xuất dữ liệu trong các cơ sở dữ liệu. Thực sự mà nói, khả năng của SQL vượt xa so với một công cụ truy xuất dữ </w:t>
+      </w:r>
+      <w:r>
+        <w:lastRenderedPageBreak/>
+        <w:t xml:space="preserve">liệu, mặc dù đây là mục đích ban đầu khi SQL được xây dựng nên và truy xuất dữ liệu vẫn còn là một trong những chức năng quan trọng của nó. </w:t>
+      </w:r>
+    </w:p>
+    <w:p>
+      <w:pPr>
+        <w:pStyle w:val="nd"/>
+        <w:rPr>
+          <w:lang w:val="vi-VN"/>
+        </w:rPr>
+      </w:pPr>
+      <w:r>
+        <w:t xml:space="preserve">SQL được sử dụng để điều khiển tất cả các chức năng mà một hệ quản trị cơ sở dữ liệu cung cấp cho người dùng bao gồm: </w:t>
+      </w:r>
+    </w:p>
+    <w:p>
+      <w:pPr>
+        <w:pStyle w:val="nd"/>
+        <w:rPr>
+          <w:lang w:val="vi-VN"/>
+        </w:rPr>
+      </w:pPr>
+      <w:r>
+        <w:rPr>
+          <w:lang w:val="vi-VN"/>
+        </w:rPr>
+        <w:t xml:space="preserve">- </w:t>
+      </w:r>
+      <w:r>
+        <w:t>Định nghĩa dữ liệu: SQL cung cấp khả năng định nghĩa các cơ sở dữ liệu, các cấu trúc lưu trữ và tổ chức dữ liệu cũng như mối quan hệ giữa các thành phần dữ liệu.</w:t>
+      </w:r>
+    </w:p>
+    <w:p>
+      <w:pPr>
+        <w:pStyle w:val="nd"/>
+        <w:rPr>
+          <w:lang w:val="vi-VN"/>
+        </w:rPr>
+      </w:pPr>
+      <w:r>
+        <w:rPr>
+          <w:lang w:val="vi-VN"/>
+        </w:rPr>
+        <w:t xml:space="preserve">- </w:t>
+      </w:r>
+      <w:r>
+        <w:t xml:space="preserve">Truy xuất và thao tác dữ liệu: Với SQL, người dùng có thể dễ dàng thực hiện các thao tác truy xuất, bổ sung, cập nhật và loại bỏ dữ liệu trong các cơ sở dữ liệu. </w:t>
+      </w:r>
+    </w:p>
+    <w:p>
+      <w:pPr>
+        <w:pStyle w:val="nd"/>
+        <w:rPr>
+          <w:lang w:val="vi-VN"/>
+        </w:rPr>
+      </w:pPr>
+      <w:r>
+        <w:rPr>
+          <w:lang w:val="vi-VN"/>
+        </w:rPr>
+        <w:t xml:space="preserve">- </w:t>
+      </w:r>
+      <w:r>
+        <w:t xml:space="preserve">Điều khiển truy cập: SQL có thể được sử dụng để cấp phát và kiểm soát các thao tác của người sử dụng trên dữ liệu, đảm bảo sự an toàn cho cơ sở dữ </w:t>
+      </w:r>
+      <w:r>
+        <w:t>liệu</w:t>
+      </w:r>
+      <w:r>
+        <w:rPr>
+          <w:lang w:val="vi-VN"/>
+        </w:rPr>
+        <w:t>.</w:t>
+      </w:r>
+    </w:p>
+    <w:p>
+      <w:pPr>
+        <w:pStyle w:val="nd"/>
+        <w:rPr>
+          <w:lang w:val="vi-VN"/>
+        </w:rPr>
+      </w:pPr>
+      <w:r>
+        <w:rPr>
+          <w:lang w:val="vi-VN"/>
+        </w:rPr>
+        <w:t xml:space="preserve">- </w:t>
+      </w:r>
+      <w:r>
+        <w:t xml:space="preserve">Đảm bảo toàn vẹn dữ liệu: SQL định nghĩa các ràng buộc toàn vẹn trong cơ sở dữ liệu nhờ đó đảm bảo tính hợp lệ và chính xác của dữ liệu trước các thao tác cập nhật cũng như các lỗi của hệ thống. </w:t>
+      </w:r>
+    </w:p>
+    <w:p>
+      <w:pPr>
+        <w:pStyle w:val="Heading3"/>
+        <w:rPr>
+          <w:lang w:val="vi-VN"/>
+        </w:rPr>
+      </w:pPr>
+      <w:bookmarkStart w:id="16" w:name="_Toc243310702"/>
+      <w:r>
+        <w:t>Vai trò của SQL</w:t>
+      </w:r>
+      <w:bookmarkEnd w:id="16"/>
+    </w:p>
+    <w:p>
+      <w:pPr>
+        <w:pStyle w:val="nd"/>
+        <w:rPr>
+          <w:lang w:val="vi-VN"/>
+        </w:rPr>
+      </w:pPr>
+      <w:r>
+        <w:t>SQL không phải là một hệ quản trị cơ sở dữ liệu, nó không thể tồn tại độc lập. SQL thực sự là một phần của hệ quản trị cơ sở dữ liệu, nó xuất hiện trong các hệ quản trị cơ sở dữ liệu với vai trò ngôn ngữ và là công cụ giao tiếp giữa người sử dụng và hệ quản trị cơ sở dữ liệu.</w:t>
+      </w:r>
+    </w:p>
+    <w:p>
+      <w:pPr>
+        <w:pStyle w:val="nd"/>
+        <w:rPr>
+          <w:lang w:val="vi-VN"/>
+        </w:rPr>
+      </w:pPr>
+      <w:r>
+        <w:t xml:space="preserve">SQL có những vai trò như sau: </w:t>
+      </w:r>
+    </w:p>
+    <w:p>
+      <w:pPr>
+        <w:pStyle w:val="nd"/>
+        <w:rPr>
+          <w:lang w:val="vi-VN"/>
+        </w:rPr>
+      </w:pPr>
+      <w:r>
+        <w:rPr>
+          <w:lang w:val="vi-VN"/>
+        </w:rPr>
+        <w:t xml:space="preserve">- </w:t>
+      </w:r>
+      <w:r>
+        <w:t xml:space="preserve">SQL là ngôn ngữ hỏi có tính tương tác: Người sử dụng có thể dễ dàng thông qua các trình tiện ích để gởi các yêu cầu dưới dạng các câu lệnh SQL đến cơ sở dữ liệu và nhận kết quả trả về từ cơ sở dữ </w:t>
+      </w:r>
+      <w:r>
+        <w:t>liệu</w:t>
+      </w:r>
+      <w:r>
+        <w:rPr>
+          <w:lang w:val="vi-VN"/>
+        </w:rPr>
+        <w:t xml:space="preserve">. </w:t>
+      </w:r>
+    </w:p>
+    <w:p>
+      <w:pPr>
+        <w:pStyle w:val="nd"/>
+        <w:rPr>
+          <w:lang w:val="vi-VN"/>
+        </w:rPr>
+      </w:pPr>
+      <w:r>
+        <w:rPr>
+          <w:lang w:val="vi-VN"/>
+        </w:rPr>
+        <w:t xml:space="preserve">- </w:t>
+      </w:r>
+      <w:r>
+        <w:t xml:space="preserve">SQL là ngôn ngữ lập trình cơ sở dữ liệu: Các lập trình viên có thể nhúng các câu lệnh SQL vào trong các ngôn ngữ lập trình để xây dựng nên các chương trình ứng dụng giao tiếp với cơ sở dữ </w:t>
+      </w:r>
+      <w:r>
+        <w:t>liệu</w:t>
+      </w:r>
+      <w:r>
+        <w:rPr>
+          <w:lang w:val="vi-VN"/>
+        </w:rPr>
+        <w:t>.</w:t>
+      </w:r>
+    </w:p>
+    <w:p>
+      <w:pPr>
+        <w:pStyle w:val="nd"/>
+      </w:pPr>
+      <w:r>
+        <w:rPr>
+          <w:lang w:val="vi-VN"/>
+        </w:rPr>
+        <w:t xml:space="preserve">- </w:t>
+      </w:r>
+      <w:r>
+        <w:t>SQL là ngôn ngữ quản trị cơ sở dữ liệu: Thông qua SQL, người quản trị cơ sở dữ liệu có thể quản lý được cơ sở dữ liệu, định nghĩa các cấu trúc lưu trữ dữ liệu, điều khiển truy cập cơ sở dữ liệu</w:t>
+      </w:r>
+      <w:r>
+        <w:t>.</w:t>
+      </w:r>
+    </w:p>
+    <w:p>
+      <w:pPr>
+        <w:pStyle w:val="nd"/>
+        <w:rPr>
+          <w:lang w:val="vi-VN"/>
+        </w:rPr>
+      </w:pPr>
+      <w:r>
+        <w:lastRenderedPageBreak/>
+        <w:t xml:space="preserve">- </w:t>
+      </w:r>
+      <w:r>
+        <w:rPr>
+          <w:lang w:val="vi-VN"/>
+        </w:rPr>
+        <w:t>S</w:t>
+      </w:r>
+      <w:r>
+        <w:t xml:space="preserve">QL là ngôn ngữ cho các hệ thống khách/chủ (client/server): Trong các hệ thống cơ sở dữ liệu khách/chủ, SQL được sử dụng như là công cụ để giao tiếp giữa các trình ứng dụng phía máy khách với máy chủ cơ sở dữ liệu. </w:t>
+      </w:r>
+    </w:p>
+    <w:p>
+      <w:pPr>
+        <w:pStyle w:val="nd"/>
+        <w:rPr>
+          <w:lang w:val="vi-VN"/>
+        </w:rPr>
+      </w:pPr>
+      <w:r>
+        <w:rPr>
+          <w:lang w:val="vi-VN"/>
+        </w:rPr>
+        <w:t xml:space="preserve">- </w:t>
+      </w:r>
+      <w:r>
+        <w:t xml:space="preserve">SQL là ngôn ngữ truy cập dữ liệu trên Internet: Cho đến nay, hầu hết các máy chủ Web cũng như các máy chủ trên Internet sử dụng SQL với vai trò là ngôn ngữ để tương tác với dữ liệu trong các cơ sở dữ liệu. </w:t>
+      </w:r>
+    </w:p>
+    <w:p>
+      <w:pPr>
+        <w:pStyle w:val="nd"/>
+        <w:rPr>
+          <w:lang w:val="vi-VN"/>
+        </w:rPr>
+      </w:pPr>
+      <w:r>
+        <w:rPr>
+          <w:lang w:val="vi-VN"/>
+        </w:rPr>
+        <w:t xml:space="preserve">- </w:t>
+      </w:r>
+      <w:r>
+        <w:t>SQL là ngôn ngữ cơ sở dữ liệu phân tán: Đối với các hệ quản trị cơ sở dữ liệu phân tán, mỗi một hệ thống sử dụng SQL để giao tiếp với các hệ thống khác trên mạng, gởi và nhận các yêu cầu truy xuất dữ liệu với nhau.</w:t>
+      </w:r>
+    </w:p>
+    <w:p>
+      <w:pPr>
+        <w:pStyle w:val="nd"/>
+        <w:rPr>
+          <w:lang w:val="vi-VN"/>
+        </w:rPr>
+      </w:pPr>
+      <w:r>
+        <w:rPr>
+          <w:lang w:val="vi-VN"/>
+        </w:rPr>
+        <w:t xml:space="preserve">- </w:t>
+      </w:r>
+      <w:r>
+        <w:t xml:space="preserve">SQL là ngôn ngữ sử dụng cho các cổng giao tiếp cơ sở dữ liệu: Trong một hệ thống mạng máy tính với nhiều hệ quản trị cơ sở dữ liệu khác </w:t>
+      </w:r>
+      <w:bookmarkStart w:id="17" w:name="_Toc243310703"/>
+      <w:r>
+        <w:t>nhau</w:t>
+      </w:r>
+      <w:r>
+        <w:rPr>
+          <w:lang w:val="vi-VN"/>
+        </w:rPr>
+        <w:t>.</w:t>
+      </w:r>
+    </w:p>
+    <w:p>
+      <w:pPr>
+        <w:pStyle w:val="Heading3"/>
+        <w:rPr>
+          <w:lang w:val="vi-VN"/>
+        </w:rPr>
+      </w:pPr>
+      <w:r>
+        <w:t>Các nhóm lệnh SQL</w:t>
+      </w:r>
+      <w:bookmarkEnd w:id="17"/>
+    </w:p>
+    <w:p>
+      <w:pPr>
+        <w:rPr>
+          <w:lang w:val="vi-VN"/>
+        </w:rPr>
+      </w:pPr>
+      <w:r>
+        <w:t>Các câu lệnh SQL được chia thành 4 nhóm chính</w:t>
+      </w:r>
+    </w:p>
+    <w:p>
+      <w:pPr>
+        <w:pStyle w:val="nd"/>
+        <w:rPr>
+          <w:i/>
+          <w:iCs/>
+          <w:lang w:val="vi-VN"/>
+        </w:rPr>
+      </w:pPr>
+      <w:r>
+        <w:rPr>
+          <w:lang w:val="vi-VN"/>
+        </w:rPr>
+        <w:t xml:space="preserve">- </w:t>
+      </w:r>
+      <w:r>
+        <w:rPr>
+          <w:i/>
+          <w:iCs/>
+        </w:rPr>
+        <w:t>DDL (Data Definition Language)</w:t>
+      </w:r>
+      <w:r>
+        <w:rPr>
+          <w:i/>
+          <w:iCs/>
+          <w:lang w:val="vi-VN"/>
+        </w:rPr>
+        <w:t xml:space="preserve">- </w:t>
+      </w:r>
+      <w:r>
+        <w:t xml:space="preserve">Định nghĩa dữ </w:t>
+      </w:r>
+      <w:r>
+        <w:t>liệu</w:t>
+      </w:r>
+      <w:r>
+        <w:rPr>
+          <w:i/>
+          <w:iCs/>
+          <w:lang w:val="vi-VN"/>
+        </w:rPr>
+        <w:t xml:space="preserve">: </w:t>
+      </w:r>
+      <w:r>
+        <w:t>Nhóm lệnh này dùng để định nghĩa, thay đổi hoặc hủy bỏ cấu trúc của các đối tượng trong database (bảng, index, view, schema).</w:t>
+      </w:r>
+    </w:p>
+    <w:p>
+      <w:pPr>
+        <w:pStyle w:val="nd"/>
+      </w:pPr>
+      <w:r>
+        <w:t>Các lệnh chính: CREATE, ALTER, DROP, TRUNCATE.</w:t>
+      </w:r>
+    </w:p>
+    <w:p>
+      <w:pPr>
+        <w:pStyle w:val="nd"/>
+        <w:rPr>
+          <w:lang w:val="vi-VN"/>
+        </w:rPr>
+      </w:pPr>
+      <w:r>
+        <w:t>Đặc điểm: Trong nhiều RDBMS (như MySQL), các lệnh DDL sẽ kích hoạt Implicit Commit (tự động commit). Bạn không thể rollback một lệnh DROP TABLE nếu nó đã thực thi thành công.</w:t>
+      </w:r>
+    </w:p>
+    <w:p>
+      <w:pPr>
+        <w:pStyle w:val="nd"/>
+        <w:rPr>
+          <w:lang w:val="vi-VN"/>
+        </w:rPr>
+      </w:pPr>
+      <w:r>
+        <w:rPr>
+          <w:lang w:val="vi-VN"/>
+        </w:rPr>
+        <w:t xml:space="preserve">- </w:t>
+      </w:r>
+      <w:r>
+        <w:rPr>
+          <w:i/>
+          <w:iCs/>
+        </w:rPr>
+        <w:t xml:space="preserve">DML (Data Manipulation Language) </w:t>
+      </w:r>
+      <w:r>
+        <w:rPr>
+          <w:i/>
+          <w:iCs/>
+        </w:rPr>
+        <w:t>và</w:t>
+      </w:r>
+      <w:r>
+        <w:rPr>
+          <w:i/>
+          <w:iCs/>
+          <w:lang w:val="vi-VN"/>
+        </w:rPr>
+        <w:t xml:space="preserve"> </w:t>
+      </w:r>
+      <w:r>
+        <w:rPr>
+          <w:i/>
+          <w:iCs/>
+        </w:rPr>
+        <w:t>DQL (Data Query Language) -</w:t>
+      </w:r>
+      <w:r>
+        <w:t xml:space="preserve"> Thao tác dữ </w:t>
+      </w:r>
+      <w:r>
+        <w:t>liệu</w:t>
+      </w:r>
+    </w:p>
+    <w:p>
+      <w:pPr>
+        <w:pStyle w:val="nd"/>
+        <w:rPr>
+          <w:lang w:val="vi-VN"/>
+        </w:rPr>
+      </w:pPr>
+      <w:r>
+        <w:t>Nhóm lệnh dùng để truy vấn và thay đổi dữ liệu thực tế bên trong các bảng.</w:t>
+      </w:r>
+    </w:p>
+    <w:p>
+      <w:pPr>
+        <w:pStyle w:val="nd"/>
+      </w:pPr>
+      <w:r>
+        <w:t>Các lệnh chính: INSERT, UPDATE, DELETE (DML) và SELECT (thường được tách riêng thành DQL - Data Query Language).</w:t>
+      </w:r>
+    </w:p>
+    <w:p>
+      <w:pPr>
+        <w:pStyle w:val="nd"/>
+        <w:rPr>
+          <w:lang w:val="vi-VN"/>
+        </w:rPr>
+      </w:pPr>
+      <w:r>
+        <w:t xml:space="preserve">Đặc </w:t>
+      </w:r>
+      <w:r>
+        <w:t>điểm</w:t>
+      </w:r>
+      <w:r>
+        <w:rPr>
+          <w:lang w:val="vi-VN"/>
+        </w:rPr>
+        <w:t xml:space="preserve">: </w:t>
+      </w:r>
+      <w:r>
+        <w:t xml:space="preserve">Các lệnh này không tự động commit (trừ khi bật chế độ </w:t>
+      </w:r>
+      <w:r>
+        <w:rPr>
+          <w:i/>
+          <w:iCs/>
+        </w:rPr>
+        <w:t>autocommit</w:t>
+      </w:r>
+      <w:r>
+        <w:t>). Chúng có thể được rollback nếu nằm trong một transaction.</w:t>
+      </w:r>
+    </w:p>
+    <w:p>
+      <w:pPr>
+        <w:pStyle w:val="nd"/>
+        <w:rPr>
+          <w:i/>
+          <w:iCs/>
+        </w:rPr>
+      </w:pPr>
+      <w:r>
+        <w:rPr>
+          <w:i/>
+          <w:iCs/>
+          <w:lang w:val="vi-VN"/>
+        </w:rPr>
+        <w:t xml:space="preserve">- </w:t>
+      </w:r>
+      <w:r>
+        <w:rPr>
+          <w:i/>
+          <w:iCs/>
+        </w:rPr>
+        <w:t>DCL (Data Control Language) - Kiểm soát dữ liệu</w:t>
+      </w:r>
+    </w:p>
+    <w:p>
+      <w:pPr>
+        <w:pStyle w:val="nd"/>
+      </w:pPr>
+      <w:r>
+        <w:t>Nhóm lệnh dùng để quản lý quyền truy cập và bảo mật thông tin trong database.</w:t>
+      </w:r>
+    </w:p>
+    <w:p>
+      <w:pPr>
+        <w:pStyle w:val="nd"/>
+      </w:pPr>
+      <w:r>
+        <w:lastRenderedPageBreak/>
+        <w:t>Các lệnh chính: GRANT (cấp quyền truy cập/thao tác), REVOKE (thu hồi quyền).</w:t>
+      </w:r>
+    </w:p>
+    <w:p>
+      <w:pPr>
+        <w:pStyle w:val="nd"/>
+        <w:rPr>
+          <w:i/>
+          <w:iCs/>
+        </w:rPr>
+      </w:pPr>
+      <w:r>
+        <w:rPr>
+          <w:i/>
+          <w:iCs/>
+          <w:lang w:val="vi-VN"/>
+        </w:rPr>
+        <w:t xml:space="preserve">- </w:t>
+      </w:r>
+      <w:r>
+        <w:rPr>
+          <w:i/>
+          <w:iCs/>
+        </w:rPr>
+        <w:t>TCL (Transaction Control Language) - Quản lý giao dịch</w:t>
+      </w:r>
+    </w:p>
+    <w:p>
+      <w:pPr>
+        <w:pStyle w:val="nd"/>
+      </w:pPr>
+      <w:r>
+        <w:t>Nhóm lệnh dùng để quản lý tính toàn vẹn của dữ liệu thông qua các transaction (giao dịch), đảm bảo nguyên lý ACID.</w:t>
+      </w:r>
+    </w:p>
+    <w:p>
+      <w:pPr>
+        <w:pStyle w:val="nd"/>
+        <w:rPr>
+          <w:lang w:val="vi-VN"/>
+        </w:rPr>
+      </w:pPr>
+      <w:r>
+        <w:t>Các lệnh chính: COMMIT (lưu thay đổi vĩnh viễn), ROLLBACK (hủy bỏ các thay đổi chưa commit), SAVEPOINT (tạo điểm neo để rollback một phần).</w:t>
+      </w:r>
+    </w:p>
+    <w:p>
+      <w:pPr>
+        <w:pStyle w:val="Heading2"/>
+        <w:rPr>
+          <w:lang w:val="vi-VN"/>
+        </w:rPr>
+      </w:pPr>
+      <w:r>
+        <w:rPr>
+          <w:lang w:val="vi-VN"/>
+        </w:rPr>
+        <w:t>Tổng kết chương</w:t>
+      </w:r>
+    </w:p>
+    <w:p>
+      <w:pPr>
+        <w:pStyle w:val="nd"/>
+      </w:pPr>
+      <w:r>
+        <w:t xml:space="preserve">Trong đề tài “Xây dựng hệ thống quản lý sản phẩm và đơn hàng”, tôi đã vận dụng các kiến thức lý thuyết đã học kết hợp với các nền tảng và công nghệ web để phân tích, thiết kế và triển khai hệ thống. HTML, CSS, JavaScript và </w:t>
+      </w:r>
+      <w:r>
+        <w:t>Bootstrap5</w:t>
+      </w:r>
+      <w:r>
+        <w:t xml:space="preserve"> được sử dụng để xây dựng giao diện website, trình bày thông tin và hỗ trợ các thao tác tương tác của người dùng. Bên cạnh đó, PHP được sử dụng để xử lý các nghiệp vụ phía máy chủ, tiếp nhận dữ liệu từ biểu mẫu và thực hiện các chức năng quản lý sản phẩm, danh mục, nhà cung cấp, khách hàng và đơn hàng. MySQL được sử dụng để lưu trữ và quản lý dữ liệu, đảm bảo thông tin được tổ chức có hệ thống và thuận tiện cho việc truy xuất, cập nhật. Ngoài ra, Visual Studio Code, Docker Desktop, WSL 2 và Apache hỗ trợ quá trình phát triển, cấu hình và vận hành ứng dụng trong môi trường thống nhất.</w:t>
+      </w:r>
+    </w:p>
+    <w:p>
+      <w:pPr>
+        <w:pStyle w:val="nd"/>
+      </w:pPr>
+      <w:r>
+        <w:t>Tổng thể, đề tài</w:t>
+      </w:r>
+      <w:r>
+        <w:rPr>
+          <w:lang w:val="vi-VN"/>
+        </w:rPr>
+        <w:t xml:space="preserve"> </w:t>
+      </w:r>
+      <w:r>
+        <w:t>kết hợp giữa</w:t>
+      </w:r>
+      <w:r>
+        <w:rPr>
+          <w:lang w:val="vi-VN"/>
+        </w:rPr>
+        <w:t xml:space="preserve"> </w:t>
+      </w:r>
+      <w:r>
+        <w:t xml:space="preserve">lý thuyết và ứng dụng thực tế thông qua việc sử dụng các công nghệ HTML, CSS, JavaScript, </w:t>
+      </w:r>
+      <w:r>
+        <w:t>Bootstrap5</w:t>
+      </w:r>
+      <w:r>
+        <w:t xml:space="preserve">, PHP và MySQL để xây dựng một hệ thống quản lý cụ thể. </w:t>
+      </w:r>
+    </w:p>
+    <w:p>
+      <w:pPr>
+        <w:rPr>
+          <w:lang w:val="vi-VN"/>
+        </w:rPr>
+      </w:pPr>
+    </w:p>
+    <w:p>
+      <w:pPr>
+        <w:pStyle w:val="nd"/>
+        <w:rPr>
+          <w:lang w:val="vi-VN"/>
+        </w:rPr>
+      </w:pPr>
+    </w:p>
+    <w:p>
+      <w:pPr>
+        <w:rPr>
+          <w:lang w:val="vi-VN"/>
+        </w:rPr>
+      </w:pPr>
+    </w:p>
+    <w:p>
+      <w:r>
+        <w:br w:type="page"/>
+      </w:r>
+    </w:p>
+    <w:p>
+      <w:pPr>
+        <w:pStyle w:val="Heading1"/>
+      </w:pPr>
+      <w:bookmarkStart w:id="18" w:name="_Toc243310704"/>
+      <w:r>
+        <w:rPr>
+          <w:caps w:val="0"/>
+        </w:rPr>
+        <w:lastRenderedPageBreak/>
+        <w:t>HIỆN</w:t>
+      </w:r>
+      <w:r>
+        <w:rPr>
+          <w:caps w:val="0"/>
+          <w:lang w:val="vi-VN"/>
+        </w:rPr>
+        <w:t xml:space="preserve"> THỰC </w:t>
+      </w:r>
+      <w:r>
+        <w:rPr>
+          <w:caps w:val="0"/>
+        </w:rPr>
+        <w:t>HÓA NGHIÊN CỨU</w:t>
+      </w:r>
+      <w:bookmarkEnd w:id="18"/>
+    </w:p>
+    <w:p>
+      <w:pPr>
+        <w:pStyle w:val="nd"/>
+        <w:ind w:firstLine="432"/>
+        <w:rPr>
+          <w:lang w:val="vi-VN"/>
+        </w:rPr>
+      </w:pPr>
+      <w:r>
+        <w:t>Chương</w:t>
+      </w:r>
+      <w:r>
+        <w:rPr>
+          <w:lang w:val="vi-VN"/>
+        </w:rPr>
+        <w:t xml:space="preserve"> 3</w:t>
+      </w:r>
+      <w:r>
+        <w:rPr>
+          <w:lang w:val="vi-VN"/>
+        </w:rPr>
+        <w:t xml:space="preserve"> </w:t>
+      </w:r>
+      <w:r>
+        <w:t xml:space="preserve">trình bày các phương pháp nghiên cứu được sử dụng trong quá trình thực hiện đề tài </w:t>
       </w:r>
       <w:r>
         <w:rPr>
           <w:rStyle w:val="Strong"/>
           <w:b w:val="0"/>
           <w:bCs w:val="0"/>
-          <w:szCs w:val="26"/>
-        </w:rPr>
-        <w:t>MySQL</w:t>
-      </w:r>
-      <w:r>
-        <w:t xml:space="preserve"> để quản lý dữ liệu</w:t>
-      </w:r>
-    </w:p>
-    <w:p>
-      <w:pPr>
-        <w:pStyle w:val="Heading3"/>
-        <w:rPr>
-          <w:lang w:val="vi-VN"/>
-        </w:rPr>
-      </w:pPr>
-      <w:bookmarkStart w:id="11" w:name="_Toc243310698"/>
-      <w:r>
-        <w:t>Lịch</w:t>
-      </w:r>
-      <w:r>
-        <w:rPr>
-          <w:lang w:val="vi-VN"/>
-        </w:rPr>
-        <w:t xml:space="preserve"> </w:t>
-      </w:r>
-      <w:r>
-        <w:rPr>
-          <w:lang w:val="vi-VN"/>
-        </w:rPr>
-        <w:t>sử hình thành và quá trình</w:t>
-      </w:r>
-      <w:r>
-        <w:rPr>
-          <w:lang w:val="vi-VN"/>
-        </w:rPr>
-        <w:t xml:space="preserve"> phát triển</w:t>
-      </w:r>
-      <w:bookmarkEnd w:id="11"/>
+        </w:rPr>
+        <w:t>“Xây dựng hệ thống quản lý sản phẩm và đơn hàng”</w:t>
+      </w:r>
+      <w:r>
+        <w:t>.</w:t>
+      </w:r>
+      <w:r>
+        <w:t xml:space="preserve"> Việc lựa chọn phương pháp nghiên cứu phù hợp giúp xác định rõ các yêu cầu của hệ thống, phân tích quy trình nghiệp vụ và xây dựng mô hình dữ liệu đáp ứng nhu cầu quản lý.</w:t>
+      </w:r>
+    </w:p>
+    <w:p>
+      <w:pPr>
+        <w:pStyle w:val="Heading2"/>
+        <w:jc w:val="both"/>
+        <w:rPr>
+          <w:lang w:val="vi-VN"/>
+        </w:rPr>
+      </w:pPr>
+      <w:bookmarkStart w:id="19" w:name="_Ref242367482"/>
+      <w:bookmarkStart w:id="20" w:name="_Toc243310705"/>
+      <w:r>
+        <w:t>Mô tả bài toán</w:t>
+      </w:r>
+      <w:bookmarkEnd w:id="19"/>
+      <w:bookmarkEnd w:id="20"/>
     </w:p>
     <w:p>
       <w:pPr>
@@ -7641,656 +8878,7 @@
         </w:rPr>
       </w:pPr>
       <w:r>
-        <w:t>PHP được khai sinh vào năm 1994 bởi lập trình viên người Đan Mạch-Canada tên là Rasmus Lerdorf. Ban đầu, nó chỉ là một tập hợp các mã kịch bản nhỏ ông viết để theo dõi lượng truy cập vào trang CV cá nhân của mình. Ông gọi nó là Personal Home Page Tools.</w:t>
-      </w:r>
-    </w:p>
-    <w:p>
-      <w:pPr>
-        <w:pStyle w:val="nd"/>
-        <w:rPr>
-          <w:lang w:val="vi-VN"/>
-        </w:rPr>
-      </w:pPr>
-      <w:r>
-        <w:rPr>
-          <w:lang w:val="vi-VN"/>
-        </w:rPr>
-        <w:t xml:space="preserve">1995: Sau khi công bố mã nguồn của PHP Tools, Rasmus đã phát triển thêm chức năng hỗ trợ xử lý biểu mẫu web và tương tác với cơ sở dữ liệu. Công cụ này </w:t>
-      </w:r>
-      <w:r>
-        <w:rPr>
-          <w:lang w:val="vi-VN"/>
-        </w:rPr>
-        <w:lastRenderedPageBreak/>
-        <w:t>được đặt tên là PHP/FI (Personal Home Page/Form Interpreter), cho phép lập trình viên tạo các trang web động. Đây là phiên bản PHP đầu tiên có thể sử dụng rộng rãi.</w:t>
-      </w:r>
-    </w:p>
-    <w:p>
-      <w:pPr>
-        <w:pStyle w:val="nd"/>
-        <w:rPr>
-          <w:lang w:val="vi-VN"/>
-        </w:rPr>
-      </w:pPr>
-      <w:r>
-        <w:rPr>
-          <w:lang w:val="vi-VN"/>
-        </w:rPr>
-        <w:t>1997: Sự phổ biến của PHP/FI dẫn đến việc cần một hệ thống mạnh mẽ hơn. Zeev Suraski và Andi Gutmans, hai lập trình viên từ Israel, đã tiến hành viết lại cốt lõi của PHP. Kết quả là một phiên bản ổn định và hiệu quả hơn, đặt nền móng cho PHP 3.</w:t>
-      </w:r>
-    </w:p>
-    <w:p>
-      <w:pPr>
-        <w:pStyle w:val="nd"/>
-        <w:rPr>
-          <w:lang w:val="vi-VN"/>
-        </w:rPr>
-      </w:pPr>
-      <w:r>
-        <w:rPr>
-          <w:lang w:val="vi-VN"/>
-        </w:rPr>
-        <w:t>1998: PHP 3 chính thức ra mắt, đánh dấu bước ngoặt lớn trong lịch sử phát triển của ngôn ngữ.</w:t>
-      </w:r>
-    </w:p>
-    <w:p>
-      <w:pPr>
-        <w:pStyle w:val="nd"/>
-        <w:rPr>
-          <w:lang w:val="vi-VN"/>
-        </w:rPr>
-      </w:pPr>
-      <w:r>
-        <w:rPr>
-          <w:lang w:val="vi-VN"/>
-        </w:rPr>
-        <w:t>2000: PHP 4 ra đời, sử dụng Zend Engine 1.0, một công cụ thực thi mới được phát triển bởi Zeev Suraski và Andi Gutmans. Phiên bản này cải thiện đáng kể hiệu suất và khả năng mở rộng, làm cho PHP trở thành lựa chọn ưu tiên cho các dự án lớn.</w:t>
-      </w:r>
-    </w:p>
-    <w:p>
-      <w:pPr>
-        <w:pStyle w:val="nd"/>
-        <w:rPr>
-          <w:lang w:val="vi-VN"/>
-        </w:rPr>
-      </w:pPr>
-      <w:r>
-        <w:rPr>
-          <w:lang w:val="vi-VN"/>
-        </w:rPr>
-        <w:t>2004: PHP 5 ra mắt với nhiều cải tiến mạnh mẽ nhờ Zend Engine 2.0. Phiên bản này đánh dấu sự trưởng thành của PHP trong việc hỗ trợ các mô hình lập trình hiện đại.</w:t>
-      </w:r>
-    </w:p>
-    <w:p>
-      <w:pPr>
-        <w:pStyle w:val="nd"/>
-        <w:rPr>
-          <w:lang w:val="vi-VN"/>
-        </w:rPr>
-      </w:pPr>
-      <w:r>
-        <w:rPr>
-          <w:lang w:val="vi-VN"/>
-        </w:rPr>
-        <w:t>2015: PHP 7 chính thức phát hành, sử dụng Zend Engine 3.0, mang lại những cải tiến vượt trội về hiệu suất và hiệu quả.</w:t>
-      </w:r>
-    </w:p>
-    <w:p>
-      <w:pPr>
-        <w:pStyle w:val="nd"/>
-        <w:rPr>
-          <w:lang w:val="vi-VN"/>
-        </w:rPr>
-      </w:pPr>
-      <w:r>
-        <w:rPr>
-          <w:lang w:val="vi-VN"/>
-        </w:rPr>
-        <w:t xml:space="preserve">2020: PHP 8 phát hành với những thay đổi quan trọng, đưa ngôn ngữ lên một tầm cao </w:t>
-      </w:r>
-      <w:r>
-        <w:rPr>
-          <w:lang w:val="vi-VN"/>
-        </w:rPr>
-        <w:t>mới</w:t>
-      </w:r>
-      <w:r>
-        <w:rPr>
-          <w:lang w:val="vi-VN"/>
-        </w:rPr>
-        <w:t>.</w:t>
-      </w:r>
-    </w:p>
-    <w:p>
-      <w:pPr>
-        <w:pStyle w:val="Heading3"/>
-        <w:rPr>
-          <w:lang w:val="vi-VN"/>
-        </w:rPr>
-      </w:pPr>
-      <w:bookmarkStart w:id="12" w:name="_Toc243310699"/>
-      <w:r>
-        <w:t>Vai trò của</w:t>
-      </w:r>
-      <w:r>
-        <w:rPr>
-          <w:lang w:val="vi-VN"/>
-        </w:rPr>
-        <w:t xml:space="preserve"> ngôn ngữ PHP</w:t>
-      </w:r>
-      <w:bookmarkEnd w:id="12"/>
-    </w:p>
-    <w:p>
-      <w:pPr>
-        <w:pStyle w:val="nd"/>
-        <w:rPr>
-          <w:lang w:val="vi-VN"/>
-        </w:rPr>
-      </w:pPr>
-      <w:r>
-        <w:rPr>
-          <w:lang w:val="vi-VN"/>
-        </w:rPr>
-        <w:t>PHP đóng vai trò là "bộ não" phía máy chủ (server-side) của website, xử lý logic, tương tác dữ liệu và tạo nội dung động trước khi gửi về trình duyệt, giúp xây dựng các trang web động và kết nối hiệu quả với cơ sở dữ liệu (CSDL)</w:t>
-      </w:r>
-    </w:p>
-    <w:p>
-      <w:pPr>
-        <w:pStyle w:val="nd"/>
-        <w:rPr>
-          <w:lang w:val="vi-VN"/>
-        </w:rPr>
-      </w:pPr>
-      <w:r>
-        <w:rPr>
-          <w:lang w:val="vi-VN"/>
-        </w:rPr>
-        <w:t xml:space="preserve">Các vai trò </w:t>
-      </w:r>
-      <w:r>
-        <w:rPr>
-          <w:lang w:val="vi-VN"/>
-        </w:rPr>
-        <w:t>của PHP</w:t>
-      </w:r>
-      <w:r>
-        <w:rPr>
-          <w:lang w:val="vi-VN"/>
-        </w:rPr>
-        <w:t>:</w:t>
-      </w:r>
-    </w:p>
-    <w:p>
-      <w:pPr>
-        <w:pStyle w:val="nd"/>
-        <w:rPr>
-          <w:lang w:val="vi-VN"/>
-        </w:rPr>
-      </w:pPr>
-      <w:r>
-        <w:rPr>
-          <w:lang w:val="vi-VN"/>
-        </w:rPr>
-        <w:t xml:space="preserve">- Xử </w:t>
-      </w:r>
-      <w:r>
-        <w:rPr>
-          <w:bCs/>
-          <w:lang w:val="vi-VN"/>
-        </w:rPr>
-        <w:t>lý phía máy chủ</w:t>
-      </w:r>
-      <w:r>
-        <w:rPr>
-          <w:lang w:val="vi-VN"/>
-        </w:rPr>
-        <w:t>: PHP được thực thi trên web server, xử lý yêu cầu từ người dùng, truy vấn CSDL</w:t>
-      </w:r>
-    </w:p>
-    <w:p>
-      <w:pPr>
-        <w:pStyle w:val="nd"/>
-        <w:rPr>
-          <w:lang w:val="vi-VN"/>
-        </w:rPr>
-      </w:pPr>
-      <w:r>
-        <w:rPr>
-          <w:lang w:val="vi-VN"/>
-        </w:rPr>
-        <w:t xml:space="preserve">- </w:t>
-      </w:r>
-      <w:r>
-        <w:rPr>
-          <w:bCs/>
-          <w:lang w:val="vi-VN"/>
-        </w:rPr>
-        <w:t>Tạo nội dung động:</w:t>
-      </w:r>
-      <w:r>
-        <w:rPr>
-          <w:lang w:val="vi-VN"/>
-        </w:rPr>
-        <w:t xml:space="preserve"> Cho phép nhúng trực tiếp vào HTML, PHP tạo ra nội dung thay đổi dựa trên dữ </w:t>
-      </w:r>
-      <w:r>
-        <w:rPr>
-          <w:lang w:val="vi-VN"/>
-        </w:rPr>
-        <w:t>liệu.</w:t>
-      </w:r>
-    </w:p>
-    <w:p>
-      <w:pPr>
-        <w:pStyle w:val="nd"/>
-        <w:rPr>
-          <w:lang w:val="vi-VN"/>
-        </w:rPr>
-      </w:pPr>
-      <w:r>
-        <w:rPr>
-          <w:lang w:val="vi-VN"/>
-        </w:rPr>
-        <w:t xml:space="preserve">- </w:t>
-      </w:r>
-      <w:r>
-        <w:rPr>
-          <w:bCs/>
-          <w:lang w:val="vi-VN"/>
-        </w:rPr>
-        <w:t>Tương tác với cơ sở dữ liệu:</w:t>
-      </w:r>
-      <w:r>
-        <w:rPr>
-          <w:lang w:val="vi-VN"/>
-        </w:rPr>
-        <w:t xml:space="preserve"> PHP là công cụ mạnh mẽ để kết nối, truy vấn, cập nhật và quản lý dữ liệu trong các hệ quản trị </w:t>
-      </w:r>
-      <w:r>
-        <w:rPr>
-          <w:lang w:val="vi-VN"/>
-        </w:rPr>
-        <w:t>CSDL.</w:t>
-      </w:r>
-    </w:p>
-    <w:p>
-      <w:pPr>
-        <w:pStyle w:val="Heading2"/>
-        <w:rPr>
-          <w:lang w:val="vi-VN"/>
-        </w:rPr>
-      </w:pPr>
-      <w:bookmarkStart w:id="13" w:name="_Toc243310700"/>
-      <w:r>
-        <w:lastRenderedPageBreak/>
-        <w:t xml:space="preserve">Ngôn ngữ truy vấn </w:t>
-      </w:r>
-      <w:r>
-        <w:t>SQL</w:t>
-      </w:r>
-      <w:bookmarkEnd w:id="13"/>
-    </w:p>
-    <w:p>
-      <w:pPr>
-        <w:pStyle w:val="Heading3"/>
-        <w:rPr>
-          <w:lang w:val="vi-VN"/>
-        </w:rPr>
-      </w:pPr>
-      <w:bookmarkStart w:id="14" w:name="_Toc243310701"/>
-      <w:r>
-        <w:rPr>
-          <w:lang w:val="vi-VN"/>
-        </w:rPr>
-        <w:t>Khái quát về ngôn ngữ SQL</w:t>
-      </w:r>
-      <w:bookmarkEnd w:id="14"/>
-    </w:p>
-    <w:p>
-      <w:pPr>
-        <w:pStyle w:val="nd"/>
-        <w:rPr>
-          <w:lang w:val="vi-VN"/>
-        </w:rPr>
-      </w:pPr>
-      <w:r>
-        <w:t xml:space="preserve">SQL, viết tắt của Structured Query Language (ngôn ngữ hỏi có cấu trúc), là công cụ sử dụng để tổ chức, quản lý và truy xuất dữ liệu đuợc lưu trữ trong các cơ sở dữ liệu. SQL là một hệ thống ngôn ngữ bao gồm tập các câu lệnh sử dụng để tương tác với cơ sở dữ liệu quan hệ. Tên gọi ngôn ngữ hỏi có cấu trúc phần nào làm chúng ta liên tưởng đến một công cụ (ngôn ngữ) dùng để truy xuất dữ liệu trong các cơ sở dữ liệu. Thực sự mà nói, khả năng của SQL vượt xa so với một công cụ truy xuất dữ liệu, mặc dù đây là mục đích ban đầu khi SQL được xây dựng nên và truy xuất dữ liệu vẫn còn là một trong những chức năng quan trọng của nó. SQL được sử dụng để điều khiển tất cả các chức năng mà một hệ quản trị cơ sở dữ liệu cung cấp cho người dùng bao gồm: </w:t>
-      </w:r>
-    </w:p>
-    <w:p>
-      <w:pPr>
-        <w:pStyle w:val="nd"/>
-        <w:rPr>
-          <w:lang w:val="vi-VN"/>
-        </w:rPr>
-      </w:pPr>
-      <w:r>
-        <w:rPr>
-          <w:lang w:val="vi-VN"/>
-        </w:rPr>
-        <w:t xml:space="preserve">- </w:t>
-      </w:r>
-      <w:r>
-        <w:t>Định nghĩa dữ liệu: SQL cung cấp khả năng định nghĩa các cơ sở dữ liệu, các cấu trúc lưu trữ và tổ chức dữ liệu cũng như mối quan hệ giữa các thành phần dữ liệu.</w:t>
-      </w:r>
-    </w:p>
-    <w:p>
-      <w:pPr>
-        <w:pStyle w:val="nd"/>
-        <w:rPr>
-          <w:lang w:val="vi-VN"/>
-        </w:rPr>
-      </w:pPr>
-      <w:r>
-        <w:rPr>
-          <w:lang w:val="vi-VN"/>
-        </w:rPr>
-        <w:t xml:space="preserve">- </w:t>
-      </w:r>
-      <w:r>
-        <w:t xml:space="preserve">Truy xuất và thao tác dữ liệu: Với SQL, người dùng có thể dễ dàng thực hiện các thao tác truy xuất, bổ sung, cập nhật và loại bỏ dữ liệu trong các cơ sở dữ liệu. </w:t>
-      </w:r>
-    </w:p>
-    <w:p>
-      <w:pPr>
-        <w:pStyle w:val="nd"/>
-        <w:rPr>
-          <w:lang w:val="vi-VN"/>
-        </w:rPr>
-      </w:pPr>
-      <w:r>
-        <w:rPr>
-          <w:lang w:val="vi-VN"/>
-        </w:rPr>
-        <w:t xml:space="preserve">- </w:t>
-      </w:r>
-      <w:r>
-        <w:t xml:space="preserve">Điều khiển truy cập: SQL có thể được sử dụng để cấp phát và kiểm soát các thao tác của người sử dụng trên dữ liệu, đảm bảo sự an toàn cho cơ sở dữ </w:t>
-      </w:r>
-      <w:r>
-        <w:t>liệu</w:t>
-      </w:r>
-      <w:r>
-        <w:rPr>
-          <w:lang w:val="vi-VN"/>
-        </w:rPr>
-        <w:t>.</w:t>
-      </w:r>
-    </w:p>
-    <w:p>
-      <w:pPr>
-        <w:pStyle w:val="nd"/>
-        <w:rPr>
-          <w:lang w:val="vi-VN"/>
-        </w:rPr>
-      </w:pPr>
-      <w:r>
-        <w:rPr>
-          <w:lang w:val="vi-VN"/>
-        </w:rPr>
-        <w:t xml:space="preserve">- </w:t>
-      </w:r>
-      <w:r>
-        <w:t xml:space="preserve">Đảm bảo toàn vẹn dữ liệu: SQL định nghĩa các ràng buộc toàn vẹn trong cơ sở dữ liệu nhờ đó đảm bảo tính hợp lệ và chính xác của dữ liệu trước các thao tác cập nhật cũng như các lỗi của hệ thống. </w:t>
-      </w:r>
-    </w:p>
-    <w:p>
-      <w:pPr>
-        <w:pStyle w:val="Heading3"/>
-        <w:rPr>
-          <w:lang w:val="vi-VN"/>
-        </w:rPr>
-      </w:pPr>
-      <w:bookmarkStart w:id="15" w:name="_Toc243310702"/>
-      <w:r>
-        <w:t>Vai trò của SQL</w:t>
-      </w:r>
-      <w:bookmarkEnd w:id="15"/>
-    </w:p>
-    <w:p>
-      <w:pPr>
-        <w:pStyle w:val="nd"/>
-        <w:rPr>
-          <w:lang w:val="vi-VN"/>
-        </w:rPr>
-      </w:pPr>
-      <w:r>
-        <w:t>SQL không phải là một hệ quản trị cơ sở dữ liệu, nó không thể tồn tại độc lập. SQL thực sự là một phần của hệ quản trị cơ sở dữ liệu, nó xuất hiện trong các hệ quản trị cơ sở dữ liệu với vai trò ngôn ngữ và là công cụ giao tiếp giữa người sử dụng và hệ quản trị cơ sở dữ liệu.</w:t>
-      </w:r>
-    </w:p>
-    <w:p>
-      <w:pPr>
-        <w:pStyle w:val="nd"/>
-        <w:rPr>
-          <w:lang w:val="vi-VN"/>
-        </w:rPr>
-      </w:pPr>
-      <w:r>
-        <w:t xml:space="preserve">SQL có những vai trò như sau: </w:t>
-      </w:r>
-    </w:p>
-    <w:p>
-      <w:pPr>
-        <w:pStyle w:val="nd"/>
-        <w:rPr>
-          <w:lang w:val="vi-VN"/>
-        </w:rPr>
-      </w:pPr>
-      <w:r>
-        <w:rPr>
-          <w:lang w:val="vi-VN"/>
-        </w:rPr>
-        <w:t xml:space="preserve">- </w:t>
-      </w:r>
-      <w:r>
-        <w:t xml:space="preserve">SQL là ngôn ngữ hỏi có tính tương tác: Người sử dụng có thể dễ dàng thông qua các trình tiện ích để gởi các yêu cầu dưới dạng các câu lệnh SQL đến cơ sở dữ liệu và nhận kết quả trả về từ cơ sở dữ </w:t>
-      </w:r>
-      <w:r>
-        <w:t>liệu</w:t>
-      </w:r>
-      <w:r>
-        <w:rPr>
-          <w:lang w:val="vi-VN"/>
-        </w:rPr>
-        <w:t xml:space="preserve">. </w:t>
-      </w:r>
-    </w:p>
-    <w:p>
-      <w:pPr>
-        <w:pStyle w:val="nd"/>
-        <w:rPr>
-          <w:lang w:val="vi-VN"/>
-        </w:rPr>
-      </w:pPr>
-      <w:r>
-        <w:rPr>
-          <w:lang w:val="vi-VN"/>
-        </w:rPr>
-        <w:lastRenderedPageBreak/>
-        <w:t xml:space="preserve">- </w:t>
-      </w:r>
-      <w:r>
-        <w:t xml:space="preserve">SQL là ngôn ngữ lập trình cơ sở dữ liệu: Các lập trình viên có thể nhúng các câu lệnh SQL vào trong các ngôn ngữ lập trình để xây dựng nên các chương trình ứng dụng giao tiếp với cơ sở dữ </w:t>
-      </w:r>
-      <w:r>
-        <w:t>liệu</w:t>
-      </w:r>
-      <w:r>
-        <w:rPr>
-          <w:lang w:val="vi-VN"/>
-        </w:rPr>
-        <w:t>.</w:t>
-      </w:r>
-    </w:p>
-    <w:p>
-      <w:pPr>
-        <w:pStyle w:val="nd"/>
-        <w:rPr>
-          <w:lang w:val="vi-VN"/>
-        </w:rPr>
-      </w:pPr>
-      <w:r>
-        <w:rPr>
-          <w:lang w:val="vi-VN"/>
-        </w:rPr>
-        <w:t xml:space="preserve">- </w:t>
-      </w:r>
-      <w:r>
-        <w:t>SQL là ngôn ngữ quản trị cơ sở dữ liệu: Thông qua SQL, người quản trị cơ sở dữ liệu có thể quản lý được cơ sở dữ liệu, định nghĩa các cấu trúc lưu trữ dữ liệu, điều khiển truy cập cơ sở dữ liệu,...</w:t>
-      </w:r>
-    </w:p>
-    <w:p>
-      <w:pPr>
-        <w:pStyle w:val="nd"/>
-        <w:rPr>
-          <w:lang w:val="vi-VN"/>
-        </w:rPr>
-      </w:pPr>
-      <w:r>
-        <w:rPr>
-          <w:lang w:val="vi-VN"/>
-        </w:rPr>
-        <w:t>- S</w:t>
-      </w:r>
-      <w:r>
-        <w:t xml:space="preserve">QL là ngôn ngữ cho các hệ thống khách/chủ (client/server): Trong các hệ thống cơ sở dữ liệu khách/chủ, SQL được sử dụng như là công cụ để giao tiếp giữa các trình ứng dụng phía máy khách với máy chủ cơ sở dữ liệu. </w:t>
-      </w:r>
-    </w:p>
-    <w:p>
-      <w:pPr>
-        <w:pStyle w:val="nd"/>
-        <w:rPr>
-          <w:lang w:val="vi-VN"/>
-        </w:rPr>
-      </w:pPr>
-      <w:r>
-        <w:rPr>
-          <w:lang w:val="vi-VN"/>
-        </w:rPr>
-        <w:t xml:space="preserve">- </w:t>
-      </w:r>
-      <w:r>
-        <w:t xml:space="preserve">SQL là ngôn ngữ truy cập dữ liệu trên Internet: Cho đến nay, hầu hết các máy chủ Web cũng như các máy chủ trên Internet sử dụng SQL với vai trò là ngôn ngữ để tương tác với dữ liệu trong các cơ sở dữ liệu. </w:t>
-      </w:r>
-    </w:p>
-    <w:p>
-      <w:pPr>
-        <w:pStyle w:val="nd"/>
-        <w:rPr>
-          <w:lang w:val="vi-VN"/>
-        </w:rPr>
-      </w:pPr>
-      <w:r>
-        <w:rPr>
-          <w:lang w:val="vi-VN"/>
-        </w:rPr>
-        <w:t xml:space="preserve">- </w:t>
-      </w:r>
-      <w:r>
-        <w:t>SQL là ngôn ngữ cơ sở dữ liệu phân tán: Đối với các hệ quản trị cơ sở dữ liệu phân tán, mỗi một hệ thống sử dụng SQL để giao tiếp với các hệ thống khác trên mạng, gởi và nhận các yêu cầu truy xuất dữ liệu với nhau. 8 Khoa CNTT - Trường ĐHKH Huế Giáo trình SQL</w:t>
-      </w:r>
-    </w:p>
-    <w:p>
-      <w:pPr>
-        <w:pStyle w:val="nd"/>
-        <w:rPr>
-          <w:lang w:val="vi-VN"/>
-        </w:rPr>
-      </w:pPr>
-      <w:r>
-        <w:rPr>
-          <w:lang w:val="vi-VN"/>
-        </w:rPr>
-        <w:t xml:space="preserve">- </w:t>
-      </w:r>
-      <w:r>
-        <w:t>SQL là ngôn ngữ sử dụng cho các cổng giao tiếp cơ sở dữ liệu: Trong một hệ thống mạng máy tính với nhiều hệ quản trị cơ sở dữ liệu khác nhau, SQL thường được sử dụng như là một chuẩn ngôn ngữ để giao tiếp giữa các hệ quản trị cơ sở dữ liệu.</w:t>
-      </w:r>
-    </w:p>
-    <w:p>
-      <w:pPr>
-        <w:pStyle w:val="Heading3"/>
-        <w:rPr>
-          <w:lang w:val="vi-VN"/>
-        </w:rPr>
-      </w:pPr>
-      <w:bookmarkStart w:id="16" w:name="_Toc243310703"/>
-      <w:r>
-        <w:t>Các nhóm lệnh SQL</w:t>
-      </w:r>
-      <w:bookmarkEnd w:id="16"/>
-    </w:p>
-    <w:p>
-      <w:pPr>
-        <w:rPr>
-          <w:lang w:val="vi-VN"/>
-        </w:rPr>
-      </w:pPr>
-    </w:p>
-    <w:p>
-      <w:pPr>
-        <w:rPr>
-          <w:lang w:val="vi-VN"/>
-        </w:rPr>
-      </w:pPr>
-    </w:p>
-    <w:p>
-      <w:r>
-        <w:br w:type="page"/>
-      </w:r>
-    </w:p>
-    <w:p>
-      <w:pPr>
-        <w:pStyle w:val="Heading1"/>
-      </w:pPr>
-      <w:bookmarkStart w:id="17" w:name="_Toc243310704"/>
-      <w:r>
-        <w:rPr>
-          <w:caps w:val="0"/>
-        </w:rPr>
-        <w:lastRenderedPageBreak/>
-        <w:t>HIỆN</w:t>
-      </w:r>
-      <w:r>
-        <w:rPr>
-          <w:caps w:val="0"/>
-          <w:lang w:val="vi-VN"/>
-        </w:rPr>
-        <w:t xml:space="preserve"> THỰC </w:t>
-      </w:r>
-      <w:r>
-        <w:rPr>
-          <w:caps w:val="0"/>
-        </w:rPr>
-        <w:t>HÓA NGHIÊN CỨU</w:t>
-      </w:r>
-      <w:bookmarkEnd w:id="17"/>
-    </w:p>
-    <w:p>
-      <w:pPr>
-        <w:pStyle w:val="nd"/>
-        <w:ind w:firstLine="432"/>
-        <w:rPr>
-          <w:lang w:val="vi-VN"/>
-        </w:rPr>
-      </w:pPr>
-      <w:r>
-        <w:t>Chương</w:t>
-      </w:r>
-      <w:r>
-        <w:rPr>
-          <w:lang w:val="vi-VN"/>
-        </w:rPr>
-        <w:t xml:space="preserve"> 3</w:t>
-      </w:r>
-      <w:r>
-        <w:rPr>
-          <w:lang w:val="vi-VN"/>
-        </w:rPr>
-        <w:t xml:space="preserve"> </w:t>
-      </w:r>
-      <w:r>
-        <w:t xml:space="preserve">trình bày các phương pháp nghiên cứu được sử dụng trong quá trình thực hiện đề tài </w:t>
+        <w:t xml:space="preserve">Đề tài </w:t>
       </w:r>
       <w:r>
         <w:rPr>
@@ -8301,59 +8889,18 @@
         <w:t>“Xây dựng hệ thống quản lý sản phẩm và đơn hàng”</w:t>
       </w:r>
       <w:r>
-        <w:t>.</w:t>
-      </w:r>
-      <w:r>
-        <w:t xml:space="preserve"> Việc lựa chọn phương pháp nghiên cứu phù hợp giúp xác định rõ các yêu cầu của hệ thống, phân tích quy trình nghiệp vụ và xây dựng mô hình dữ liệu đáp ứng nhu cầu quản lý.</w:t>
+        <w:t xml:space="preserve"> nhằm hỗ trợ cửa hàng, doanh nghiệp quản lý tập trung thông tin sản phẩm, danh mục, nhà cung cấp, khách hàng, nhân viên và đơn hàng. Hệ thống được xây dựng trên nền tảng web, hỗ trợ thêm, sửa, xóa, tìm kiếm và cập nhật dữ liệu, quản lý hình ảnh sản phẩm, theo dõi chi tiết đơn hàng, số lượng và đơn giá. Dữ liệu được lưu trữ trong cơ sở dữ liệu MySQL, giúp nâng cao hiệu quả quản lý, hạn chế sai sót và thuận tiện cho việc tra cứu, mở rộng hệ thống.</w:t>
       </w:r>
     </w:p>
     <w:p>
       <w:pPr>
         <w:pStyle w:val="Heading2"/>
-        <w:jc w:val="both"/>
-        <w:rPr>
-          <w:lang w:val="vi-VN"/>
-        </w:rPr>
-      </w:pPr>
-      <w:bookmarkStart w:id="18" w:name="_Ref242367482"/>
-      <w:bookmarkStart w:id="19" w:name="_Toc243310705"/>
-      <w:r>
-        <w:t>Mô tả bài toán</w:t>
-      </w:r>
-      <w:bookmarkEnd w:id="18"/>
-      <w:bookmarkEnd w:id="19"/>
-    </w:p>
-    <w:p>
-      <w:pPr>
-        <w:pStyle w:val="nd"/>
-        <w:rPr>
-          <w:lang w:val="vi-VN"/>
-        </w:rPr>
-      </w:pPr>
-      <w:r>
-        <w:t xml:space="preserve">Đề tài </w:t>
-      </w:r>
-      <w:r>
-        <w:rPr>
-          <w:rStyle w:val="Strong"/>
-          <w:b w:val="0"/>
-          <w:bCs w:val="0"/>
-        </w:rPr>
-        <w:t>“Xây dựng hệ thống quản lý sản phẩm và đơn hàng”</w:t>
-      </w:r>
-      <w:r>
-        <w:t xml:space="preserve"> nhằm hỗ trợ cửa hàng, doanh nghiệp quản lý tập trung thông tin sản phẩm, danh mục, nhà cung cấp, khách hàng, nhân viên và đơn hàng. Hệ thống được xây dựng trên nền tảng web, hỗ trợ thêm, sửa, xóa, tìm kiếm và cập nhật dữ liệu, quản lý hình ảnh sản phẩm, theo dõi chi tiết đơn hàng, số lượng và đơn giá. Dữ liệu được lưu trữ trong cơ sở dữ liệu MySQL, giúp nâng cao hiệu quả quản lý, hạn chế sai sót và thuận tiện cho việc tra cứu, mở rộng hệ thống.</w:t>
-      </w:r>
-    </w:p>
-    <w:p>
-      <w:pPr>
-        <w:pStyle w:val="Heading2"/>
-      </w:pPr>
-      <w:bookmarkStart w:id="20" w:name="_Toc243310706"/>
+      </w:pPr>
+      <w:bookmarkStart w:id="21" w:name="_Toc243310706"/>
       <w:r>
         <w:t>Đặc tả yêu cầu</w:t>
       </w:r>
-      <w:bookmarkEnd w:id="20"/>
+      <w:bookmarkEnd w:id="21"/>
     </w:p>
     <w:p>
       <w:pPr>
@@ -8362,7 +8909,7 @@
           <w:lang w:val="vi-VN"/>
         </w:rPr>
       </w:pPr>
-      <w:bookmarkStart w:id="21" w:name="_Toc243310707"/>
+      <w:bookmarkStart w:id="22" w:name="_Toc243310707"/>
       <w:r>
         <w:t>Yêu cầ</w:t>
       </w:r>
@@ -8372,7 +8919,7 @@
       <w:r>
         <w:t xml:space="preserve"> chức năng</w:t>
       </w:r>
-      <w:bookmarkEnd w:id="21"/>
+      <w:bookmarkEnd w:id="22"/>
     </w:p>
     <w:p>
       <w:pPr>
@@ -8505,8 +9052,8 @@
           <w:lang w:val="vi-VN"/>
         </w:rPr>
       </w:pPr>
-      <w:bookmarkStart w:id="22" w:name="_Ref242454868"/>
-      <w:bookmarkStart w:id="23" w:name="_Toc243308586"/>
+      <w:bookmarkStart w:id="23" w:name="_Ref242454868"/>
+      <w:bookmarkStart w:id="24" w:name="_Toc243308586"/>
       <w:r>
         <w:rPr>
           <w:i w:val="0"/>
@@ -8629,7 +9176,7 @@
         </w:rPr>
         <w:fldChar w:fldCharType="end"/>
       </w:r>
-      <w:bookmarkEnd w:id="22"/>
+      <w:bookmarkEnd w:id="23"/>
       <w:r>
         <w:t xml:space="preserve"> </w:t>
       </w:r>
@@ -8643,7 +9190,7 @@
         </w:rPr>
         <w:t>Các yêu cầu chức năng của hệ thống</w:t>
       </w:r>
-      <w:bookmarkEnd w:id="23"/>
+      <w:bookmarkEnd w:id="24"/>
     </w:p>
     <w:tbl>
       <w:tblPr>
@@ -10583,7 +11130,7 @@
           <w:lang w:val="vi-VN"/>
         </w:rPr>
       </w:pPr>
-      <w:bookmarkStart w:id="24" w:name="_Toc243310708"/>
+      <w:bookmarkStart w:id="25" w:name="_Toc243310708"/>
       <w:r>
         <w:t xml:space="preserve">Yêu cầu </w:t>
       </w:r>
@@ -10593,7 +11140,7 @@
       <w:r>
         <w:t>chức năng</w:t>
       </w:r>
-      <w:bookmarkEnd w:id="24"/>
+      <w:bookmarkEnd w:id="25"/>
     </w:p>
     <w:p>
       <w:pPr>
@@ -10726,8 +11273,8 @@
           <w:lang w:val="vi-VN"/>
         </w:rPr>
       </w:pPr>
-      <w:bookmarkStart w:id="25" w:name="_Ref242455183"/>
-      <w:bookmarkStart w:id="26" w:name="_Toc243308587"/>
+      <w:bookmarkStart w:id="26" w:name="_Ref242455183"/>
+      <w:bookmarkStart w:id="27" w:name="_Toc243308587"/>
       <w:r>
         <w:rPr>
           <w:i w:val="0"/>
@@ -10850,7 +11397,7 @@
         </w:rPr>
         <w:fldChar w:fldCharType="end"/>
       </w:r>
-      <w:bookmarkEnd w:id="25"/>
+      <w:bookmarkEnd w:id="26"/>
       <w:r>
         <w:rPr>
           <w:i w:val="0"/>
@@ -10893,7 +11440,7 @@
         </w:rPr>
         <w:t>chức năng</w:t>
       </w:r>
-      <w:bookmarkEnd w:id="26"/>
+      <w:bookmarkEnd w:id="27"/>
     </w:p>
     <w:tbl>
       <w:tblPr>
@@ -11808,12 +12355,12 @@
           <w:lang w:val="vi-VN"/>
         </w:rPr>
       </w:pPr>
-      <w:bookmarkStart w:id="27" w:name="_Toc243310709"/>
+      <w:bookmarkStart w:id="28" w:name="_Toc243310709"/>
       <w:r>
         <w:lastRenderedPageBreak/>
         <w:t>Kiến trúc hệ thống</w:t>
       </w:r>
-      <w:bookmarkEnd w:id="27"/>
+      <w:bookmarkEnd w:id="28"/>
     </w:p>
     <w:p>
       <w:pPr>
@@ -11883,8 +12430,8 @@
           <w:lang w:val="vi-VN"/>
         </w:rPr>
       </w:pPr>
-      <w:bookmarkStart w:id="28" w:name="_Toc242546993"/>
-      <w:bookmarkStart w:id="29" w:name="_Toc242972285"/>
+      <w:bookmarkStart w:id="29" w:name="_Toc242546993"/>
+      <w:bookmarkStart w:id="30" w:name="_Toc242972285"/>
       <w:r>
         <w:rPr>
           <w:i w:val="0"/>
@@ -12028,8 +12575,8 @@
         </w:rPr>
         <w:t xml:space="preserve"> trúc hệ thống</w:t>
       </w:r>
-      <w:bookmarkEnd w:id="28"/>
       <w:bookmarkEnd w:id="29"/>
+      <w:bookmarkEnd w:id="30"/>
     </w:p>
     <w:p>
       <w:pPr>
@@ -12067,12 +12614,12 @@
           <w:lang w:val="vi-VN"/>
         </w:rPr>
       </w:pPr>
-      <w:bookmarkStart w:id="30" w:name="_Toc243310710"/>
+      <w:bookmarkStart w:id="31" w:name="_Toc243310710"/>
       <w:r>
         <w:lastRenderedPageBreak/>
         <w:t>Thiết kế dữ liệu</w:t>
       </w:r>
-      <w:bookmarkEnd w:id="30"/>
+      <w:bookmarkEnd w:id="31"/>
     </w:p>
     <w:p>
       <w:pPr>
@@ -12081,14 +12628,14 @@
           <w:lang w:val="vi-VN"/>
         </w:rPr>
       </w:pPr>
-      <w:bookmarkStart w:id="31" w:name="_Toc243310711"/>
+      <w:bookmarkStart w:id="32" w:name="_Toc243310711"/>
       <w:r>
         <w:rPr>
           <w:lang w:val="vi-VN"/>
         </w:rPr>
         <w:t>Mô hình ERD</w:t>
       </w:r>
-      <w:bookmarkEnd w:id="31"/>
+      <w:bookmarkEnd w:id="32"/>
     </w:p>
     <w:p>
       <w:pPr>
@@ -12160,7 +12707,7 @@
           <w:lang w:val="vi-VN"/>
         </w:rPr>
       </w:pPr>
-      <w:bookmarkStart w:id="32" w:name="_Toc242972286"/>
+      <w:bookmarkStart w:id="33" w:name="_Toc242972286"/>
       <w:r>
         <w:rPr>
           <w:i w:val="0"/>
@@ -12294,17 +12841,17 @@
         </w:rPr>
         <w:t xml:space="preserve"> Mô hình ERD</w:t>
       </w:r>
-      <w:bookmarkEnd w:id="32"/>
+      <w:bookmarkEnd w:id="33"/>
     </w:p>
     <w:p>
       <w:pPr>
         <w:pStyle w:val="Heading3"/>
       </w:pPr>
-      <w:bookmarkStart w:id="33" w:name="_Toc243310712"/>
+      <w:bookmarkStart w:id="34" w:name="_Toc243310712"/>
       <w:r>
         <w:t>Chi tiết các thực thể</w:t>
       </w:r>
-      <w:bookmarkEnd w:id="33"/>
+      <w:bookmarkEnd w:id="34"/>
     </w:p>
     <w:p>
       <w:pPr>
@@ -12531,9 +13078,9 @@
           <w:lang w:val="vi-VN"/>
         </w:rPr>
       </w:pPr>
-      <w:bookmarkStart w:id="34" w:name="_Ref242454215"/>
-      <w:bookmarkStart w:id="35" w:name="_Ref242645622"/>
-      <w:bookmarkStart w:id="36" w:name="_Toc243308588"/>
+      <w:bookmarkStart w:id="35" w:name="_Ref242454215"/>
+      <w:bookmarkStart w:id="36" w:name="_Ref242645622"/>
+      <w:bookmarkStart w:id="37" w:name="_Toc243308588"/>
       <w:r>
         <w:rPr>
           <w:i w:val="0"/>
@@ -12657,7 +13204,7 @@
         </w:rPr>
         <w:fldChar w:fldCharType="end"/>
       </w:r>
-      <w:bookmarkEnd w:id="34"/>
+      <w:bookmarkEnd w:id="35"/>
       <w:r>
         <w:rPr>
           <w:i w:val="0"/>
@@ -12709,8 +13256,8 @@
         </w:rPr>
         <w:t>ategories</w:t>
       </w:r>
-      <w:bookmarkEnd w:id="35"/>
       <w:bookmarkEnd w:id="36"/>
+      <w:bookmarkEnd w:id="37"/>
     </w:p>
     <w:tbl>
       <w:tblPr>
@@ -13162,12 +13709,12 @@
           <w:lang w:val="vi-VN"/>
         </w:rPr>
       </w:pPr>
-      <w:bookmarkStart w:id="37" w:name="_Ref242822477"/>
-      <w:bookmarkStart w:id="38" w:name="_Ref242645558"/>
-      <w:bookmarkStart w:id="39" w:name="_Ref242645572"/>
-      <w:bookmarkStart w:id="40" w:name="_Ref242645608"/>
-      <w:bookmarkStart w:id="41" w:name="_Ref242645619"/>
-      <w:bookmarkStart w:id="42" w:name="_Toc243308589"/>
+      <w:bookmarkStart w:id="38" w:name="_Ref242822477"/>
+      <w:bookmarkStart w:id="39" w:name="_Ref242645558"/>
+      <w:bookmarkStart w:id="40" w:name="_Ref242645572"/>
+      <w:bookmarkStart w:id="41" w:name="_Ref242645608"/>
+      <w:bookmarkStart w:id="42" w:name="_Ref242645619"/>
+      <w:bookmarkStart w:id="43" w:name="_Toc243308589"/>
       <w:r>
         <w:t xml:space="preserve">Bảng </w:t>
       </w:r>
@@ -13216,24 +13763,24 @@
         </w:rPr>
         <w:fldChar w:fldCharType="end"/>
       </w:r>
-      <w:bookmarkEnd w:id="37"/>
+      <w:bookmarkEnd w:id="38"/>
       <w:r>
         <w:rPr>
           <w:lang w:val="vi-VN"/>
         </w:rPr>
         <w:t xml:space="preserve"> Thực thể </w:t>
       </w:r>
-      <w:bookmarkEnd w:id="38"/>
       <w:bookmarkEnd w:id="39"/>
       <w:bookmarkEnd w:id="40"/>
       <w:bookmarkEnd w:id="41"/>
+      <w:bookmarkEnd w:id="42"/>
       <w:r>
         <w:rPr>
           <w:lang w:val="vi-VN"/>
         </w:rPr>
         <w:t>suppliers</w:t>
       </w:r>
-      <w:bookmarkEnd w:id="42"/>
+      <w:bookmarkEnd w:id="43"/>
     </w:p>
     <w:tbl>
       <w:tblPr>
@@ -14139,9 +14686,9 @@
           <w:lang w:val="vi-VN"/>
         </w:rPr>
       </w:pPr>
-      <w:bookmarkStart w:id="43" w:name="_Ref242454583"/>
-      <w:bookmarkStart w:id="44" w:name="_Ref242645705"/>
-      <w:bookmarkStart w:id="45" w:name="_Toc243308590"/>
+      <w:bookmarkStart w:id="44" w:name="_Ref242454583"/>
+      <w:bookmarkStart w:id="45" w:name="_Ref242645705"/>
+      <w:bookmarkStart w:id="46" w:name="_Toc243308590"/>
       <w:r>
         <w:rPr>
           <w:szCs w:val="26"/>
@@ -14216,7 +14763,7 @@
         </w:rPr>
         <w:fldChar w:fldCharType="end"/>
       </w:r>
-      <w:bookmarkEnd w:id="43"/>
+      <w:bookmarkEnd w:id="44"/>
       <w:r>
         <w:rPr>
           <w:szCs w:val="26"/>
@@ -14233,8 +14780,8 @@
       <w:r>
         <w:t>ustomers</w:t>
       </w:r>
-      <w:bookmarkEnd w:id="44"/>
       <w:bookmarkEnd w:id="45"/>
+      <w:bookmarkEnd w:id="46"/>
     </w:p>
     <w:tbl>
       <w:tblPr>
@@ -15044,9 +15591,9 @@
           <w:lang w:val="vi-VN"/>
         </w:rPr>
       </w:pPr>
-      <w:bookmarkStart w:id="46" w:name="_Ref242456404"/>
-      <w:bookmarkStart w:id="47" w:name="_Ref242645743"/>
-      <w:bookmarkStart w:id="48" w:name="_Toc243308591"/>
+      <w:bookmarkStart w:id="47" w:name="_Ref242456404"/>
+      <w:bookmarkStart w:id="48" w:name="_Ref242645743"/>
+      <w:bookmarkStart w:id="49" w:name="_Toc243308591"/>
       <w:r>
         <w:rPr>
           <w:szCs w:val="26"/>
@@ -15121,7 +15668,7 @@
         </w:rPr>
         <w:fldChar w:fldCharType="end"/>
       </w:r>
-      <w:bookmarkEnd w:id="46"/>
+      <w:bookmarkEnd w:id="47"/>
       <w:r>
         <w:rPr>
           <w:szCs w:val="26"/>
@@ -15138,8 +15685,8 @@
       <w:r>
         <w:t>mployees</w:t>
       </w:r>
-      <w:bookmarkEnd w:id="47"/>
       <w:bookmarkEnd w:id="48"/>
+      <w:bookmarkEnd w:id="49"/>
     </w:p>
     <w:tbl>
       <w:tblPr>
@@ -15877,9 +16424,9 @@
           <w:lang w:val="vi-VN"/>
         </w:rPr>
       </w:pPr>
-      <w:bookmarkStart w:id="49" w:name="_Ref242456647"/>
-      <w:bookmarkStart w:id="50" w:name="_Ref242645788"/>
-      <w:bookmarkStart w:id="51" w:name="_Toc243308592"/>
+      <w:bookmarkStart w:id="50" w:name="_Ref242456647"/>
+      <w:bookmarkStart w:id="51" w:name="_Ref242645788"/>
+      <w:bookmarkStart w:id="52" w:name="_Toc243308592"/>
       <w:r>
         <w:rPr>
           <w:szCs w:val="26"/>
@@ -15954,7 +16501,7 @@
         </w:rPr>
         <w:fldChar w:fldCharType="end"/>
       </w:r>
-      <w:bookmarkEnd w:id="49"/>
+      <w:bookmarkEnd w:id="50"/>
       <w:r>
         <w:rPr>
           <w:szCs w:val="26"/>
@@ -15971,8 +16518,8 @@
       <w:r>
         <w:t>hippers</w:t>
       </w:r>
-      <w:bookmarkEnd w:id="50"/>
       <w:bookmarkEnd w:id="51"/>
+      <w:bookmarkEnd w:id="52"/>
     </w:p>
     <w:tbl>
       <w:tblPr>
@@ -16446,9 +16993,9 @@
           <w:lang w:val="vi-VN"/>
         </w:rPr>
       </w:pPr>
-      <w:bookmarkStart w:id="52" w:name="_Ref242457071"/>
-      <w:bookmarkStart w:id="53" w:name="_Ref242645847"/>
-      <w:bookmarkStart w:id="54" w:name="_Toc243308593"/>
+      <w:bookmarkStart w:id="53" w:name="_Ref242457071"/>
+      <w:bookmarkStart w:id="54" w:name="_Ref242645847"/>
+      <w:bookmarkStart w:id="55" w:name="_Toc243308593"/>
       <w:r>
         <w:rPr>
           <w:szCs w:val="26"/>
@@ -16523,7 +17070,7 @@
         </w:rPr>
         <w:fldChar w:fldCharType="end"/>
       </w:r>
-      <w:bookmarkEnd w:id="52"/>
+      <w:bookmarkEnd w:id="53"/>
       <w:r>
         <w:t xml:space="preserve"> Thực thể </w:t>
       </w:r>
@@ -16533,8 +17080,8 @@
       <w:r>
         <w:t>roducts</w:t>
       </w:r>
-      <w:bookmarkEnd w:id="53"/>
       <w:bookmarkEnd w:id="54"/>
+      <w:bookmarkEnd w:id="55"/>
     </w:p>
     <w:tbl>
       <w:tblPr>
@@ -17577,9 +18124,9 @@
           <w:lang w:val="vi-VN"/>
         </w:rPr>
       </w:pPr>
-      <w:bookmarkStart w:id="55" w:name="_Ref242457136"/>
-      <w:bookmarkStart w:id="56" w:name="_Ref242645875"/>
-      <w:bookmarkStart w:id="57" w:name="_Toc243308594"/>
+      <w:bookmarkStart w:id="56" w:name="_Ref242457136"/>
+      <w:bookmarkStart w:id="57" w:name="_Ref242645875"/>
+      <w:bookmarkStart w:id="58" w:name="_Toc243308594"/>
       <w:r>
         <w:rPr>
           <w:szCs w:val="26"/>
@@ -17654,7 +18201,7 @@
         </w:rPr>
         <w:fldChar w:fldCharType="end"/>
       </w:r>
-      <w:bookmarkEnd w:id="55"/>
+      <w:bookmarkEnd w:id="56"/>
       <w:r>
         <w:rPr>
           <w:szCs w:val="26"/>
@@ -17677,8 +18224,8 @@
       <w:r>
         <w:t>mages</w:t>
       </w:r>
-      <w:bookmarkEnd w:id="56"/>
       <w:bookmarkEnd w:id="57"/>
+      <w:bookmarkEnd w:id="58"/>
     </w:p>
     <w:tbl>
       <w:tblPr>
@@ -18439,9 +18986,9 @@
           <w:lang w:val="vi-VN"/>
         </w:rPr>
       </w:pPr>
-      <w:bookmarkStart w:id="58" w:name="_Ref242457632"/>
-      <w:bookmarkStart w:id="59" w:name="_Ref242645910"/>
-      <w:bookmarkStart w:id="60" w:name="_Toc243308595"/>
+      <w:bookmarkStart w:id="59" w:name="_Ref242457632"/>
+      <w:bookmarkStart w:id="60" w:name="_Ref242645910"/>
+      <w:bookmarkStart w:id="61" w:name="_Toc243308595"/>
       <w:r>
         <w:rPr>
           <w:szCs w:val="26"/>
@@ -18516,7 +19063,7 @@
         </w:rPr>
         <w:fldChar w:fldCharType="end"/>
       </w:r>
-      <w:bookmarkEnd w:id="58"/>
+      <w:bookmarkEnd w:id="59"/>
       <w:r>
         <w:rPr>
           <w:szCs w:val="26"/>
@@ -18533,8 +19080,8 @@
       <w:r>
         <w:t>rders</w:t>
       </w:r>
-      <w:bookmarkEnd w:id="59"/>
       <w:bookmarkEnd w:id="60"/>
+      <w:bookmarkEnd w:id="61"/>
     </w:p>
     <w:tbl>
       <w:tblPr>
@@ -19193,9 +19740,9 @@
           <w:lang w:val="vi-VN"/>
         </w:rPr>
       </w:pPr>
-      <w:bookmarkStart w:id="61" w:name="_Ref242458121"/>
-      <w:bookmarkStart w:id="62" w:name="_Ref242645951"/>
-      <w:bookmarkStart w:id="63" w:name="_Toc243308596"/>
+      <w:bookmarkStart w:id="62" w:name="_Ref242458121"/>
+      <w:bookmarkStart w:id="63" w:name="_Ref242645951"/>
+      <w:bookmarkStart w:id="64" w:name="_Toc243308596"/>
       <w:r>
         <w:rPr>
           <w:i w:val="0"/>
@@ -19318,7 +19865,7 @@
         </w:rPr>
         <w:fldChar w:fldCharType="end"/>
       </w:r>
-      <w:bookmarkEnd w:id="61"/>
+      <w:bookmarkEnd w:id="62"/>
       <w:r>
         <w:rPr>
           <w:i w:val="0"/>
@@ -19371,8 +19918,8 @@
         </w:rPr>
         <w:t>OrderDetail</w:t>
       </w:r>
-      <w:bookmarkEnd w:id="62"/>
       <w:bookmarkEnd w:id="63"/>
+      <w:bookmarkEnd w:id="64"/>
     </w:p>
     <w:tbl>
       <w:tblPr>
@@ -19881,11 +20428,11 @@
       <w:pPr>
         <w:pStyle w:val="Heading2"/>
       </w:pPr>
-      <w:bookmarkStart w:id="64" w:name="_Toc243310713"/>
+      <w:bookmarkStart w:id="65" w:name="_Toc243310713"/>
       <w:r>
         <w:t>Thiết kế xử lý</w:t>
       </w:r>
-      <w:bookmarkEnd w:id="64"/>
+      <w:bookmarkEnd w:id="65"/>
     </w:p>
     <w:p>
       <w:pPr>
@@ -19894,11 +20441,11 @@
           <w:lang w:val="vi-VN"/>
         </w:rPr>
       </w:pPr>
-      <w:bookmarkStart w:id="65" w:name="_Toc243310714"/>
+      <w:bookmarkStart w:id="66" w:name="_Toc243310714"/>
       <w:r>
         <w:t>Mô hình DFD mức ngữ cảnh</w:t>
       </w:r>
-      <w:bookmarkEnd w:id="65"/>
+      <w:bookmarkEnd w:id="66"/>
     </w:p>
     <w:p>
       <w:pPr>
@@ -20097,7 +20644,7 @@
           <w:lang w:val="vi-VN"/>
         </w:rPr>
       </w:pPr>
-      <w:bookmarkStart w:id="66" w:name="_Toc242972287"/>
+      <w:bookmarkStart w:id="67" w:name="_Toc242972287"/>
       <w:r>
         <w:rPr>
           <w:i w:val="0"/>
@@ -20231,7 +20778,7 @@
         </w:rPr>
         <w:t xml:space="preserve"> Mô hình DFD mức ngữ cảnh</w:t>
       </w:r>
-      <w:bookmarkEnd w:id="66"/>
+      <w:bookmarkEnd w:id="67"/>
     </w:p>
     <w:p>
       <w:pPr>
@@ -20240,12 +20787,12 @@
           <w:lang w:val="vi-VN"/>
         </w:rPr>
       </w:pPr>
-      <w:bookmarkStart w:id="67" w:name="_Toc243310715"/>
+      <w:bookmarkStart w:id="68" w:name="_Toc243310715"/>
       <w:r>
         <w:lastRenderedPageBreak/>
         <w:t>Mô hình DFD phân rã chức năng</w:t>
       </w:r>
-      <w:bookmarkEnd w:id="67"/>
+      <w:bookmarkEnd w:id="68"/>
     </w:p>
     <w:p>
       <w:pPr>
@@ -20357,7 +20904,7 @@
           <w:lang w:val="vi-VN"/>
         </w:rPr>
       </w:pPr>
-      <w:bookmarkStart w:id="68" w:name="_Toc242972288"/>
+      <w:bookmarkStart w:id="69" w:name="_Toc242972288"/>
       <w:r>
         <w:rPr>
           <w:i w:val="0"/>
@@ -20501,7 +21048,7 @@
         </w:rPr>
         <w:t>1</w:t>
       </w:r>
-      <w:bookmarkEnd w:id="68"/>
+      <w:bookmarkEnd w:id="69"/>
     </w:p>
     <w:p>
       <w:pPr>
@@ -20619,7 +21166,7 @@
           <w:szCs w:val="26"/>
         </w:rPr>
       </w:pPr>
-      <w:bookmarkStart w:id="69" w:name="_Toc242972289"/>
+      <w:bookmarkStart w:id="70" w:name="_Toc242972289"/>
       <w:r>
         <w:rPr>
           <w:i w:val="0"/>
@@ -20763,7 +21310,7 @@
         </w:rPr>
         <w:t>1.1</w:t>
       </w:r>
-      <w:bookmarkEnd w:id="69"/>
+      <w:bookmarkEnd w:id="70"/>
     </w:p>
     <w:p>
       <w:pPr>
@@ -20888,7 +21435,7 @@
           <w:lang w:val="vi-VN"/>
         </w:rPr>
       </w:pPr>
-      <w:bookmarkStart w:id="70" w:name="_Toc242972290"/>
+      <w:bookmarkStart w:id="71" w:name="_Toc242972290"/>
       <w:r>
         <w:rPr>
           <w:i w:val="0"/>
@@ -21077,7 +21624,7 @@
         </w:rPr>
         <w:t xml:space="preserve"> 1.2</w:t>
       </w:r>
-      <w:bookmarkEnd w:id="70"/>
+      <w:bookmarkEnd w:id="71"/>
       <w:r>
         <w:rPr>
           <w:i w:val="0"/>
@@ -21212,7 +21759,7 @@
           <w:lang w:val="vi-VN"/>
         </w:rPr>
       </w:pPr>
-      <w:bookmarkStart w:id="71" w:name="_Toc242972291"/>
+      <w:bookmarkStart w:id="72" w:name="_Toc242972291"/>
       <w:r>
         <w:rPr>
           <w:i w:val="0"/>
@@ -21378,7 +21925,7 @@
         </w:rPr>
         <w:t>1.3</w:t>
       </w:r>
-      <w:bookmarkEnd w:id="71"/>
+      <w:bookmarkEnd w:id="72"/>
     </w:p>
     <w:p>
       <w:pPr>
@@ -21494,7 +22041,7 @@
           <w:lang w:val="vi-VN"/>
         </w:rPr>
       </w:pPr>
-      <w:bookmarkStart w:id="72" w:name="_Toc242972292"/>
+      <w:bookmarkStart w:id="73" w:name="_Toc242972292"/>
       <w:r>
         <w:rPr>
           <w:i w:val="0"/>
@@ -21670,7 +22217,7 @@
         </w:rPr>
         <w:t>DFD mức 1.4</w:t>
       </w:r>
-      <w:bookmarkEnd w:id="72"/>
+      <w:bookmarkEnd w:id="73"/>
     </w:p>
     <w:p>
       <w:pPr>
@@ -21782,7 +22329,7 @@
           <w:lang w:val="vi-VN"/>
         </w:rPr>
       </w:pPr>
-      <w:bookmarkStart w:id="73" w:name="_Toc242972293"/>
+      <w:bookmarkStart w:id="74" w:name="_Toc242972293"/>
       <w:r>
         <w:rPr>
           <w:i w:val="0"/>
@@ -21948,7 +22495,7 @@
         </w:rPr>
         <w:t>1.5</w:t>
       </w:r>
-      <w:bookmarkEnd w:id="73"/>
+      <w:bookmarkEnd w:id="74"/>
     </w:p>
     <w:p>
       <w:pPr>
@@ -21965,12 +22512,12 @@
           <w:lang w:val="vi-VN"/>
         </w:rPr>
       </w:pPr>
-      <w:bookmarkStart w:id="74" w:name="_Toc243310716"/>
+      <w:bookmarkStart w:id="75" w:name="_Toc243310716"/>
       <w:r>
         <w:lastRenderedPageBreak/>
         <w:t>Thiết kế giao diện</w:t>
       </w:r>
-      <w:bookmarkEnd w:id="74"/>
+      <w:bookmarkEnd w:id="75"/>
       <w:r>
         <w:t xml:space="preserve"> </w:t>
       </w:r>
@@ -21982,14 +22529,14 @@
           <w:lang w:val="vi-VN"/>
         </w:rPr>
       </w:pPr>
-      <w:bookmarkStart w:id="75" w:name="_Toc243310717"/>
+      <w:bookmarkStart w:id="76" w:name="_Toc243310717"/>
       <w:r>
         <w:rPr>
           <w:lang w:val="vi-VN"/>
         </w:rPr>
         <w:t>Sơ đồ website</w:t>
       </w:r>
-      <w:bookmarkEnd w:id="75"/>
+      <w:bookmarkEnd w:id="76"/>
     </w:p>
     <w:p>
       <w:pPr>
@@ -22059,8 +22606,8 @@
           <w:lang w:val="vi-VN"/>
         </w:rPr>
       </w:pPr>
-      <w:bookmarkStart w:id="76" w:name="_Toc242546995"/>
-      <w:bookmarkStart w:id="77" w:name="_Toc242972294"/>
+      <w:bookmarkStart w:id="77" w:name="_Toc242546995"/>
+      <w:bookmarkStart w:id="78" w:name="_Toc242972294"/>
       <w:r>
         <w:rPr>
           <w:i w:val="0"/>
@@ -22194,8 +22741,8 @@
         </w:rPr>
         <w:t xml:space="preserve"> Sơ đồ website</w:t>
       </w:r>
-      <w:bookmarkEnd w:id="76"/>
       <w:bookmarkEnd w:id="77"/>
+      <w:bookmarkEnd w:id="78"/>
     </w:p>
     <w:p>
       <w:pPr>
@@ -22204,14 +22751,14 @@
           <w:lang w:val="vi-VN"/>
         </w:rPr>
       </w:pPr>
-      <w:bookmarkStart w:id="78" w:name="_Toc243310718"/>
+      <w:bookmarkStart w:id="79" w:name="_Toc243310718"/>
       <w:r>
         <w:rPr>
           <w:lang w:val="vi-VN"/>
         </w:rPr>
         <w:t>Giao diện trang chủ</w:t>
       </w:r>
-      <w:bookmarkEnd w:id="78"/>
+      <w:bookmarkEnd w:id="79"/>
     </w:p>
     <w:p>
       <w:pPr>
@@ -22262,7 +22809,7 @@
         </w:rPr>
         <w:lastRenderedPageBreak/>
         <w:drawing>
-          <wp:inline distT="0" distB="0" distL="0" distR="0" wp14:anchorId="24440EFF" wp14:editId="6F63A8D2">
+          <wp:inline distT="0" distB="0" distL="0" distR="0" wp14:anchorId="24440EFF" wp14:editId="1176F2EE">
             <wp:extent cx="5580380" cy="6107430"/>
             <wp:effectExtent l="19050" t="19050" r="20320" b="26670"/>
             <wp:docPr id="325028545" name="Picture 2"/>
@@ -22322,8 +22869,8 @@
           <w:lang w:val="vi-VN"/>
         </w:rPr>
       </w:pPr>
-      <w:bookmarkStart w:id="79" w:name="_Toc242546996"/>
-      <w:bookmarkStart w:id="80" w:name="_Toc242972295"/>
+      <w:bookmarkStart w:id="80" w:name="_Toc242546996"/>
+      <w:bookmarkStart w:id="81" w:name="_Toc242972295"/>
       <w:r>
         <w:rPr>
           <w:i w:val="0"/>
@@ -22457,8 +23004,8 @@
         </w:rPr>
         <w:t xml:space="preserve"> Giao diện trang chủ</w:t>
       </w:r>
-      <w:bookmarkEnd w:id="79"/>
       <w:bookmarkEnd w:id="80"/>
+      <w:bookmarkEnd w:id="81"/>
     </w:p>
     <w:p>
       <w:pPr>
@@ -22467,7 +23014,7 @@
           <w:lang w:val="vi-VN"/>
         </w:rPr>
       </w:pPr>
-      <w:bookmarkStart w:id="81" w:name="_Toc243310719"/>
+      <w:bookmarkStart w:id="82" w:name="_Toc243310719"/>
       <w:r>
         <w:rPr>
           <w:lang w:val="vi-VN"/>
@@ -22480,7 +23027,7 @@
         </w:rPr>
         <w:t>quản trị</w:t>
       </w:r>
-      <w:bookmarkEnd w:id="81"/>
+      <w:bookmarkEnd w:id="82"/>
     </w:p>
     <w:p>
       <w:pPr>
@@ -22537,7 +23084,7 @@
         </w:rPr>
         <w:lastRenderedPageBreak/>
         <w:drawing>
-          <wp:inline distT="0" distB="0" distL="0" distR="0" wp14:anchorId="6D169D41" wp14:editId="60D53BCA">
+          <wp:inline distT="0" distB="0" distL="0" distR="0" wp14:anchorId="6D169D41" wp14:editId="462EEE40">
             <wp:extent cx="5580380" cy="6107430"/>
             <wp:effectExtent l="19050" t="19050" r="20320" b="26670"/>
             <wp:docPr id="1452594711" name="Picture 5"/>
@@ -22597,8 +23144,8 @@
           <w:lang w:val="vi-VN"/>
         </w:rPr>
       </w:pPr>
-      <w:bookmarkStart w:id="82" w:name="_Toc242546997"/>
-      <w:bookmarkStart w:id="83" w:name="_Toc242972296"/>
+      <w:bookmarkStart w:id="83" w:name="_Toc242546997"/>
+      <w:bookmarkStart w:id="84" w:name="_Toc242972296"/>
       <w:r>
         <w:rPr>
           <w:i w:val="0"/>
@@ -22732,8 +23279,8 @@
         </w:rPr>
         <w:t xml:space="preserve"> Giao diện trang quản trị</w:t>
       </w:r>
-      <w:bookmarkEnd w:id="82"/>
       <w:bookmarkEnd w:id="83"/>
+      <w:bookmarkEnd w:id="84"/>
     </w:p>
     <w:p>
       <w:pPr>
@@ -22742,14 +23289,14 @@
           <w:lang w:val="vi-VN"/>
         </w:rPr>
       </w:pPr>
-      <w:bookmarkStart w:id="84" w:name="_Toc243310720"/>
+      <w:bookmarkStart w:id="85" w:name="_Toc243310720"/>
       <w:r>
         <w:rPr>
           <w:lang w:val="vi-VN"/>
         </w:rPr>
         <w:t>Giao diện trang đăng nhập, đăng ký</w:t>
       </w:r>
-      <w:bookmarkEnd w:id="84"/>
+      <w:bookmarkEnd w:id="85"/>
     </w:p>
     <w:p>
       <w:pPr>
@@ -22791,7 +23338,7 @@
           <w:noProof/>
         </w:rPr>
         <w:drawing>
-          <wp:inline distT="0" distB="0" distL="0" distR="0" wp14:anchorId="6914A94E" wp14:editId="5CDB36E1">
+          <wp:inline distT="0" distB="0" distL="0" distR="0" wp14:anchorId="6914A94E" wp14:editId="5B4376BC">
             <wp:extent cx="5580380" cy="3137535"/>
             <wp:effectExtent l="0" t="0" r="1270" b="5715"/>
             <wp:docPr id="2050384003" name="Picture 4"/>
@@ -22846,8 +23393,8 @@
           <w:lang w:val="vi-VN"/>
         </w:rPr>
       </w:pPr>
-      <w:bookmarkStart w:id="85" w:name="_Toc242546998"/>
-      <w:bookmarkStart w:id="86" w:name="_Toc242972297"/>
+      <w:bookmarkStart w:id="86" w:name="_Toc242546998"/>
+      <w:bookmarkStart w:id="87" w:name="_Toc242972297"/>
       <w:r>
         <w:rPr>
           <w:i w:val="0"/>
@@ -22981,8 +23528,8 @@
         </w:rPr>
         <w:t xml:space="preserve"> Giao diện trang đăng nhập và đăng ký</w:t>
       </w:r>
-      <w:bookmarkEnd w:id="85"/>
       <w:bookmarkEnd w:id="86"/>
+      <w:bookmarkEnd w:id="87"/>
     </w:p>
     <w:p>
       <w:pPr>
@@ -22991,7 +23538,7 @@
           <w:lang w:val="vi-VN"/>
         </w:rPr>
       </w:pPr>
-      <w:bookmarkStart w:id="87" w:name="_Toc243310721"/>
+      <w:bookmarkStart w:id="88" w:name="_Toc243310721"/>
       <w:r>
         <w:rPr>
           <w:lang w:val="vi-VN"/>
@@ -23010,7 +23557,7 @@
         </w:rPr>
         <w:t>sản phẩm</w:t>
       </w:r>
-      <w:bookmarkEnd w:id="87"/>
+      <w:bookmarkEnd w:id="88"/>
     </w:p>
     <w:p>
       <w:pPr>
@@ -23034,7 +23581,7 @@
         </w:rPr>
         <w:lastRenderedPageBreak/>
         <w:drawing>
-          <wp:inline distT="0" distB="0" distL="0" distR="0" wp14:anchorId="10605CAD" wp14:editId="012AAA7D">
+          <wp:inline distT="0" distB="0" distL="0" distR="0" wp14:anchorId="10605CAD" wp14:editId="41F47BF0">
             <wp:extent cx="5580380" cy="6107430"/>
             <wp:effectExtent l="19050" t="19050" r="20320" b="26670"/>
             <wp:docPr id="735307609" name="Picture 6"/>
@@ -23094,8 +23641,8 @@
           <w:lang w:val="vi-VN"/>
         </w:rPr>
       </w:pPr>
-      <w:bookmarkStart w:id="88" w:name="_Toc242546999"/>
-      <w:bookmarkStart w:id="89" w:name="_Toc242972298"/>
+      <w:bookmarkStart w:id="89" w:name="_Toc242546999"/>
+      <w:bookmarkStart w:id="90" w:name="_Toc242972298"/>
       <w:r>
         <w:rPr>
           <w:i w:val="0"/>
@@ -23229,8 +23776,8 @@
         </w:rPr>
         <w:t xml:space="preserve"> Giao diện trang sản phẩm</w:t>
       </w:r>
-      <w:bookmarkEnd w:id="88"/>
       <w:bookmarkEnd w:id="89"/>
+      <w:bookmarkEnd w:id="90"/>
     </w:p>
     <w:p>
       <w:pPr>
@@ -23239,14 +23786,14 @@
           <w:lang w:val="vi-VN"/>
         </w:rPr>
       </w:pPr>
-      <w:bookmarkStart w:id="90" w:name="_Toc243310722"/>
+      <w:bookmarkStart w:id="91" w:name="_Toc243310722"/>
       <w:r>
         <w:rPr>
           <w:lang w:val="vi-VN"/>
         </w:rPr>
         <w:t>Giao diện trang chi tiết sản phẩm</w:t>
       </w:r>
-      <w:bookmarkEnd w:id="90"/>
+      <w:bookmarkEnd w:id="91"/>
     </w:p>
     <w:p>
       <w:pPr>
@@ -23279,7 +23826,7 @@
           <w:noProof/>
         </w:rPr>
         <w:drawing>
-          <wp:inline distT="0" distB="0" distL="0" distR="0" wp14:anchorId="3E50603C" wp14:editId="4DA2FF58">
+          <wp:inline distT="0" distB="0" distL="0" distR="0" wp14:anchorId="3E50603C" wp14:editId="362198ED">
             <wp:extent cx="5580380" cy="5069840"/>
             <wp:effectExtent l="19050" t="19050" r="20320" b="16510"/>
             <wp:docPr id="712871940" name="Picture 3"/>
@@ -23339,8 +23886,8 @@
           <w:lang w:val="vi-VN"/>
         </w:rPr>
       </w:pPr>
-      <w:bookmarkStart w:id="91" w:name="_Toc242547000"/>
-      <w:bookmarkStart w:id="92" w:name="_Toc242972299"/>
+      <w:bookmarkStart w:id="92" w:name="_Toc242547000"/>
+      <w:bookmarkStart w:id="93" w:name="_Toc242972299"/>
       <w:r>
         <w:rPr>
           <w:i w:val="0"/>
@@ -23474,14 +24021,14 @@
         </w:rPr>
         <w:t xml:space="preserve"> Giao diện trang chi tiết sản phẩm</w:t>
       </w:r>
-      <w:bookmarkEnd w:id="91"/>
       <w:bookmarkEnd w:id="92"/>
+      <w:bookmarkEnd w:id="93"/>
     </w:p>
     <w:p>
       <w:pPr>
         <w:pStyle w:val="Heading2"/>
       </w:pPr>
-      <w:bookmarkStart w:id="93" w:name="_Toc243310723"/>
+      <w:bookmarkStart w:id="94" w:name="_Toc243310723"/>
       <w:r>
         <w:t>Tổng</w:t>
       </w:r>
@@ -23497,7 +24044,7 @@
       <w:r>
         <w:t>chương</w:t>
       </w:r>
-      <w:bookmarkEnd w:id="93"/>
+      <w:bookmarkEnd w:id="94"/>
     </w:p>
     <w:p>
       <w:pPr>
@@ -23534,14 +24081,14 @@
         </w:rPr>
         <w:t xml:space="preserve"> </w:t>
       </w:r>
-      <w:bookmarkStart w:id="94" w:name="_Toc243310724"/>
+      <w:bookmarkStart w:id="95" w:name="_Toc243310724"/>
       <w:r>
         <w:rPr>
           <w:lang w:val="vi-VN"/>
         </w:rPr>
         <w:t>KẾT QUẢ NGHIÊN CỨU</w:t>
       </w:r>
-      <w:bookmarkEnd w:id="94"/>
+      <w:bookmarkEnd w:id="95"/>
     </w:p>
     <w:p>
       <w:pPr>
@@ -23550,11 +24097,11 @@
           <w:lang w:val="vi-VN"/>
         </w:rPr>
       </w:pPr>
-      <w:bookmarkStart w:id="95" w:name="_Toc243310725"/>
+      <w:bookmarkStart w:id="96" w:name="_Toc243310725"/>
       <w:r>
         <w:t>Kịch bản triển khai</w:t>
       </w:r>
-      <w:bookmarkEnd w:id="95"/>
+      <w:bookmarkEnd w:id="96"/>
     </w:p>
     <w:p>
       <w:pPr>
@@ -23591,18 +24138,18 @@
       <w:pPr>
         <w:pStyle w:val="Heading2"/>
       </w:pPr>
-      <w:bookmarkStart w:id="96" w:name="_Toc243310726"/>
-      <w:bookmarkEnd w:id="96"/>
+      <w:bookmarkStart w:id="97" w:name="_Toc243310726"/>
+      <w:bookmarkEnd w:id="97"/>
     </w:p>
     <w:p>
       <w:pPr>
         <w:pStyle w:val="Heading2"/>
       </w:pPr>
-      <w:bookmarkStart w:id="97" w:name="_Toc243310727"/>
+      <w:bookmarkStart w:id="98" w:name="_Toc243310727"/>
       <w:r>
         <w:t>Kết quả</w:t>
       </w:r>
-      <w:bookmarkEnd w:id="97"/>
+      <w:bookmarkEnd w:id="98"/>
       <w:r>
         <w:t xml:space="preserve"> </w:t>
       </w:r>
@@ -23611,11 +24158,11 @@
       <w:pPr>
         <w:pStyle w:val="Heading2"/>
       </w:pPr>
-      <w:bookmarkStart w:id="98" w:name="_Toc243310728"/>
+      <w:bookmarkStart w:id="99" w:name="_Toc243310728"/>
       <w:r>
         <w:t>Các giao diện</w:t>
       </w:r>
-      <w:bookmarkEnd w:id="98"/>
+      <w:bookmarkEnd w:id="99"/>
     </w:p>
     <w:p>
       <w:pPr>
@@ -23651,7 +24198,7 @@
           <w:lang w:val="vi-VN"/>
         </w:rPr>
       </w:pPr>
-      <w:bookmarkStart w:id="99" w:name="_Toc243310729"/>
+      <w:bookmarkStart w:id="100" w:name="_Toc243310729"/>
       <w:r>
         <w:rPr>
           <w:caps w:val="0"/>
@@ -23659,7 +24206,7 @@
         </w:rPr>
         <w:t>KẾT LUẬN VÀ HƯỚNG PHÁT TRIỂN</w:t>
       </w:r>
-      <w:bookmarkEnd w:id="99"/>
+      <w:bookmarkEnd w:id="100"/>
     </w:p>
     <w:p/>
     <w:p>
@@ -24129,6 +24676,155 @@
     </w:lvl>
   </w:abstractNum>
   <w:abstractNum w:abstractNumId="3" w15:restartNumberingAfterBreak="0">
+    <w:nsid w:val="209B21BD"/>
+    <w:multiLevelType w:val="multilevel"/>
+    <w:tmpl w:val="1612336A"/>
+    <w:lvl w:ilvl="0">
+      <w:start w:val="1"/>
+      <w:numFmt w:val="bullet"/>
+      <w:lvlText w:val=""/>
+      <w:lvlJc w:val="left"/>
+      <w:pPr>
+        <w:tabs>
+          <w:tab w:val="num" w:pos="720"/>
+        </w:tabs>
+        <w:ind w:left="720" w:hanging="360"/>
+      </w:pPr>
+      <w:rPr>
+        <w:rFonts w:ascii="Symbol" w:hAnsi="Symbol" w:hint="default"/>
+        <w:sz w:val="20"/>
+      </w:rPr>
+    </w:lvl>
+    <w:lvl w:ilvl="1" w:tentative="1">
+      <w:start w:val="1"/>
+      <w:numFmt w:val="bullet"/>
+      <w:lvlText w:val="o"/>
+      <w:lvlJc w:val="left"/>
+      <w:pPr>
+        <w:tabs>
+          <w:tab w:val="num" w:pos="1440"/>
+        </w:tabs>
+        <w:ind w:left="1440" w:hanging="360"/>
+      </w:pPr>
+      <w:rPr>
+        <w:rFonts w:ascii="Courier New" w:hAnsi="Courier New" w:hint="default"/>
+        <w:sz w:val="20"/>
+      </w:rPr>
+    </w:lvl>
+    <w:lvl w:ilvl="2" w:tentative="1">
+      <w:start w:val="1"/>
+      <w:numFmt w:val="bullet"/>
+      <w:lvlText w:val=""/>
+      <w:lvlJc w:val="left"/>
+      <w:pPr>
+        <w:tabs>
+          <w:tab w:val="num" w:pos="2160"/>
+        </w:tabs>
+        <w:ind w:left="2160" w:hanging="360"/>
+      </w:pPr>
+      <w:rPr>
+        <w:rFonts w:ascii="Wingdings" w:hAnsi="Wingdings" w:hint="default"/>
+        <w:sz w:val="20"/>
+      </w:rPr>
+    </w:lvl>
+    <w:lvl w:ilvl="3" w:tentative="1">
+      <w:start w:val="1"/>
+      <w:numFmt w:val="bullet"/>
+      <w:lvlText w:val=""/>
+      <w:lvlJc w:val="left"/>
+      <w:pPr>
+        <w:tabs>
+          <w:tab w:val="num" w:pos="2880"/>
+        </w:tabs>
+        <w:ind w:left="2880" w:hanging="360"/>
+      </w:pPr>
+      <w:rPr>
+        <w:rFonts w:ascii="Wingdings" w:hAnsi="Wingdings" w:hint="default"/>
+        <w:sz w:val="20"/>
+      </w:rPr>
+    </w:lvl>
+    <w:lvl w:ilvl="4" w:tentative="1">
+      <w:start w:val="1"/>
+      <w:numFmt w:val="bullet"/>
+      <w:lvlText w:val=""/>
+      <w:lvlJc w:val="left"/>
+      <w:pPr>
+        <w:tabs>
+          <w:tab w:val="num" w:pos="3600"/>
+        </w:tabs>
+        <w:ind w:left="3600" w:hanging="360"/>
+      </w:pPr>
+      <w:rPr>
+        <w:rFonts w:ascii="Wingdings" w:hAnsi="Wingdings" w:hint="default"/>
+        <w:sz w:val="20"/>
+      </w:rPr>
+    </w:lvl>
+    <w:lvl w:ilvl="5" w:tentative="1">
+      <w:start w:val="1"/>
+      <w:numFmt w:val="bullet"/>
+      <w:lvlText w:val=""/>
+      <w:lvlJc w:val="left"/>
+      <w:pPr>
+        <w:tabs>
+          <w:tab w:val="num" w:pos="4320"/>
+        </w:tabs>
+        <w:ind w:left="4320" w:hanging="360"/>
+      </w:pPr>
+      <w:rPr>
+        <w:rFonts w:ascii="Wingdings" w:hAnsi="Wingdings" w:hint="default"/>
+        <w:sz w:val="20"/>
+      </w:rPr>
+    </w:lvl>
+    <w:lvl w:ilvl="6" w:tentative="1">
+      <w:start w:val="1"/>
+      <w:numFmt w:val="bullet"/>
+      <w:lvlText w:val=""/>
+      <w:lvlJc w:val="left"/>
+      <w:pPr>
+        <w:tabs>
+          <w:tab w:val="num" w:pos="5040"/>
+        </w:tabs>
+        <w:ind w:left="5040" w:hanging="360"/>
+      </w:pPr>
+      <w:rPr>
+        <w:rFonts w:ascii="Wingdings" w:hAnsi="Wingdings" w:hint="default"/>
+        <w:sz w:val="20"/>
+      </w:rPr>
+    </w:lvl>
+    <w:lvl w:ilvl="7" w:tentative="1">
+      <w:start w:val="1"/>
+      <w:numFmt w:val="bullet"/>
+      <w:lvlText w:val=""/>
+      <w:lvlJc w:val="left"/>
+      <w:pPr>
+        <w:tabs>
+          <w:tab w:val="num" w:pos="5760"/>
+        </w:tabs>
+        <w:ind w:left="5760" w:hanging="360"/>
+      </w:pPr>
+      <w:rPr>
+        <w:rFonts w:ascii="Wingdings" w:hAnsi="Wingdings" w:hint="default"/>
+        <w:sz w:val="20"/>
+      </w:rPr>
+    </w:lvl>
+    <w:lvl w:ilvl="8" w:tentative="1">
+      <w:start w:val="1"/>
+      <w:numFmt w:val="bullet"/>
+      <w:lvlText w:val=""/>
+      <w:lvlJc w:val="left"/>
+      <w:pPr>
+        <w:tabs>
+          <w:tab w:val="num" w:pos="6480"/>
+        </w:tabs>
+        <w:ind w:left="6480" w:hanging="360"/>
+      </w:pPr>
+      <w:rPr>
+        <w:rFonts w:ascii="Wingdings" w:hAnsi="Wingdings" w:hint="default"/>
+        <w:sz w:val="20"/>
+      </w:rPr>
+    </w:lvl>
+  </w:abstractNum>
+  <w:abstractNum w:abstractNumId="4" w15:restartNumberingAfterBreak="0">
     <w:nsid w:val="28B72FEF"/>
     <w:multiLevelType w:val="multilevel"/>
     <w:tmpl w:val="D45C53F2"/>
@@ -24261,7 +24957,7 @@
       </w:rPr>
     </w:lvl>
   </w:abstractNum>
-  <w:abstractNum w:abstractNumId="4" w15:restartNumberingAfterBreak="0">
+  <w:abstractNum w:abstractNumId="5" w15:restartNumberingAfterBreak="0">
     <w:nsid w:val="2A6515D4"/>
     <w:multiLevelType w:val="multilevel"/>
     <w:tmpl w:val="1F681CD4"/>
@@ -24389,7 +25085,7 @@
       </w:rPr>
     </w:lvl>
   </w:abstractNum>
-  <w:abstractNum w:abstractNumId="5" w15:restartNumberingAfterBreak="0">
+  <w:abstractNum w:abstractNumId="6" w15:restartNumberingAfterBreak="0">
     <w:nsid w:val="2A9A1A98"/>
     <w:multiLevelType w:val="hybridMultilevel"/>
     <w:tmpl w:val="16B4489A"/>
@@ -24480,7 +25176,7 @@
       </w:pPr>
     </w:lvl>
   </w:abstractNum>
-  <w:abstractNum w:abstractNumId="6" w15:restartNumberingAfterBreak="0">
+  <w:abstractNum w:abstractNumId="7" w15:restartNumberingAfterBreak="0">
     <w:nsid w:val="310301F0"/>
     <w:multiLevelType w:val="hybridMultilevel"/>
     <w:tmpl w:val="22069D3C"/>
@@ -24593,7 +25289,305 @@
       </w:rPr>
     </w:lvl>
   </w:abstractNum>
-  <w:abstractNum w:abstractNumId="7" w15:restartNumberingAfterBreak="0">
+  <w:abstractNum w:abstractNumId="8" w15:restartNumberingAfterBreak="0">
+    <w:nsid w:val="505B7F18"/>
+    <w:multiLevelType w:val="multilevel"/>
+    <w:tmpl w:val="1482171A"/>
+    <w:lvl w:ilvl="0">
+      <w:start w:val="1"/>
+      <w:numFmt w:val="bullet"/>
+      <w:lvlText w:val=""/>
+      <w:lvlJc w:val="left"/>
+      <w:pPr>
+        <w:tabs>
+          <w:tab w:val="num" w:pos="720"/>
+        </w:tabs>
+        <w:ind w:left="720" w:hanging="360"/>
+      </w:pPr>
+      <w:rPr>
+        <w:rFonts w:ascii="Symbol" w:hAnsi="Symbol" w:hint="default"/>
+        <w:sz w:val="20"/>
+      </w:rPr>
+    </w:lvl>
+    <w:lvl w:ilvl="1" w:tentative="1">
+      <w:start w:val="1"/>
+      <w:numFmt w:val="bullet"/>
+      <w:lvlText w:val="o"/>
+      <w:lvlJc w:val="left"/>
+      <w:pPr>
+        <w:tabs>
+          <w:tab w:val="num" w:pos="1440"/>
+        </w:tabs>
+        <w:ind w:left="1440" w:hanging="360"/>
+      </w:pPr>
+      <w:rPr>
+        <w:rFonts w:ascii="Courier New" w:hAnsi="Courier New" w:hint="default"/>
+        <w:sz w:val="20"/>
+      </w:rPr>
+    </w:lvl>
+    <w:lvl w:ilvl="2" w:tentative="1">
+      <w:start w:val="1"/>
+      <w:numFmt w:val="bullet"/>
+      <w:lvlText w:val=""/>
+      <w:lvlJc w:val="left"/>
+      <w:pPr>
+        <w:tabs>
+          <w:tab w:val="num" w:pos="2160"/>
+        </w:tabs>
+        <w:ind w:left="2160" w:hanging="360"/>
+      </w:pPr>
+      <w:rPr>
+        <w:rFonts w:ascii="Wingdings" w:hAnsi="Wingdings" w:hint="default"/>
+        <w:sz w:val="20"/>
+      </w:rPr>
+    </w:lvl>
+    <w:lvl w:ilvl="3" w:tentative="1">
+      <w:start w:val="1"/>
+      <w:numFmt w:val="bullet"/>
+      <w:lvlText w:val=""/>
+      <w:lvlJc w:val="left"/>
+      <w:pPr>
+        <w:tabs>
+          <w:tab w:val="num" w:pos="2880"/>
+        </w:tabs>
+        <w:ind w:left="2880" w:hanging="360"/>
+      </w:pPr>
+      <w:rPr>
+        <w:rFonts w:ascii="Wingdings" w:hAnsi="Wingdings" w:hint="default"/>
+        <w:sz w:val="20"/>
+      </w:rPr>
+    </w:lvl>
+    <w:lvl w:ilvl="4" w:tentative="1">
+      <w:start w:val="1"/>
+      <w:numFmt w:val="bullet"/>
+      <w:lvlText w:val=""/>
+      <w:lvlJc w:val="left"/>
+      <w:pPr>
+        <w:tabs>
+          <w:tab w:val="num" w:pos="3600"/>
+        </w:tabs>
+        <w:ind w:left="3600" w:hanging="360"/>
+      </w:pPr>
+      <w:rPr>
+        <w:rFonts w:ascii="Wingdings" w:hAnsi="Wingdings" w:hint="default"/>
+        <w:sz w:val="20"/>
+      </w:rPr>
+    </w:lvl>
+    <w:lvl w:ilvl="5" w:tentative="1">
+      <w:start w:val="1"/>
+      <w:numFmt w:val="bullet"/>
+      <w:lvlText w:val=""/>
+      <w:lvlJc w:val="left"/>
+      <w:pPr>
+        <w:tabs>
+          <w:tab w:val="num" w:pos="4320"/>
+        </w:tabs>
+        <w:ind w:left="4320" w:hanging="360"/>
+      </w:pPr>
+      <w:rPr>
+        <w:rFonts w:ascii="Wingdings" w:hAnsi="Wingdings" w:hint="default"/>
+        <w:sz w:val="20"/>
+      </w:rPr>
+    </w:lvl>
+    <w:lvl w:ilvl="6" w:tentative="1">
+      <w:start w:val="1"/>
+      <w:numFmt w:val="bullet"/>
+      <w:lvlText w:val=""/>
+      <w:lvlJc w:val="left"/>
+      <w:pPr>
+        <w:tabs>
+          <w:tab w:val="num" w:pos="5040"/>
+        </w:tabs>
+        <w:ind w:left="5040" w:hanging="360"/>
+      </w:pPr>
+      <w:rPr>
+        <w:rFonts w:ascii="Wingdings" w:hAnsi="Wingdings" w:hint="default"/>
+        <w:sz w:val="20"/>
+      </w:rPr>
+    </w:lvl>
+    <w:lvl w:ilvl="7" w:tentative="1">
+      <w:start w:val="1"/>
+      <w:numFmt w:val="bullet"/>
+      <w:lvlText w:val=""/>
+      <w:lvlJc w:val="left"/>
+      <w:pPr>
+        <w:tabs>
+          <w:tab w:val="num" w:pos="5760"/>
+        </w:tabs>
+        <w:ind w:left="5760" w:hanging="360"/>
+      </w:pPr>
+      <w:rPr>
+        <w:rFonts w:ascii="Wingdings" w:hAnsi="Wingdings" w:hint="default"/>
+        <w:sz w:val="20"/>
+      </w:rPr>
+    </w:lvl>
+    <w:lvl w:ilvl="8" w:tentative="1">
+      <w:start w:val="1"/>
+      <w:numFmt w:val="bullet"/>
+      <w:lvlText w:val=""/>
+      <w:lvlJc w:val="left"/>
+      <w:pPr>
+        <w:tabs>
+          <w:tab w:val="num" w:pos="6480"/>
+        </w:tabs>
+        <w:ind w:left="6480" w:hanging="360"/>
+      </w:pPr>
+      <w:rPr>
+        <w:rFonts w:ascii="Wingdings" w:hAnsi="Wingdings" w:hint="default"/>
+        <w:sz w:val="20"/>
+      </w:rPr>
+    </w:lvl>
+  </w:abstractNum>
+  <w:abstractNum w:abstractNumId="9" w15:restartNumberingAfterBreak="0">
+    <w:nsid w:val="56111C79"/>
+    <w:multiLevelType w:val="multilevel"/>
+    <w:tmpl w:val="26A047B2"/>
+    <w:lvl w:ilvl="0">
+      <w:start w:val="1"/>
+      <w:numFmt w:val="bullet"/>
+      <w:lvlText w:val=""/>
+      <w:lvlJc w:val="left"/>
+      <w:pPr>
+        <w:tabs>
+          <w:tab w:val="num" w:pos="720"/>
+        </w:tabs>
+        <w:ind w:left="720" w:hanging="360"/>
+      </w:pPr>
+      <w:rPr>
+        <w:rFonts w:ascii="Symbol" w:hAnsi="Symbol" w:hint="default"/>
+        <w:sz w:val="20"/>
+      </w:rPr>
+    </w:lvl>
+    <w:lvl w:ilvl="1" w:tentative="1">
+      <w:start w:val="1"/>
+      <w:numFmt w:val="bullet"/>
+      <w:lvlText w:val="o"/>
+      <w:lvlJc w:val="left"/>
+      <w:pPr>
+        <w:tabs>
+          <w:tab w:val="num" w:pos="1440"/>
+        </w:tabs>
+        <w:ind w:left="1440" w:hanging="360"/>
+      </w:pPr>
+      <w:rPr>
+        <w:rFonts w:ascii="Courier New" w:hAnsi="Courier New" w:hint="default"/>
+        <w:sz w:val="20"/>
+      </w:rPr>
+    </w:lvl>
+    <w:lvl w:ilvl="2" w:tentative="1">
+      <w:start w:val="1"/>
+      <w:numFmt w:val="bullet"/>
+      <w:lvlText w:val=""/>
+      <w:lvlJc w:val="left"/>
+      <w:pPr>
+        <w:tabs>
+          <w:tab w:val="num" w:pos="2160"/>
+        </w:tabs>
+        <w:ind w:left="2160" w:hanging="360"/>
+      </w:pPr>
+      <w:rPr>
+        <w:rFonts w:ascii="Wingdings" w:hAnsi="Wingdings" w:hint="default"/>
+        <w:sz w:val="20"/>
+      </w:rPr>
+    </w:lvl>
+    <w:lvl w:ilvl="3" w:tentative="1">
+      <w:start w:val="1"/>
+      <w:numFmt w:val="bullet"/>
+      <w:lvlText w:val=""/>
+      <w:lvlJc w:val="left"/>
+      <w:pPr>
+        <w:tabs>
+          <w:tab w:val="num" w:pos="2880"/>
+        </w:tabs>
+        <w:ind w:left="2880" w:hanging="360"/>
+      </w:pPr>
+      <w:rPr>
+        <w:rFonts w:ascii="Wingdings" w:hAnsi="Wingdings" w:hint="default"/>
+        <w:sz w:val="20"/>
+      </w:rPr>
+    </w:lvl>
+    <w:lvl w:ilvl="4" w:tentative="1">
+      <w:start w:val="1"/>
+      <w:numFmt w:val="bullet"/>
+      <w:lvlText w:val=""/>
+      <w:lvlJc w:val="left"/>
+      <w:pPr>
+        <w:tabs>
+          <w:tab w:val="num" w:pos="3600"/>
+        </w:tabs>
+        <w:ind w:left="3600" w:hanging="360"/>
+      </w:pPr>
+      <w:rPr>
+        <w:rFonts w:ascii="Wingdings" w:hAnsi="Wingdings" w:hint="default"/>
+        <w:sz w:val="20"/>
+      </w:rPr>
+    </w:lvl>
+    <w:lvl w:ilvl="5" w:tentative="1">
+      <w:start w:val="1"/>
+      <w:numFmt w:val="bullet"/>
+      <w:lvlText w:val=""/>
+      <w:lvlJc w:val="left"/>
+      <w:pPr>
+        <w:tabs>
+          <w:tab w:val="num" w:pos="4320"/>
+        </w:tabs>
+        <w:ind w:left="4320" w:hanging="360"/>
+      </w:pPr>
+      <w:rPr>
+        <w:rFonts w:ascii="Wingdings" w:hAnsi="Wingdings" w:hint="default"/>
+        <w:sz w:val="20"/>
+      </w:rPr>
+    </w:lvl>
+    <w:lvl w:ilvl="6" w:tentative="1">
+      <w:start w:val="1"/>
+      <w:numFmt w:val="bullet"/>
+      <w:lvlText w:val=""/>
+      <w:lvlJc w:val="left"/>
+      <w:pPr>
+        <w:tabs>
+          <w:tab w:val="num" w:pos="5040"/>
+        </w:tabs>
+        <w:ind w:left="5040" w:hanging="360"/>
+      </w:pPr>
+      <w:rPr>
+        <w:rFonts w:ascii="Wingdings" w:hAnsi="Wingdings" w:hint="default"/>
+        <w:sz w:val="20"/>
+      </w:rPr>
+    </w:lvl>
+    <w:lvl w:ilvl="7" w:tentative="1">
+      <w:start w:val="1"/>
+      <w:numFmt w:val="bullet"/>
+      <w:lvlText w:val=""/>
+      <w:lvlJc w:val="left"/>
+      <w:pPr>
+        <w:tabs>
+          <w:tab w:val="num" w:pos="5760"/>
+        </w:tabs>
+        <w:ind w:left="5760" w:hanging="360"/>
+      </w:pPr>
+      <w:rPr>
+        <w:rFonts w:ascii="Wingdings" w:hAnsi="Wingdings" w:hint="default"/>
+        <w:sz w:val="20"/>
+      </w:rPr>
+    </w:lvl>
+    <w:lvl w:ilvl="8" w:tentative="1">
+      <w:start w:val="1"/>
+      <w:numFmt w:val="bullet"/>
+      <w:lvlText w:val=""/>
+      <w:lvlJc w:val="left"/>
+      <w:pPr>
+        <w:tabs>
+          <w:tab w:val="num" w:pos="6480"/>
+        </w:tabs>
+        <w:ind w:left="6480" w:hanging="360"/>
+      </w:pPr>
+      <w:rPr>
+        <w:rFonts w:ascii="Wingdings" w:hAnsi="Wingdings" w:hint="default"/>
+        <w:sz w:val="20"/>
+      </w:rPr>
+    </w:lvl>
+  </w:abstractNum>
+  <w:abstractNum w:abstractNumId="10" w15:restartNumberingAfterBreak="0">
     <w:nsid w:val="581978EB"/>
     <w:multiLevelType w:val="hybridMultilevel"/>
     <w:tmpl w:val="2102BE48"/>
@@ -24682,7 +25676,7 @@
       </w:pPr>
     </w:lvl>
   </w:abstractNum>
-  <w:abstractNum w:abstractNumId="8" w15:restartNumberingAfterBreak="0">
+  <w:abstractNum w:abstractNumId="11" w15:restartNumberingAfterBreak="0">
     <w:nsid w:val="67910029"/>
     <w:multiLevelType w:val="multilevel"/>
     <w:tmpl w:val="D39C8ED8"/>
@@ -24815,20 +25809,169 @@
       </w:rPr>
     </w:lvl>
   </w:abstractNum>
+  <w:abstractNum w:abstractNumId="12" w15:restartNumberingAfterBreak="0">
+    <w:nsid w:val="71011698"/>
+    <w:multiLevelType w:val="multilevel"/>
+    <w:tmpl w:val="FF145FC0"/>
+    <w:lvl w:ilvl="0">
+      <w:start w:val="1"/>
+      <w:numFmt w:val="bullet"/>
+      <w:lvlText w:val=""/>
+      <w:lvlJc w:val="left"/>
+      <w:pPr>
+        <w:tabs>
+          <w:tab w:val="num" w:pos="720"/>
+        </w:tabs>
+        <w:ind w:left="720" w:hanging="360"/>
+      </w:pPr>
+      <w:rPr>
+        <w:rFonts w:ascii="Symbol" w:hAnsi="Symbol" w:hint="default"/>
+        <w:sz w:val="20"/>
+      </w:rPr>
+    </w:lvl>
+    <w:lvl w:ilvl="1" w:tentative="1">
+      <w:start w:val="1"/>
+      <w:numFmt w:val="bullet"/>
+      <w:lvlText w:val="o"/>
+      <w:lvlJc w:val="left"/>
+      <w:pPr>
+        <w:tabs>
+          <w:tab w:val="num" w:pos="1440"/>
+        </w:tabs>
+        <w:ind w:left="1440" w:hanging="360"/>
+      </w:pPr>
+      <w:rPr>
+        <w:rFonts w:ascii="Courier New" w:hAnsi="Courier New" w:hint="default"/>
+        <w:sz w:val="20"/>
+      </w:rPr>
+    </w:lvl>
+    <w:lvl w:ilvl="2" w:tentative="1">
+      <w:start w:val="1"/>
+      <w:numFmt w:val="bullet"/>
+      <w:lvlText w:val=""/>
+      <w:lvlJc w:val="left"/>
+      <w:pPr>
+        <w:tabs>
+          <w:tab w:val="num" w:pos="2160"/>
+        </w:tabs>
+        <w:ind w:left="2160" w:hanging="360"/>
+      </w:pPr>
+      <w:rPr>
+        <w:rFonts w:ascii="Wingdings" w:hAnsi="Wingdings" w:hint="default"/>
+        <w:sz w:val="20"/>
+      </w:rPr>
+    </w:lvl>
+    <w:lvl w:ilvl="3" w:tentative="1">
+      <w:start w:val="1"/>
+      <w:numFmt w:val="bullet"/>
+      <w:lvlText w:val=""/>
+      <w:lvlJc w:val="left"/>
+      <w:pPr>
+        <w:tabs>
+          <w:tab w:val="num" w:pos="2880"/>
+        </w:tabs>
+        <w:ind w:left="2880" w:hanging="360"/>
+      </w:pPr>
+      <w:rPr>
+        <w:rFonts w:ascii="Wingdings" w:hAnsi="Wingdings" w:hint="default"/>
+        <w:sz w:val="20"/>
+      </w:rPr>
+    </w:lvl>
+    <w:lvl w:ilvl="4" w:tentative="1">
+      <w:start w:val="1"/>
+      <w:numFmt w:val="bullet"/>
+      <w:lvlText w:val=""/>
+      <w:lvlJc w:val="left"/>
+      <w:pPr>
+        <w:tabs>
+          <w:tab w:val="num" w:pos="3600"/>
+        </w:tabs>
+        <w:ind w:left="3600" w:hanging="360"/>
+      </w:pPr>
+      <w:rPr>
+        <w:rFonts w:ascii="Wingdings" w:hAnsi="Wingdings" w:hint="default"/>
+        <w:sz w:val="20"/>
+      </w:rPr>
+    </w:lvl>
+    <w:lvl w:ilvl="5" w:tentative="1">
+      <w:start w:val="1"/>
+      <w:numFmt w:val="bullet"/>
+      <w:lvlText w:val=""/>
+      <w:lvlJc w:val="left"/>
+      <w:pPr>
+        <w:tabs>
+          <w:tab w:val="num" w:pos="4320"/>
+        </w:tabs>
+        <w:ind w:left="4320" w:hanging="360"/>
+      </w:pPr>
+      <w:rPr>
+        <w:rFonts w:ascii="Wingdings" w:hAnsi="Wingdings" w:hint="default"/>
+        <w:sz w:val="20"/>
+      </w:rPr>
+    </w:lvl>
+    <w:lvl w:ilvl="6" w:tentative="1">
+      <w:start w:val="1"/>
+      <w:numFmt w:val="bullet"/>
+      <w:lvlText w:val=""/>
+      <w:lvlJc w:val="left"/>
+      <w:pPr>
+        <w:tabs>
+          <w:tab w:val="num" w:pos="5040"/>
+        </w:tabs>
+        <w:ind w:left="5040" w:hanging="360"/>
+      </w:pPr>
+      <w:rPr>
+        <w:rFonts w:ascii="Wingdings" w:hAnsi="Wingdings" w:hint="default"/>
+        <w:sz w:val="20"/>
+      </w:rPr>
+    </w:lvl>
+    <w:lvl w:ilvl="7" w:tentative="1">
+      <w:start w:val="1"/>
+      <w:numFmt w:val="bullet"/>
+      <w:lvlText w:val=""/>
+      <w:lvlJc w:val="left"/>
+      <w:pPr>
+        <w:tabs>
+          <w:tab w:val="num" w:pos="5760"/>
+        </w:tabs>
+        <w:ind w:left="5760" w:hanging="360"/>
+      </w:pPr>
+      <w:rPr>
+        <w:rFonts w:ascii="Wingdings" w:hAnsi="Wingdings" w:hint="default"/>
+        <w:sz w:val="20"/>
+      </w:rPr>
+    </w:lvl>
+    <w:lvl w:ilvl="8" w:tentative="1">
+      <w:start w:val="1"/>
+      <w:numFmt w:val="bullet"/>
+      <w:lvlText w:val=""/>
+      <w:lvlJc w:val="left"/>
+      <w:pPr>
+        <w:tabs>
+          <w:tab w:val="num" w:pos="6480"/>
+        </w:tabs>
+        <w:ind w:left="6480" w:hanging="360"/>
+      </w:pPr>
+      <w:rPr>
+        <w:rFonts w:ascii="Wingdings" w:hAnsi="Wingdings" w:hint="default"/>
+        <w:sz w:val="20"/>
+      </w:rPr>
+    </w:lvl>
+  </w:abstractNum>
   <w:num w:numId="1" w16cid:durableId="1747266641">
-    <w:abstractNumId w:val="3"/>
+    <w:abstractNumId w:val="4"/>
   </w:num>
   <w:num w:numId="2" w16cid:durableId="1772387228">
-    <w:abstractNumId w:val="8"/>
+    <w:abstractNumId w:val="11"/>
   </w:num>
   <w:num w:numId="3" w16cid:durableId="1252474530">
-    <w:abstractNumId w:val="4"/>
+    <w:abstractNumId w:val="5"/>
   </w:num>
   <w:num w:numId="4" w16cid:durableId="1929000181">
-    <w:abstractNumId w:val="7"/>
+    <w:abstractNumId w:val="10"/>
   </w:num>
   <w:num w:numId="5" w16cid:durableId="1864055140">
-    <w:abstractNumId w:val="5"/>
+    <w:abstractNumId w:val="6"/>
   </w:num>
   <w:num w:numId="6" w16cid:durableId="1984771879">
     <w:abstractNumId w:val="1"/>
@@ -24837,10 +25980,22 @@
     <w:abstractNumId w:val="0"/>
   </w:num>
   <w:num w:numId="8" w16cid:durableId="576474671">
-    <w:abstractNumId w:val="6"/>
+    <w:abstractNumId w:val="7"/>
   </w:num>
   <w:num w:numId="9" w16cid:durableId="411394465">
     <w:abstractNumId w:val="2"/>
+  </w:num>
+  <w:num w:numId="10" w16cid:durableId="1515536369">
+    <w:abstractNumId w:val="3"/>
+  </w:num>
+  <w:num w:numId="11" w16cid:durableId="1306620924">
+    <w:abstractNumId w:val="8"/>
+  </w:num>
+  <w:num w:numId="12" w16cid:durableId="2137094251">
+    <w:abstractNumId w:val="9"/>
+  </w:num>
+  <w:num w:numId="13" w16cid:durableId="1691377413">
+    <w:abstractNumId w:val="12"/>
   </w:num>
 </w:numbering>
 </file>

</xml_diff>

<commit_message>
Xong phần kịch bản
</commit_message>
<xml_diff>
--- a/thesis/qt_baocao_110123058_huynhlengoctrinh_110123058_da23ttb.docx
+++ b/thesis/qt_baocao_110123058_huynhlengoctrinh_110123058_da23ttb.docx
@@ -7485,10 +7485,7 @@
         </w:rPr>
       </w:pPr>
       <w:r>
-        <w:t xml:space="preserve">CSS là viết tắt của Cascading Style Sheets, một ngôn ngữ thiết kế đơn giản, xử lý một phần giao diện của trang web. CSS mô tả cách các phần tử HTML hiển thị trên màn hình và các phương tiện </w:t>
-      </w:r>
-      <w:r>
-        <w:t>khác</w:t>
+        <w:t>CSS là viết tắt của Cascading Style Sheets, một ngôn ngữ thiết kế đơn giản, xử lý một phần giao diện của trang web. CSS mô tả cách các phần tử HTML hiển thị trên màn hình và các phương tiện khác</w:t>
       </w:r>
       <w:r>
         <w:rPr>
@@ -8478,10 +8475,7 @@
         <w:t xml:space="preserve">- </w:t>
       </w:r>
       <w:r>
-        <w:t xml:space="preserve">Định nghĩa dữ </w:t>
-      </w:r>
-      <w:r>
-        <w:t>liệu</w:t>
+        <w:t>Định nghĩa dữ liệu</w:t>
       </w:r>
       <w:r>
         <w:rPr>
@@ -8532,14 +8526,7 @@
           <w:i/>
           <w:iCs/>
         </w:rPr>
-        <w:t xml:space="preserve">DML (Data Manipulation Language) </w:t>
-      </w:r>
-      <w:r>
-        <w:rPr>
-          <w:i/>
-          <w:iCs/>
-        </w:rPr>
-        <w:t>và</w:t>
+        <w:t>DML (Data Manipulation Language) và</w:t>
       </w:r>
       <w:r>
         <w:rPr>
@@ -22809,7 +22796,7 @@
         </w:rPr>
         <w:lastRenderedPageBreak/>
         <w:drawing>
-          <wp:inline distT="0" distB="0" distL="0" distR="0" wp14:anchorId="24440EFF" wp14:editId="1176F2EE">
+          <wp:inline distT="0" distB="0" distL="0" distR="0" wp14:anchorId="24440EFF" wp14:editId="4A994A88">
             <wp:extent cx="5580380" cy="6107430"/>
             <wp:effectExtent l="19050" t="19050" r="20320" b="26670"/>
             <wp:docPr id="325028545" name="Picture 2"/>
@@ -23084,7 +23071,7 @@
         </w:rPr>
         <w:lastRenderedPageBreak/>
         <w:drawing>
-          <wp:inline distT="0" distB="0" distL="0" distR="0" wp14:anchorId="6D169D41" wp14:editId="462EEE40">
+          <wp:inline distT="0" distB="0" distL="0" distR="0" wp14:anchorId="6D169D41" wp14:editId="4E9BD077">
             <wp:extent cx="5580380" cy="6107430"/>
             <wp:effectExtent l="19050" t="19050" r="20320" b="26670"/>
             <wp:docPr id="1452594711" name="Picture 5"/>
@@ -23338,7 +23325,7 @@
           <w:noProof/>
         </w:rPr>
         <w:drawing>
-          <wp:inline distT="0" distB="0" distL="0" distR="0" wp14:anchorId="6914A94E" wp14:editId="5B4376BC">
+          <wp:inline distT="0" distB="0" distL="0" distR="0" wp14:anchorId="6914A94E" wp14:editId="6246BBB4">
             <wp:extent cx="5580380" cy="3137535"/>
             <wp:effectExtent l="0" t="0" r="1270" b="5715"/>
             <wp:docPr id="2050384003" name="Picture 4"/>
@@ -23581,7 +23568,7 @@
         </w:rPr>
         <w:lastRenderedPageBreak/>
         <w:drawing>
-          <wp:inline distT="0" distB="0" distL="0" distR="0" wp14:anchorId="10605CAD" wp14:editId="41F47BF0">
+          <wp:inline distT="0" distB="0" distL="0" distR="0" wp14:anchorId="10605CAD" wp14:editId="5E9A589F">
             <wp:extent cx="5580380" cy="6107430"/>
             <wp:effectExtent l="19050" t="19050" r="20320" b="26670"/>
             <wp:docPr id="735307609" name="Picture 6"/>
@@ -23826,7 +23813,7 @@
           <w:noProof/>
         </w:rPr>
         <w:drawing>
-          <wp:inline distT="0" distB="0" distL="0" distR="0" wp14:anchorId="3E50603C" wp14:editId="362198ED">
+          <wp:inline distT="0" distB="0" distL="0" distR="0" wp14:anchorId="3E50603C" wp14:editId="10D5368C">
             <wp:extent cx="5580380" cy="5069840"/>
             <wp:effectExtent l="19050" t="19050" r="20320" b="16510"/>
             <wp:docPr id="712871940" name="Picture 3"/>
@@ -24049,21 +24036,13 @@
     <w:p>
       <w:pPr>
         <w:pStyle w:val="nd"/>
+        <w:rPr>
+          <w:lang w:val="vi-VN"/>
+        </w:rPr>
       </w:pPr>
       <w:r>
         <w:t>Chương 3 đã trình bày quá trình phân tích và thiết kế hệ thống quản lý sản phẩm và đơn hàng, bao gồm đặc tả yêu cầu, kiến trúc hệ thống, thiết kế dữ liệu ERD, mô hình xử lý DFD và giao diện. Hệ thống sử dụng PHP, MySQL và Docker Compose nhằm hỗ trợ quản lý tập trung các thông tin sản phẩm, nhà cung cấp, khách hàng và đơn hàng. Những kết quả đạt được là cơ sở cho quá trình xây dựng, triển khai và kiểm thử hệ thống.</w:t>
       </w:r>
-    </w:p>
-    <w:p>
-      <w:pPr>
-        <w:rPr>
-          <w:rFonts w:eastAsiaTheme="majorEastAsia" w:cstheme="majorBidi"/>
-          <w:b/>
-          <w:sz w:val="26"/>
-          <w:szCs w:val="26"/>
-          <w:lang w:val="vi-VN"/>
-        </w:rPr>
-      </w:pPr>
     </w:p>
     <w:p>
       <w:pPr>
@@ -24079,6 +24058,7 @@
         <w:rPr>
           <w:lang w:val="vi-VN"/>
         </w:rPr>
+        <w:lastRenderedPageBreak/>
         <w:t xml:space="preserve"> </w:t>
       </w:r>
       <w:bookmarkStart w:id="95" w:name="_Toc243310724"/>
@@ -24105,108 +24085,1186 @@
     </w:p>
     <w:p>
       <w:pPr>
-        <w:rPr>
-          <w:lang w:val="vi-VN"/>
-        </w:rPr>
-      </w:pPr>
-    </w:p>
-    <w:p>
-      <w:pPr>
         <w:pStyle w:val="nd"/>
-      </w:pPr>
-      <w:r>
-        <w:t xml:space="preserve">- Mua hàng </w:t>
+        <w:rPr>
+          <w:lang w:val="vi-VN"/>
+        </w:rPr>
+      </w:pPr>
+      <w:r>
+        <w:rPr>
+          <w:b/>
+          <w:bCs/>
+          <w:lang w:val="vi-VN"/>
+        </w:rPr>
+        <w:t>Các t</w:t>
+      </w:r>
+      <w:r>
+        <w:rPr>
+          <w:b/>
+          <w:bCs/>
+          <w:lang w:val="vi-VN"/>
+        </w:rPr>
+        <w:t>ác nhân:</w:t>
+      </w:r>
+      <w:r>
+        <w:rPr>
+          <w:lang w:val="vi-VN"/>
+        </w:rPr>
+        <w:t xml:space="preserve"> Khách </w:t>
+      </w:r>
+      <w:r>
+        <w:rPr>
+          <w:lang w:val="vi-VN"/>
+        </w:rPr>
+        <w:t>hàng, Admin</w:t>
       </w:r>
     </w:p>
     <w:p>
       <w:pPr>
         <w:pStyle w:val="nd"/>
-      </w:pPr>
-      <w:r>
-        <w:t>- Quản lý sản phẩm</w:t>
+        <w:rPr>
+          <w:lang w:val="vi-VN"/>
+        </w:rPr>
+      </w:pPr>
+      <w:r>
+        <w:rPr>
+          <w:b/>
+          <w:bCs/>
+          <w:lang w:val="vi-VN"/>
+        </w:rPr>
+        <w:t>Phạm vi hệ thống:</w:t>
+      </w:r>
+      <w:r>
+        <w:rPr>
+          <w:lang w:val="vi-VN"/>
+        </w:rPr>
+        <w:t xml:space="preserve"> Website </w:t>
+      </w:r>
+      <w:r>
+        <w:rPr>
+          <w:lang w:val="vi-VN"/>
+        </w:rPr>
+        <w:t>quản lý sản phẩm và đơn hàng</w:t>
       </w:r>
     </w:p>
     <w:p>
       <w:pPr>
         <w:pStyle w:val="nd"/>
-      </w:pPr>
-      <w:r>
-        <w:t xml:space="preserve">- Theo quy trình cụ thể </w:t>
+        <w:rPr>
+          <w:lang w:val="vi-VN"/>
+        </w:rPr>
+      </w:pPr>
+      <w:r>
+        <w:rPr>
+          <w:b/>
+          <w:bCs/>
+          <w:lang w:val="vi-VN"/>
+        </w:rPr>
+        <w:t>Kịch bản 1:</w:t>
+      </w:r>
+      <w:r>
+        <w:rPr>
+          <w:lang w:val="vi-VN"/>
+        </w:rPr>
+        <w:t xml:space="preserve"> Duyệt sản phẩm - Tìm kiếm - Lọc sản phẩm theo hãng</w:t>
+      </w:r>
+    </w:p>
+    <w:p>
+      <w:pPr>
+        <w:pStyle w:val="nd"/>
+        <w:rPr>
+          <w:lang w:val="vi-VN"/>
+        </w:rPr>
+      </w:pPr>
+      <w:r>
+        <w:rPr>
+          <w:b/>
+          <w:bCs/>
+          <w:lang w:val="vi-VN"/>
+        </w:rPr>
+        <w:t>Mục tiêu:</w:t>
+      </w:r>
+      <w:r>
+        <w:rPr>
+          <w:lang w:val="vi-VN"/>
+        </w:rPr>
+        <w:t xml:space="preserve"> </w:t>
+      </w:r>
+      <w:r>
+        <w:rPr>
+          <w:lang w:val="vi-VN"/>
+        </w:rPr>
+        <w:t>Mô tả quá trình khách hàng truy cập hệ thống, xem danh sách sản phẩm, thực hiện tìm kiếm theo từ khóa và lọc sản phẩm theo hãng nhằm xác định sản phẩm phù hợp trước khi xem chi tiết.</w:t>
+      </w:r>
+    </w:p>
+    <w:p>
+      <w:pPr>
+        <w:pStyle w:val="nd"/>
+        <w:rPr>
+          <w:b/>
+          <w:bCs/>
+          <w:lang w:val="vi-VN"/>
+        </w:rPr>
+      </w:pPr>
+      <w:r>
+        <w:rPr>
+          <w:b/>
+          <w:bCs/>
+          <w:lang w:val="vi-VN"/>
+        </w:rPr>
+        <w:t>Các bước thực hiện:</w:t>
+      </w:r>
+    </w:p>
+    <w:p>
+      <w:pPr>
+        <w:pStyle w:val="nd"/>
+        <w:rPr>
+          <w:lang w:val="vi-VN"/>
+        </w:rPr>
+      </w:pPr>
+      <w:r>
+        <w:rPr>
+          <w:lang w:val="vi-VN"/>
+        </w:rPr>
+        <w:t>Khách hàng truy cập hệ thống.</w:t>
+      </w:r>
+      <w:r>
+        <w:rPr>
+          <w:lang w:val="vi-VN"/>
+        </w:rPr>
+        <w:t xml:space="preserve"> </w:t>
+      </w:r>
+      <w:r>
+        <w:rPr>
+          <w:lang w:val="vi-VN"/>
+        </w:rPr>
+        <w:t>Hệ thống hiển thị Trang chủ, bao gồm danh sách sản phẩm</w:t>
+      </w:r>
+      <w:r>
+        <w:rPr>
+          <w:lang w:val="vi-VN"/>
+        </w:rPr>
+        <w:t xml:space="preserve"> nổi bật, sản phẩm mới nhất</w:t>
+      </w:r>
+      <w:r>
+        <w:rPr>
+          <w:lang w:val="vi-VN"/>
+        </w:rPr>
+        <w:t xml:space="preserve"> và các thành phần điều hướng.</w:t>
+      </w:r>
+    </w:p>
+    <w:p>
+      <w:pPr>
+        <w:pStyle w:val="nd"/>
+        <w:rPr>
+          <w:lang w:val="vi-VN"/>
+        </w:rPr>
+      </w:pPr>
+      <w:r>
+        <w:rPr>
+          <w:lang w:val="vi-VN"/>
+        </w:rPr>
+        <w:t>Khách hàng chuyển sang Trang sản phẩm để xem đầy đủ sản phẩm</w:t>
+      </w:r>
+      <w:r>
+        <w:rPr>
+          <w:lang w:val="vi-VN"/>
+        </w:rPr>
+        <w:t xml:space="preserve"> và </w:t>
+      </w:r>
+      <w:r>
+        <w:rPr>
+          <w:lang w:val="vi-VN"/>
+        </w:rPr>
+        <w:t>nhập từ khóa vào thanh tìm kiếm.</w:t>
+      </w:r>
+      <w:r>
+        <w:rPr>
+          <w:lang w:val="vi-VN"/>
+        </w:rPr>
+        <w:t xml:space="preserve"> </w:t>
+      </w:r>
+      <w:r>
+        <w:rPr>
+          <w:lang w:val="vi-VN"/>
+        </w:rPr>
+        <w:t>Hệ thống truy vấn dữ liệu theo từ khóa và hiển thị danh sách sản phẩm phù hợp.</w:t>
+      </w:r>
+    </w:p>
+    <w:p>
+      <w:pPr>
+        <w:pStyle w:val="nd"/>
+        <w:rPr>
+          <w:b/>
+          <w:bCs/>
+          <w:lang w:val="vi-VN"/>
+        </w:rPr>
+      </w:pPr>
+      <w:r>
+        <w:rPr>
+          <w:b/>
+          <w:bCs/>
+          <w:lang w:val="vi-VN"/>
+        </w:rPr>
+        <w:t>Kết quả:</w:t>
+      </w:r>
+    </w:p>
+    <w:p>
+      <w:pPr>
+        <w:pStyle w:val="nd"/>
+        <w:rPr>
+          <w:lang w:val="vi-VN"/>
+        </w:rPr>
+      </w:pPr>
+      <w:r>
+        <w:rPr>
+          <w:lang w:val="vi-VN"/>
+        </w:rPr>
+        <w:t>Kết quả 1: Hệ thống hiển thị sản phẩm theo từ khóa đã tìm kiếm</w:t>
+      </w:r>
+    </w:p>
+    <w:p>
+      <w:pPr>
+        <w:pStyle w:val="nd"/>
+        <w:rPr>
+          <w:lang w:val="vi-VN"/>
+        </w:rPr>
+      </w:pPr>
+      <w:r>
+        <w:rPr>
+          <w:lang w:val="vi-VN"/>
+        </w:rPr>
+        <w:t xml:space="preserve">Kết quả 2: </w:t>
+      </w:r>
+      <w:r>
+        <w:rPr>
+          <w:lang w:val="vi-VN"/>
+        </w:rPr>
+        <w:t>Hệ thống hiển thị thông báo “Không tìm thấy sản phẩm phù hợp”</w:t>
+      </w:r>
+    </w:p>
+    <w:p>
+      <w:pPr>
+        <w:pStyle w:val="nd"/>
+        <w:rPr>
+          <w:lang w:val="vi-VN"/>
+        </w:rPr>
+      </w:pPr>
+      <w:r>
+        <w:rPr>
+          <w:b/>
+          <w:lang w:val="vi-VN"/>
+        </w:rPr>
+        <w:t>Kịch bản 2</w:t>
+      </w:r>
+      <w:r>
+        <w:rPr>
+          <w:lang w:val="vi-VN"/>
+        </w:rPr>
+        <w:t xml:space="preserve">: </w:t>
+      </w:r>
+      <w:r>
+        <w:rPr>
+          <w:lang w:val="vi-VN"/>
+        </w:rPr>
+        <w:t>Xem chi tiết sản phẩm – Thêm vào giỏ / Mua ngay</w:t>
+      </w:r>
+      <w:r>
+        <w:rPr>
+          <w:lang w:val="vi-VN"/>
+        </w:rPr>
+        <w:t xml:space="preserve"> ( bắt buộc đăng nhập )</w:t>
+      </w:r>
+    </w:p>
+    <w:p>
+      <w:pPr>
+        <w:pStyle w:val="nd"/>
+        <w:rPr>
+          <w:lang w:val="vi-VN"/>
+        </w:rPr>
+      </w:pPr>
+      <w:r>
+        <w:rPr>
+          <w:b/>
+          <w:lang w:val="vi-VN"/>
+        </w:rPr>
+        <w:t>Mục tiêu</w:t>
+      </w:r>
+      <w:r>
+        <w:rPr>
+          <w:lang w:val="vi-VN"/>
+        </w:rPr>
+        <w:t xml:space="preserve">: </w:t>
+      </w:r>
+      <w:r>
+        <w:rPr>
+          <w:lang w:val="vi-VN"/>
+        </w:rPr>
+        <w:t xml:space="preserve">Mô tả quá trình khách hàng xem chi tiết sản phẩm, lựa chọn phiên bản bộ nhớ và màu sắc, sau đó thực hiện hành động thêm vào giỏ hoặc mua ngay với ràng buộc </w:t>
+      </w:r>
+      <w:r>
+        <w:rPr>
+          <w:lang w:val="vi-VN"/>
+        </w:rPr>
+        <w:t>đăng nhập.</w:t>
+      </w:r>
+    </w:p>
+    <w:p>
+      <w:pPr>
+        <w:pStyle w:val="nd"/>
+        <w:rPr>
+          <w:lang w:val="vi-VN"/>
+        </w:rPr>
+      </w:pPr>
+      <w:r>
+        <w:rPr>
+          <w:b/>
+          <w:lang w:val="vi-VN"/>
+        </w:rPr>
+        <w:t>Điều kiện</w:t>
+      </w:r>
+      <w:r>
+        <w:rPr>
+          <w:lang w:val="vi-VN"/>
+        </w:rPr>
+        <w:t>: Khách hàng phải tiến hành đăng nhập tài khoản trước khi mua hàng</w:t>
+      </w:r>
+    </w:p>
+    <w:p>
+      <w:pPr>
+        <w:pStyle w:val="nd"/>
+        <w:rPr>
+          <w:lang w:val="vi-VN"/>
+        </w:rPr>
+      </w:pPr>
+      <w:r>
+        <w:rPr>
+          <w:b/>
+          <w:lang w:val="vi-VN"/>
+        </w:rPr>
+        <w:t>Các bước thực hiện</w:t>
+      </w:r>
+      <w:r>
+        <w:rPr>
+          <w:lang w:val="vi-VN"/>
+        </w:rPr>
+        <w:t>:</w:t>
+      </w:r>
+    </w:p>
+    <w:p>
+      <w:pPr>
+        <w:pStyle w:val="nd"/>
+        <w:rPr>
+          <w:lang w:val="vi-VN"/>
+        </w:rPr>
+      </w:pPr>
+      <w:r>
+        <w:rPr>
+          <w:lang w:val="vi-VN"/>
+        </w:rPr>
+        <w:t>Khách hàng từ danh sách sản phẩm chọn một sản phẩm</w:t>
+      </w:r>
+      <w:r>
+        <w:rPr>
+          <w:lang w:val="vi-VN"/>
+        </w:rPr>
+        <w:t xml:space="preserve"> để xem</w:t>
+      </w:r>
+      <w:r>
+        <w:rPr>
+          <w:lang w:val="vi-VN"/>
+        </w:rPr>
+        <w:t>.</w:t>
+      </w:r>
+      <w:r>
+        <w:rPr>
+          <w:lang w:val="vi-VN"/>
+        </w:rPr>
+        <w:t xml:space="preserve"> </w:t>
+      </w:r>
+      <w:r>
+        <w:rPr>
+          <w:lang w:val="vi-VN"/>
+        </w:rPr>
+        <w:t>Hệ thống hiển thị Trang chi tiết sản phẩm, gồm: ảnh, giá bán, thông số cấu hình, lựa chọn phiên bản, lựa chọn màu sắc.</w:t>
+      </w:r>
+      <w:r>
+        <w:rPr>
+          <w:lang w:val="vi-VN"/>
+        </w:rPr>
+        <w:t xml:space="preserve"> </w:t>
+      </w:r>
+      <w:r>
+        <w:rPr>
+          <w:lang w:val="vi-VN"/>
+        </w:rPr>
+        <w:t xml:space="preserve">Khách hàng chọn phiên bản bộ </w:t>
+      </w:r>
+      <w:r>
+        <w:rPr>
+          <w:lang w:val="vi-VN"/>
+        </w:rPr>
+        <w:t xml:space="preserve">nhớ, màu sắc. </w:t>
+      </w:r>
+      <w:r>
+        <w:rPr>
+          <w:lang w:val="vi-VN"/>
+        </w:rPr>
+        <w:t>Khách hàng nhấn “Thêm vào giỏ hàng” hoặc “Mua ngay”.</w:t>
+      </w:r>
+    </w:p>
+    <w:p>
+      <w:pPr>
+        <w:pStyle w:val="nd"/>
+        <w:rPr>
+          <w:lang w:val="vi-VN"/>
+        </w:rPr>
+      </w:pPr>
+      <w:r>
+        <w:rPr>
+          <w:lang w:val="vi-VN"/>
+        </w:rPr>
+        <w:lastRenderedPageBreak/>
+        <w:t>Hệ thống kiểm tra trạng thái đăng nhập:</w:t>
+      </w:r>
+      <w:r>
+        <w:rPr>
+          <w:lang w:val="vi-VN"/>
+        </w:rPr>
+        <w:t xml:space="preserve"> </w:t>
+      </w:r>
+    </w:p>
+    <w:p>
+      <w:pPr>
+        <w:pStyle w:val="nd"/>
+        <w:rPr>
+          <w:lang w:val="vi-VN"/>
+        </w:rPr>
+      </w:pPr>
+      <w:r>
+        <w:rPr>
+          <w:lang w:val="vi-VN"/>
+        </w:rPr>
+        <w:t xml:space="preserve">Nếu đã đăng nhập: Hệ thống </w:t>
+      </w:r>
+      <w:r>
+        <w:rPr>
+          <w:lang w:val="vi-VN"/>
+        </w:rPr>
+        <w:t xml:space="preserve">sẽ cho phép thực hiện hành động theo lựa chọn của khách hàng. Nếu </w:t>
+      </w:r>
+      <w:r>
+        <w:rPr>
+          <w:lang w:val="vi-VN"/>
+        </w:rPr>
+        <w:t>“Thêm vào giỏ hàng”</w:t>
+      </w:r>
+      <w:r>
+        <w:rPr>
+          <w:lang w:val="vi-VN"/>
+        </w:rPr>
+        <w:t xml:space="preserve"> thì sản phẩm sẽ được thêm vào giỏ hàng Nếu. </w:t>
+      </w:r>
+      <w:r>
+        <w:rPr>
+          <w:lang w:val="vi-VN"/>
+        </w:rPr>
+        <w:t>“Mua ngay”</w:t>
+      </w:r>
+      <w:r>
+        <w:rPr>
+          <w:lang w:val="vi-VN"/>
+        </w:rPr>
+        <w:t xml:space="preserve"> </w:t>
+      </w:r>
+      <w:r>
+        <w:rPr>
+          <w:lang w:val="vi-VN"/>
+        </w:rPr>
+        <w:t>hệ thống chuyển sang trang đặt hàng</w:t>
+      </w:r>
+      <w:r>
+        <w:rPr>
+          <w:lang w:val="vi-VN"/>
+        </w:rPr>
+        <w:t xml:space="preserve"> với </w:t>
+      </w:r>
+      <w:r>
+        <w:rPr>
+          <w:lang w:val="vi-VN"/>
+        </w:rPr>
+        <w:t>sản phẩm đã chọn.</w:t>
+      </w:r>
+    </w:p>
+    <w:p>
+      <w:pPr>
+        <w:pStyle w:val="nd"/>
+        <w:rPr>
+          <w:lang w:val="vi-VN"/>
+        </w:rPr>
+      </w:pPr>
+      <w:r>
+        <w:rPr>
+          <w:lang w:val="vi-VN"/>
+        </w:rPr>
+        <w:t xml:space="preserve">Nếu chưa đăng </w:t>
+      </w:r>
+      <w:r>
+        <w:rPr>
+          <w:lang w:val="vi-VN"/>
+        </w:rPr>
+        <w:t>nhập: h</w:t>
+      </w:r>
+      <w:r>
+        <w:rPr>
+          <w:lang w:val="vi-VN"/>
+        </w:rPr>
+        <w:t>ệ thống chuyển hướng đến Trang đăng nhập/đăng ký</w:t>
+      </w:r>
+    </w:p>
+    <w:p>
+      <w:pPr>
+        <w:pStyle w:val="nd"/>
+        <w:rPr>
+          <w:lang w:val="vi-VN"/>
+        </w:rPr>
+      </w:pPr>
+      <w:r>
+        <w:rPr>
+          <w:b/>
+          <w:lang w:val="vi-VN"/>
+        </w:rPr>
+        <w:t>Kết quả</w:t>
+      </w:r>
+      <w:r>
+        <w:rPr>
+          <w:lang w:val="vi-VN"/>
+        </w:rPr>
+        <w:t>:</w:t>
+      </w:r>
+    </w:p>
+    <w:p>
+      <w:pPr>
+        <w:pStyle w:val="nd"/>
+        <w:rPr>
+          <w:lang w:val="vi-VN"/>
+        </w:rPr>
+      </w:pPr>
+      <w:r>
+        <w:rPr>
+          <w:lang w:val="vi-VN"/>
+        </w:rPr>
+        <w:t>Kết quả 1: Khách hàng đã đăng nhập từ trước và thực hiện mua sắm bình thường.</w:t>
+      </w:r>
+    </w:p>
+    <w:p>
+      <w:pPr>
+        <w:pStyle w:val="nd"/>
+        <w:rPr>
+          <w:lang w:val="vi-VN"/>
+        </w:rPr>
+      </w:pPr>
+      <w:r>
+        <w:rPr>
+          <w:lang w:val="vi-VN"/>
+        </w:rPr>
+        <w:t>Kết quả 2: Khách hàng chưa đăng nhập sẽ không thêm sản phẩm vào giỏ hàng được hoặc khách hàng chưa có tài khoản thì cần đăng ký tài khoản.</w:t>
+      </w:r>
+    </w:p>
+    <w:p>
+      <w:pPr>
+        <w:pStyle w:val="nd"/>
+        <w:rPr>
+          <w:lang w:val="vi-VN"/>
+        </w:rPr>
+      </w:pPr>
+      <w:r>
+        <w:rPr>
+          <w:b/>
+          <w:lang w:val="vi-VN"/>
+        </w:rPr>
+        <w:t>Kịch bản 3</w:t>
+      </w:r>
+      <w:r>
+        <w:rPr>
+          <w:lang w:val="vi-VN"/>
+        </w:rPr>
+        <w:t>: Quản lý giỏ hàng – Đặt hàng – Xem lại đơn hàng</w:t>
+      </w:r>
+    </w:p>
+    <w:p>
+      <w:pPr>
+        <w:pStyle w:val="nd"/>
+        <w:rPr>
+          <w:lang w:val="vi-VN"/>
+        </w:rPr>
+      </w:pPr>
+      <w:r>
+        <w:rPr>
+          <w:b/>
+          <w:bCs/>
+          <w:lang w:val="vi-VN"/>
+        </w:rPr>
+        <w:t>Mục tiêu:</w:t>
+      </w:r>
+      <w:r>
+        <w:rPr>
+          <w:lang w:val="vi-VN"/>
+        </w:rPr>
+        <w:t xml:space="preserve"> </w:t>
+      </w:r>
+      <w:r>
+        <w:rPr>
+          <w:lang w:val="vi-VN"/>
+        </w:rPr>
+        <w:t xml:space="preserve">Mô tả quá trình khách hàng quản lý giỏ hàng (tăng/giảm số lượng, xóa sản phẩm), thực hiện đặt hàng bằng cách nhập thông tin giao </w:t>
+      </w:r>
+      <w:r>
+        <w:rPr>
+          <w:lang w:val="vi-VN"/>
+        </w:rPr>
+        <w:t>hàng</w:t>
+      </w:r>
+    </w:p>
+    <w:p>
+      <w:pPr>
+        <w:pStyle w:val="nd"/>
+        <w:rPr>
+          <w:lang w:val="vi-VN"/>
+        </w:rPr>
+      </w:pPr>
+      <w:r>
+        <w:rPr>
+          <w:lang w:val="vi-VN"/>
+        </w:rPr>
+        <w:t>Điều kiện: Khách hàng đã đăng nhập hệ thống và có ít nhất 1 sản phẩm trong giỏ hàng.</w:t>
+      </w:r>
+    </w:p>
+    <w:p>
+      <w:pPr>
+        <w:pStyle w:val="nd"/>
+        <w:rPr>
+          <w:b/>
+          <w:bCs/>
+          <w:lang w:val="vi-VN"/>
+        </w:rPr>
+      </w:pPr>
+      <w:r>
+        <w:rPr>
+          <w:b/>
+          <w:bCs/>
+          <w:lang w:val="vi-VN"/>
+        </w:rPr>
+        <w:t>Các bước thực hiện</w:t>
+      </w:r>
+    </w:p>
+    <w:p>
+      <w:pPr>
+        <w:pStyle w:val="nd"/>
+        <w:rPr>
+          <w:lang w:val="vi-VN"/>
+        </w:rPr>
+      </w:pPr>
+      <w:r>
+        <w:rPr>
+          <w:lang w:val="vi-VN"/>
+        </w:rPr>
+        <w:t>Khách hàng truy cập Trang giỏ hàng.</w:t>
+      </w:r>
+      <w:r>
+        <w:rPr>
+          <w:lang w:val="vi-VN"/>
+        </w:rPr>
+        <w:t xml:space="preserve"> </w:t>
+      </w:r>
+      <w:r>
+        <w:rPr>
+          <w:lang w:val="vi-VN"/>
+        </w:rPr>
+        <w:t>Hệ thống hiển thị danh sách sản phẩm trong giỏ, bao gồm:</w:t>
+      </w:r>
+      <w:r>
+        <w:rPr>
+          <w:lang w:val="vi-VN"/>
+        </w:rPr>
+        <w:t xml:space="preserve"> hình ảnh,</w:t>
+      </w:r>
+      <w:r>
+        <w:rPr>
+          <w:lang w:val="vi-VN"/>
+        </w:rPr>
+        <w:t xml:space="preserve"> tên sản phẩm, số lượng, giá, tổng tiền.</w:t>
+      </w:r>
+      <w:r>
+        <w:rPr>
+          <w:lang w:val="vi-VN"/>
+        </w:rPr>
+        <w:t xml:space="preserve"> </w:t>
+      </w:r>
+      <w:r>
+        <w:rPr>
+          <w:lang w:val="vi-VN"/>
+        </w:rPr>
+        <w:t>Khách hàng điều chỉnh số lượng (tăng/giảm) hoặc xóa sản phẩm.</w:t>
+      </w:r>
+      <w:r>
+        <w:rPr>
+          <w:lang w:val="vi-VN"/>
+        </w:rPr>
+        <w:t xml:space="preserve"> </w:t>
+      </w:r>
+      <w:r>
+        <w:rPr>
+          <w:lang w:val="vi-VN"/>
+        </w:rPr>
+        <w:t>Hệ thống cập nhật dữ liệu giỏ hàng và tính lại tổng tiền theo thay đổi.</w:t>
+      </w:r>
+    </w:p>
+    <w:p>
+      <w:pPr>
+        <w:pStyle w:val="nd"/>
+        <w:rPr>
+          <w:lang w:val="vi-VN"/>
+        </w:rPr>
+      </w:pPr>
+      <w:r>
+        <w:rPr>
+          <w:lang w:val="vi-VN"/>
+        </w:rPr>
+        <w:t>Khách hàng nhấn đặt mua, hệ thống chuyển sang trang đặt hàng. Sau đó k</w:t>
+      </w:r>
+      <w:r>
+        <w:rPr>
+          <w:lang w:val="vi-VN"/>
+        </w:rPr>
+        <w:t>hách hàng nhập thông tin giao hàng: tên người nhận, số điện thoại, địa chỉ</w:t>
+      </w:r>
+      <w:r>
+        <w:rPr>
+          <w:lang w:val="vi-VN"/>
+        </w:rPr>
+        <w:t xml:space="preserve"> và nhấn đặt hàng. </w:t>
+      </w:r>
+      <w:r>
+        <w:rPr>
+          <w:lang w:val="vi-VN"/>
+        </w:rPr>
+        <w:t>Hệ thống hiển thị thông báo đặt hàng thành công</w:t>
+      </w:r>
+    </w:p>
+    <w:p>
+      <w:pPr>
+        <w:pStyle w:val="nd"/>
+        <w:rPr>
+          <w:b/>
+          <w:bCs/>
+          <w:lang w:val="vi-VN"/>
+        </w:rPr>
+      </w:pPr>
+      <w:r>
+        <w:rPr>
+          <w:b/>
+          <w:bCs/>
+          <w:lang w:val="vi-VN"/>
+        </w:rPr>
+        <w:t>Kết quả:</w:t>
+      </w:r>
+    </w:p>
+    <w:p>
+      <w:pPr>
+        <w:pStyle w:val="nd"/>
+        <w:rPr>
+          <w:lang w:val="vi-VN"/>
+        </w:rPr>
+      </w:pPr>
+      <w:r>
+        <w:rPr>
+          <w:lang w:val="vi-VN"/>
+        </w:rPr>
+        <w:t>Kết quả 1: Khách hàng đặt hàng thành công</w:t>
+      </w:r>
+    </w:p>
+    <w:p>
+      <w:pPr>
+        <w:pStyle w:val="nd"/>
+        <w:rPr>
+          <w:lang w:val="vi-VN"/>
+        </w:rPr>
+      </w:pPr>
+      <w:r>
+        <w:rPr>
+          <w:lang w:val="vi-VN"/>
+        </w:rPr>
+        <w:t>Kết quả 2: Khách hàng điền thiếu thông tin giao hàng, hệ thống sẽ nhắc nhở và yêu cầu bổ sung thông tin.</w:t>
+      </w:r>
+    </w:p>
+    <w:p>
+      <w:pPr>
+        <w:pStyle w:val="nd"/>
+        <w:rPr>
+          <w:b/>
+          <w:bCs/>
+        </w:rPr>
+      </w:pPr>
+      <w:r>
+        <w:rPr>
+          <w:b/>
+          <w:bCs/>
+        </w:rPr>
+        <w:t>Kịch bản 4: Quản lý đơn hàng</w:t>
+      </w:r>
+    </w:p>
+    <w:p>
+      <w:pPr>
+        <w:pStyle w:val="nd"/>
+      </w:pPr>
+      <w:r>
+        <w:rPr>
+          <w:b/>
+          <w:bCs/>
+        </w:rPr>
+        <w:lastRenderedPageBreak/>
+        <w:t>Mục tiêu:</w:t>
+      </w:r>
+      <w:r>
+        <w:t xml:space="preserve"> Mô tả quá trình Admin tiếp nhận, xem danh sách, tìm kiếm, kiểm tra và cập nhật thông tin đơn hàng do khách hàng đặt trên hệ thống.</w:t>
+      </w:r>
+    </w:p>
+    <w:p>
+      <w:pPr>
+        <w:pStyle w:val="nd"/>
+      </w:pPr>
+      <w:r>
+        <w:t>Điều kiện: Admin</w:t>
+      </w:r>
+      <w:r>
+        <w:rPr>
+          <w:lang w:val="vi-VN"/>
+        </w:rPr>
+        <w:t xml:space="preserve"> </w:t>
+      </w:r>
+      <w:r>
+        <w:t>đã đăng nhập hệ thống và được cấp quyền quản lý đơn hàng.</w:t>
+      </w:r>
+    </w:p>
+    <w:p>
+      <w:pPr>
+        <w:pStyle w:val="nd"/>
+        <w:rPr>
+          <w:b/>
+          <w:bCs/>
+        </w:rPr>
+      </w:pPr>
+      <w:r>
+        <w:rPr>
+          <w:b/>
+          <w:bCs/>
+        </w:rPr>
+        <w:t>Các bước thực hiện:</w:t>
+      </w:r>
+    </w:p>
+    <w:p>
+      <w:pPr>
+        <w:pStyle w:val="nd"/>
+      </w:pPr>
+      <w:r>
+        <w:t>Admin truy cập chức năng Quản lý đơn hàng.</w:t>
+      </w:r>
+    </w:p>
+    <w:p>
+      <w:pPr>
+        <w:pStyle w:val="nd"/>
+        <w:rPr>
+          <w:lang w:val="vi-VN"/>
+        </w:rPr>
+      </w:pPr>
+      <w:r>
+        <w:t>Hệ thống truy vấn dữ liệu và hiển thị danh sách đơn hàng, bao gồm: mã đơn hàng, tên khách hàng, ngày đặt hàng, tổng tiền, phương thức thanh toán và trạng thái đơn hàng.</w:t>
+      </w:r>
+      <w:r>
+        <w:rPr>
+          <w:lang w:val="vi-VN"/>
+        </w:rPr>
+        <w:t xml:space="preserve"> </w:t>
+      </w:r>
+      <w:r>
+        <w:t>Admin lựa chọn một đơn hàng để xem chi tiết.</w:t>
+      </w:r>
+      <w:r>
+        <w:rPr>
+          <w:lang w:val="vi-VN"/>
+        </w:rPr>
+        <w:t xml:space="preserve"> </w:t>
+      </w:r>
+    </w:p>
+    <w:p>
+      <w:pPr>
+        <w:pStyle w:val="nd"/>
+      </w:pPr>
+      <w:r>
+        <w:t>Hệ thống hiển thị thông tin đơn hàng, bao gồm thông tin khách hàng, địa chỉ giao hàng, số điện thoại, danh sách sản phẩm, số lượng, đơn giá và tổng tiền.</w:t>
+      </w:r>
+      <w:r>
+        <w:rPr>
+          <w:lang w:val="vi-VN"/>
+        </w:rPr>
+        <w:t xml:space="preserve"> </w:t>
+      </w:r>
+      <w:r>
+        <w:t>Admin kiểm tra thông tin đơn hàng và cập nhật trạng thái xử lý khi cần thiết.</w:t>
+      </w:r>
+      <w:r>
+        <w:rPr>
+          <w:lang w:val="vi-VN"/>
+        </w:rPr>
+        <w:t xml:space="preserve"> </w:t>
+      </w:r>
+      <w:r>
+        <w:t>Hệ thống kiểm tra tính hợp lệ của thông tin, lưu thay đổi và thông báo kết quả.</w:t>
+      </w:r>
+    </w:p>
+    <w:p>
+      <w:pPr>
+        <w:pStyle w:val="nd"/>
+        <w:rPr>
+          <w:b/>
+          <w:bCs/>
+        </w:rPr>
+      </w:pPr>
+      <w:r>
+        <w:rPr>
+          <w:b/>
+          <w:bCs/>
+        </w:rPr>
+        <w:t>Kết quả:</w:t>
+      </w:r>
+    </w:p>
+    <w:p>
+      <w:pPr>
+        <w:pStyle w:val="nd"/>
+      </w:pPr>
+      <w:r>
+        <w:t>Kết quả 1: Đơn hàng được hiển thị và cập nhật thành công.</w:t>
+      </w:r>
+    </w:p>
+    <w:p>
+      <w:pPr>
+        <w:pStyle w:val="nd"/>
+      </w:pPr>
+      <w:r>
+        <w:t>Kết quả 2: Hệ thống thông báo lỗi khi đơn hàng không tồn tại hoặc thông tin cập nhật không hợp lệ.</w:t>
+      </w:r>
+    </w:p>
+    <w:p>
+      <w:pPr>
+        <w:pStyle w:val="nd"/>
+        <w:rPr>
+          <w:b/>
+          <w:bCs/>
+          <w:lang w:val="vi-VN"/>
+        </w:rPr>
+      </w:pPr>
+      <w:r>
+        <w:rPr>
+          <w:b/>
+          <w:bCs/>
+        </w:rPr>
+        <w:t xml:space="preserve">Kịch bản 5: </w:t>
+      </w:r>
+      <w:r>
+        <w:t>Xử lý và cập nhật trạng thái đơn hàng</w:t>
+      </w:r>
+    </w:p>
+    <w:p>
+      <w:pPr>
+        <w:pStyle w:val="nd"/>
+      </w:pPr>
+      <w:r>
+        <w:rPr>
+          <w:b/>
+          <w:bCs/>
+        </w:rPr>
+        <w:t>Mục tiêu:</w:t>
+      </w:r>
+      <w:r>
+        <w:t xml:space="preserve"> Mô tả quá trình kiểm tra và cập nhật trạng thái đơn hàng từ khi khách hàng đặt hàng đến khi đơn hàng được giao thành công hoặc bị hủy.</w:t>
+      </w:r>
+    </w:p>
+    <w:p>
+      <w:pPr>
+        <w:pStyle w:val="nd"/>
+        <w:rPr>
+          <w:lang w:val="vi-VN"/>
+        </w:rPr>
+      </w:pPr>
+      <w:r>
+        <w:t xml:space="preserve">Điều kiện: </w:t>
+      </w:r>
+      <w:r>
+        <w:t>Đ</w:t>
+      </w:r>
+      <w:r>
+        <w:t>ơn hàng tồn tại trong hệ thống.</w:t>
+      </w:r>
+    </w:p>
+    <w:p>
+      <w:pPr>
+        <w:pStyle w:val="nd"/>
+        <w:rPr>
+          <w:b/>
+          <w:bCs/>
+          <w:lang w:val="vi-VN"/>
+        </w:rPr>
+      </w:pPr>
+      <w:r>
+        <w:rPr>
+          <w:b/>
+          <w:bCs/>
+        </w:rPr>
+        <w:t>Các bước thực hiện:</w:t>
+      </w:r>
+    </w:p>
+    <w:p>
+      <w:pPr>
+        <w:pStyle w:val="nd"/>
+        <w:rPr>
+          <w:lang w:val="vi-VN"/>
+        </w:rPr>
+      </w:pPr>
+      <w:r>
+        <w:t>Admin truy cập chức năng Quản lý đơn hàng, hệ thống hiển thị danh sách các đơn hàng cùng trạng thái hiện tại. Người dùng chọn đơn hàng cần xử lý, hệ thống hiển thị thông tin chi tiết để kiểm tra. Sau khi xác nhận thông tin hợp lệ, Admin</w:t>
+      </w:r>
+      <w:r>
+        <w:rPr>
+          <w:lang w:val="vi-VN"/>
+        </w:rPr>
+        <w:t xml:space="preserve"> </w:t>
+      </w:r>
+      <w:r>
+        <w:t>cập nhật trạng thái đơn hàng theo quy trình nghiệp vụ, bao gồm: Chờ xác nhận, Đã xác nhận, Đang xử lý, Đang giao hàng, Đã giao hàng hoặc Đã hủy. Hệ thống kiểm tra tính hợp lệ của trạng thái, lưu thông tin cập nhật và hiển thị thông báo kết quả.</w:t>
+      </w:r>
+    </w:p>
+    <w:p>
+      <w:pPr>
+        <w:pStyle w:val="nd"/>
+        <w:rPr>
+          <w:b/>
+          <w:bCs/>
+        </w:rPr>
+      </w:pPr>
+      <w:r>
+        <w:rPr>
+          <w:b/>
+          <w:bCs/>
+        </w:rPr>
+        <w:t>Kết quả:</w:t>
+      </w:r>
+    </w:p>
+    <w:p>
+      <w:pPr>
+        <w:pStyle w:val="nd"/>
+      </w:pPr>
+      <w:r>
+        <w:lastRenderedPageBreak/>
+        <w:t>Kết quả 1: Trạng thái đơn hàng được cập nhật thành công.</w:t>
+      </w:r>
+    </w:p>
+    <w:p>
+      <w:pPr>
+        <w:pStyle w:val="nd"/>
+        <w:rPr>
+          <w:lang w:val="vi-VN"/>
+        </w:rPr>
+      </w:pPr>
+      <w:r>
+        <w:t>Kết quả 2: Hệ thống thông báo lỗi nếu trạng thái không hợp lệ hoặc đơn hàng không tồn tại.</w:t>
       </w:r>
     </w:p>
     <w:p>
       <w:pPr>
         <w:pStyle w:val="Heading2"/>
-      </w:pPr>
-      <w:bookmarkStart w:id="97" w:name="_Toc243310726"/>
+        <w:rPr>
+          <w:lang w:val="vi-VN"/>
+        </w:rPr>
+      </w:pPr>
+      <w:bookmarkStart w:id="97" w:name="_Toc243310727"/>
+      <w:r>
+        <w:t>Kết quả</w:t>
+      </w:r>
       <w:bookmarkEnd w:id="97"/>
+      <w:r>
+        <w:t xml:space="preserve"> </w:t>
+      </w:r>
+      <w:r>
+        <w:t>thực</w:t>
+      </w:r>
+      <w:r>
+        <w:rPr>
+          <w:lang w:val="vi-VN"/>
+        </w:rPr>
+        <w:t xml:space="preserve"> nghiệm</w:t>
+      </w:r>
+    </w:p>
+    <w:p>
+      <w:pPr>
+        <w:rPr>
+          <w:lang w:val="vi-VN"/>
+        </w:rPr>
+      </w:pPr>
     </w:p>
     <w:p>
       <w:pPr>
         <w:pStyle w:val="Heading2"/>
       </w:pPr>
-      <w:bookmarkStart w:id="98" w:name="_Toc243310727"/>
-      <w:r>
-        <w:t>Kết quả</w:t>
+      <w:bookmarkStart w:id="98" w:name="_Toc243310728"/>
+      <w:r>
+        <w:t>Các giao diện</w:t>
       </w:r>
       <w:bookmarkEnd w:id="98"/>
-      <w:r>
-        <w:t xml:space="preserve"> </w:t>
-      </w:r>
-    </w:p>
-    <w:p>
-      <w:pPr>
-        <w:pStyle w:val="Heading2"/>
-      </w:pPr>
-      <w:bookmarkStart w:id="99" w:name="_Toc243310728"/>
-      <w:r>
-        <w:t>Các giao diện</w:t>
+    </w:p>
+    <w:p>
+      <w:pPr>
+        <w:rPr>
+          <w:lang w:val="vi-VN"/>
+        </w:rPr>
+      </w:pPr>
+    </w:p>
+    <w:p>
+      <w:pPr>
+        <w:rPr>
+          <w:lang w:val="vi-VN"/>
+        </w:rPr>
+      </w:pPr>
+      <w:r>
+        <w:rPr>
+          <w:lang w:val="vi-VN"/>
+        </w:rPr>
+        <w:br w:type="page"/>
+      </w:r>
+    </w:p>
+    <w:p>
+      <w:pPr>
+        <w:rPr>
+          <w:lang w:val="vi-VN"/>
+        </w:rPr>
+      </w:pPr>
+    </w:p>
+    <w:p>
+      <w:pPr>
+        <w:pStyle w:val="Heading1"/>
+        <w:rPr>
+          <w:lang w:val="vi-VN"/>
+        </w:rPr>
+      </w:pPr>
+      <w:bookmarkStart w:id="99" w:name="_Toc243310729"/>
+      <w:r>
+        <w:rPr>
+          <w:caps w:val="0"/>
+          <w:lang w:val="vi-VN"/>
+        </w:rPr>
+        <w:t>KẾT LUẬN VÀ HƯỚNG PHÁT TRIỂN</w:t>
       </w:r>
       <w:bookmarkEnd w:id="99"/>
-    </w:p>
-    <w:p>
-      <w:pPr>
-        <w:rPr>
-          <w:lang w:val="vi-VN"/>
-        </w:rPr>
-      </w:pPr>
-    </w:p>
-    <w:p>
-      <w:pPr>
-        <w:rPr>
-          <w:lang w:val="vi-VN"/>
-        </w:rPr>
-      </w:pPr>
-      <w:r>
-        <w:rPr>
-          <w:lang w:val="vi-VN"/>
-        </w:rPr>
-        <w:br w:type="page"/>
-      </w:r>
-    </w:p>
-    <w:p>
-      <w:pPr>
-        <w:rPr>
-          <w:lang w:val="vi-VN"/>
-        </w:rPr>
-      </w:pPr>
-    </w:p>
-    <w:p>
-      <w:pPr>
-        <w:pStyle w:val="Heading1"/>
-        <w:rPr>
-          <w:lang w:val="vi-VN"/>
-        </w:rPr>
-      </w:pPr>
-      <w:bookmarkStart w:id="100" w:name="_Toc243310729"/>
-      <w:r>
-        <w:rPr>
-          <w:caps w:val="0"/>
-          <w:lang w:val="vi-VN"/>
-        </w:rPr>
-        <w:t>KẾT LUẬN VÀ HƯỚNG PHÁT TRIỂN</w:t>
-      </w:r>
-      <w:bookmarkEnd w:id="100"/>
     </w:p>
     <w:p/>
     <w:p>
@@ -24527,6 +25585,119 @@
     </w:lvl>
   </w:abstractNum>
   <w:abstractNum w:abstractNumId="2" w15:restartNumberingAfterBreak="0">
+    <w:nsid w:val="0D0236D7"/>
+    <w:multiLevelType w:val="multilevel"/>
+    <w:tmpl w:val="18968316"/>
+    <w:lvl w:ilvl="0">
+      <w:start w:val="1"/>
+      <w:numFmt w:val="decimal"/>
+      <w:lvlText w:val="%1."/>
+      <w:lvlJc w:val="left"/>
+      <w:pPr>
+        <w:tabs>
+          <w:tab w:val="num" w:pos="720"/>
+        </w:tabs>
+        <w:ind w:left="720" w:hanging="360"/>
+      </w:pPr>
+    </w:lvl>
+    <w:lvl w:ilvl="1" w:tentative="1">
+      <w:start w:val="1"/>
+      <w:numFmt w:val="decimal"/>
+      <w:lvlText w:val="%2."/>
+      <w:lvlJc w:val="left"/>
+      <w:pPr>
+        <w:tabs>
+          <w:tab w:val="num" w:pos="1440"/>
+        </w:tabs>
+        <w:ind w:left="1440" w:hanging="360"/>
+      </w:pPr>
+    </w:lvl>
+    <w:lvl w:ilvl="2" w:tentative="1">
+      <w:start w:val="1"/>
+      <w:numFmt w:val="decimal"/>
+      <w:lvlText w:val="%3."/>
+      <w:lvlJc w:val="left"/>
+      <w:pPr>
+        <w:tabs>
+          <w:tab w:val="num" w:pos="2160"/>
+        </w:tabs>
+        <w:ind w:left="2160" w:hanging="360"/>
+      </w:pPr>
+    </w:lvl>
+    <w:lvl w:ilvl="3" w:tentative="1">
+      <w:start w:val="1"/>
+      <w:numFmt w:val="decimal"/>
+      <w:lvlText w:val="%4."/>
+      <w:lvlJc w:val="left"/>
+      <w:pPr>
+        <w:tabs>
+          <w:tab w:val="num" w:pos="2880"/>
+        </w:tabs>
+        <w:ind w:left="2880" w:hanging="360"/>
+      </w:pPr>
+    </w:lvl>
+    <w:lvl w:ilvl="4" w:tentative="1">
+      <w:start w:val="1"/>
+      <w:numFmt w:val="decimal"/>
+      <w:lvlText w:val="%5."/>
+      <w:lvlJc w:val="left"/>
+      <w:pPr>
+        <w:tabs>
+          <w:tab w:val="num" w:pos="3600"/>
+        </w:tabs>
+        <w:ind w:left="3600" w:hanging="360"/>
+      </w:pPr>
+    </w:lvl>
+    <w:lvl w:ilvl="5" w:tentative="1">
+      <w:start w:val="1"/>
+      <w:numFmt w:val="decimal"/>
+      <w:lvlText w:val="%6."/>
+      <w:lvlJc w:val="left"/>
+      <w:pPr>
+        <w:tabs>
+          <w:tab w:val="num" w:pos="4320"/>
+        </w:tabs>
+        <w:ind w:left="4320" w:hanging="360"/>
+      </w:pPr>
+    </w:lvl>
+    <w:lvl w:ilvl="6" w:tentative="1">
+      <w:start w:val="1"/>
+      <w:numFmt w:val="decimal"/>
+      <w:lvlText w:val="%7."/>
+      <w:lvlJc w:val="left"/>
+      <w:pPr>
+        <w:tabs>
+          <w:tab w:val="num" w:pos="5040"/>
+        </w:tabs>
+        <w:ind w:left="5040" w:hanging="360"/>
+      </w:pPr>
+    </w:lvl>
+    <w:lvl w:ilvl="7" w:tentative="1">
+      <w:start w:val="1"/>
+      <w:numFmt w:val="decimal"/>
+      <w:lvlText w:val="%8."/>
+      <w:lvlJc w:val="left"/>
+      <w:pPr>
+        <w:tabs>
+          <w:tab w:val="num" w:pos="5760"/>
+        </w:tabs>
+        <w:ind w:left="5760" w:hanging="360"/>
+      </w:pPr>
+    </w:lvl>
+    <w:lvl w:ilvl="8" w:tentative="1">
+      <w:start w:val="1"/>
+      <w:numFmt w:val="decimal"/>
+      <w:lvlText w:val="%9."/>
+      <w:lvlJc w:val="left"/>
+      <w:pPr>
+        <w:tabs>
+          <w:tab w:val="num" w:pos="6480"/>
+        </w:tabs>
+        <w:ind w:left="6480" w:hanging="360"/>
+      </w:pPr>
+    </w:lvl>
+  </w:abstractNum>
+  <w:abstractNum w:abstractNumId="3" w15:restartNumberingAfterBreak="0">
     <w:nsid w:val="145712BC"/>
     <w:multiLevelType w:val="multilevel"/>
     <w:tmpl w:val="D7F8E420"/>
@@ -24675,7 +25846,7 @@
       </w:rPr>
     </w:lvl>
   </w:abstractNum>
-  <w:abstractNum w:abstractNumId="3" w15:restartNumberingAfterBreak="0">
+  <w:abstractNum w:abstractNumId="4" w15:restartNumberingAfterBreak="0">
     <w:nsid w:val="209B21BD"/>
     <w:multiLevelType w:val="multilevel"/>
     <w:tmpl w:val="1612336A"/>
@@ -24824,7 +25995,7 @@
       </w:rPr>
     </w:lvl>
   </w:abstractNum>
-  <w:abstractNum w:abstractNumId="4" w15:restartNumberingAfterBreak="0">
+  <w:abstractNum w:abstractNumId="5" w15:restartNumberingAfterBreak="0">
     <w:nsid w:val="28B72FEF"/>
     <w:multiLevelType w:val="multilevel"/>
     <w:tmpl w:val="D45C53F2"/>
@@ -24957,7 +26128,7 @@
       </w:rPr>
     </w:lvl>
   </w:abstractNum>
-  <w:abstractNum w:abstractNumId="5" w15:restartNumberingAfterBreak="0">
+  <w:abstractNum w:abstractNumId="6" w15:restartNumberingAfterBreak="0">
     <w:nsid w:val="2A6515D4"/>
     <w:multiLevelType w:val="multilevel"/>
     <w:tmpl w:val="1F681CD4"/>
@@ -25085,7 +26256,7 @@
       </w:rPr>
     </w:lvl>
   </w:abstractNum>
-  <w:abstractNum w:abstractNumId="6" w15:restartNumberingAfterBreak="0">
+  <w:abstractNum w:abstractNumId="7" w15:restartNumberingAfterBreak="0">
     <w:nsid w:val="2A9A1A98"/>
     <w:multiLevelType w:val="hybridMultilevel"/>
     <w:tmpl w:val="16B4489A"/>
@@ -25176,7 +26347,7 @@
       </w:pPr>
     </w:lvl>
   </w:abstractNum>
-  <w:abstractNum w:abstractNumId="7" w15:restartNumberingAfterBreak="0">
+  <w:abstractNum w:abstractNumId="8" w15:restartNumberingAfterBreak="0">
     <w:nsid w:val="310301F0"/>
     <w:multiLevelType w:val="hybridMultilevel"/>
     <w:tmpl w:val="22069D3C"/>
@@ -25289,10 +26460,10 @@
       </w:rPr>
     </w:lvl>
   </w:abstractNum>
-  <w:abstractNum w:abstractNumId="8" w15:restartNumberingAfterBreak="0">
-    <w:nsid w:val="505B7F18"/>
+  <w:abstractNum w:abstractNumId="9" w15:restartNumberingAfterBreak="0">
+    <w:nsid w:val="49F57791"/>
     <w:multiLevelType w:val="multilevel"/>
-    <w:tmpl w:val="1482171A"/>
+    <w:tmpl w:val="84760348"/>
     <w:lvl w:ilvl="0">
       <w:start w:val="1"/>
       <w:numFmt w:val="bullet"/>
@@ -25438,10 +26609,10 @@
       </w:rPr>
     </w:lvl>
   </w:abstractNum>
-  <w:abstractNum w:abstractNumId="9" w15:restartNumberingAfterBreak="0">
-    <w:nsid w:val="56111C79"/>
+  <w:abstractNum w:abstractNumId="10" w15:restartNumberingAfterBreak="0">
+    <w:nsid w:val="505B7F18"/>
     <w:multiLevelType w:val="multilevel"/>
-    <w:tmpl w:val="26A047B2"/>
+    <w:tmpl w:val="1482171A"/>
     <w:lvl w:ilvl="0">
       <w:start w:val="1"/>
       <w:numFmt w:val="bullet"/>
@@ -25587,7 +26758,156 @@
       </w:rPr>
     </w:lvl>
   </w:abstractNum>
-  <w:abstractNum w:abstractNumId="10" w15:restartNumberingAfterBreak="0">
+  <w:abstractNum w:abstractNumId="11" w15:restartNumberingAfterBreak="0">
+    <w:nsid w:val="56111C79"/>
+    <w:multiLevelType w:val="multilevel"/>
+    <w:tmpl w:val="26A047B2"/>
+    <w:lvl w:ilvl="0">
+      <w:start w:val="1"/>
+      <w:numFmt w:val="bullet"/>
+      <w:lvlText w:val=""/>
+      <w:lvlJc w:val="left"/>
+      <w:pPr>
+        <w:tabs>
+          <w:tab w:val="num" w:pos="720"/>
+        </w:tabs>
+        <w:ind w:left="720" w:hanging="360"/>
+      </w:pPr>
+      <w:rPr>
+        <w:rFonts w:ascii="Symbol" w:hAnsi="Symbol" w:hint="default"/>
+        <w:sz w:val="20"/>
+      </w:rPr>
+    </w:lvl>
+    <w:lvl w:ilvl="1" w:tentative="1">
+      <w:start w:val="1"/>
+      <w:numFmt w:val="bullet"/>
+      <w:lvlText w:val="o"/>
+      <w:lvlJc w:val="left"/>
+      <w:pPr>
+        <w:tabs>
+          <w:tab w:val="num" w:pos="1440"/>
+        </w:tabs>
+        <w:ind w:left="1440" w:hanging="360"/>
+      </w:pPr>
+      <w:rPr>
+        <w:rFonts w:ascii="Courier New" w:hAnsi="Courier New" w:hint="default"/>
+        <w:sz w:val="20"/>
+      </w:rPr>
+    </w:lvl>
+    <w:lvl w:ilvl="2" w:tentative="1">
+      <w:start w:val="1"/>
+      <w:numFmt w:val="bullet"/>
+      <w:lvlText w:val=""/>
+      <w:lvlJc w:val="left"/>
+      <w:pPr>
+        <w:tabs>
+          <w:tab w:val="num" w:pos="2160"/>
+        </w:tabs>
+        <w:ind w:left="2160" w:hanging="360"/>
+      </w:pPr>
+      <w:rPr>
+        <w:rFonts w:ascii="Wingdings" w:hAnsi="Wingdings" w:hint="default"/>
+        <w:sz w:val="20"/>
+      </w:rPr>
+    </w:lvl>
+    <w:lvl w:ilvl="3" w:tentative="1">
+      <w:start w:val="1"/>
+      <w:numFmt w:val="bullet"/>
+      <w:lvlText w:val=""/>
+      <w:lvlJc w:val="left"/>
+      <w:pPr>
+        <w:tabs>
+          <w:tab w:val="num" w:pos="2880"/>
+        </w:tabs>
+        <w:ind w:left="2880" w:hanging="360"/>
+      </w:pPr>
+      <w:rPr>
+        <w:rFonts w:ascii="Wingdings" w:hAnsi="Wingdings" w:hint="default"/>
+        <w:sz w:val="20"/>
+      </w:rPr>
+    </w:lvl>
+    <w:lvl w:ilvl="4" w:tentative="1">
+      <w:start w:val="1"/>
+      <w:numFmt w:val="bullet"/>
+      <w:lvlText w:val=""/>
+      <w:lvlJc w:val="left"/>
+      <w:pPr>
+        <w:tabs>
+          <w:tab w:val="num" w:pos="3600"/>
+        </w:tabs>
+        <w:ind w:left="3600" w:hanging="360"/>
+      </w:pPr>
+      <w:rPr>
+        <w:rFonts w:ascii="Wingdings" w:hAnsi="Wingdings" w:hint="default"/>
+        <w:sz w:val="20"/>
+      </w:rPr>
+    </w:lvl>
+    <w:lvl w:ilvl="5" w:tentative="1">
+      <w:start w:val="1"/>
+      <w:numFmt w:val="bullet"/>
+      <w:lvlText w:val=""/>
+      <w:lvlJc w:val="left"/>
+      <w:pPr>
+        <w:tabs>
+          <w:tab w:val="num" w:pos="4320"/>
+        </w:tabs>
+        <w:ind w:left="4320" w:hanging="360"/>
+      </w:pPr>
+      <w:rPr>
+        <w:rFonts w:ascii="Wingdings" w:hAnsi="Wingdings" w:hint="default"/>
+        <w:sz w:val="20"/>
+      </w:rPr>
+    </w:lvl>
+    <w:lvl w:ilvl="6" w:tentative="1">
+      <w:start w:val="1"/>
+      <w:numFmt w:val="bullet"/>
+      <w:lvlText w:val=""/>
+      <w:lvlJc w:val="left"/>
+      <w:pPr>
+        <w:tabs>
+          <w:tab w:val="num" w:pos="5040"/>
+        </w:tabs>
+        <w:ind w:left="5040" w:hanging="360"/>
+      </w:pPr>
+      <w:rPr>
+        <w:rFonts w:ascii="Wingdings" w:hAnsi="Wingdings" w:hint="default"/>
+        <w:sz w:val="20"/>
+      </w:rPr>
+    </w:lvl>
+    <w:lvl w:ilvl="7" w:tentative="1">
+      <w:start w:val="1"/>
+      <w:numFmt w:val="bullet"/>
+      <w:lvlText w:val=""/>
+      <w:lvlJc w:val="left"/>
+      <w:pPr>
+        <w:tabs>
+          <w:tab w:val="num" w:pos="5760"/>
+        </w:tabs>
+        <w:ind w:left="5760" w:hanging="360"/>
+      </w:pPr>
+      <w:rPr>
+        <w:rFonts w:ascii="Wingdings" w:hAnsi="Wingdings" w:hint="default"/>
+        <w:sz w:val="20"/>
+      </w:rPr>
+    </w:lvl>
+    <w:lvl w:ilvl="8" w:tentative="1">
+      <w:start w:val="1"/>
+      <w:numFmt w:val="bullet"/>
+      <w:lvlText w:val=""/>
+      <w:lvlJc w:val="left"/>
+      <w:pPr>
+        <w:tabs>
+          <w:tab w:val="num" w:pos="6480"/>
+        </w:tabs>
+        <w:ind w:left="6480" w:hanging="360"/>
+      </w:pPr>
+      <w:rPr>
+        <w:rFonts w:ascii="Wingdings" w:hAnsi="Wingdings" w:hint="default"/>
+        <w:sz w:val="20"/>
+      </w:rPr>
+    </w:lvl>
+  </w:abstractNum>
+  <w:abstractNum w:abstractNumId="12" w15:restartNumberingAfterBreak="0">
     <w:nsid w:val="581978EB"/>
     <w:multiLevelType w:val="hybridMultilevel"/>
     <w:tmpl w:val="2102BE48"/>
@@ -25676,7 +26996,7 @@
       </w:pPr>
     </w:lvl>
   </w:abstractNum>
-  <w:abstractNum w:abstractNumId="11" w15:restartNumberingAfterBreak="0">
+  <w:abstractNum w:abstractNumId="13" w15:restartNumberingAfterBreak="0">
     <w:nsid w:val="67910029"/>
     <w:multiLevelType w:val="multilevel"/>
     <w:tmpl w:val="D39C8ED8"/>
@@ -25809,7 +27129,7 @@
       </w:rPr>
     </w:lvl>
   </w:abstractNum>
-  <w:abstractNum w:abstractNumId="12" w15:restartNumberingAfterBreak="0">
+  <w:abstractNum w:abstractNumId="14" w15:restartNumberingAfterBreak="0">
     <w:nsid w:val="71011698"/>
     <w:multiLevelType w:val="multilevel"/>
     <w:tmpl w:val="FF145FC0"/>
@@ -25958,20 +27278,169 @@
       </w:rPr>
     </w:lvl>
   </w:abstractNum>
+  <w:abstractNum w:abstractNumId="15" w15:restartNumberingAfterBreak="0">
+    <w:nsid w:val="7F967C86"/>
+    <w:multiLevelType w:val="multilevel"/>
+    <w:tmpl w:val="E6AC19A6"/>
+    <w:lvl w:ilvl="0">
+      <w:start w:val="1"/>
+      <w:numFmt w:val="bullet"/>
+      <w:lvlText w:val=""/>
+      <w:lvlJc w:val="left"/>
+      <w:pPr>
+        <w:tabs>
+          <w:tab w:val="num" w:pos="720"/>
+        </w:tabs>
+        <w:ind w:left="720" w:hanging="360"/>
+      </w:pPr>
+      <w:rPr>
+        <w:rFonts w:ascii="Symbol" w:hAnsi="Symbol" w:hint="default"/>
+        <w:sz w:val="20"/>
+      </w:rPr>
+    </w:lvl>
+    <w:lvl w:ilvl="1" w:tentative="1">
+      <w:start w:val="1"/>
+      <w:numFmt w:val="bullet"/>
+      <w:lvlText w:val="o"/>
+      <w:lvlJc w:val="left"/>
+      <w:pPr>
+        <w:tabs>
+          <w:tab w:val="num" w:pos="1440"/>
+        </w:tabs>
+        <w:ind w:left="1440" w:hanging="360"/>
+      </w:pPr>
+      <w:rPr>
+        <w:rFonts w:ascii="Courier New" w:hAnsi="Courier New" w:hint="default"/>
+        <w:sz w:val="20"/>
+      </w:rPr>
+    </w:lvl>
+    <w:lvl w:ilvl="2" w:tentative="1">
+      <w:start w:val="1"/>
+      <w:numFmt w:val="bullet"/>
+      <w:lvlText w:val=""/>
+      <w:lvlJc w:val="left"/>
+      <w:pPr>
+        <w:tabs>
+          <w:tab w:val="num" w:pos="2160"/>
+        </w:tabs>
+        <w:ind w:left="2160" w:hanging="360"/>
+      </w:pPr>
+      <w:rPr>
+        <w:rFonts w:ascii="Wingdings" w:hAnsi="Wingdings" w:hint="default"/>
+        <w:sz w:val="20"/>
+      </w:rPr>
+    </w:lvl>
+    <w:lvl w:ilvl="3" w:tentative="1">
+      <w:start w:val="1"/>
+      <w:numFmt w:val="bullet"/>
+      <w:lvlText w:val=""/>
+      <w:lvlJc w:val="left"/>
+      <w:pPr>
+        <w:tabs>
+          <w:tab w:val="num" w:pos="2880"/>
+        </w:tabs>
+        <w:ind w:left="2880" w:hanging="360"/>
+      </w:pPr>
+      <w:rPr>
+        <w:rFonts w:ascii="Wingdings" w:hAnsi="Wingdings" w:hint="default"/>
+        <w:sz w:val="20"/>
+      </w:rPr>
+    </w:lvl>
+    <w:lvl w:ilvl="4" w:tentative="1">
+      <w:start w:val="1"/>
+      <w:numFmt w:val="bullet"/>
+      <w:lvlText w:val=""/>
+      <w:lvlJc w:val="left"/>
+      <w:pPr>
+        <w:tabs>
+          <w:tab w:val="num" w:pos="3600"/>
+        </w:tabs>
+        <w:ind w:left="3600" w:hanging="360"/>
+      </w:pPr>
+      <w:rPr>
+        <w:rFonts w:ascii="Wingdings" w:hAnsi="Wingdings" w:hint="default"/>
+        <w:sz w:val="20"/>
+      </w:rPr>
+    </w:lvl>
+    <w:lvl w:ilvl="5" w:tentative="1">
+      <w:start w:val="1"/>
+      <w:numFmt w:val="bullet"/>
+      <w:lvlText w:val=""/>
+      <w:lvlJc w:val="left"/>
+      <w:pPr>
+        <w:tabs>
+          <w:tab w:val="num" w:pos="4320"/>
+        </w:tabs>
+        <w:ind w:left="4320" w:hanging="360"/>
+      </w:pPr>
+      <w:rPr>
+        <w:rFonts w:ascii="Wingdings" w:hAnsi="Wingdings" w:hint="default"/>
+        <w:sz w:val="20"/>
+      </w:rPr>
+    </w:lvl>
+    <w:lvl w:ilvl="6" w:tentative="1">
+      <w:start w:val="1"/>
+      <w:numFmt w:val="bullet"/>
+      <w:lvlText w:val=""/>
+      <w:lvlJc w:val="left"/>
+      <w:pPr>
+        <w:tabs>
+          <w:tab w:val="num" w:pos="5040"/>
+        </w:tabs>
+        <w:ind w:left="5040" w:hanging="360"/>
+      </w:pPr>
+      <w:rPr>
+        <w:rFonts w:ascii="Wingdings" w:hAnsi="Wingdings" w:hint="default"/>
+        <w:sz w:val="20"/>
+      </w:rPr>
+    </w:lvl>
+    <w:lvl w:ilvl="7" w:tentative="1">
+      <w:start w:val="1"/>
+      <w:numFmt w:val="bullet"/>
+      <w:lvlText w:val=""/>
+      <w:lvlJc w:val="left"/>
+      <w:pPr>
+        <w:tabs>
+          <w:tab w:val="num" w:pos="5760"/>
+        </w:tabs>
+        <w:ind w:left="5760" w:hanging="360"/>
+      </w:pPr>
+      <w:rPr>
+        <w:rFonts w:ascii="Wingdings" w:hAnsi="Wingdings" w:hint="default"/>
+        <w:sz w:val="20"/>
+      </w:rPr>
+    </w:lvl>
+    <w:lvl w:ilvl="8" w:tentative="1">
+      <w:start w:val="1"/>
+      <w:numFmt w:val="bullet"/>
+      <w:lvlText w:val=""/>
+      <w:lvlJc w:val="left"/>
+      <w:pPr>
+        <w:tabs>
+          <w:tab w:val="num" w:pos="6480"/>
+        </w:tabs>
+        <w:ind w:left="6480" w:hanging="360"/>
+      </w:pPr>
+      <w:rPr>
+        <w:rFonts w:ascii="Wingdings" w:hAnsi="Wingdings" w:hint="default"/>
+        <w:sz w:val="20"/>
+      </w:rPr>
+    </w:lvl>
+  </w:abstractNum>
   <w:num w:numId="1" w16cid:durableId="1747266641">
-    <w:abstractNumId w:val="4"/>
+    <w:abstractNumId w:val="5"/>
   </w:num>
   <w:num w:numId="2" w16cid:durableId="1772387228">
-    <w:abstractNumId w:val="11"/>
+    <w:abstractNumId w:val="13"/>
   </w:num>
   <w:num w:numId="3" w16cid:durableId="1252474530">
-    <w:abstractNumId w:val="5"/>
+    <w:abstractNumId w:val="6"/>
   </w:num>
   <w:num w:numId="4" w16cid:durableId="1929000181">
-    <w:abstractNumId w:val="10"/>
+    <w:abstractNumId w:val="12"/>
   </w:num>
   <w:num w:numId="5" w16cid:durableId="1864055140">
-    <w:abstractNumId w:val="6"/>
+    <w:abstractNumId w:val="7"/>
   </w:num>
   <w:num w:numId="6" w16cid:durableId="1984771879">
     <w:abstractNumId w:val="1"/>
@@ -25980,22 +27449,31 @@
     <w:abstractNumId w:val="0"/>
   </w:num>
   <w:num w:numId="8" w16cid:durableId="576474671">
-    <w:abstractNumId w:val="7"/>
+    <w:abstractNumId w:val="8"/>
   </w:num>
   <w:num w:numId="9" w16cid:durableId="411394465">
+    <w:abstractNumId w:val="3"/>
+  </w:num>
+  <w:num w:numId="10" w16cid:durableId="1515536369">
+    <w:abstractNumId w:val="4"/>
+  </w:num>
+  <w:num w:numId="11" w16cid:durableId="1306620924">
+    <w:abstractNumId w:val="10"/>
+  </w:num>
+  <w:num w:numId="12" w16cid:durableId="2137094251">
+    <w:abstractNumId w:val="11"/>
+  </w:num>
+  <w:num w:numId="13" w16cid:durableId="1691377413">
+    <w:abstractNumId w:val="14"/>
+  </w:num>
+  <w:num w:numId="14" w16cid:durableId="871652723">
     <w:abstractNumId w:val="2"/>
   </w:num>
-  <w:num w:numId="10" w16cid:durableId="1515536369">
-    <w:abstractNumId w:val="3"/>
-  </w:num>
-  <w:num w:numId="11" w16cid:durableId="1306620924">
-    <w:abstractNumId w:val="8"/>
-  </w:num>
-  <w:num w:numId="12" w16cid:durableId="2137094251">
+  <w:num w:numId="15" w16cid:durableId="756705162">
     <w:abstractNumId w:val="9"/>
   </w:num>
-  <w:num w:numId="13" w16cid:durableId="1691377413">
-    <w:abstractNumId w:val="12"/>
+  <w:num w:numId="16" w16cid:durableId="751270051">
+    <w:abstractNumId w:val="15"/>
   </w:num>
 </w:numbering>
 </file>

</xml_diff>